<commit_message>
reran cloud experiments with smoothed goes cloud fraction profile
</commit_message>
<xml_diff>
--- a/doc/DiM_ms20260713.docx
+++ b/doc/DiM_ms20260713.docx
@@ -251,19 +251,7 @@
         <w:rPr>
           <w:rFonts w:ascii="Aptos" w:hAnsi="Aptos"/>
         </w:rPr>
-        <w:t xml:space="preserve">moisture balance </w:t>
-      </w:r>
-      <w:r>
-        <w:rPr>
-          <w:rFonts w:ascii="Aptos" w:hAnsi="Aptos"/>
-        </w:rPr>
-        <w:t xml:space="preserve">model </w:t>
-      </w:r>
-      <w:r>
-        <w:rPr>
-          <w:rFonts w:ascii="Aptos" w:hAnsi="Aptos"/>
-        </w:rPr>
-        <w:t>of the lower troposphere</w:t>
+        <w:t>moisture balance model of the lower troposphere</w:t>
       </w:r>
       <w:r>
         <w:rPr>
@@ -348,13 +336,7 @@
         <w:rPr>
           <w:rFonts w:ascii="Aptos" w:hAnsi="Aptos"/>
         </w:rPr>
-        <w:t>cloud</w:t>
-      </w:r>
-      <w:r>
-        <w:rPr>
-          <w:rFonts w:ascii="Aptos" w:hAnsi="Aptos"/>
-        </w:rPr>
-        <w:t xml:space="preserve"> moisture flux balances</w:t>
+        <w:t>cloud moisture flux balances</w:t>
       </w:r>
       <w:r>
         <w:rPr>
@@ -420,27 +402,14 @@
         <w:rPr>
           <w:rFonts w:ascii="Aptos" w:hAnsi="Aptos"/>
         </w:rPr>
-        <w:t xml:space="preserve">decrease </w:t>
-      </w:r>
-      <w:r>
-        <w:rPr>
-          <w:rFonts w:ascii="Aptos" w:hAnsi="Aptos"/>
-        </w:rPr>
-        <w:t>–5 % K</w:t>
+        <w:t>decrease –5 % K</w:t>
       </w:r>
       <w:r>
         <w:rPr>
           <w:rFonts w:ascii="Aptos" w:hAnsi="Aptos"/>
           <w:vertAlign w:val="superscript"/>
         </w:rPr>
-        <w:t>-1</w:t>
-      </w:r>
-      <w:r>
-        <w:rPr>
-          <w:rFonts w:ascii="Aptos" w:hAnsi="Aptos"/>
-          <w:vertAlign w:val="superscript"/>
-        </w:rPr>
-        <w:t xml:space="preserve"> </w:t>
+        <w:t xml:space="preserve">-1 </w:t>
       </w:r>
       <w:r>
         <w:rPr>
@@ -580,21 +549,7 @@
         <w:rPr>
           <w:rFonts w:ascii="Aptos" w:hAnsi="Aptos"/>
         </w:rPr>
-        <w:t xml:space="preserve"> to </w:t>
-      </w:r>
-      <w:proofErr w:type="gramStart"/>
-      <w:r>
-        <w:rPr>
-          <w:rFonts w:ascii="Aptos" w:hAnsi="Aptos"/>
-        </w:rPr>
-        <w:t>increasing</w:t>
-      </w:r>
-      <w:proofErr w:type="gramEnd"/>
-      <w:r>
-        <w:rPr>
-          <w:rFonts w:ascii="Aptos" w:hAnsi="Aptos"/>
-        </w:rPr>
-        <w:t xml:space="preserve"> CO2</w:t>
+        <w:t xml:space="preserve"> to increasing CO2</w:t>
       </w:r>
       <w:r>
         <w:rPr>
@@ -635,15 +590,7 @@
         <w:t xml:space="preserve">y </w:t>
       </w:r>
       <w:r>
-        <w:t xml:space="preserve">low cloud </w:t>
-      </w:r>
-      <w:proofErr w:type="gramStart"/>
-      <w:r>
-        <w:t>feedbacks</w:t>
-      </w:r>
-      <w:proofErr w:type="gramEnd"/>
-      <w:r>
-        <w:t xml:space="preserve"> and widen the spread of climate projections. </w:t>
+        <w:t xml:space="preserve">low cloud feedbacks and widen the spread of climate projections. </w:t>
       </w:r>
       <w:r>
         <w:rPr>
@@ -655,14 +602,7 @@
         <w:rPr>
           <w:rFonts w:ascii="Aptos" w:hAnsi="Aptos"/>
         </w:rPr>
-        <w:t xml:space="preserve">ositive </w:t>
-      </w:r>
-      <w:proofErr w:type="gramStart"/>
-      <w:r>
-        <w:rPr>
-          <w:rFonts w:ascii="Aptos" w:hAnsi="Aptos"/>
-        </w:rPr>
-        <w:t>feedback</w:t>
+        <w:t>ositive feedback</w:t>
       </w:r>
       <w:r>
         <w:rPr>
@@ -670,7 +610,6 @@
         </w:rPr>
         <w:t>s</w:t>
       </w:r>
-      <w:proofErr w:type="gramEnd"/>
       <w:r>
         <w:rPr>
           <w:rFonts w:ascii="Aptos" w:hAnsi="Aptos"/>
@@ -717,21 +656,7 @@
         <w:rPr>
           <w:rFonts w:ascii="Aptos" w:hAnsi="Aptos"/>
         </w:rPr>
-        <w:t xml:space="preserve">s dominates </w:t>
-      </w:r>
-      <w:proofErr w:type="gramStart"/>
-      <w:r>
-        <w:rPr>
-          <w:rFonts w:ascii="Aptos" w:hAnsi="Aptos"/>
-        </w:rPr>
-        <w:t>feedbacks</w:t>
-      </w:r>
-      <w:proofErr w:type="gramEnd"/>
-      <w:r>
-        <w:rPr>
-          <w:rFonts w:ascii="Aptos" w:hAnsi="Aptos"/>
-        </w:rPr>
-        <w:t xml:space="preserve"> from changes in </w:t>
+        <w:t xml:space="preserve">s dominates feedbacks from changes in </w:t>
       </w:r>
       <w:r>
         <w:rPr>
@@ -856,15 +781,7 @@
         <w:t xml:space="preserve">and LES </w:t>
       </w:r>
       <w:r>
-        <w:t xml:space="preserve">suggest that </w:t>
-      </w:r>
-      <w:proofErr w:type="spellStart"/>
-      <w:r>
-        <w:t>subcloud</w:t>
-      </w:r>
-      <w:proofErr w:type="spellEnd"/>
-      <w:r>
-        <w:t xml:space="preserve"> layer turbulence moderates cloud base moisture</w:t>
+        <w:t>suggest that subcloud layer turbulence moderates cloud base moisture</w:t>
       </w:r>
       <w:r>
         <w:t xml:space="preserve"> and </w:t>
@@ -935,21 +852,13 @@
         <w:t xml:space="preserve"> in 4 of 5 models</w:t>
       </w:r>
       <w:r>
-        <w:t xml:space="preserve">, </w:t>
-      </w:r>
-      <w:proofErr w:type="gramStart"/>
-      <w:r>
-        <w:t>a</w:t>
+        <w:t>, a</w:t>
       </w:r>
       <w:r>
         <w:t xml:space="preserve"> </w:t>
       </w:r>
       <w:r>
-        <w:t>negative feedback (Huang et al. 2026)</w:t>
-      </w:r>
-      <w:proofErr w:type="gramEnd"/>
-      <w:r>
-        <w:t>.</w:t>
+        <w:t>negative feedback (Huang et al. 2026).</w:t>
       </w:r>
     </w:p>
     <w:p>
@@ -1023,21 +932,7 @@
         <w:rPr>
           <w:rFonts w:ascii="Aptos" w:hAnsi="Aptos"/>
         </w:rPr>
-        <w:t xml:space="preserve">Sherwood et al. (2014) proposed that in a </w:t>
-      </w:r>
-      <w:proofErr w:type="gramStart"/>
-      <w:r>
-        <w:rPr>
-          <w:rFonts w:ascii="Aptos" w:hAnsi="Aptos"/>
-        </w:rPr>
-        <w:t>warmed</w:t>
-      </w:r>
-      <w:proofErr w:type="gramEnd"/>
-      <w:r>
-        <w:rPr>
-          <w:rFonts w:ascii="Aptos" w:hAnsi="Aptos"/>
-        </w:rPr>
-        <w:t xml:space="preserve"> climate, increased vertical mixing reduces cloud fraction by desiccating the shallow cumulus layer. Field observations from EUREC4A (Stevens et al. 2021; George et al. 2022) show clouds are correlated more strongly to mass flux than to relative humidity, challenging the importance of humidity and its desiccation by vertical mixing, and suggesting that vertical mixing processes are correlated with clouds (Vogel et al. 2022). </w:t>
+        <w:t xml:space="preserve">Sherwood et al. (2014) proposed that in a warmed climate, increased vertical mixing reduces cloud fraction by desiccating the shallow cumulus layer. Field observations from EUREC4A (Stevens et al. 2021; George et al. 2022) show clouds are correlated more strongly to mass flux than to relative humidity, challenging the importance of humidity and its desiccation by vertical mixing, and suggesting that vertical mixing processes are correlated with clouds (Vogel et al. 2022). </w:t>
       </w:r>
       <w:r>
         <w:rPr>
@@ -1137,21 +1032,7 @@
         <w:rPr>
           <w:rFonts w:ascii="Aptos" w:hAnsi="Aptos"/>
         </w:rPr>
-        <w:t xml:space="preserve">can be used to understand mean climates of the shallow cumulus regime. In a steady climate, the moisture budget over the shallow cumulus regime is balanced. A change in the drying by the </w:t>
-      </w:r>
-      <w:proofErr w:type="gramStart"/>
-      <w:r>
-        <w:rPr>
-          <w:rFonts w:ascii="Aptos" w:hAnsi="Aptos"/>
-        </w:rPr>
-        <w:t>large scale</w:t>
-      </w:r>
-      <w:proofErr w:type="gramEnd"/>
-      <w:r>
-        <w:rPr>
-          <w:rFonts w:ascii="Aptos" w:hAnsi="Aptos"/>
-        </w:rPr>
-        <w:t xml:space="preserve"> circulation is thus compensated by the opposite moistening by the divergence of the shallow cumulus cloud eddy flux.</w:t>
+        <w:t>can be used to understand mean climates of the shallow cumulus regime. In a steady climate, the moisture budget over the shallow cumulus regime is balanced. A change in the drying by the large scale circulation is thus compensated by the opposite moistening by the divergence of the shallow cumulus cloud eddy flux.</w:t>
       </w:r>
     </w:p>
     <w:p>
@@ -1163,13 +1044,8 @@
       </w:r>
     </w:p>
     <w:p>
-      <w:proofErr w:type="gramStart"/>
-      <w:r>
-        <w:t>The Dynamical Inhibition of Moisture (DIM) cloud equilibrium hypothesis,</w:t>
-      </w:r>
-      <w:proofErr w:type="gramEnd"/>
-      <w:r>
-        <w:t xml:space="preserve"> predicts the direct effect of large-scale circulation on shallow cumulus clouds. For a climatological mean with a balanced moisture budge</w:t>
+      <w:r>
+        <w:t>The Dynamical Inhibition of Moisture (DIM) cloud equilibrium hypothesis, predicts the direct effect of large-scale circulation on shallow cumulus clouds. For a climatological mean with a balanced moisture budge</w:t>
       </w:r>
       <w:r>
         <w:t>t</w:t>
@@ -1185,15 +1061,7 @@
         <w:t xml:space="preserve"> </w:t>
       </w:r>
       <w:r>
-        <w:t xml:space="preserve">the planetary albedo, with </w:t>
-      </w:r>
-      <w:proofErr w:type="gramStart"/>
-      <w:r>
-        <w:t>a weak positive feedback</w:t>
-      </w:r>
-      <w:proofErr w:type="gramEnd"/>
-      <w:r>
-        <w:t xml:space="preserve"> that scales with the shallow cumulus cloud fraction.</w:t>
+        <w:t>the planetary albedo, with a weak positive feedback that scales with the shallow cumulus cloud fraction.</w:t>
       </w:r>
     </w:p>
     <w:p>
@@ -2059,14 +1927,12 @@
         </w:rPr>
         <w:t xml:space="preserve">each </w:t>
       </w:r>
-      <w:proofErr w:type="gramStart"/>
       <w:r>
         <w:rPr>
           <w:rFonts w:eastAsiaTheme="minorEastAsia"/>
         </w:rPr>
         <w:t>terms</w:t>
       </w:r>
-      <w:proofErr w:type="gramEnd"/>
       <w:r>
         <w:rPr>
           <w:rFonts w:eastAsiaTheme="minorEastAsia"/>
@@ -2091,35 +1957,7 @@
         <w:rPr>
           <w:rFonts w:eastAsiaTheme="minorEastAsia"/>
         </w:rPr>
-        <w:t xml:space="preserve">We will show precipitation </w:t>
-      </w:r>
-      <w:proofErr w:type="gramStart"/>
-      <w:r>
-        <w:rPr>
-          <w:rFonts w:eastAsiaTheme="minorEastAsia"/>
-        </w:rPr>
-        <w:t>also scales</w:t>
-      </w:r>
-      <w:proofErr w:type="gramEnd"/>
-      <w:r>
-        <w:rPr>
-          <w:rFonts w:eastAsiaTheme="minorEastAsia"/>
-        </w:rPr>
-        <w:t xml:space="preserve"> with the mass flux and </w:t>
-      </w:r>
-      <w:proofErr w:type="gramStart"/>
-      <w:r>
-        <w:rPr>
-          <w:rFonts w:eastAsiaTheme="minorEastAsia"/>
-        </w:rPr>
-        <w:t>the humidity</w:t>
-      </w:r>
-      <w:proofErr w:type="gramEnd"/>
-      <w:r>
-        <w:rPr>
-          <w:rFonts w:eastAsiaTheme="minorEastAsia"/>
-        </w:rPr>
-        <w:t xml:space="preserve">. </w:t>
+        <w:t xml:space="preserve">We will show precipitation also scales with the mass flux and the humidity. </w:t>
       </w:r>
       <w:r>
         <w:rPr>
@@ -2186,36 +2024,20 @@
           <w:rFonts w:eastAsiaTheme="minorEastAsia"/>
           <w:color w:val="4EA72E" w:themeColor="accent6"/>
         </w:rPr>
-        <w:t xml:space="preserve"> in Fig. </w:t>
-      </w:r>
-      <w:proofErr w:type="spellStart"/>
+        <w:t xml:space="preserve"> in Fig. CFMWa.</w:t>
+      </w:r>
       <w:r>
         <w:rPr>
           <w:rFonts w:eastAsiaTheme="minorEastAsia"/>
           <w:color w:val="4EA72E" w:themeColor="accent6"/>
         </w:rPr>
-        <w:t>CFMWa</w:t>
-      </w:r>
-      <w:proofErr w:type="spellEnd"/>
+        <w:t>]</w:t>
+      </w:r>
       <w:r>
         <w:rPr>
           <w:rFonts w:eastAsiaTheme="minorEastAsia"/>
           <w:color w:val="4EA72E" w:themeColor="accent6"/>
         </w:rPr>
-        <w:t>.</w:t>
-      </w:r>
-      <w:r>
-        <w:rPr>
-          <w:rFonts w:eastAsiaTheme="minorEastAsia"/>
-          <w:color w:val="4EA72E" w:themeColor="accent6"/>
-        </w:rPr>
-        <w:t>]</w:t>
-      </w:r>
-      <w:r>
-        <w:rPr>
-          <w:rFonts w:eastAsiaTheme="minorEastAsia"/>
-          <w:color w:val="4EA72E" w:themeColor="accent6"/>
-        </w:rPr>
         <w:t xml:space="preserve"> </w:t>
       </w:r>
       <w:r>
@@ -2246,21 +2068,7 @@
         <w:rPr>
           <w:rFonts w:eastAsiaTheme="minorEastAsia"/>
         </w:rPr>
-        <w:t xml:space="preserve">the effect of </w:t>
-      </w:r>
-      <w:proofErr w:type="gramStart"/>
-      <w:r>
-        <w:rPr>
-          <w:rFonts w:eastAsiaTheme="minorEastAsia"/>
-        </w:rPr>
-        <w:t>large scale</w:t>
-      </w:r>
-      <w:proofErr w:type="gramEnd"/>
-      <w:r>
-        <w:rPr>
-          <w:rFonts w:eastAsiaTheme="minorEastAsia"/>
-        </w:rPr>
-        <w:t xml:space="preserve"> circulation </w:t>
+        <w:t xml:space="preserve">the effect of large scale circulation </w:t>
       </w:r>
       <m:oMath>
         <m:r>
@@ -2325,27 +2133,13 @@
         <w:rPr>
           <w:rFonts w:eastAsiaTheme="minorEastAsia"/>
         </w:rPr>
-        <w:t xml:space="preserve"> on </w:t>
-      </w:r>
-      <w:proofErr w:type="gramStart"/>
-      <w:r>
-        <w:rPr>
-          <w:rFonts w:eastAsiaTheme="minorEastAsia"/>
-        </w:rPr>
-        <w:t xml:space="preserve">the </w:t>
-      </w:r>
-      <w:r>
-        <w:rPr>
-          <w:rFonts w:eastAsiaTheme="minorEastAsia"/>
-        </w:rPr>
-        <w:t>cloud</w:t>
-      </w:r>
-      <w:proofErr w:type="gramEnd"/>
-      <w:r>
-        <w:rPr>
-          <w:rFonts w:eastAsiaTheme="minorEastAsia"/>
-        </w:rPr>
-        <w:t xml:space="preserve"> mass and</w:t>
+        <w:t xml:space="preserve"> on the </w:t>
+      </w:r>
+      <w:r>
+        <w:rPr>
+          <w:rFonts w:eastAsiaTheme="minorEastAsia"/>
+        </w:rPr>
+        <w:t>cloud mass and</w:t>
       </w:r>
       <w:r>
         <w:rPr>
@@ -3260,21 +3054,7 @@
         <w:rPr>
           <w:rFonts w:eastAsiaTheme="minorEastAsia"/>
         </w:rPr>
-        <w:t xml:space="preserve">The DIM hypothesis predicts the change in area of low clouds responsible for the moisture </w:t>
-      </w:r>
-      <w:proofErr w:type="gramStart"/>
-      <w:r>
-        <w:rPr>
-          <w:rFonts w:eastAsiaTheme="minorEastAsia"/>
-        </w:rPr>
-        <w:t>flux, but</w:t>
-      </w:r>
-      <w:proofErr w:type="gramEnd"/>
-      <w:r>
-        <w:rPr>
-          <w:rFonts w:eastAsiaTheme="minorEastAsia"/>
-        </w:rPr>
-        <w:t xml:space="preserve"> does not account for secondary desiccation of the optically thick stratocumulus clouds at cloud base in most climate models. </w:t>
+        <w:t xml:space="preserve">The DIM hypothesis predicts the change in area of low clouds responsible for the moisture flux, but does not account for secondary desiccation of the optically thick stratocumulus clouds at cloud base in most climate models. </w:t>
       </w:r>
       <w:r>
         <w:rPr>
@@ -3765,14 +3545,7 @@
         <w:rPr>
           <w:rFonts w:eastAsiaTheme="minorEastAsia"/>
         </w:rPr>
-        <w:t xml:space="preserve"> many global </w:t>
-      </w:r>
-      <w:proofErr w:type="gramStart"/>
-      <w:r>
-        <w:rPr>
-          <w:rFonts w:eastAsiaTheme="minorEastAsia"/>
-        </w:rPr>
-        <w:t>constraints</w:t>
+        <w:t xml:space="preserve"> many global constraints</w:t>
       </w:r>
       <w:r>
         <w:rPr>
@@ -3784,14 +3557,7 @@
         <w:rPr>
           <w:rFonts w:eastAsiaTheme="minorEastAsia"/>
         </w:rPr>
-        <w:t>but</w:t>
-      </w:r>
-      <w:proofErr w:type="gramEnd"/>
-      <w:r>
-        <w:rPr>
-          <w:rFonts w:eastAsiaTheme="minorEastAsia"/>
-        </w:rPr>
-        <w:t xml:space="preserve"> </w:t>
+        <w:t xml:space="preserve">but </w:t>
       </w:r>
       <w:r>
         <w:rPr>
@@ -3877,23 +3643,7 @@
           <w:rFonts w:eastAsiaTheme="minorEastAsia"/>
           <w:iCs/>
         </w:rPr>
-        <w:t xml:space="preserve">determines </w:t>
-      </w:r>
-      <w:proofErr w:type="gramStart"/>
-      <w:r>
-        <w:rPr>
-          <w:rFonts w:eastAsiaTheme="minorEastAsia"/>
-          <w:iCs/>
-        </w:rPr>
-        <w:t>a profile</w:t>
-      </w:r>
-      <w:proofErr w:type="gramEnd"/>
-      <w:r>
-        <w:rPr>
-          <w:rFonts w:eastAsiaTheme="minorEastAsia"/>
-          <w:iCs/>
-        </w:rPr>
-        <w:t xml:space="preserve"> of </w:t>
+        <w:t xml:space="preserve">determines a profile of </w:t>
       </w:r>
       <w:r>
         <w:rPr>
@@ -4294,31 +4044,22 @@
           <w:rFonts w:eastAsiaTheme="minorEastAsia"/>
           <w:iCs/>
         </w:rPr>
-        <w:t xml:space="preserve"> cloud fraction observed in </w:t>
-      </w:r>
-      <w:proofErr w:type="gramStart"/>
+        <w:t xml:space="preserve"> cloud fraction observed in EUREC4A</w:t>
+      </w:r>
       <w:r>
         <w:rPr>
           <w:rFonts w:eastAsiaTheme="minorEastAsia"/>
           <w:iCs/>
         </w:rPr>
-        <w:t>EUREC4A</w:t>
+        <w:t>,</w:t>
       </w:r>
       <w:r>
         <w:rPr>
           <w:rFonts w:eastAsiaTheme="minorEastAsia"/>
           <w:iCs/>
         </w:rPr>
-        <w:t>,</w:t>
-      </w:r>
-      <w:r>
-        <w:rPr>
-          <w:rFonts w:eastAsiaTheme="minorEastAsia"/>
-          <w:iCs/>
-        </w:rPr>
         <w:t xml:space="preserve"> and</w:t>
       </w:r>
-      <w:proofErr w:type="gramEnd"/>
       <w:r>
         <w:rPr>
           <w:rFonts w:eastAsiaTheme="minorEastAsia"/>
@@ -4499,23 +4240,7 @@
           <w:rFonts w:eastAsiaTheme="minorEastAsia"/>
           <w:iCs/>
         </w:rPr>
-        <w:t xml:space="preserve"> cloud top height distribution to change to match the </w:t>
-      </w:r>
-      <w:proofErr w:type="gramStart"/>
-      <w:r>
-        <w:rPr>
-          <w:rFonts w:eastAsiaTheme="minorEastAsia"/>
-          <w:iCs/>
-        </w:rPr>
-        <w:t>large scale</w:t>
-      </w:r>
-      <w:proofErr w:type="gramEnd"/>
-      <w:r>
-        <w:rPr>
-          <w:rFonts w:eastAsiaTheme="minorEastAsia"/>
-          <w:iCs/>
-        </w:rPr>
-        <w:t xml:space="preserve"> drying term in a changed climate.</w:t>
+        <w:t xml:space="preserve"> cloud top height distribution to change to match the large scale drying term in a changed climate.</w:t>
       </w:r>
       <w:r>
         <w:rPr>
@@ -4743,21 +4468,7 @@
         <w:rPr>
           <w:rFonts w:ascii="Aptos" w:hAnsi="Aptos"/>
         </w:rPr>
-        <w:t xml:space="preserve">, leaving a proportionality between the </w:t>
-      </w:r>
-      <w:proofErr w:type="gramStart"/>
-      <w:r>
-        <w:rPr>
-          <w:rFonts w:ascii="Aptos" w:hAnsi="Aptos"/>
-        </w:rPr>
-        <w:t>large scale</w:t>
-      </w:r>
-      <w:proofErr w:type="gramEnd"/>
-      <w:r>
-        <w:rPr>
-          <w:rFonts w:ascii="Aptos" w:hAnsi="Aptos"/>
-        </w:rPr>
-        <w:t xml:space="preserve"> </w:t>
+        <w:t xml:space="preserve">, leaving a proportionality between the large scale </w:t>
       </w:r>
       <w:r>
         <w:rPr>
@@ -5095,13 +4806,8 @@
       <w:r>
         <w:t xml:space="preserve">he distribution of entrainment rates </w:t>
       </w:r>
-      <w:proofErr w:type="gramStart"/>
-      <w:r>
-        <w:t>are</w:t>
-      </w:r>
-      <w:proofErr w:type="gramEnd"/>
-      <w:r>
-        <w:t xml:space="preserve"> set </w:t>
+      <w:r>
+        <w:t xml:space="preserve">are set </w:t>
       </w:r>
       <w:r>
         <w:t>to match the cloud top</w:t>
@@ -5137,21 +4843,7 @@
         <w:rPr>
           <w:rFonts w:ascii="Aptos" w:hAnsi="Aptos"/>
         </w:rPr>
-        <w:t xml:space="preserve"> water </w:t>
-      </w:r>
-      <w:proofErr w:type="gramStart"/>
-      <w:r>
-        <w:rPr>
-          <w:rFonts w:ascii="Aptos" w:hAnsi="Aptos"/>
-        </w:rPr>
-        <w:t>in excess of</w:t>
-      </w:r>
-      <w:proofErr w:type="gramEnd"/>
-      <w:r>
-        <w:rPr>
-          <w:rFonts w:ascii="Aptos" w:hAnsi="Aptos"/>
-        </w:rPr>
-        <w:t xml:space="preserve"> the saturation specific humidity condenses as cloud liquid.</w:t>
+        <w:t xml:space="preserve"> water in excess of the saturation specific humidity condenses as cloud liquid.</w:t>
       </w:r>
       <w:bookmarkEnd w:id="0"/>
       <w:bookmarkEnd w:id="2"/>
@@ -5235,15 +4927,7 @@
         <w:t>2</w:t>
       </w:r>
       <w:r>
-        <w:t xml:space="preserve"> GOES satellite reflectance scenes. The mean mass flux binned as a function of </w:t>
-      </w:r>
-      <w:proofErr w:type="gramStart"/>
-      <w:r>
-        <w:t>scene mean</w:t>
-      </w:r>
-      <w:proofErr w:type="gramEnd"/>
-      <w:r>
-        <w:t xml:space="preserve"> reflectance is shown in Fig. REFLMASSFL. The resulting slope 2.4 % (mm s</w:t>
+        <w:t xml:space="preserve"> GOES satellite reflectance scenes. The mean mass flux binned as a function of scene mean reflectance is shown in Fig. REFLMASSFL. The resulting slope 2.4 % (mm s</w:t>
       </w:r>
       <w:r>
         <w:rPr>
@@ -5361,21 +5045,7 @@
         <w:rPr>
           <w:rFonts w:ascii="Aptos Narrow" w:eastAsiaTheme="minorEastAsia" w:hAnsi="Aptos Narrow" w:cs="Times New Roman"/>
         </w:rPr>
-        <w:t xml:space="preserve">Figure REFLMASSFL. Modeled </w:t>
-      </w:r>
-      <w:proofErr w:type="gramStart"/>
-      <w:r>
-        <w:rPr>
-          <w:rFonts w:ascii="Aptos Narrow" w:eastAsiaTheme="minorEastAsia" w:hAnsi="Aptos Narrow" w:cs="Times New Roman"/>
-        </w:rPr>
-        <w:t>mean</w:t>
-      </w:r>
-      <w:proofErr w:type="gramEnd"/>
-      <w:r>
-        <w:rPr>
-          <w:rFonts w:ascii="Aptos Narrow" w:eastAsiaTheme="minorEastAsia" w:hAnsi="Aptos Narrow" w:cs="Times New Roman"/>
-        </w:rPr>
-        <w:t xml:space="preserve"> cloud base (700 m) mass flux for all scenes in each reflectance bin (blue points and whiskers). Black line shows a slope of </w:t>
+        <w:t xml:space="preserve">Figure REFLMASSFL. Modeled mean cloud base (700 m) mass flux for all scenes in each reflectance bin (blue points and whiskers). Black line shows a slope of </w:t>
       </w:r>
       <w:r>
         <w:rPr>
@@ -5466,15 +5136,7 @@
         </w:rPr>
       </w:pPr>
       <w:r>
-        <w:t xml:space="preserve">We use the proportionality between cloud mass flux and reflectance to scale the response of shallow cumulus clouds to changes in the </w:t>
-      </w:r>
-      <w:proofErr w:type="gramStart"/>
-      <w:r>
-        <w:t>large scale</w:t>
-      </w:r>
-      <w:proofErr w:type="gramEnd"/>
-      <w:r>
-        <w:t xml:space="preserve"> circulation. </w:t>
+        <w:t xml:space="preserve">We use the proportionality between cloud mass flux and reflectance to scale the response of shallow cumulus clouds to changes in the large scale circulation. </w:t>
       </w:r>
       <w:r>
         <w:rPr>
@@ -5577,21 +5239,7 @@
         <w:rPr>
           <w:rFonts w:ascii="Aptos" w:hAnsi="Aptos"/>
         </w:rPr>
-        <w:t xml:space="preserve">and precipitation </w:t>
-      </w:r>
-      <w:proofErr w:type="gramStart"/>
-      <w:r>
-        <w:rPr>
-          <w:rFonts w:ascii="Aptos" w:hAnsi="Aptos"/>
-        </w:rPr>
-        <w:t>increases</w:t>
-      </w:r>
-      <w:proofErr w:type="gramEnd"/>
-      <w:r>
-        <w:rPr>
-          <w:rFonts w:ascii="Aptos" w:hAnsi="Aptos"/>
-        </w:rPr>
-        <w:t xml:space="preserve"> </w:t>
+        <w:t xml:space="preserve">and precipitation increases </w:t>
       </w:r>
       <w:r>
         <w:rPr>
@@ -6144,21 +5792,7 @@
         <w:rPr>
           <w:rFonts w:ascii="Aptos Narrow" w:eastAsiaTheme="minorEastAsia" w:hAnsi="Aptos Narrow" w:cs="Times New Roman"/>
         </w:rPr>
-        <w:t xml:space="preserve"> </w:t>
-      </w:r>
-      <w:proofErr w:type="spellStart"/>
-      <w:r>
-        <w:rPr>
-          <w:rFonts w:ascii="Aptos Narrow" w:eastAsiaTheme="minorEastAsia" w:hAnsi="Aptos Narrow" w:cs="Times New Roman"/>
-        </w:rPr>
-        <w:t>hPa</w:t>
-      </w:r>
-      <w:proofErr w:type="spellEnd"/>
-      <w:r>
-        <w:rPr>
-          <w:rFonts w:ascii="Aptos Narrow" w:eastAsiaTheme="minorEastAsia" w:hAnsi="Aptos Narrow" w:cs="Times New Roman"/>
-        </w:rPr>
-        <w:t xml:space="preserve"> day</w:t>
+        <w:t xml:space="preserve"> hPa day</w:t>
       </w:r>
       <w:r>
         <w:rPr>
@@ -6195,16 +5829,8 @@
         <w:rPr>
           <w:rFonts w:ascii="Aptos Narrow" w:eastAsiaTheme="minorEastAsia" w:hAnsi="Aptos Narrow" w:cs="Times New Roman"/>
         </w:rPr>
-        <w:t xml:space="preserve"> </w:t>
-      </w:r>
-      <w:proofErr w:type="spellStart"/>
-      <w:r>
-        <w:rPr>
-          <w:rFonts w:ascii="Aptos Narrow" w:eastAsiaTheme="minorEastAsia" w:hAnsi="Aptos Narrow" w:cs="Times New Roman"/>
-        </w:rPr>
-        <w:t>hPa</w:t>
-      </w:r>
-      <w:proofErr w:type="spellEnd"/>
+        <w:t xml:space="preserve"> hPa</w:t>
+      </w:r>
       <w:r>
         <w:rPr>
           <w:rFonts w:ascii="Aptos Narrow" w:eastAsiaTheme="minorEastAsia" w:hAnsi="Aptos Narrow" w:cs="Times New Roman"/>
@@ -6283,47 +5909,7 @@
           <w:sz w:val="20"/>
           <w:szCs w:val="20"/>
         </w:rPr>
-        <w:t>/Users/</w:t>
-      </w:r>
-      <w:proofErr w:type="spellStart"/>
-      <w:r>
-        <w:rPr>
-          <w:rFonts w:ascii="Menlo" w:hAnsi="Menlo" w:cs="Menlo"/>
-          <w:color w:val="3B2322"/>
-          <w:sz w:val="20"/>
-          <w:szCs w:val="20"/>
-        </w:rPr>
-        <w:t>deszoeks</w:t>
-      </w:r>
-      <w:proofErr w:type="spellEnd"/>
-      <w:r>
-        <w:rPr>
-          <w:rFonts w:ascii="Menlo" w:hAnsi="Menlo" w:cs="Menlo"/>
-          <w:color w:val="3B2322"/>
-          <w:sz w:val="20"/>
-          <w:szCs w:val="20"/>
-        </w:rPr>
-        <w:t>/Projects/ATOMIC/cmip6/</w:t>
-      </w:r>
-      <w:proofErr w:type="spellStart"/>
-      <w:r>
-        <w:rPr>
-          <w:rFonts w:ascii="Menlo" w:hAnsi="Menlo" w:cs="Menlo"/>
-          <w:color w:val="3B2322"/>
-          <w:sz w:val="20"/>
-          <w:szCs w:val="20"/>
-        </w:rPr>
-        <w:t>src</w:t>
-      </w:r>
-      <w:proofErr w:type="spellEnd"/>
-      <w:r>
-        <w:rPr>
-          <w:rFonts w:ascii="Menlo" w:hAnsi="Menlo" w:cs="Menlo"/>
-          <w:color w:val="3B2322"/>
-          <w:sz w:val="20"/>
-          <w:szCs w:val="20"/>
-        </w:rPr>
-        <w:t>/axes_5.pdf</w:t>
+        <w:t>/Users/deszoeks/Projects/ATOMIC/cmip6/src/axes_5.pdf</w:t>
       </w:r>
     </w:p>
     <w:p>
@@ -6356,45 +5942,7 @@
         <w:rPr>
           <w:rFonts w:ascii="Aptos" w:hAnsi="Aptos"/>
         </w:rPr>
-        <w:t xml:space="preserve">A series of experiments predict the mass and moisture flux for </w:t>
-      </w:r>
-      <w:r>
-        <w:rPr>
-          <w:rFonts w:ascii="Aptos" w:hAnsi="Aptos"/>
-        </w:rPr>
-        <w:t xml:space="preserve">cloud </w:t>
-      </w:r>
-      <w:r>
-        <w:rPr>
-          <w:rFonts w:ascii="Aptos" w:hAnsi="Aptos"/>
-        </w:rPr>
-        <w:t xml:space="preserve">updrafts </w:t>
-      </w:r>
-      <w:r>
-        <w:rPr>
-          <w:rFonts w:ascii="Aptos" w:hAnsi="Aptos"/>
-        </w:rPr>
-        <w:t xml:space="preserve">with </w:t>
-      </w:r>
-      <w:r>
-        <w:rPr>
-          <w:rFonts w:ascii="Aptos" w:hAnsi="Aptos"/>
-        </w:rPr>
-        <w:t xml:space="preserve">perturbed atmospheric soundings and </w:t>
-      </w:r>
-      <w:proofErr w:type="gramStart"/>
-      <w:r>
-        <w:rPr>
-          <w:rFonts w:ascii="Aptos" w:hAnsi="Aptos"/>
-        </w:rPr>
-        <w:t>large scale</w:t>
-      </w:r>
-      <w:proofErr w:type="gramEnd"/>
-      <w:r>
-        <w:rPr>
-          <w:rFonts w:ascii="Aptos" w:hAnsi="Aptos"/>
-        </w:rPr>
-        <w:t xml:space="preserve"> moisture flux</w:t>
+        <w:t>A series of experiments predict the mass and moisture flux for cloud updrafts with perturbed atmospheric soundings and large scale moisture flux</w:t>
       </w:r>
       <w:r>
         <w:rPr>
@@ -6683,21 +6231,7 @@
         <w:rPr>
           <w:rFonts w:ascii="Aptos" w:eastAsiaTheme="minorEastAsia" w:hAnsi="Aptos"/>
         </w:rPr>
-        <w:t xml:space="preserve"> are s</w:t>
-      </w:r>
-      <w:proofErr w:type="spellStart"/>
-      <w:r>
-        <w:rPr>
-          <w:rFonts w:ascii="Aptos" w:eastAsiaTheme="minorEastAsia" w:hAnsi="Aptos"/>
-        </w:rPr>
-        <w:t>hown</w:t>
-      </w:r>
-      <w:proofErr w:type="spellEnd"/>
-      <w:r>
-        <w:rPr>
-          <w:rFonts w:ascii="Aptos" w:eastAsiaTheme="minorEastAsia" w:hAnsi="Aptos"/>
-        </w:rPr>
-        <w:t xml:space="preserve"> in Table 1.</w:t>
+        <w:t xml:space="preserve"> are shown in Table 1.</w:t>
       </w:r>
     </w:p>
     <w:p>
@@ -6711,19 +6245,7 @@
         <w:rPr>
           <w:rFonts w:ascii="Aptos" w:hAnsi="Aptos"/>
         </w:rPr>
-        <w:t xml:space="preserve">The first experiment, </w:t>
-      </w:r>
-      <w:r>
-        <w:rPr>
-          <w:rFonts w:ascii="Aptos" w:hAnsi="Aptos"/>
-        </w:rPr>
-        <w:t>subsidence</w:t>
-      </w:r>
-      <w:r>
-        <w:rPr>
-          <w:rFonts w:ascii="Aptos" w:hAnsi="Aptos"/>
-        </w:rPr>
-        <w:t xml:space="preserve">-5%, decreases the large-scale subsidence by -5%, corresponding to large-scale moisture flux increasing +2% in radiative-convective equilibrium under +1 K warming. Because the saturation vapor pressure </w:t>
+        <w:t xml:space="preserve">The first experiment, subsidence-5%, decreases the large-scale subsidence by -5%, corresponding to large-scale moisture flux increasing +2% in radiative-convective equilibrium under +1 K warming. Because the saturation vapor pressure </w:t>
       </w:r>
       <m:oMath>
         <m:f>
@@ -6905,13 +6427,7 @@
         <w:rPr>
           <w:rFonts w:ascii="Aptos" w:hAnsi="Aptos"/>
         </w:rPr>
-        <w:t>.</w:t>
-      </w:r>
-      <w:r>
-        <w:rPr>
-          <w:rFonts w:ascii="Aptos" w:hAnsi="Aptos"/>
-        </w:rPr>
-        <w:t xml:space="preserve"> </w:t>
+        <w:t xml:space="preserve">. </w:t>
       </w:r>
       <w:r>
         <w:rPr>
@@ -7158,21 +6674,7 @@
         <w:rPr>
           <w:rFonts w:ascii="Aptos" w:hAnsi="Aptos"/>
         </w:rPr>
-        <w:t xml:space="preserve"> </w:t>
-      </w:r>
-      <w:proofErr w:type="gramStart"/>
-      <w:r>
-        <w:rPr>
-          <w:rFonts w:ascii="Aptos" w:hAnsi="Aptos"/>
-        </w:rPr>
-        <w:t>increase</w:t>
-      </w:r>
-      <w:proofErr w:type="gramEnd"/>
-      <w:r>
-        <w:rPr>
-          <w:rFonts w:ascii="Aptos" w:hAnsi="Aptos"/>
-        </w:rPr>
-        <w:t xml:space="preserve"> +7% </w:t>
+        <w:t xml:space="preserve"> increase +7% </w:t>
       </w:r>
       <w:r>
         <w:rPr>
@@ -7267,37 +6769,25 @@
         <w:rPr>
           <w:rFonts w:ascii="Aptos" w:hAnsi="Aptos"/>
         </w:rPr>
-        <w:t>)</w:t>
-      </w:r>
-      <w:r>
-        <w:rPr>
-          <w:rFonts w:ascii="Aptos" w:hAnsi="Aptos"/>
-        </w:rPr>
-        <w:t xml:space="preserve">, </w:t>
-      </w:r>
-      <w:r>
-        <w:rPr>
-          <w:rFonts w:ascii="Aptos" w:hAnsi="Aptos"/>
-        </w:rPr>
-        <w:t xml:space="preserve">keeping </w:t>
-      </w:r>
-      <w:r>
-        <w:rPr>
-          <w:rFonts w:ascii="Aptos" w:hAnsi="Aptos"/>
-        </w:rPr>
-        <w:t>constant</w:t>
-      </w:r>
-      <w:r>
-        <w:rPr>
-          <w:rFonts w:ascii="Aptos" w:hAnsi="Aptos"/>
-        </w:rPr>
-        <w:t xml:space="preserve"> relative humidity</w:t>
-      </w:r>
-      <w:r>
-        <w:rPr>
-          <w:rFonts w:ascii="Aptos" w:hAnsi="Aptos"/>
-        </w:rPr>
-        <w:t>,</w:t>
+        <w:t>), keeping constant relative humidity, i</w:t>
+      </w:r>
+      <w:r>
+        <w:rPr>
+          <w:rFonts w:ascii="Aptos" w:hAnsi="Aptos"/>
+        </w:rPr>
+        <w:t xml:space="preserve">n </w:t>
+      </w:r>
+      <w:r>
+        <w:rPr>
+          <w:rFonts w:ascii="Aptos" w:hAnsi="Aptos"/>
+        </w:rPr>
+        <w:t>experiment</w:t>
+      </w:r>
+      <w:r>
+        <w:rPr>
+          <w:rFonts w:ascii="Aptos" w:hAnsi="Aptos"/>
+        </w:rPr>
+        <w:t xml:space="preserve"> q&amp;qs+7%.</w:t>
       </w:r>
       <w:r>
         <w:rPr>
@@ -7306,36 +6796,6 @@
         <w:t xml:space="preserve"> </w:t>
       </w:r>
       <w:r>
-        <w:rPr>
-          <w:rFonts w:ascii="Aptos" w:hAnsi="Aptos"/>
-        </w:rPr>
-        <w:t>i</w:t>
-      </w:r>
-      <w:r>
-        <w:rPr>
-          <w:rFonts w:ascii="Aptos" w:hAnsi="Aptos"/>
-        </w:rPr>
-        <w:t xml:space="preserve">n </w:t>
-      </w:r>
-      <w:r>
-        <w:rPr>
-          <w:rFonts w:ascii="Aptos" w:hAnsi="Aptos"/>
-        </w:rPr>
-        <w:t>experiment</w:t>
-      </w:r>
-      <w:r>
-        <w:rPr>
-          <w:rFonts w:ascii="Aptos" w:hAnsi="Aptos"/>
-        </w:rPr>
-        <w:t xml:space="preserve"> q&amp;qs+7%.</w:t>
-      </w:r>
-      <w:r>
-        <w:rPr>
-          <w:rFonts w:ascii="Aptos" w:hAnsi="Aptos"/>
-        </w:rPr>
-        <w:t xml:space="preserve"> </w:t>
-      </w:r>
-      <w:r>
         <w:t>I</w:t>
       </w:r>
       <w:r>
@@ -7354,10 +6814,7 @@
         <w:t xml:space="preserve">humidity </w:t>
       </w:r>
       <w:r>
-        <w:t>decreases the mass flux and cloud fraction</w:t>
-      </w:r>
-      <w:r>
-        <w:t xml:space="preserve"> by</w:t>
+        <w:t>decreases the mass flux and cloud fraction by</w:t>
       </w:r>
       <w:r>
         <w:rPr>
@@ -7400,19 +6857,7 @@
         <w:rPr>
           <w:rFonts w:ascii="Aptos" w:eastAsiaTheme="minorEastAsia" w:hAnsi="Aptos"/>
         </w:rPr>
-        <w:t xml:space="preserve"> (</w:t>
-      </w:r>
-      <w:r>
-        <w:rPr>
-          <w:rFonts w:ascii="Aptos" w:eastAsiaTheme="minorEastAsia" w:hAnsi="Aptos"/>
-        </w:rPr>
-        <w:t>-2.7%</w:t>
-      </w:r>
-      <w:r>
-        <w:rPr>
-          <w:rFonts w:ascii="Aptos" w:eastAsiaTheme="minorEastAsia" w:hAnsi="Aptos"/>
-        </w:rPr>
-        <w:t xml:space="preserve">) required to achieve the same moisture flux </w:t>
+        <w:t xml:space="preserve"> (-2.7%) required to achieve the same moisture flux </w:t>
       </w:r>
       <m:oMath>
         <m:r>
@@ -7461,6 +6906,9 @@
         <w:t xml:space="preserve">. </w:t>
       </w:r>
       <w:r>
+        <w:t xml:space="preserve">Relative humidity below cloud base does not affect the clouds. </w:t>
+      </w:r>
+      <w:r>
         <w:t>Two experiments increas</w:t>
       </w:r>
       <w:r>
@@ -7470,169 +6918,53 @@
         <w:t xml:space="preserve"> </w:t>
       </w:r>
       <w:r>
-        <w:t xml:space="preserve">relative humidity, </w:t>
-      </w:r>
-      <w:r>
-        <w:br/>
-      </w:r>
-      <m:oMathPara>
-        <m:oMath>
-          <m:r>
-            <w:rPr>
-              <w:rFonts w:ascii="Cambria Math" w:hAnsi="Cambria Math"/>
-            </w:rPr>
-            <m:t>RH=R</m:t>
-          </m:r>
-          <m:sSub>
-            <m:sSubPr>
-              <m:ctrlPr>
-                <w:rPr>
-                  <w:rFonts w:ascii="Cambria Math" w:hAnsi="Cambria Math"/>
-                  <w:i/>
-                </w:rPr>
-              </m:ctrlPr>
-            </m:sSubPr>
-            <m:e>
-              <m:r>
-                <w:rPr>
-                  <w:rFonts w:ascii="Cambria Math" w:hAnsi="Cambria Math"/>
-                </w:rPr>
-                <m:t>H</m:t>
-              </m:r>
-            </m:e>
-            <m:sub>
-              <m:r>
-                <w:rPr>
-                  <w:rFonts w:ascii="Cambria Math" w:hAnsi="Cambria Math"/>
-                </w:rPr>
-                <m:t>ctl</m:t>
-              </m:r>
-            </m:sub>
-          </m:sSub>
-          <m:r>
-            <w:rPr>
-              <w:rFonts w:ascii="Cambria Math" w:hAnsi="Cambria Math"/>
-            </w:rPr>
-            <m:t>+0.05</m:t>
-          </m:r>
-          <m:d>
-            <m:dPr>
-              <m:ctrlPr>
-                <w:rPr>
-                  <w:rFonts w:ascii="Cambria Math" w:hAnsi="Cambria Math"/>
-                  <w:i/>
-                </w:rPr>
-              </m:ctrlPr>
-            </m:dPr>
-            <m:e>
-              <m:r>
-                <w:rPr>
-                  <w:rFonts w:ascii="Cambria Math" w:hAnsi="Cambria Math"/>
-                </w:rPr>
-                <m:t>1-R</m:t>
-              </m:r>
-              <m:sSub>
-                <m:sSubPr>
-                  <m:ctrlPr>
-                    <w:rPr>
-                      <w:rFonts w:ascii="Cambria Math" w:hAnsi="Cambria Math"/>
-                      <w:i/>
-                    </w:rPr>
-                  </m:ctrlPr>
-                </m:sSubPr>
-                <m:e>
-                  <m:r>
-                    <w:rPr>
-                      <w:rFonts w:ascii="Cambria Math" w:hAnsi="Cambria Math"/>
-                    </w:rPr>
-                    <m:t>H</m:t>
-                  </m:r>
-                </m:e>
-                <m:sub>
-                  <m:r>
-                    <w:rPr>
-                      <w:rFonts w:ascii="Cambria Math" w:hAnsi="Cambria Math"/>
-                    </w:rPr>
-                    <m:t>ctl</m:t>
-                  </m:r>
-                </m:sub>
-              </m:sSub>
-            </m:e>
-          </m:d>
-          <m:r>
-            <w:rPr>
-              <w:rFonts w:ascii="Cambria Math" w:hAnsi="Cambria Math"/>
-            </w:rPr>
-            <m:t>(2</m:t>
-          </m:r>
-          <m:sSub>
-            <m:sSubPr>
-              <m:ctrlPr>
-                <w:rPr>
-                  <w:rFonts w:ascii="Cambria Math" w:hAnsi="Cambria Math"/>
-                  <w:i/>
-                </w:rPr>
-              </m:ctrlPr>
-            </m:sSubPr>
-            <m:e>
-              <m:r>
-                <w:rPr>
-                  <w:rFonts w:ascii="Cambria Math" w:hAnsi="Cambria Math"/>
-                </w:rPr>
-                <m:t>z</m:t>
-              </m:r>
-            </m:e>
-            <m:sub>
-              <m:r>
-                <w:rPr>
-                  <w:rFonts w:ascii="Cambria Math" w:hAnsi="Cambria Math"/>
-                </w:rPr>
-                <m:t>CB</m:t>
-              </m:r>
-            </m:sub>
-          </m:sSub>
-          <m:r>
-            <w:rPr>
-              <w:rFonts w:ascii="Cambria Math" w:hAnsi="Cambria Math"/>
-            </w:rPr>
-            <m:t>-z)/</m:t>
-          </m:r>
-          <m:sSub>
-            <m:sSubPr>
-              <m:ctrlPr>
-                <w:rPr>
-                  <w:rFonts w:ascii="Cambria Math" w:hAnsi="Cambria Math"/>
-                  <w:i/>
-                </w:rPr>
-              </m:ctrlPr>
-            </m:sSubPr>
-            <m:e>
-              <m:r>
-                <w:rPr>
-                  <w:rFonts w:ascii="Cambria Math" w:hAnsi="Cambria Math"/>
-                </w:rPr>
-                <m:t>z</m:t>
-              </m:r>
-            </m:e>
-            <m:sub>
-              <m:r>
-                <w:rPr>
-                  <w:rFonts w:ascii="Cambria Math" w:hAnsi="Cambria Math"/>
-                </w:rPr>
-                <m:t>CB</m:t>
-              </m:r>
-            </m:sub>
-          </m:sSub>
-          <m:r>
-            <w:rPr>
-              <w:rFonts w:eastAsiaTheme="minorEastAsia"/>
-            </w:rPr>
-            <w:br/>
-          </m:r>
-        </m:oMath>
-      </m:oMathPara>
-      <w:r>
-        <w:t xml:space="preserve">by 0.3% at cloud base, and </w:t>
+        <w:t>relative humidity</w:t>
+      </w:r>
+      <w:r>
+        <w:t xml:space="preserve"> in the cloud layer</w:t>
+      </w:r>
+      <w:r>
+        <w:t xml:space="preserve"> below </w:t>
+      </w:r>
+      <m:oMath>
+        <m:r>
+          <w:rPr>
+            <w:rFonts w:ascii="Cambria Math" w:hAnsi="Cambria Math"/>
+          </w:rPr>
+          <m:t>2</m:t>
+        </m:r>
+        <m:sSub>
+          <m:sSubPr>
+            <m:ctrlPr>
+              <w:rPr>
+                <w:rFonts w:ascii="Cambria Math" w:hAnsi="Cambria Math"/>
+                <w:i/>
+              </w:rPr>
+            </m:ctrlPr>
+          </m:sSubPr>
+          <m:e>
+            <m:r>
+              <w:rPr>
+                <w:rFonts w:ascii="Cambria Math" w:hAnsi="Cambria Math"/>
+              </w:rPr>
+              <m:t>z</m:t>
+            </m:r>
+          </m:e>
+          <m:sub>
+            <m:r>
+              <w:rPr>
+                <w:rFonts w:ascii="Cambria Math" w:hAnsi="Cambria Math"/>
+              </w:rPr>
+              <m:t>CB</m:t>
+            </m:r>
+          </m:sub>
+        </m:sSub>
+      </m:oMath>
+      <w:r>
+        <w:t>. One sets</w:t>
+      </w:r>
+      <w:r>
+        <w:t xml:space="preserve"> it to</w:t>
       </w:r>
       <w:r>
         <w:br/>
@@ -7792,15 +7124,255 @@
             </m:sub>
           </m:sSub>
           <m:r>
+            <w:rPr>
+              <w:rFonts w:ascii="Cambria Math" w:eastAsiaTheme="minorEastAsia" w:hAnsi="Cambria Math"/>
+            </w:rPr>
+            <m:t>,</m:t>
+          </m:r>
+          <m:r>
+            <m:rPr>
+              <m:sty m:val="p"/>
+            </m:rPr>
+            <w:rPr>
+              <w:rFonts w:eastAsiaTheme="minorEastAsia"/>
+            </w:rPr>
             <w:br/>
           </m:r>
         </m:oMath>
       </m:oMathPara>
       <w:r>
+        <w:t xml:space="preserve">increasing </w:t>
+      </w:r>
+      <w:r>
+        <w:t>the RH</w:t>
+      </w:r>
+      <w:r>
+        <w:t xml:space="preserve"> </w:t>
+      </w:r>
+      <w:r>
+        <w:t>by 0.3%</w:t>
+      </w:r>
+      <w:r>
+        <w:t xml:space="preserve"> (</w:t>
+      </w:r>
+      <w:r>
+        <w:t>absolute</w:t>
+      </w:r>
+      <w:r>
+        <w:t>)</w:t>
+      </w:r>
+      <w:r>
+        <w:t xml:space="preserve"> at cloud base</w:t>
+      </w:r>
+      <w:r>
+        <w:t xml:space="preserve">. The second </w:t>
+      </w:r>
+      <w:r>
+        <w:t xml:space="preserve">increases RH by twice that amount, </w:t>
+      </w:r>
+      <w:r>
+        <w:br/>
+      </w:r>
+      <m:oMathPara>
+        <m:oMath>
+          <m:r>
+            <w:rPr>
+              <w:rFonts w:ascii="Cambria Math" w:hAnsi="Cambria Math"/>
+            </w:rPr>
+            <m:t>RH=R</m:t>
+          </m:r>
+          <m:sSub>
+            <m:sSubPr>
+              <m:ctrlPr>
+                <w:rPr>
+                  <w:rFonts w:ascii="Cambria Math" w:hAnsi="Cambria Math"/>
+                  <w:i/>
+                </w:rPr>
+              </m:ctrlPr>
+            </m:sSubPr>
+            <m:e>
+              <m:r>
+                <w:rPr>
+                  <w:rFonts w:ascii="Cambria Math" w:hAnsi="Cambria Math"/>
+                </w:rPr>
+                <m:t>H</m:t>
+              </m:r>
+            </m:e>
+            <m:sub>
+              <m:r>
+                <w:rPr>
+                  <w:rFonts w:ascii="Cambria Math" w:hAnsi="Cambria Math"/>
+                </w:rPr>
+                <m:t>ctl</m:t>
+              </m:r>
+            </m:sub>
+          </m:sSub>
+          <m:r>
+            <w:rPr>
+              <w:rFonts w:ascii="Cambria Math" w:hAnsi="Cambria Math"/>
+            </w:rPr>
+            <m:t>+0.05</m:t>
+          </m:r>
+          <m:d>
+            <m:dPr>
+              <m:ctrlPr>
+                <w:rPr>
+                  <w:rFonts w:ascii="Cambria Math" w:hAnsi="Cambria Math"/>
+                  <w:i/>
+                </w:rPr>
+              </m:ctrlPr>
+            </m:dPr>
+            <m:e>
+              <m:r>
+                <w:rPr>
+                  <w:rFonts w:ascii="Cambria Math" w:hAnsi="Cambria Math"/>
+                </w:rPr>
+                <m:t>1-R</m:t>
+              </m:r>
+              <m:sSub>
+                <m:sSubPr>
+                  <m:ctrlPr>
+                    <w:rPr>
+                      <w:rFonts w:ascii="Cambria Math" w:hAnsi="Cambria Math"/>
+                      <w:i/>
+                    </w:rPr>
+                  </m:ctrlPr>
+                </m:sSubPr>
+                <m:e>
+                  <m:r>
+                    <w:rPr>
+                      <w:rFonts w:ascii="Cambria Math" w:hAnsi="Cambria Math"/>
+                    </w:rPr>
+                    <m:t>H</m:t>
+                  </m:r>
+                </m:e>
+                <m:sub>
+                  <m:r>
+                    <w:rPr>
+                      <w:rFonts w:ascii="Cambria Math" w:hAnsi="Cambria Math"/>
+                    </w:rPr>
+                    <m:t>ctl</m:t>
+                  </m:r>
+                </m:sub>
+              </m:sSub>
+            </m:e>
+          </m:d>
+          <m:r>
+            <w:rPr>
+              <w:rFonts w:ascii="Cambria Math" w:hAnsi="Cambria Math"/>
+            </w:rPr>
+            <m:t>(2</m:t>
+          </m:r>
+          <m:sSub>
+            <m:sSubPr>
+              <m:ctrlPr>
+                <w:rPr>
+                  <w:rFonts w:ascii="Cambria Math" w:hAnsi="Cambria Math"/>
+                  <w:i/>
+                </w:rPr>
+              </m:ctrlPr>
+            </m:sSubPr>
+            <m:e>
+              <m:r>
+                <w:rPr>
+                  <w:rFonts w:ascii="Cambria Math" w:hAnsi="Cambria Math"/>
+                </w:rPr>
+                <m:t>z</m:t>
+              </m:r>
+            </m:e>
+            <m:sub>
+              <m:r>
+                <w:rPr>
+                  <w:rFonts w:ascii="Cambria Math" w:hAnsi="Cambria Math"/>
+                </w:rPr>
+                <m:t>CB</m:t>
+              </m:r>
+            </m:sub>
+          </m:sSub>
+          <m:r>
+            <w:rPr>
+              <w:rFonts w:ascii="Cambria Math" w:hAnsi="Cambria Math"/>
+            </w:rPr>
+            <m:t>-z)/</m:t>
+          </m:r>
+          <m:sSub>
+            <m:sSubPr>
+              <m:ctrlPr>
+                <w:rPr>
+                  <w:rFonts w:ascii="Cambria Math" w:hAnsi="Cambria Math"/>
+                  <w:i/>
+                </w:rPr>
+              </m:ctrlPr>
+            </m:sSubPr>
+            <m:e>
+              <m:r>
+                <w:rPr>
+                  <w:rFonts w:ascii="Cambria Math" w:hAnsi="Cambria Math"/>
+                </w:rPr>
+                <m:t>z</m:t>
+              </m:r>
+            </m:e>
+            <m:sub>
+              <m:r>
+                <w:rPr>
+                  <w:rFonts w:ascii="Cambria Math" w:hAnsi="Cambria Math"/>
+                </w:rPr>
+                <m:t>CB</m:t>
+              </m:r>
+              <m:r>
+                <w:rPr>
+                  <w:rFonts w:ascii="Cambria Math" w:hAnsi="Cambria Math"/>
+                </w:rPr>
+                <m:t>,</m:t>
+              </m:r>
+            </m:sub>
+          </m:sSub>
+          <m:r>
+            <m:rPr>
+              <m:sty m:val="p"/>
+            </m:rPr>
+            <w:br/>
+          </m:r>
+        </m:oMath>
+      </m:oMathPara>
+      <w:r>
+        <w:t xml:space="preserve">increasing it </w:t>
+      </w:r>
+      <w:r>
         <w:t>by 0.6% at cloud base.</w:t>
       </w:r>
       <w:r>
-        <w:t xml:space="preserve"> Each 0.03% reduction of cloud base RH compensates about half of the reduction of clouds required to balance the subsidence drying. </w:t>
+        <w:t xml:space="preserve"> </w:t>
+      </w:r>
+      <w:r>
+        <w:t>The resulting increase of clouds for e</w:t>
+      </w:r>
+      <w:r>
+        <w:t xml:space="preserve">ach 0.3% </w:t>
+      </w:r>
+      <w:r>
+        <w:t>increase</w:t>
+      </w:r>
+      <w:r>
+        <w:t xml:space="preserve"> of cloud base RH</w:t>
+      </w:r>
+      <w:r>
+        <w:t xml:space="preserve"> </w:t>
+      </w:r>
+      <w:r>
+        <w:t>compensate</w:t>
+      </w:r>
+      <w:r>
+        <w:t>s</w:t>
+      </w:r>
+      <w:r>
+        <w:t xml:space="preserve"> about half of the reduction of clouds </w:t>
+      </w:r>
+      <w:r>
+        <w:t>due to the reduced</w:t>
+      </w:r>
+      <w:r>
+        <w:t xml:space="preserve"> subsidence.</w:t>
       </w:r>
     </w:p>
     <w:p>
@@ -7814,25 +7386,7 @@
         <w:rPr>
           <w:rFonts w:ascii="Aptos" w:hAnsi="Aptos"/>
         </w:rPr>
-        <w:t>W</w:t>
-      </w:r>
-      <w:r>
-        <w:rPr>
-          <w:rFonts w:ascii="Aptos" w:hAnsi="Aptos"/>
-        </w:rPr>
-        <w:t xml:space="preserve">e expect the cloud base to form at the lifting condensation level, at a similar relative humidity </w:t>
-      </w:r>
-      <w:r>
-        <w:rPr>
-          <w:rFonts w:ascii="Aptos" w:hAnsi="Aptos"/>
-        </w:rPr>
-        <w:t>in the control and all the experiments</w:t>
-      </w:r>
-      <w:r>
-        <w:rPr>
-          <w:rFonts w:ascii="Aptos" w:hAnsi="Aptos"/>
-        </w:rPr>
-        <w:t>.</w:t>
+        <w:t>We expect the cloud base to form at the lifting condensation level, at a similar relative humidity in the control and all the experiments.</w:t>
       </w:r>
       <w:r>
         <w:rPr>
@@ -8361,35 +7915,7 @@
         <w:rPr>
           <w:rFonts w:ascii="Aptos Narrow" w:hAnsi="Aptos Narrow"/>
         </w:rPr>
-        <w:t xml:space="preserve">Table 1. Cloud </w:t>
-      </w:r>
-      <w:proofErr w:type="gramStart"/>
-      <w:r>
-        <w:rPr>
-          <w:rFonts w:ascii="Aptos Narrow" w:hAnsi="Aptos Narrow"/>
-        </w:rPr>
-        <w:t>fraction</w:t>
-      </w:r>
-      <w:proofErr w:type="gramEnd"/>
-      <w:r>
-        <w:rPr>
-          <w:rFonts w:ascii="Aptos Narrow" w:hAnsi="Aptos Narrow"/>
-        </w:rPr>
-        <w:t xml:space="preserve"> change </w:t>
-      </w:r>
-      <w:proofErr w:type="gramStart"/>
-      <w:r>
-        <w:rPr>
-          <w:rFonts w:ascii="Aptos Narrow" w:hAnsi="Aptos Narrow"/>
-        </w:rPr>
-        <w:t>relative</w:t>
-      </w:r>
-      <w:proofErr w:type="gramEnd"/>
-      <w:r>
-        <w:rPr>
-          <w:rFonts w:ascii="Aptos Narrow" w:hAnsi="Aptos Narrow"/>
-        </w:rPr>
-        <w:t xml:space="preserve"> to the control simulation (%).</w:t>
+        <w:t>Table 1. Cloud fraction change relative to the control simulation (%).</w:t>
       </w:r>
     </w:p>
     <w:tbl>
@@ -8699,24 +8225,7 @@
         <w:pStyle w:val="FirstParagraph"/>
       </w:pPr>
       <w:r>
-        <w:lastRenderedPageBreak/>
-        <w:t xml:space="preserve">Relative humidity (RH) increases clouds, but absolute humidity decreases them. A 0.00875 increase of RH at cloud base increases clouds </w:t>
-      </w:r>
-      <w:proofErr w:type="gramStart"/>
-      <w:r>
-        <w:t>2.7% [???</w:t>
-      </w:r>
-      <w:proofErr w:type="gramEnd"/>
-      <w:r>
-        <w:t>by increasing which clouds?</w:t>
-      </w:r>
-      <w:proofErr w:type="gramStart"/>
-      <w:r>
-        <w:t>??]</w:t>
-      </w:r>
-      <w:proofErr w:type="gramEnd"/>
-      <w:r>
-        <w:t xml:space="preserve">, compensating the 5% reduction of cloud fraction associated with their moisture flux. Increasing absolute (specific) humidity, as due to saturation vapor pressure, increases the cloud moisture flux </w:t>
+        <w:t xml:space="preserve">Relative humidity (RH) increases clouds, but absolute humidity decreases them. A 0.00875 increase of RH at cloud base increases clouds 2.7% [???by increasing which clouds???], compensating the 5% reduction of cloud fraction associated with their moisture flux. Increasing absolute (specific) humidity, as due to saturation vapor pressure, increases the cloud moisture flux </w:t>
       </w:r>
       <m:oMath>
         <m:r>
@@ -8762,15 +8271,7 @@
       </w:pPr>
       <w:bookmarkStart w:id="3" w:name="cloud-base-clouds"/>
       <w:r>
-        <w:t>Cloud-</w:t>
-      </w:r>
-      <w:proofErr w:type="gramStart"/>
-      <w:r>
-        <w:t>base</w:t>
-      </w:r>
-      <w:proofErr w:type="gramEnd"/>
-      <w:r>
-        <w:t xml:space="preserve"> clouds</w:t>
+        <w:t>Cloud-base clouds</w:t>
       </w:r>
     </w:p>
     <w:p>
@@ -8784,35 +8285,7 @@
         <w:rPr>
           <w:rFonts w:ascii="Aptos" w:hAnsi="Aptos"/>
         </w:rPr>
-        <w:t xml:space="preserve">While shallow cumulus </w:t>
-      </w:r>
-      <w:proofErr w:type="gramStart"/>
-      <w:r>
-        <w:rPr>
-          <w:rFonts w:ascii="Aptos" w:hAnsi="Aptos"/>
-        </w:rPr>
-        <w:t>decrease</w:t>
-      </w:r>
-      <w:proofErr w:type="gramEnd"/>
-      <w:r>
-        <w:rPr>
-          <w:rFonts w:ascii="Aptos" w:hAnsi="Aptos"/>
-        </w:rPr>
-        <w:t xml:space="preserve"> with reduced large-scale overturning, local scaling of the moist turbulent </w:t>
-      </w:r>
-      <w:proofErr w:type="spellStart"/>
-      <w:r>
-        <w:rPr>
-          <w:rFonts w:ascii="Aptos" w:hAnsi="Aptos"/>
-        </w:rPr>
-        <w:t>subcloud</w:t>
-      </w:r>
-      <w:proofErr w:type="spellEnd"/>
-      <w:r>
-        <w:rPr>
-          <w:rFonts w:ascii="Aptos" w:hAnsi="Aptos"/>
-        </w:rPr>
-        <w:t xml:space="preserve"> boundary layer sugges</w:t>
+        <w:t>While shallow cumulus decrease with reduced large-scale overturning, local scaling of the moist turbulent subcloud boundary layer sugges</w:t>
       </w:r>
       <w:r>
         <w:rPr>
@@ -8824,21 +8297,7 @@
         <w:rPr>
           <w:rFonts w:ascii="Aptos" w:hAnsi="Aptos"/>
         </w:rPr>
-        <w:t xml:space="preserve"> that cloud base clouds increase by about the same amount. The net cloud radiative effect depends on the relative amount of shallow cumulus vs. cloud-</w:t>
-      </w:r>
-      <w:proofErr w:type="gramStart"/>
-      <w:r>
-        <w:rPr>
-          <w:rFonts w:ascii="Aptos" w:hAnsi="Aptos"/>
-        </w:rPr>
-        <w:t>base</w:t>
-      </w:r>
-      <w:proofErr w:type="gramEnd"/>
-      <w:r>
-        <w:rPr>
-          <w:rFonts w:ascii="Aptos" w:hAnsi="Aptos"/>
-        </w:rPr>
-        <w:t xml:space="preserve"> clouds.</w:t>
+        <w:t xml:space="preserve"> that cloud base clouds increase by about the same amount. The net cloud radiative effect depends on the relative amount of shallow cumulus vs. cloud-base clouds.</w:t>
       </w:r>
     </w:p>
     <w:p>
@@ -8962,21 +8421,7 @@
         <w:rPr>
           <w:rFonts w:ascii="Aptos" w:hAnsi="Aptos"/>
         </w:rPr>
-        <w:t xml:space="preserve">condenses from turbulent </w:t>
-      </w:r>
-      <w:proofErr w:type="spellStart"/>
-      <w:r>
-        <w:rPr>
-          <w:rFonts w:ascii="Aptos" w:hAnsi="Aptos"/>
-        </w:rPr>
-        <w:t>subcloud</w:t>
-      </w:r>
-      <w:proofErr w:type="spellEnd"/>
-      <w:r>
-        <w:rPr>
-          <w:rFonts w:ascii="Aptos" w:hAnsi="Aptos"/>
-        </w:rPr>
-        <w:t xml:space="preserve"> thermals</w:t>
+        <w:t>condenses from turbulent subcloud thermals</w:t>
       </w:r>
       <w:r>
         <w:rPr>
@@ -9024,21 +8469,7 @@
         <w:rPr>
           <w:rFonts w:ascii="Aptos" w:hAnsi="Aptos"/>
         </w:rPr>
-        <w:t>(</w:t>
-      </w:r>
-      <w:proofErr w:type="spellStart"/>
-      <w:r>
-        <w:rPr>
-          <w:rFonts w:ascii="Aptos" w:hAnsi="Aptos"/>
-        </w:rPr>
-        <w:t>Sommeria</w:t>
-      </w:r>
-      <w:proofErr w:type="spellEnd"/>
-      <w:r>
-        <w:rPr>
-          <w:rFonts w:ascii="Aptos" w:hAnsi="Aptos"/>
-        </w:rPr>
-        <w:t xml:space="preserve"> and Deardorff, 1977; Mellor 1977). For a normal distribution of relative humidity, the cloud fraction is</w:t>
+        <w:t>(Sommeria and Deardorff, 1977; Mellor 1977). For a normal distribution of relative humidity, the cloud fraction is</w:t>
       </w:r>
       <w:r>
         <w:rPr>
@@ -9276,7 +8707,6 @@
         </w:rPr>
         <w:t xml:space="preserve"> m</w:t>
       </w:r>
-      <w:proofErr w:type="spellStart"/>
       <w:r>
         <w:rPr>
           <w:rFonts w:ascii="Aptos" w:hAnsi="Aptos"/>
@@ -9289,7 +8719,6 @@
         </w:rPr>
         <w:t>ing</w:t>
       </w:r>
-      <w:proofErr w:type="spellEnd"/>
       <w:r>
         <w:rPr>
           <w:rFonts w:ascii="Aptos" w:hAnsi="Aptos"/>
@@ -11923,21 +11352,7 @@
         <w:rPr>
           <w:rFonts w:ascii="Aptos" w:hAnsi="Aptos"/>
         </w:rPr>
-        <w:t xml:space="preserve">scales with the humidity scale, the </w:t>
-      </w:r>
-      <w:proofErr w:type="spellStart"/>
-      <w:r>
-        <w:rPr>
-          <w:rFonts w:ascii="Aptos" w:hAnsi="Aptos"/>
-        </w:rPr>
-        <w:t>subcloud</w:t>
-      </w:r>
-      <w:proofErr w:type="spellEnd"/>
-      <w:r>
-        <w:rPr>
-          <w:rFonts w:ascii="Aptos" w:hAnsi="Aptos"/>
-        </w:rPr>
-        <w:t xml:space="preserve"> mean humidity difference, and the saturation specific humidity.</w:t>
+        <w:t>scales with the humidity scale, the subcloud mean humidity difference, and the saturation specific humidity.</w:t>
       </w:r>
     </w:p>
     <w:p>
@@ -13400,28 +12815,14 @@
         <w:rPr>
           <w:rFonts w:ascii="Aptos" w:hAnsi="Aptos"/>
         </w:rPr>
-        <w:t>Figure MODISISCCP shows ISCCP-H cloud top height and optical thickness cloud fraction histograms observed from the 1-km pixel MODIS observations in the Northern Atlantic shallow cumulus region (80-20°W, 15-</w:t>
+        <w:t xml:space="preserve">Figure MODISISCCP shows ISCCP-H </w:t>
       </w:r>
       <w:r>
         <w:rPr>
           <w:rFonts w:ascii="Aptos" w:hAnsi="Aptos"/>
         </w:rPr>
         <w:lastRenderedPageBreak/>
-        <w:t xml:space="preserve">35°N) for January-February of 2019-2021. These high-resolution observations avoid partially cloudy pixels and are designed to be compared to COSP satellite simulators in climate models. Most (29.1%) of the clouds are below 800 </w:t>
-      </w:r>
-      <w:proofErr w:type="spellStart"/>
-      <w:r>
-        <w:rPr>
-          <w:rFonts w:ascii="Aptos" w:hAnsi="Aptos"/>
-        </w:rPr>
-        <w:t>hPa</w:t>
-      </w:r>
-      <w:proofErr w:type="spellEnd"/>
-      <w:r>
-        <w:rPr>
-          <w:rFonts w:ascii="Aptos" w:hAnsi="Aptos"/>
-        </w:rPr>
-        <w:t xml:space="preserve"> with cloud optical thickness between 1.3-9.4.</w:t>
+        <w:t>cloud top height and optical thickness cloud fraction histograms observed from the 1-km pixel MODIS observations in the Northern Atlantic shallow cumulus region (80-20°W, 15-35°N) for January-February of 2019-2021. These high-resolution observations avoid partially cloudy pixels and are designed to be compared to COSP satellite simulators in climate models. Most (29.1%) of the clouds are below 800 hPa with cloud optical thickness between 1.3-9.4.</w:t>
       </w:r>
     </w:p>
     <w:p>
@@ -13435,15 +12836,7 @@
         <w:t>2</w:t>
       </w:r>
       <w:r>
-        <w:t xml:space="preserve"> regions, assuming updraft cores are cloudy with saturated specific humidity. The horizontal-time ensemble </w:t>
-      </w:r>
-      <w:proofErr w:type="gramStart"/>
-      <w:r>
-        <w:t>mean</w:t>
-      </w:r>
-      <w:proofErr w:type="gramEnd"/>
-      <w:r>
-        <w:t xml:space="preserve"> trade cumulus water (vapor + liquid) flux due to updrafts and precipitation balances mean subsidence. Cloud mass flux is initialized at cloud base to match the mean observed surface evaporation minus precipitation. </w:t>
+        <w:t xml:space="preserve"> regions, assuming updraft cores are cloudy with saturated specific humidity. The horizontal-time ensemble mean trade cumulus water (vapor + liquid) flux due to updrafts and precipitation balances mean subsidence. Cloud mass flux is initialized at cloud base to match the mean observed surface evaporation minus precipitation. </w:t>
       </w:r>
     </w:p>
     <w:p>
@@ -13786,15 +13179,7 @@
         </w:rPr>
       </w:pPr>
       <w:r>
-        <w:t xml:space="preserve">The all-sky </w:t>
-      </w:r>
-      <w:proofErr w:type="gramStart"/>
-      <w:r>
-        <w:t>mean</w:t>
-      </w:r>
-      <w:proofErr w:type="gramEnd"/>
-      <w:r>
-        <w:t xml:space="preserve"> large scale eddy flux </w:t>
+        <w:t xml:space="preserve">The all-sky mean large scale eddy flux </w:t>
       </w:r>
       <m:oMath>
         <m:r>
@@ -14182,21 +13567,7 @@
         <w:rPr>
           <w:rFonts w:eastAsiaTheme="minorEastAsia"/>
         </w:rPr>
-        <w:t xml:space="preserve">is an </w:t>
-      </w:r>
-      <w:proofErr w:type="spellStart"/>
-      <w:r>
-        <w:rPr>
-          <w:rFonts w:eastAsiaTheme="minorEastAsia"/>
-        </w:rPr>
-        <w:t>underconstrained</w:t>
-      </w:r>
-      <w:proofErr w:type="spellEnd"/>
-      <w:r>
-        <w:rPr>
-          <w:rFonts w:eastAsiaTheme="minorEastAsia"/>
-        </w:rPr>
-        <w:t xml:space="preserve"> problem</w:t>
+        <w:t>is an underconstrained problem</w:t>
       </w:r>
       <w:r>
         <w:rPr>
@@ -14242,21 +13613,7 @@
         <w:rPr>
           <w:rFonts w:eastAsiaTheme="minorEastAsia"/>
         </w:rPr>
-        <w:t xml:space="preserve">The all-sky </w:t>
-      </w:r>
-      <w:proofErr w:type="gramStart"/>
-      <w:r>
-        <w:rPr>
-          <w:rFonts w:eastAsiaTheme="minorEastAsia"/>
-        </w:rPr>
-        <w:t>mean</w:t>
-      </w:r>
-      <w:proofErr w:type="gramEnd"/>
-      <w:r>
-        <w:rPr>
-          <w:rFonts w:eastAsiaTheme="minorEastAsia"/>
-        </w:rPr>
-        <w:t xml:space="preserve"> flux profile </w:t>
+        <w:t xml:space="preserve">The all-sky mean flux profile </w:t>
       </w:r>
       <m:oMath>
         <m:r>
@@ -14734,7 +14091,6 @@
         </w:rPr>
         <w:t xml:space="preserve"> to each height category. </w:t>
       </w:r>
-      <w:proofErr w:type="gramStart"/>
       <w:r>
         <w:rPr>
           <w:rFonts w:eastAsiaTheme="minorEastAsia"/>
@@ -14745,14 +14101,7 @@
         <w:rPr>
           <w:rFonts w:eastAsiaTheme="minorEastAsia"/>
         </w:rPr>
-        <w:t xml:space="preserve"> cloud</w:t>
-      </w:r>
-      <w:proofErr w:type="gramEnd"/>
-      <w:r>
-        <w:rPr>
-          <w:rFonts w:eastAsiaTheme="minorEastAsia"/>
-        </w:rPr>
-        <w:t xml:space="preserve"> top height </w:t>
+        <w:t xml:space="preserve"> cloud top height </w:t>
       </w:r>
       <m:oMath>
         <m:sSub>
@@ -14989,14 +14338,12 @@
       <w:r>
         <w:t xml:space="preserve"> </w:t>
       </w:r>
-      <w:proofErr w:type="spellStart"/>
       <w:r>
         <w:rPr>
           <w:rFonts w:ascii="ComicShannsMono Nerd Font" w:hAnsi="ComicShannsMono Nerd Font"/>
         </w:rPr>
         <w:t>amip</w:t>
       </w:r>
-      <w:proofErr w:type="spellEnd"/>
       <w:r>
         <w:t xml:space="preserve"> (historical) and </w:t>
       </w:r>
@@ -15030,14 +14377,12 @@
       <w:r>
         <w:t xml:space="preserve"> and </w:t>
       </w:r>
-      <w:proofErr w:type="spellStart"/>
       <w:r>
         <w:rPr>
           <w:rFonts w:ascii="ComicShannsMono Nerd Font" w:hAnsi="ComicShannsMono Nerd Font"/>
         </w:rPr>
         <w:t>amip</w:t>
       </w:r>
-      <w:proofErr w:type="spellEnd"/>
       <w:r>
         <w:t xml:space="preserve"> during</w:t>
       </w:r>
@@ -16273,21 +15618,7 @@
         <w:rPr>
           <w:rFonts w:ascii="Aptos" w:eastAsiaTheme="minorEastAsia" w:hAnsi="Aptos" w:cs="Times New Roman"/>
         </w:rPr>
-        <w:t xml:space="preserve"> The dependence on this condensation rate is eliminated in the total cloud water balance equation. Summing the liquid and </w:t>
-      </w:r>
-      <w:proofErr w:type="gramStart"/>
-      <w:r>
-        <w:rPr>
-          <w:rFonts w:ascii="Aptos" w:eastAsiaTheme="minorEastAsia" w:hAnsi="Aptos" w:cs="Times New Roman"/>
-        </w:rPr>
-        <w:t>vapor, and</w:t>
-      </w:r>
-      <w:proofErr w:type="gramEnd"/>
-      <w:r>
-        <w:rPr>
-          <w:rFonts w:ascii="Aptos" w:eastAsiaTheme="minorEastAsia" w:hAnsi="Aptos" w:cs="Times New Roman"/>
-        </w:rPr>
-        <w:t xml:space="preserve"> taking the Eulerian total specific humidity </w:t>
+        <w:t xml:space="preserve"> The dependence on this condensation rate is eliminated in the total cloud water balance equation. Summing the liquid and vapor, and taking the Eulerian total specific humidity </w:t>
       </w:r>
       <m:oMath>
         <m:sSub>
@@ -17288,19 +16619,11 @@
         </w:rPr>
         <w:t>relax</w:t>
       </w:r>
-      <w:proofErr w:type="spellStart"/>
       <w:r>
         <w:rPr>
           <w:rFonts w:ascii="Aptos" w:eastAsiaTheme="minorEastAsia" w:hAnsi="Aptos" w:cs="Times New Roman"/>
         </w:rPr>
-        <w:t>ing</w:t>
-      </w:r>
-      <w:proofErr w:type="spellEnd"/>
-      <w:r>
-        <w:rPr>
-          <w:rFonts w:ascii="Aptos" w:eastAsiaTheme="minorEastAsia" w:hAnsi="Aptos" w:cs="Times New Roman"/>
-        </w:rPr>
-        <w:t xml:space="preserve"> </w:t>
+        <w:t xml:space="preserve">ing </w:t>
       </w:r>
       <m:oMath>
         <m:sSub>
@@ -17616,21 +16939,7 @@
         <w:rPr>
           <w:rFonts w:ascii="Aptos" w:eastAsiaTheme="minorEastAsia" w:hAnsi="Aptos" w:cs="Times New Roman"/>
         </w:rPr>
-        <w:t>[q and cloud top where q=</w:t>
-      </w:r>
-      <w:proofErr w:type="spellStart"/>
-      <w:r>
-        <w:rPr>
-          <w:rFonts w:ascii="Aptos" w:eastAsiaTheme="minorEastAsia" w:hAnsi="Aptos" w:cs="Times New Roman"/>
-        </w:rPr>
-        <w:t>qs</w:t>
-      </w:r>
-      <w:proofErr w:type="spellEnd"/>
-      <w:r>
-        <w:rPr>
-          <w:rFonts w:ascii="Aptos" w:eastAsiaTheme="minorEastAsia" w:hAnsi="Aptos" w:cs="Times New Roman"/>
-        </w:rPr>
-        <w:t xml:space="preserve"> depends only on the sounding and cloud base initial condition, so it can be computed from the sounding, without the flux condition. </w:t>
+        <w:t xml:space="preserve">[q and cloud top where q=qs depends only on the sounding and cloud base initial condition, so it can be computed from the sounding, without the flux condition. </w:t>
       </w:r>
       <w:r>
         <w:rPr>
@@ -18503,19 +17812,7 @@
           <w:rPr>
             <w:rFonts w:ascii="Cambria Math" w:eastAsiaTheme="minorEastAsia" w:hAnsi="Cambria Math" w:cs="Times New Roman"/>
           </w:rPr>
-          <m:t>∂</m:t>
-        </m:r>
-        <m:r>
-          <w:rPr>
-            <w:rFonts w:ascii="Cambria Math" w:eastAsiaTheme="minorEastAsia" w:hAnsi="Cambria Math" w:cs="Times New Roman"/>
-          </w:rPr>
-          <m:t>q_l</m:t>
-        </m:r>
-        <m:r>
-          <w:rPr>
-            <w:rFonts w:ascii="Cambria Math" w:eastAsiaTheme="minorEastAsia" w:hAnsi="Cambria Math" w:cs="Times New Roman"/>
-          </w:rPr>
-          <m:t>/∂z+</m:t>
+          <m:t>∂q_l/∂z+</m:t>
         </m:r>
         <m:r>
           <w:rPr>
@@ -18629,21 +17926,7 @@
         <w:rPr>
           <w:rFonts w:ascii="Aptos" w:eastAsiaTheme="minorEastAsia" w:hAnsi="Aptos" w:cs="Times New Roman"/>
         </w:rPr>
-        <w:t xml:space="preserve"> is found by numerically integrating the precipitation. The precipitation </w:t>
-      </w:r>
-      <w:proofErr w:type="gramStart"/>
-      <w:r>
-        <w:rPr>
-          <w:rFonts w:ascii="Aptos" w:eastAsiaTheme="minorEastAsia" w:hAnsi="Aptos" w:cs="Times New Roman"/>
-        </w:rPr>
-        <w:t>sink</w:t>
-      </w:r>
-      <w:proofErr w:type="gramEnd"/>
-      <w:r>
-        <w:rPr>
-          <w:rFonts w:ascii="Aptos" w:eastAsiaTheme="minorEastAsia" w:hAnsi="Aptos" w:cs="Times New Roman"/>
-        </w:rPr>
-        <w:t>,</w:t>
+        <w:t xml:space="preserve"> is found by numerically integrating the precipitation. The precipitation sink,</w:t>
       </w:r>
       <w:r>
         <w:rPr>
@@ -19825,51 +19108,29 @@
         </w:rPr>
         <w:t xml:space="preserve">parameter </w:t>
       </w:r>
-      <w:proofErr w:type="gramStart"/>
       <w:r>
         <w:rPr>
           <w:rFonts w:ascii="Aptos" w:eastAsiaTheme="minorEastAsia" w:hAnsi="Aptos" w:cs="Times New Roman"/>
         </w:rPr>
-        <w:t>is</w:t>
-      </w:r>
-      <w:proofErr w:type="gramEnd"/>
+        <w:t xml:space="preserve">is shown </w:t>
+      </w:r>
       <w:r>
         <w:rPr>
           <w:rFonts w:ascii="Aptos" w:eastAsiaTheme="minorEastAsia" w:hAnsi="Aptos" w:cs="Times New Roman"/>
         </w:rPr>
-        <w:t xml:space="preserve"> shown </w:t>
+        <w:t xml:space="preserve">for </w:t>
       </w:r>
       <w:r>
         <w:rPr>
           <w:rFonts w:ascii="Aptos" w:eastAsiaTheme="minorEastAsia" w:hAnsi="Aptos" w:cs="Times New Roman"/>
         </w:rPr>
-        <w:t xml:space="preserve">for </w:t>
+        <w:t xml:space="preserve">an ensemble of sink rates </w:t>
       </w:r>
       <w:r>
         <w:rPr>
           <w:rFonts w:ascii="Aptos" w:eastAsiaTheme="minorEastAsia" w:hAnsi="Aptos" w:cs="Times New Roman"/>
         </w:rPr>
-        <w:t xml:space="preserve">an ensemble of sink rates </w:t>
-      </w:r>
-      <w:r>
-        <w:rPr>
-          <w:rFonts w:ascii="Aptos" w:eastAsiaTheme="minorEastAsia" w:hAnsi="Aptos" w:cs="Times New Roman"/>
-        </w:rPr>
-        <w:t>in Fig. WPROF. This is used to compute (c) cloud-</w:t>
-      </w:r>
-      <w:proofErr w:type="gramStart"/>
-      <w:r>
-        <w:rPr>
-          <w:rFonts w:ascii="Aptos" w:eastAsiaTheme="minorEastAsia" w:hAnsi="Aptos" w:cs="Times New Roman"/>
-        </w:rPr>
-        <w:t>mean</w:t>
-      </w:r>
-      <w:proofErr w:type="gramEnd"/>
-      <w:r>
-        <w:rPr>
-          <w:rFonts w:ascii="Aptos" w:eastAsiaTheme="minorEastAsia" w:hAnsi="Aptos" w:cs="Times New Roman"/>
-        </w:rPr>
-        <w:t xml:space="preserve"> vertical velocity</w:t>
+        <w:t>in Fig. WPROF. This is used to compute (c) cloud-mean vertical velocity</w:t>
       </w:r>
       <w:r>
         <w:rPr>
@@ -21635,43 +20896,11 @@
         <w:pStyle w:val="BodyText"/>
       </w:pPr>
       <w:r>
-        <w:t xml:space="preserve">[[For discussion on the compensation between cumulus and stratocumulus clouds: Myers and Norris (2014) show, all else being equal, subsidence reduces stratocumulus clouds. Cloud properties and within-regime </w:t>
-      </w:r>
-      <w:proofErr w:type="gramStart"/>
-      <w:r>
-        <w:t>feedbacks</w:t>
-      </w:r>
-      <w:proofErr w:type="gramEnd"/>
-      <w:r>
-        <w:t xml:space="preserve"> are similar between shallow cumulus and optically thicker stratocumulus clouds (</w:t>
-      </w:r>
-      <w:proofErr w:type="spellStart"/>
-      <w:r>
-        <w:t>Tselioudis</w:t>
-      </w:r>
-      <w:proofErr w:type="spellEnd"/>
-      <w:r>
-        <w:t xml:space="preserve"> et al., 2021; Zelinka et al. 2025), suggesting temperature-induced changes result in compensation between stratocumulus </w:t>
+        <w:t xml:space="preserve">[[For discussion on the compensation between cumulus and stratocumulus clouds: Myers and Norris (2014) show, all else being equal, subsidence reduces stratocumulus clouds. Cloud properties and within-regime feedbacks are similar between shallow cumulus and optically thicker stratocumulus clouds (Tselioudis et al., 2021; Zelinka et al. 2025), suggesting temperature-induced changes result in compensation between stratocumulus </w:t>
       </w:r>
       <w:r>
         <w:lastRenderedPageBreak/>
-        <w:t xml:space="preserve">and shallow cumulus cloud types. Sherwood’s (2014) desiccation hypothesis describes a version of this </w:t>
-      </w:r>
-      <w:proofErr w:type="gramStart"/>
-      <w:r>
-        <w:t>competition,</w:t>
-      </w:r>
-      <w:proofErr w:type="gramEnd"/>
-      <w:r>
-        <w:t xml:space="preserve"> whereby shallow cumulus convection dries lower levels near cloud base that support stratocumulus clouds. Based on their similar behavior and </w:t>
-      </w:r>
-      <w:proofErr w:type="gramStart"/>
-      <w:r>
-        <w:t>feedbacks</w:t>
-      </w:r>
-      <w:proofErr w:type="gramEnd"/>
-      <w:r>
-        <w:t xml:space="preserve"> (Zelinka et al. 2025) we suggest considering the stratocumulus and shallow cumulus as a continuum. Regardless, here shallow cumulus clouds are nearly ubiquitous, to the exclusion of stratocumulus clouds, over the northern tropical Atlantic in January-February.]]</w:t>
+        <w:t>and shallow cumulus cloud types. Sherwood’s (2014) desiccation hypothesis describes a version of this competition, whereby shallow cumulus convection dries lower levels near cloud base that support stratocumulus clouds. Based on their similar behavior and feedbacks (Zelinka et al. 2025) we suggest considering the stratocumulus and shallow cumulus as a continuum. Regardless, here shallow cumulus clouds are nearly ubiquitous, to the exclusion of stratocumulus clouds, over the northern tropical Atlantic in January-February.]]</w:t>
       </w:r>
     </w:p>
     <w:p>
@@ -21801,25 +21030,7 @@
           <w:kern w:val="0"/>
           <w14:ligatures w14:val="none"/>
         </w:rPr>
-        <w:t xml:space="preserve">Figure GOESISCCP. GOES-16 (a) cloud fraction by cloud type for 12.5-16 °N, 60-49 °W, 2020 Jan 15- February 28. (b) Shortwave cloud radiative effect (CRE) for each cloud top pressure and optical depth. The total cloud radiative effect for clouds below 680 </w:t>
-      </w:r>
-      <w:proofErr w:type="spellStart"/>
-      <w:r>
-        <w:rPr>
-          <w:rFonts w:ascii="Aptos Narrow" w:eastAsiaTheme="minorEastAsia" w:hAnsi="Aptos Narrow" w:cs="Times New Roman"/>
-          <w:kern w:val="0"/>
-          <w14:ligatures w14:val="none"/>
-        </w:rPr>
-        <w:t>hPa</w:t>
-      </w:r>
-      <w:proofErr w:type="spellEnd"/>
-      <w:r>
-        <w:rPr>
-          <w:rFonts w:ascii="Aptos Narrow" w:eastAsiaTheme="minorEastAsia" w:hAnsi="Aptos Narrow" w:cs="Times New Roman"/>
-          <w:kern w:val="0"/>
-          <w14:ligatures w14:val="none"/>
-        </w:rPr>
-        <w:t xml:space="preserve"> is 32 W m</w:t>
+        <w:t>Figure GOESISCCP. GOES-16 (a) cloud fraction by cloud type for 12.5-16 °N, 60-49 °W, 2020 Jan 15- February 28. (b) Shortwave cloud radiative effect (CRE) for each cloud top pressure and optical depth. The total cloud radiative effect for clouds below 680 hPa is 32 W m</w:t>
       </w:r>
       <w:r>
         <w:rPr>
@@ -23269,6 +22480,7 @@
   <w:style w:type="character" w:default="1" w:styleId="DefaultParagraphFont">
     <w:name w:val="Default Paragraph Font"/>
     <w:uiPriority w:val="1"/>
+    <w:semiHidden/>
     <w:unhideWhenUsed/>
   </w:style>
   <w:style w:type="table" w:default="1" w:styleId="TableNormal">

</xml_diff>

<commit_message>
wrote results of E1 experiments
</commit_message>
<xml_diff>
--- a/doc/DiM_ms20260713.docx
+++ b/doc/DiM_ms20260713.docx
@@ -781,7 +781,15 @@
         <w:t xml:space="preserve">and LES </w:t>
       </w:r>
       <w:r>
-        <w:t>suggest that subcloud layer turbulence moderates cloud base moisture</w:t>
+        <w:t xml:space="preserve">suggest that </w:t>
+      </w:r>
+      <w:proofErr w:type="spellStart"/>
+      <w:r>
+        <w:t>subcloud</w:t>
+      </w:r>
+      <w:proofErr w:type="spellEnd"/>
+      <w:r>
+        <w:t xml:space="preserve"> layer turbulence moderates cloud base moisture</w:t>
       </w:r>
       <w:r>
         <w:t xml:space="preserve"> and </w:t>
@@ -2024,7 +2032,23 @@
           <w:rFonts w:eastAsiaTheme="minorEastAsia"/>
           <w:color w:val="4EA72E" w:themeColor="accent6"/>
         </w:rPr>
-        <w:t xml:space="preserve"> in Fig. CFMWa.</w:t>
+        <w:t xml:space="preserve"> in Fig. </w:t>
+      </w:r>
+      <w:proofErr w:type="spellStart"/>
+      <w:r>
+        <w:rPr>
+          <w:rFonts w:eastAsiaTheme="minorEastAsia"/>
+          <w:color w:val="4EA72E" w:themeColor="accent6"/>
+        </w:rPr>
+        <w:t>CFMWa</w:t>
+      </w:r>
+      <w:proofErr w:type="spellEnd"/>
+      <w:r>
+        <w:rPr>
+          <w:rFonts w:eastAsiaTheme="minorEastAsia"/>
+          <w:color w:val="4EA72E" w:themeColor="accent6"/>
+        </w:rPr>
+        <w:t>.</w:t>
       </w:r>
       <w:r>
         <w:rPr>
@@ -5792,7 +5816,21 @@
         <w:rPr>
           <w:rFonts w:ascii="Aptos Narrow" w:eastAsiaTheme="minorEastAsia" w:hAnsi="Aptos Narrow" w:cs="Times New Roman"/>
         </w:rPr>
-        <w:t xml:space="preserve"> hPa day</w:t>
+        <w:t xml:space="preserve"> </w:t>
+      </w:r>
+      <w:proofErr w:type="spellStart"/>
+      <w:r>
+        <w:rPr>
+          <w:rFonts w:ascii="Aptos Narrow" w:eastAsiaTheme="minorEastAsia" w:hAnsi="Aptos Narrow" w:cs="Times New Roman"/>
+        </w:rPr>
+        <w:t>hPa</w:t>
+      </w:r>
+      <w:proofErr w:type="spellEnd"/>
+      <w:r>
+        <w:rPr>
+          <w:rFonts w:ascii="Aptos Narrow" w:eastAsiaTheme="minorEastAsia" w:hAnsi="Aptos Narrow" w:cs="Times New Roman"/>
+        </w:rPr>
+        <w:t xml:space="preserve"> day</w:t>
       </w:r>
       <w:r>
         <w:rPr>
@@ -5829,8 +5867,16 @@
         <w:rPr>
           <w:rFonts w:ascii="Aptos Narrow" w:eastAsiaTheme="minorEastAsia" w:hAnsi="Aptos Narrow" w:cs="Times New Roman"/>
         </w:rPr>
-        <w:t xml:space="preserve"> hPa</w:t>
-      </w:r>
+        <w:t xml:space="preserve"> </w:t>
+      </w:r>
+      <w:proofErr w:type="spellStart"/>
+      <w:r>
+        <w:rPr>
+          <w:rFonts w:ascii="Aptos Narrow" w:eastAsiaTheme="minorEastAsia" w:hAnsi="Aptos Narrow" w:cs="Times New Roman"/>
+        </w:rPr>
+        <w:t>hPa</w:t>
+      </w:r>
+      <w:proofErr w:type="spellEnd"/>
       <w:r>
         <w:rPr>
           <w:rFonts w:ascii="Aptos Narrow" w:eastAsiaTheme="minorEastAsia" w:hAnsi="Aptos Narrow" w:cs="Times New Roman"/>
@@ -5909,7 +5955,47 @@
           <w:sz w:val="20"/>
           <w:szCs w:val="20"/>
         </w:rPr>
-        <w:t>/Users/deszoeks/Projects/ATOMIC/cmip6/src/axes_5.pdf</w:t>
+        <w:t>/Users/</w:t>
+      </w:r>
+      <w:proofErr w:type="spellStart"/>
+      <w:r>
+        <w:rPr>
+          <w:rFonts w:ascii="Menlo" w:hAnsi="Menlo" w:cs="Menlo"/>
+          <w:color w:val="3B2322"/>
+          <w:sz w:val="20"/>
+          <w:szCs w:val="20"/>
+        </w:rPr>
+        <w:t>deszoeks</w:t>
+      </w:r>
+      <w:proofErr w:type="spellEnd"/>
+      <w:r>
+        <w:rPr>
+          <w:rFonts w:ascii="Menlo" w:hAnsi="Menlo" w:cs="Menlo"/>
+          <w:color w:val="3B2322"/>
+          <w:sz w:val="20"/>
+          <w:szCs w:val="20"/>
+        </w:rPr>
+        <w:t>/Projects/ATOMIC/cmip6/</w:t>
+      </w:r>
+      <w:proofErr w:type="spellStart"/>
+      <w:r>
+        <w:rPr>
+          <w:rFonts w:ascii="Menlo" w:hAnsi="Menlo" w:cs="Menlo"/>
+          <w:color w:val="3B2322"/>
+          <w:sz w:val="20"/>
+          <w:szCs w:val="20"/>
+        </w:rPr>
+        <w:t>src</w:t>
+      </w:r>
+      <w:proofErr w:type="spellEnd"/>
+      <w:r>
+        <w:rPr>
+          <w:rFonts w:ascii="Menlo" w:hAnsi="Menlo" w:cs="Menlo"/>
+          <w:color w:val="3B2322"/>
+          <w:sz w:val="20"/>
+          <w:szCs w:val="20"/>
+        </w:rPr>
+        <w:t>/axes_5.pdf</w:t>
       </w:r>
     </w:p>
     <w:p>
@@ -6674,7 +6760,19 @@
         <w:rPr>
           <w:rFonts w:ascii="Aptos" w:hAnsi="Aptos"/>
         </w:rPr>
-        <w:t xml:space="preserve"> increase +7% </w:t>
+        <w:t xml:space="preserve"> </w:t>
+      </w:r>
+      <w:r>
+        <w:rPr>
+          <w:rFonts w:ascii="Aptos" w:hAnsi="Aptos"/>
+        </w:rPr>
+        <w:t>increase by</w:t>
+      </w:r>
+      <w:r>
+        <w:rPr>
+          <w:rFonts w:ascii="Aptos" w:hAnsi="Aptos"/>
+        </w:rPr>
+        <w:t xml:space="preserve"> +7% </w:t>
       </w:r>
       <w:r>
         <w:rPr>
@@ -6799,19 +6897,7 @@
         <w:t>I</w:t>
       </w:r>
       <w:r>
-        <w:t xml:space="preserve">ncreasing specific </w:t>
-      </w:r>
-      <w:r>
-        <w:t>(</w:t>
-      </w:r>
-      <w:r>
-        <w:t>absolute</w:t>
-      </w:r>
-      <w:r>
-        <w:t xml:space="preserve">) </w:t>
-      </w:r>
-      <w:r>
-        <w:t xml:space="preserve">humidity </w:t>
+        <w:t xml:space="preserve">ncreasing specific humidity </w:t>
       </w:r>
       <w:r>
         <w:t>decreases the mass flux and cloud fraction by</w:t>
@@ -6820,30 +6906,77 @@
         <w:rPr>
           <w:rFonts w:ascii="Aptos" w:hAnsi="Aptos"/>
         </w:rPr>
-        <w:t xml:space="preserve"> increases the vertical moisture gradient and cloud-environment humidity difference </w:t>
+        <w:t xml:space="preserve"> increas</w:t>
+      </w:r>
+      <w:r>
+        <w:rPr>
+          <w:rFonts w:ascii="Aptos" w:hAnsi="Aptos"/>
+        </w:rPr>
+        <w:t>ing</w:t>
+      </w:r>
+      <w:r>
+        <w:rPr>
+          <w:rFonts w:ascii="Aptos" w:hAnsi="Aptos"/>
+        </w:rPr>
+        <w:t xml:space="preserve"> the vertical moisture gradient and cloud-environment humidity difference </w:t>
       </w:r>
       <m:oMath>
-        <m:r>
-          <m:rPr>
-            <m:sty m:val="p"/>
-          </m:rPr>
-          <w:rPr>
-            <w:rFonts w:ascii="Cambria Math" w:hAnsi="Cambria Math"/>
-          </w:rPr>
-          <m:t>Δ</m:t>
-        </m:r>
+        <m:sSub>
+          <m:sSubPr>
+            <m:ctrlPr>
+              <w:rPr>
+                <w:rFonts w:ascii="Cambria Math" w:hAnsi="Cambria Math"/>
+                <w:i/>
+              </w:rPr>
+            </m:ctrlPr>
+          </m:sSubPr>
+          <m:e>
+            <m:r>
+              <w:rPr>
+                <w:rFonts w:ascii="Cambria Math" w:hAnsi="Cambria Math"/>
+              </w:rPr>
+              <m:t>q</m:t>
+            </m:r>
+          </m:e>
+          <m:sub>
+            <m:r>
+              <w:rPr>
+                <w:rFonts w:ascii="Cambria Math" w:hAnsi="Cambria Math"/>
+              </w:rPr>
+              <m:t>c</m:t>
+            </m:r>
+          </m:sub>
+        </m:sSub>
         <m:r>
           <w:rPr>
             <w:rFonts w:ascii="Cambria Math" w:hAnsi="Cambria Math"/>
           </w:rPr>
-          <m:t>q</m:t>
+          <m:t>-q</m:t>
         </m:r>
       </m:oMath>
       <w:r>
         <w:rPr>
           <w:rFonts w:ascii="Aptos" w:hAnsi="Aptos"/>
         </w:rPr>
-        <w:t xml:space="preserve">, decreasing the mass flux </w:t>
+        <w:t xml:space="preserve">. This </w:t>
+      </w:r>
+      <w:r>
+        <w:rPr>
+          <w:rFonts w:ascii="Aptos" w:hAnsi="Aptos"/>
+        </w:rPr>
+        <w:t>decreas</w:t>
+      </w:r>
+      <w:r>
+        <w:rPr>
+          <w:rFonts w:ascii="Aptos" w:hAnsi="Aptos"/>
+        </w:rPr>
+        <w:t>es</w:t>
+      </w:r>
+      <w:r>
+        <w:rPr>
+          <w:rFonts w:ascii="Aptos" w:hAnsi="Aptos"/>
+        </w:rPr>
+        <w:t xml:space="preserve"> the mass flux </w:t>
       </w:r>
       <m:oMath>
         <m:r>
@@ -6857,7 +6990,7 @@
         <w:rPr>
           <w:rFonts w:ascii="Aptos" w:eastAsiaTheme="minorEastAsia" w:hAnsi="Aptos"/>
         </w:rPr>
-        <w:t xml:space="preserve"> (-2.7%) required to achieve the same moisture flux </w:t>
+        <w:t xml:space="preserve"> (-2.7%) required to achieve the moisture flux </w:t>
       </w:r>
       <m:oMath>
         <m:r>
@@ -6873,46 +7006,229 @@
           <w:rPr>
             <w:rFonts w:ascii="Cambria Math" w:eastAsiaTheme="minorEastAsia" w:hAnsi="Cambria Math"/>
           </w:rPr>
-          <m:t>Δ</m:t>
+          <m:t>(</m:t>
+        </m:r>
+        <m:sSub>
+          <m:sSubPr>
+            <m:ctrlPr>
+              <w:rPr>
+                <w:rFonts w:ascii="Cambria Math" w:hAnsi="Cambria Math"/>
+                <w:i/>
+              </w:rPr>
+            </m:ctrlPr>
+          </m:sSubPr>
+          <m:e>
+            <m:r>
+              <w:rPr>
+                <w:rFonts w:ascii="Cambria Math" w:hAnsi="Cambria Math"/>
+              </w:rPr>
+              <m:t>q</m:t>
+            </m:r>
+          </m:e>
+          <m:sub>
+            <m:r>
+              <w:rPr>
+                <w:rFonts w:ascii="Cambria Math" w:hAnsi="Cambria Math"/>
+              </w:rPr>
+              <m:t>c</m:t>
+            </m:r>
+          </m:sub>
+        </m:sSub>
+        <m:r>
+          <w:rPr>
+            <w:rFonts w:ascii="Cambria Math" w:hAnsi="Cambria Math"/>
+          </w:rPr>
+          <m:t>-q</m:t>
+        </m:r>
+        <m:r>
+          <w:rPr>
+            <w:rFonts w:ascii="Cambria Math" w:hAnsi="Cambria Math"/>
+          </w:rPr>
+          <m:t>)</m:t>
+        </m:r>
+      </m:oMath>
+      <w:r>
+        <w:rPr>
+          <w:rFonts w:ascii="Aptos" w:eastAsiaTheme="minorEastAsia" w:hAnsi="Aptos"/>
+        </w:rPr>
+        <w:t xml:space="preserve"> set by the large-scale subsidence drying.</w:t>
+      </w:r>
+    </w:p>
+    <w:p>
+      <w:pPr>
+        <w:pStyle w:val="BodyText"/>
+      </w:pPr>
+      <w:r>
+        <w:t>For the same reason</w:t>
+      </w:r>
+      <w:r>
+        <w:t xml:space="preserve">, </w:t>
+      </w:r>
+      <w:r>
+        <w:t>g</w:t>
+      </w:r>
+      <w:r>
+        <w:t>reater environmental relative humidity at cloud levels increases clouds</w:t>
+      </w:r>
+      <w:r>
+        <w:t>.</w:t>
+      </w:r>
+      <w:r>
+        <w:t xml:space="preserve"> </w:t>
+      </w:r>
+      <w:r>
+        <w:t>I</w:t>
+      </w:r>
+      <w:r>
+        <w:t xml:space="preserve">ncreasing the environmental humidity decreases </w:t>
+      </w:r>
+      <w:r>
+        <w:rPr>
+          <w:rFonts w:eastAsiaTheme="minorEastAsia"/>
+        </w:rPr>
+        <w:t>the excess humidity of the cloud</w:t>
+      </w:r>
+      <m:oMath>
+        <m:r>
+          <w:rPr>
+            <w:rFonts w:ascii="Cambria Math" w:eastAsiaTheme="minorEastAsia" w:hAnsi="Cambria Math"/>
+          </w:rPr>
+          <m:t xml:space="preserve"> </m:t>
+        </m:r>
+        <m:sSub>
+          <m:sSubPr>
+            <m:ctrlPr>
+              <w:rPr>
+                <w:rFonts w:ascii="Cambria Math" w:hAnsi="Cambria Math"/>
+                <w:i/>
+              </w:rPr>
+            </m:ctrlPr>
+          </m:sSubPr>
+          <m:e>
+            <m:r>
+              <w:rPr>
+                <w:rFonts w:ascii="Cambria Math" w:hAnsi="Cambria Math"/>
+              </w:rPr>
+              <m:t>q</m:t>
+            </m:r>
+          </m:e>
+          <m:sub>
+            <m:r>
+              <w:rPr>
+                <w:rFonts w:ascii="Cambria Math" w:hAnsi="Cambria Math"/>
+              </w:rPr>
+              <m:t>c</m:t>
+            </m:r>
+          </m:sub>
+        </m:sSub>
+        <m:r>
+          <w:rPr>
+            <w:rFonts w:ascii="Cambria Math" w:hAnsi="Cambria Math"/>
+          </w:rPr>
+          <m:t>-q</m:t>
         </m:r>
         <m:r>
           <w:rPr>
             <w:rFonts w:ascii="Cambria Math" w:eastAsiaTheme="minorEastAsia" w:hAnsi="Cambria Math"/>
           </w:rPr>
-          <m:t>q</m:t>
+          <m:t xml:space="preserve">, </m:t>
         </m:r>
       </m:oMath>
       <w:r>
         <w:rPr>
+          <w:rFonts w:eastAsiaTheme="minorEastAsia"/>
+        </w:rPr>
+        <w:t xml:space="preserve">increasing the mass flux required for the </w:t>
+      </w:r>
+      <w:r>
+        <w:rPr>
           <w:rFonts w:ascii="Aptos" w:eastAsiaTheme="minorEastAsia" w:hAnsi="Aptos"/>
         </w:rPr>
-        <w:t>.</w:t>
-      </w:r>
-    </w:p>
-    <w:p>
-      <w:pPr>
-        <w:pStyle w:val="BodyText"/>
-      </w:pPr>
-      <w:r>
-        <w:t xml:space="preserve">In contrast to absolute humidity, greater </w:t>
-      </w:r>
-      <w:r>
-        <w:t xml:space="preserve">cloud base relative humidity </w:t>
-      </w:r>
-      <w:r>
-        <w:t>tends to increase clouds</w:t>
-      </w:r>
-      <w:r>
-        <w:t xml:space="preserve">. </w:t>
-      </w:r>
-      <w:r>
-        <w:t xml:space="preserve">Relative humidity below cloud base does not affect the clouds. </w:t>
-      </w:r>
-      <w:r>
-        <w:t>Two experiments increas</w:t>
-      </w:r>
-      <w:r>
-        <w:t>e environmental</w:t>
+        <w:t xml:space="preserve">same moisture flux </w:t>
+      </w:r>
+      <m:oMath>
+        <m:r>
+          <w:rPr>
+            <w:rFonts w:ascii="Cambria Math" w:eastAsiaTheme="minorEastAsia" w:hAnsi="Cambria Math"/>
+          </w:rPr>
+          <m:t>M</m:t>
+        </m:r>
+        <m:d>
+          <m:dPr>
+            <m:ctrlPr>
+              <w:rPr>
+                <w:rFonts w:ascii="Cambria Math" w:eastAsiaTheme="minorEastAsia" w:hAnsi="Cambria Math"/>
+              </w:rPr>
+            </m:ctrlPr>
+          </m:dPr>
+          <m:e>
+            <m:sSub>
+              <m:sSubPr>
+                <m:ctrlPr>
+                  <w:rPr>
+                    <w:rFonts w:ascii="Cambria Math" w:hAnsi="Cambria Math"/>
+                    <w:i/>
+                  </w:rPr>
+                </m:ctrlPr>
+              </m:sSubPr>
+              <m:e>
+                <m:r>
+                  <w:rPr>
+                    <w:rFonts w:ascii="Cambria Math" w:hAnsi="Cambria Math"/>
+                  </w:rPr>
+                  <m:t>q</m:t>
+                </m:r>
+              </m:e>
+              <m:sub>
+                <m:r>
+                  <w:rPr>
+                    <w:rFonts w:ascii="Cambria Math" w:hAnsi="Cambria Math"/>
+                  </w:rPr>
+                  <m:t>c</m:t>
+                </m:r>
+              </m:sub>
+            </m:sSub>
+            <m:r>
+              <w:rPr>
+                <w:rFonts w:ascii="Cambria Math" w:hAnsi="Cambria Math"/>
+              </w:rPr>
+              <m:t>-q</m:t>
+            </m:r>
+            <m:ctrlPr>
+              <w:rPr>
+                <w:rFonts w:ascii="Cambria Math" w:hAnsi="Cambria Math"/>
+                <w:i/>
+              </w:rPr>
+            </m:ctrlPr>
+          </m:e>
+        </m:d>
+        <m:r>
+          <w:rPr>
+            <w:rFonts w:ascii="Cambria Math" w:hAnsi="Cambria Math"/>
+          </w:rPr>
+          <m:t>.</m:t>
+        </m:r>
+        <m:r>
+          <w:rPr>
+            <w:rFonts w:ascii="Cambria Math" w:hAnsi="Cambria Math"/>
+          </w:rPr>
+          <m:t xml:space="preserve"> </m:t>
+        </m:r>
+      </m:oMath>
+      <w:r>
+        <w:t>One</w:t>
+      </w:r>
+      <w:r>
+        <w:t xml:space="preserve"> experiment increas</w:t>
+      </w:r>
+      <w:r>
+        <w:t>e</w:t>
+      </w:r>
+      <w:r>
+        <w:t>s</w:t>
+      </w:r>
+      <w:r>
+        <w:t xml:space="preserve"> environmental</w:t>
       </w:r>
       <w:r>
         <w:t xml:space="preserve"> </w:t>
@@ -6921,7 +7237,18 @@
         <w:t>relative humidity</w:t>
       </w:r>
       <w:r>
-        <w:t xml:space="preserve"> in the cloud layer</w:t>
+        <w:t xml:space="preserve"> in the </w:t>
+      </w:r>
+      <w:proofErr w:type="spellStart"/>
+      <w:r>
+        <w:t>subcloud</w:t>
+      </w:r>
+      <w:proofErr w:type="spellEnd"/>
+      <w:r>
+        <w:t xml:space="preserve"> and </w:t>
+      </w:r>
+      <w:r>
+        <w:t>cloud layer</w:t>
       </w:r>
       <w:r>
         <w:t xml:space="preserve"> below </w:t>
@@ -6961,10 +7288,7 @@
         </m:sSub>
       </m:oMath>
       <w:r>
-        <w:t>. One sets</w:t>
-      </w:r>
-      <w:r>
-        <w:t xml:space="preserve"> it to</w:t>
+        <w:t xml:space="preserve"> to</w:t>
       </w:r>
       <w:r>
         <w:br/>
@@ -7165,214 +7489,28 @@
         <w:t xml:space="preserve"> at cloud base</w:t>
       </w:r>
       <w:r>
-        <w:t xml:space="preserve">. The second </w:t>
-      </w:r>
-      <w:r>
-        <w:t xml:space="preserve">increases RH by twice that amount, </w:t>
-      </w:r>
-      <w:r>
-        <w:br/>
-      </w:r>
-      <m:oMathPara>
-        <m:oMath>
-          <m:r>
-            <w:rPr>
-              <w:rFonts w:ascii="Cambria Math" w:hAnsi="Cambria Math"/>
-            </w:rPr>
-            <m:t>RH=R</m:t>
-          </m:r>
-          <m:sSub>
-            <m:sSubPr>
-              <m:ctrlPr>
-                <w:rPr>
-                  <w:rFonts w:ascii="Cambria Math" w:hAnsi="Cambria Math"/>
-                  <w:i/>
-                </w:rPr>
-              </m:ctrlPr>
-            </m:sSubPr>
-            <m:e>
-              <m:r>
-                <w:rPr>
-                  <w:rFonts w:ascii="Cambria Math" w:hAnsi="Cambria Math"/>
-                </w:rPr>
-                <m:t>H</m:t>
-              </m:r>
-            </m:e>
-            <m:sub>
-              <m:r>
-                <w:rPr>
-                  <w:rFonts w:ascii="Cambria Math" w:hAnsi="Cambria Math"/>
-                </w:rPr>
-                <m:t>ctl</m:t>
-              </m:r>
-            </m:sub>
-          </m:sSub>
-          <m:r>
-            <w:rPr>
-              <w:rFonts w:ascii="Cambria Math" w:hAnsi="Cambria Math"/>
-            </w:rPr>
-            <m:t>+0.05</m:t>
-          </m:r>
-          <m:d>
-            <m:dPr>
-              <m:ctrlPr>
-                <w:rPr>
-                  <w:rFonts w:ascii="Cambria Math" w:hAnsi="Cambria Math"/>
-                  <w:i/>
-                </w:rPr>
-              </m:ctrlPr>
-            </m:dPr>
-            <m:e>
-              <m:r>
-                <w:rPr>
-                  <w:rFonts w:ascii="Cambria Math" w:hAnsi="Cambria Math"/>
-                </w:rPr>
-                <m:t>1-R</m:t>
-              </m:r>
-              <m:sSub>
-                <m:sSubPr>
-                  <m:ctrlPr>
-                    <w:rPr>
-                      <w:rFonts w:ascii="Cambria Math" w:hAnsi="Cambria Math"/>
-                      <w:i/>
-                    </w:rPr>
-                  </m:ctrlPr>
-                </m:sSubPr>
-                <m:e>
-                  <m:r>
-                    <w:rPr>
-                      <w:rFonts w:ascii="Cambria Math" w:hAnsi="Cambria Math"/>
-                    </w:rPr>
-                    <m:t>H</m:t>
-                  </m:r>
-                </m:e>
-                <m:sub>
-                  <m:r>
-                    <w:rPr>
-                      <w:rFonts w:ascii="Cambria Math" w:hAnsi="Cambria Math"/>
-                    </w:rPr>
-                    <m:t>ctl</m:t>
-                  </m:r>
-                </m:sub>
-              </m:sSub>
-            </m:e>
-          </m:d>
-          <m:r>
-            <w:rPr>
-              <w:rFonts w:ascii="Cambria Math" w:hAnsi="Cambria Math"/>
-            </w:rPr>
-            <m:t>(2</m:t>
-          </m:r>
-          <m:sSub>
-            <m:sSubPr>
-              <m:ctrlPr>
-                <w:rPr>
-                  <w:rFonts w:ascii="Cambria Math" w:hAnsi="Cambria Math"/>
-                  <w:i/>
-                </w:rPr>
-              </m:ctrlPr>
-            </m:sSubPr>
-            <m:e>
-              <m:r>
-                <w:rPr>
-                  <w:rFonts w:ascii="Cambria Math" w:hAnsi="Cambria Math"/>
-                </w:rPr>
-                <m:t>z</m:t>
-              </m:r>
-            </m:e>
-            <m:sub>
-              <m:r>
-                <w:rPr>
-                  <w:rFonts w:ascii="Cambria Math" w:hAnsi="Cambria Math"/>
-                </w:rPr>
-                <m:t>CB</m:t>
-              </m:r>
-            </m:sub>
-          </m:sSub>
-          <m:r>
-            <w:rPr>
-              <w:rFonts w:ascii="Cambria Math" w:hAnsi="Cambria Math"/>
-            </w:rPr>
-            <m:t>-z)/</m:t>
-          </m:r>
-          <m:sSub>
-            <m:sSubPr>
-              <m:ctrlPr>
-                <w:rPr>
-                  <w:rFonts w:ascii="Cambria Math" w:hAnsi="Cambria Math"/>
-                  <w:i/>
-                </w:rPr>
-              </m:ctrlPr>
-            </m:sSubPr>
-            <m:e>
-              <m:r>
-                <w:rPr>
-                  <w:rFonts w:ascii="Cambria Math" w:hAnsi="Cambria Math"/>
-                </w:rPr>
-                <m:t>z</m:t>
-              </m:r>
-            </m:e>
-            <m:sub>
-              <m:r>
-                <w:rPr>
-                  <w:rFonts w:ascii="Cambria Math" w:hAnsi="Cambria Math"/>
-                </w:rPr>
-                <m:t>CB</m:t>
-              </m:r>
-              <m:r>
-                <w:rPr>
-                  <w:rFonts w:ascii="Cambria Math" w:hAnsi="Cambria Math"/>
-                </w:rPr>
-                <m:t>,</m:t>
-              </m:r>
-            </m:sub>
-          </m:sSub>
-          <m:r>
-            <m:rPr>
-              <m:sty m:val="p"/>
-            </m:rPr>
-            <w:br/>
-          </m:r>
-        </m:oMath>
-      </m:oMathPara>
-      <w:r>
-        <w:t xml:space="preserve">increasing it </w:t>
-      </w:r>
-      <w:r>
-        <w:t>by 0.6% at cloud base.</w:t>
+        <w:t xml:space="preserve">. The resulting increase of clouds </w:t>
+      </w:r>
+      <w:r>
+        <w:t xml:space="preserve">(+2.7%) </w:t>
+      </w:r>
+      <w:r>
+        <w:t>compensate</w:t>
+      </w:r>
+      <w:r>
+        <w:t>s</w:t>
+      </w:r>
+      <w:r>
+        <w:t xml:space="preserve"> about half of the reduction of clouds </w:t>
+      </w:r>
+      <w:r>
+        <w:t>due to the reduced</w:t>
+      </w:r>
+      <w:r>
+        <w:t xml:space="preserve"> subsidence.</w:t>
       </w:r>
       <w:r>
         <w:t xml:space="preserve"> </w:t>
-      </w:r>
-      <w:r>
-        <w:t>The resulting increase of clouds for e</w:t>
-      </w:r>
-      <w:r>
-        <w:t xml:space="preserve">ach 0.3% </w:t>
-      </w:r>
-      <w:r>
-        <w:t>increase</w:t>
-      </w:r>
-      <w:r>
-        <w:t xml:space="preserve"> of cloud base RH</w:t>
-      </w:r>
-      <w:r>
-        <w:t xml:space="preserve"> </w:t>
-      </w:r>
-      <w:r>
-        <w:t>compensate</w:t>
-      </w:r>
-      <w:r>
-        <w:t>s</w:t>
-      </w:r>
-      <w:r>
-        <w:t xml:space="preserve"> about half of the reduction of clouds </w:t>
-      </w:r>
-      <w:r>
-        <w:t>due to the reduced</w:t>
-      </w:r>
-      <w:r>
-        <w:t xml:space="preserve"> subsidence.</w:t>
       </w:r>
     </w:p>
     <w:p>
@@ -7386,7 +7524,13 @@
         <w:rPr>
           <w:rFonts w:ascii="Aptos" w:hAnsi="Aptos"/>
         </w:rPr>
-        <w:t>We expect the cloud base to form at the lifting condensation level, at a similar relative humidity in the control and all the experiments.</w:t>
+        <w:t>S</w:t>
+      </w:r>
+      <w:r>
+        <w:rPr>
+          <w:rFonts w:ascii="Aptos" w:hAnsi="Aptos"/>
+        </w:rPr>
+        <w:t>urface evaporation</w:t>
       </w:r>
       <w:r>
         <w:rPr>
@@ -7394,23 +7538,140 @@
         </w:rPr>
         <w:t xml:space="preserve"> </w:t>
       </w:r>
-      <w:r>
-        <w:rPr>
-          <w:rFonts w:ascii="Aptos" w:hAnsi="Aptos"/>
-        </w:rPr>
-        <w:t xml:space="preserve">Scaling the surface moisture flux with the modest expected increase </w:t>
-      </w:r>
-      <w:r>
-        <w:rPr>
-          <w:rFonts w:ascii="Aptos" w:hAnsi="Aptos"/>
-        </w:rPr>
-        <w:t>in</w:t>
-      </w:r>
-      <w:r>
-        <w:rPr>
-          <w:rFonts w:ascii="Aptos" w:hAnsi="Aptos"/>
-        </w:rPr>
-        <w:t xml:space="preserve"> precipitation </w:t>
+      <m:oMath>
+        <m:r>
+          <w:rPr>
+            <w:rFonts w:ascii="Cambria Math" w:hAnsi="Cambria Math"/>
+          </w:rPr>
+          <m:t>E</m:t>
+        </m:r>
+        <m:r>
+          <m:rPr>
+            <m:sty m:val="p"/>
+          </m:rPr>
+          <w:rPr>
+            <w:rFonts w:ascii="Cambria Math" w:hAnsi="Cambria Math"/>
+          </w:rPr>
+          <m:t>=</m:t>
+        </m:r>
+        <m:r>
+          <w:rPr>
+            <w:rFonts w:ascii="Cambria Math" w:hAnsi="Cambria Math"/>
+          </w:rPr>
+          <m:t>ρL</m:t>
+        </m:r>
+        <m:sSub>
+          <m:sSubPr>
+            <m:ctrlPr>
+              <w:rPr>
+                <w:rFonts w:ascii="Cambria Math" w:hAnsi="Cambria Math"/>
+              </w:rPr>
+            </m:ctrlPr>
+          </m:sSubPr>
+          <m:e>
+            <m:r>
+              <w:rPr>
+                <w:rFonts w:ascii="Cambria Math" w:hAnsi="Cambria Math"/>
+              </w:rPr>
+              <m:t>C</m:t>
+            </m:r>
+            <m:ctrlPr>
+              <w:rPr>
+                <w:rFonts w:ascii="Cambria Math" w:hAnsi="Cambria Math"/>
+                <w:i/>
+              </w:rPr>
+            </m:ctrlPr>
+          </m:e>
+          <m:sub>
+            <m:r>
+              <w:rPr>
+                <w:rFonts w:ascii="Cambria Math" w:hAnsi="Cambria Math"/>
+              </w:rPr>
+              <m:t>E</m:t>
+            </m:r>
+          </m:sub>
+        </m:sSub>
+        <m:r>
+          <w:rPr>
+            <w:rFonts w:ascii="Cambria Math" w:hAnsi="Cambria Math"/>
+          </w:rPr>
+          <m:t>U</m:t>
+        </m:r>
+        <m:sSub>
+          <m:sSubPr>
+            <m:ctrlPr>
+              <w:rPr>
+                <w:rFonts w:ascii="Cambria Math" w:hAnsi="Cambria Math"/>
+              </w:rPr>
+            </m:ctrlPr>
+          </m:sSubPr>
+          <m:e>
+            <m:r>
+              <w:rPr>
+                <w:rFonts w:ascii="Cambria Math" w:hAnsi="Cambria Math"/>
+              </w:rPr>
+              <m:t>q</m:t>
+            </m:r>
+            <m:ctrlPr>
+              <w:rPr>
+                <w:rFonts w:ascii="Cambria Math" w:hAnsi="Cambria Math"/>
+                <w:i/>
+              </w:rPr>
+            </m:ctrlPr>
+          </m:e>
+          <m:sub>
+            <m:r>
+              <w:rPr>
+                <w:rFonts w:ascii="Cambria Math" w:hAnsi="Cambria Math"/>
+              </w:rPr>
+              <m:t>s</m:t>
+            </m:r>
+          </m:sub>
+        </m:sSub>
+        <m:d>
+          <m:dPr>
+            <m:ctrlPr>
+              <w:rPr>
+                <w:rFonts w:ascii="Cambria Math" w:hAnsi="Cambria Math"/>
+              </w:rPr>
+            </m:ctrlPr>
+          </m:dPr>
+          <m:e>
+            <m:r>
+              <m:rPr>
+                <m:sty m:val="p"/>
+              </m:rPr>
+              <w:rPr>
+                <w:rFonts w:ascii="Cambria Math" w:hAnsi="Cambria Math"/>
+              </w:rPr>
+              <m:t>1-RH</m:t>
+            </m:r>
+          </m:e>
+        </m:d>
+      </m:oMath>
+      <w:r>
+        <w:rPr>
+          <w:rFonts w:ascii="Aptos" w:hAnsi="Aptos"/>
+        </w:rPr>
+        <w:t xml:space="preserve"> </w:t>
+      </w:r>
+      <w:r>
+        <w:rPr>
+          <w:rFonts w:ascii="Aptos" w:hAnsi="Aptos"/>
+        </w:rPr>
+        <w:t xml:space="preserve">increasing </w:t>
+      </w:r>
+      <w:r>
+        <w:rPr>
+          <w:rFonts w:ascii="Aptos" w:hAnsi="Aptos"/>
+        </w:rPr>
+        <w:t>in proportion to precipitation</w:t>
+      </w:r>
+      <w:r>
+        <w:rPr>
+          <w:rFonts w:ascii="Aptos" w:hAnsi="Aptos"/>
+        </w:rPr>
+        <w:t xml:space="preserve"> </w:t>
       </w:r>
       <m:oMath>
         <m:f>
@@ -7451,32 +7712,12 @@
                 </m:r>
               </m:fName>
               <m:e>
-                <m:sSub>
-                  <m:sSubPr>
-                    <m:ctrlPr>
-                      <w:rPr>
-                        <w:rFonts w:ascii="Cambria Math" w:hAnsi="Cambria Math"/>
-                        <w:i/>
-                      </w:rPr>
-                    </m:ctrlPr>
-                  </m:sSubPr>
-                  <m:e>
-                    <m:r>
-                      <w:rPr>
-                        <w:rFonts w:ascii="Cambria Math" w:hAnsi="Cambria Math"/>
-                      </w:rPr>
-                      <m:t>E</m:t>
-                    </m:r>
-                  </m:e>
-                  <m:sub>
-                    <m:r>
-                      <w:rPr>
-                        <w:rFonts w:ascii="Cambria Math" w:hAnsi="Cambria Math"/>
-                      </w:rPr>
-                      <m:t>0</m:t>
-                    </m:r>
-                  </m:sub>
-                </m:sSub>
+                <m:r>
+                  <w:rPr>
+                    <w:rFonts w:ascii="Cambria Math" w:hAnsi="Cambria Math"/>
+                  </w:rPr>
+                  <m:t>E</m:t>
+                </m:r>
               </m:e>
             </m:func>
           </m:num>
@@ -7493,7 +7734,46 @@
           <w:rPr>
             <w:rFonts w:ascii="Cambria Math" w:hAnsi="Cambria Math"/>
           </w:rPr>
-          <m:t>=d</m:t>
+          <m:t>=</m:t>
+        </m:r>
+      </m:oMath>
+      <w:r>
+        <w:rPr>
+          <w:rFonts w:ascii="Aptos" w:eastAsiaTheme="minorEastAsia" w:hAnsi="Aptos"/>
+        </w:rPr>
+        <w:t xml:space="preserve"> +2%</w:t>
+      </w:r>
+      <w:r>
+        <w:rPr>
+          <w:rFonts w:ascii="Aptos" w:hAnsi="Aptos"/>
+        </w:rPr>
+        <w:t xml:space="preserve"> </w:t>
+      </w:r>
+      <w:r>
+        <w:rPr>
+          <w:rFonts w:ascii="Aptos" w:hAnsi="Aptos"/>
+        </w:rPr>
+        <w:t>K</w:t>
+      </w:r>
+      <w:r>
+        <w:rPr>
+          <w:rFonts w:ascii="Aptos" w:hAnsi="Aptos"/>
+          <w:vertAlign w:val="superscript"/>
+        </w:rPr>
+        <w:t>–1</w:t>
+      </w:r>
+      <w:r>
+        <w:rPr>
+          <w:rFonts w:ascii="Aptos" w:hAnsi="Aptos"/>
+        </w:rPr>
+        <w:t xml:space="preserve">, where </w:t>
+      </w:r>
+      <m:oMath>
+        <m:r>
+          <w:rPr>
+            <w:rFonts w:ascii="Cambria Math" w:hAnsi="Cambria Math"/>
+          </w:rPr>
+          <m:t>d</m:t>
         </m:r>
         <m:func>
           <m:funcPr>
@@ -7516,57 +7796,89 @@
             </m:r>
           </m:fName>
           <m:e>
-            <m:r>
-              <w:rPr>
-                <w:rFonts w:ascii="Cambria Math" w:hAnsi="Cambria Math"/>
-              </w:rPr>
-              <m:t>P</m:t>
-            </m:r>
+            <m:sSub>
+              <m:sSubPr>
+                <m:ctrlPr>
+                  <w:rPr>
+                    <w:rFonts w:ascii="Cambria Math" w:hAnsi="Cambria Math"/>
+                    <w:i/>
+                  </w:rPr>
+                </m:ctrlPr>
+              </m:sSubPr>
+              <m:e>
+                <m:r>
+                  <w:rPr>
+                    <w:rFonts w:ascii="Cambria Math" w:hAnsi="Cambria Math"/>
+                  </w:rPr>
+                  <m:t>q</m:t>
+                </m:r>
+              </m:e>
+              <m:sub>
+                <m:r>
+                  <w:rPr>
+                    <w:rFonts w:ascii="Cambria Math" w:hAnsi="Cambria Math"/>
+                  </w:rPr>
+                  <m:t>s</m:t>
+                </m:r>
+              </m:sub>
+            </m:sSub>
           </m:e>
         </m:func>
         <m:r>
           <w:rPr>
             <w:rFonts w:ascii="Cambria Math" w:hAnsi="Cambria Math"/>
           </w:rPr>
-          <m:t>/dT=</m:t>
+          <m:t>/dT=+</m:t>
         </m:r>
       </m:oMath>
       <w:r>
         <w:rPr>
           <w:rFonts w:ascii="Aptos" w:eastAsiaTheme="minorEastAsia" w:hAnsi="Aptos"/>
         </w:rPr>
-        <w:t xml:space="preserve"> +2%</w:t>
-      </w:r>
-      <w:r>
-        <w:rPr>
-          <w:rFonts w:ascii="Aptos" w:hAnsi="Aptos"/>
-        </w:rPr>
-        <w:t xml:space="preserve"> </w:t>
-      </w:r>
-      <w:r>
-        <w:rPr>
-          <w:rFonts w:ascii="Aptos" w:hAnsi="Aptos"/>
-        </w:rPr>
-        <w:t>K</w:t>
-      </w:r>
-      <w:r>
-        <w:rPr>
-          <w:rFonts w:ascii="Aptos" w:hAnsi="Aptos"/>
+        <w:t>7% K</w:t>
+      </w:r>
+      <w:r>
+        <w:rPr>
+          <w:rFonts w:ascii="Aptos" w:eastAsiaTheme="minorEastAsia" w:hAnsi="Aptos"/>
           <w:vertAlign w:val="superscript"/>
         </w:rPr>
-        <w:t>–1</w:t>
-      </w:r>
-      <w:r>
-        <w:rPr>
-          <w:rFonts w:ascii="Aptos" w:hAnsi="Aptos"/>
-        </w:rPr>
-        <w:t xml:space="preserve"> suggests that the humidity increases</w:t>
-      </w:r>
-      <w:r>
-        <w:rPr>
-          <w:rFonts w:ascii="Aptos" w:hAnsi="Aptos"/>
-        </w:rPr>
-        <w:t xml:space="preserve"> at the </w:t>
+        <w:t>-1</w:t>
+      </w:r>
+      <w:r>
+        <w:rPr>
+          <w:rFonts w:ascii="Aptos" w:hAnsi="Aptos"/>
+        </w:rPr>
+        <w:t xml:space="preserve"> and </w:t>
+      </w:r>
+      <w:r>
+        <w:rPr>
+          <w:rFonts w:ascii="Aptos" w:hAnsi="Aptos"/>
+        </w:rPr>
+        <w:t xml:space="preserve">the </w:t>
+      </w:r>
+      <w:r>
+        <w:rPr>
+          <w:rFonts w:ascii="Aptos" w:hAnsi="Aptos"/>
+        </w:rPr>
+        <w:t>wind speed and vapor transfer coefficient</w:t>
+      </w:r>
+      <w:r>
+        <w:rPr>
+          <w:rFonts w:ascii="Aptos" w:hAnsi="Aptos"/>
+        </w:rPr>
+        <w:t xml:space="preserve"> are constant, </w:t>
+      </w:r>
+      <w:r>
+        <w:rPr>
+          <w:rFonts w:ascii="Aptos" w:hAnsi="Aptos"/>
+        </w:rPr>
+        <w:t xml:space="preserve">suggests that the </w:t>
+      </w:r>
+      <w:r>
+        <w:rPr>
+          <w:rFonts w:ascii="Aptos" w:hAnsi="Aptos"/>
+        </w:rPr>
+        <w:t>surface</w:t>
       </w:r>
       <w:r>
         <w:rPr>
@@ -7574,247 +7886,31 @@
           <w:i/>
           <w:iCs/>
         </w:rPr>
-        <w:t>surface</w:t>
-      </w:r>
-      <w:r>
-        <w:rPr>
-          <w:rFonts w:ascii="Aptos" w:hAnsi="Aptos"/>
-        </w:rPr>
-        <w:t xml:space="preserve">. </w:t>
-      </w:r>
-      <w:r>
-        <w:rPr>
-          <w:rFonts w:ascii="Aptos" w:hAnsi="Aptos"/>
-        </w:rPr>
-        <w:t xml:space="preserve">If wind speed and the vapor transfer coefficient stay the same and </w:t>
-      </w:r>
-      <m:oMath>
-        <m:sSub>
-          <m:sSubPr>
-            <m:ctrlPr>
-              <w:rPr>
-                <w:rFonts w:ascii="Cambria Math" w:hAnsi="Cambria Math"/>
-              </w:rPr>
-            </m:ctrlPr>
-          </m:sSubPr>
-          <m:e>
-            <m:r>
-              <w:rPr>
-                <w:rFonts w:ascii="Cambria Math" w:hAnsi="Cambria Math"/>
-              </w:rPr>
-              <m:t>q</m:t>
-            </m:r>
-            <m:ctrlPr>
-              <w:rPr>
-                <w:rFonts w:ascii="Cambria Math" w:hAnsi="Cambria Math"/>
-                <w:i/>
-              </w:rPr>
-            </m:ctrlPr>
-          </m:e>
-          <m:sub>
-            <m:r>
-              <w:rPr>
-                <w:rFonts w:ascii="Cambria Math" w:hAnsi="Cambria Math"/>
-              </w:rPr>
-              <m:t>s</m:t>
-            </m:r>
-          </m:sub>
-        </m:sSub>
-      </m:oMath>
-      <w:r>
-        <w:rPr>
-          <w:rFonts w:ascii="Aptos" w:hAnsi="Aptos"/>
-        </w:rPr>
-        <w:t xml:space="preserve"> increases by +7 % K</w:t>
-      </w:r>
-      <w:r>
-        <w:rPr>
-          <w:rFonts w:ascii="Aptos" w:hAnsi="Aptos"/>
-          <w:vertAlign w:val="superscript"/>
-        </w:rPr>
-        <w:t>–1</w:t>
-      </w:r>
-      <w:r>
-        <w:rPr>
-          <w:rFonts w:ascii="Aptos" w:hAnsi="Aptos"/>
-        </w:rPr>
-        <w:t xml:space="preserve">, the sensitivity of the surface evaporation flux </w:t>
-      </w:r>
-      <m:oMath>
-        <m:sSub>
-          <m:sSubPr>
-            <m:ctrlPr>
-              <w:rPr>
-                <w:rFonts w:ascii="Cambria Math" w:hAnsi="Cambria Math"/>
-              </w:rPr>
-            </m:ctrlPr>
-          </m:sSubPr>
-          <m:e>
-            <m:r>
-              <w:rPr>
-                <w:rFonts w:ascii="Cambria Math" w:hAnsi="Cambria Math"/>
-              </w:rPr>
-              <m:t>E</m:t>
-            </m:r>
-            <m:ctrlPr>
-              <w:rPr>
-                <w:rFonts w:ascii="Cambria Math" w:hAnsi="Cambria Math"/>
-                <w:i/>
-              </w:rPr>
-            </m:ctrlPr>
-          </m:e>
-          <m:sub>
-            <m:r>
-              <m:rPr>
-                <m:sty m:val="p"/>
-              </m:rPr>
-              <w:rPr>
-                <w:rFonts w:ascii="Cambria Math" w:hAnsi="Cambria Math"/>
-              </w:rPr>
-              <m:t>0</m:t>
-            </m:r>
-          </m:sub>
-        </m:sSub>
-        <m:r>
-          <m:rPr>
-            <m:sty m:val="p"/>
-          </m:rPr>
-          <w:rPr>
-            <w:rFonts w:ascii="Cambria Math" w:hAnsi="Cambria Math"/>
-          </w:rPr>
-          <m:t>=</m:t>
-        </m:r>
-        <m:r>
-          <w:rPr>
-            <w:rFonts w:ascii="Cambria Math" w:hAnsi="Cambria Math"/>
-          </w:rPr>
-          <m:t>ρL</m:t>
-        </m:r>
-        <m:sSub>
-          <m:sSubPr>
-            <m:ctrlPr>
-              <w:rPr>
-                <w:rFonts w:ascii="Cambria Math" w:hAnsi="Cambria Math"/>
-              </w:rPr>
-            </m:ctrlPr>
-          </m:sSubPr>
-          <m:e>
-            <m:r>
-              <w:rPr>
-                <w:rFonts w:ascii="Cambria Math" w:hAnsi="Cambria Math"/>
-              </w:rPr>
-              <m:t>C</m:t>
-            </m:r>
-            <m:ctrlPr>
-              <w:rPr>
-                <w:rFonts w:ascii="Cambria Math" w:hAnsi="Cambria Math"/>
-                <w:i/>
-              </w:rPr>
-            </m:ctrlPr>
-          </m:e>
-          <m:sub>
-            <m:r>
-              <w:rPr>
-                <w:rFonts w:ascii="Cambria Math" w:hAnsi="Cambria Math"/>
-              </w:rPr>
-              <m:t>E</m:t>
-            </m:r>
-          </m:sub>
-        </m:sSub>
-        <m:r>
-          <w:rPr>
-            <w:rFonts w:ascii="Cambria Math" w:hAnsi="Cambria Math"/>
-          </w:rPr>
-          <m:t>U</m:t>
-        </m:r>
-        <m:sSub>
-          <m:sSubPr>
-            <m:ctrlPr>
-              <w:rPr>
-                <w:rFonts w:ascii="Cambria Math" w:hAnsi="Cambria Math"/>
-              </w:rPr>
-            </m:ctrlPr>
-          </m:sSubPr>
-          <m:e>
-            <m:r>
-              <w:rPr>
-                <w:rFonts w:ascii="Cambria Math" w:hAnsi="Cambria Math"/>
-              </w:rPr>
-              <m:t>q</m:t>
-            </m:r>
-            <m:ctrlPr>
-              <w:rPr>
-                <w:rFonts w:ascii="Cambria Math" w:hAnsi="Cambria Math"/>
-                <w:i/>
-              </w:rPr>
-            </m:ctrlPr>
-          </m:e>
-          <m:sub>
-            <m:r>
-              <w:rPr>
-                <w:rFonts w:ascii="Cambria Math" w:hAnsi="Cambria Math"/>
-              </w:rPr>
-              <m:t>s</m:t>
-            </m:r>
-          </m:sub>
-        </m:sSub>
-        <m:d>
-          <m:dPr>
-            <m:ctrlPr>
-              <w:rPr>
-                <w:rFonts w:ascii="Cambria Math" w:hAnsi="Cambria Math"/>
-              </w:rPr>
-            </m:ctrlPr>
-          </m:dPr>
-          <m:e>
-            <m:r>
-              <m:rPr>
-                <m:sty m:val="p"/>
-              </m:rPr>
-              <w:rPr>
-                <w:rFonts w:ascii="Cambria Math" w:hAnsi="Cambria Math"/>
-              </w:rPr>
-              <m:t>1-RH</m:t>
-            </m:r>
-          </m:e>
-        </m:d>
-      </m:oMath>
-      <w:r>
-        <w:rPr>
-          <w:rFonts w:ascii="Aptos" w:hAnsi="Aptos"/>
-        </w:rPr>
-        <w:t xml:space="preserve"> is limited to </w:t>
-      </w:r>
-      <w:r>
-        <w:rPr>
-          <w:rFonts w:ascii="Aptos" w:eastAsiaTheme="minorEastAsia" w:hAnsi="Aptos"/>
-        </w:rPr>
         <w:t xml:space="preserve"> </w:t>
       </w:r>
       <w:r>
         <w:rPr>
           <w:rFonts w:ascii="Aptos" w:hAnsi="Aptos"/>
         </w:rPr>
-        <w:t>+2 % K</w:t>
-      </w:r>
-      <w:r>
-        <w:rPr>
-          <w:rFonts w:ascii="Aptos" w:hAnsi="Aptos"/>
-          <w:vertAlign w:val="superscript"/>
-        </w:rPr>
-        <w:t>–1</w:t>
-      </w:r>
-      <w:r>
-        <w:rPr>
-          <w:rFonts w:ascii="Aptos" w:hAnsi="Aptos"/>
-        </w:rPr>
-        <w:t xml:space="preserve"> by</w:t>
-      </w:r>
-      <w:r>
-        <w:rPr>
-          <w:rFonts w:ascii="Aptos" w:hAnsi="Aptos"/>
-        </w:rPr>
-        <w:t xml:space="preserve"> quenching the surface relative saturation deficit </w:t>
+        <w:t xml:space="preserve">relative </w:t>
+      </w:r>
+      <w:r>
+        <w:rPr>
+          <w:rFonts w:ascii="Aptos" w:hAnsi="Aptos"/>
+        </w:rPr>
+        <w:t>humidity increases</w:t>
+      </w:r>
+      <w:r>
+        <w:rPr>
+          <w:rFonts w:ascii="Aptos" w:hAnsi="Aptos"/>
+        </w:rPr>
+        <w:t xml:space="preserve"> to quench the </w:t>
+      </w:r>
+      <w:r>
+        <w:rPr>
+          <w:rFonts w:ascii="Aptos" w:hAnsi="Aptos"/>
+        </w:rPr>
+        <w:t xml:space="preserve">surface relative saturation deficit </w:t>
       </w:r>
       <m:oMath>
         <m:r>
@@ -7844,31 +7940,55 @@
         <w:rPr>
           <w:rFonts w:ascii="Aptos" w:hAnsi="Aptos"/>
         </w:rPr>
-        <w:t xml:space="preserve">. </w:t>
-      </w:r>
-      <w:r>
-        <w:rPr>
-          <w:rFonts w:ascii="Aptos" w:hAnsi="Aptos"/>
-        </w:rPr>
-        <w:t>For a</w:t>
-      </w:r>
-      <w:r>
-        <w:rPr>
-          <w:rFonts w:ascii="Aptos" w:hAnsi="Aptos"/>
-        </w:rPr>
-        <w:t xml:space="preserve"> mean surface relative humidity RH = 0.73, the relative saturation deficit decreases </w:t>
-      </w:r>
-      <w:r>
-        <w:rPr>
-          <w:rFonts w:ascii="Aptos" w:hAnsi="Aptos"/>
-        </w:rPr>
-        <w:t xml:space="preserve">increasing surface </w:t>
-      </w:r>
-      <w:r>
-        <w:rPr>
-          <w:rFonts w:ascii="Aptos" w:hAnsi="Aptos"/>
-        </w:rPr>
-        <w:t>RH about +0.01</w:t>
+        <w:t>.</w:t>
+      </w:r>
+      <w:r>
+        <w:rPr>
+          <w:rFonts w:ascii="Aptos" w:hAnsi="Aptos"/>
+        </w:rPr>
+        <w:t xml:space="preserve"> </w:t>
+      </w:r>
+      <w:r>
+        <w:rPr>
+          <w:rFonts w:ascii="Aptos" w:hAnsi="Aptos"/>
+        </w:rPr>
+        <w:t>For</w:t>
+      </w:r>
+      <w:r>
+        <w:rPr>
+          <w:rFonts w:ascii="Aptos" w:hAnsi="Aptos"/>
+        </w:rPr>
+        <w:t xml:space="preserve"> mean surface relative humidity RH = 0.73,</w:t>
+      </w:r>
+      <w:r>
+        <w:rPr>
+          <w:rFonts w:ascii="Aptos" w:hAnsi="Aptos"/>
+        </w:rPr>
+        <w:t xml:space="preserve"> the</w:t>
+      </w:r>
+      <w:r>
+        <w:rPr>
+          <w:rFonts w:ascii="Aptos" w:hAnsi="Aptos"/>
+        </w:rPr>
+        <w:t xml:space="preserve"> </w:t>
+      </w:r>
+      <w:r>
+        <w:rPr>
+          <w:rFonts w:ascii="Aptos" w:hAnsi="Aptos"/>
+        </w:rPr>
+        <w:t xml:space="preserve">RH </w:t>
+      </w:r>
+      <w:r>
+        <w:rPr>
+          <w:rFonts w:ascii="Aptos" w:hAnsi="Aptos"/>
+        </w:rPr>
+        <w:t xml:space="preserve">increases </w:t>
+      </w:r>
+      <w:r>
+        <w:rPr>
+          <w:rFonts w:ascii="Aptos" w:hAnsi="Aptos"/>
+        </w:rPr>
+        <w:t>+0.01</w:t>
       </w:r>
       <w:r>
         <w:rPr>
@@ -7893,6 +8013,57 @@
         <w:rPr>
           <w:rFonts w:ascii="Aptos" w:hAnsi="Aptos"/>
         </w:rPr>
+        <w:t>.</w:t>
+      </w:r>
+      <w:r>
+        <w:rPr>
+          <w:rFonts w:ascii="Aptos" w:hAnsi="Aptos"/>
+        </w:rPr>
+        <w:t xml:space="preserve"> Though RH may increase at the surface,</w:t>
+      </w:r>
+      <w:r>
+        <w:rPr>
+          <w:rFonts w:ascii="Aptos" w:hAnsi="Aptos"/>
+        </w:rPr>
+        <w:t xml:space="preserve"> r</w:t>
+      </w:r>
+      <w:r>
+        <w:t>elative humidity below cloud base does not affect the clouds</w:t>
+      </w:r>
+      <w:r>
+        <w:t>. T</w:t>
+      </w:r>
+      <w:r>
+        <w:rPr>
+          <w:rFonts w:ascii="Aptos" w:hAnsi="Aptos"/>
+        </w:rPr>
+        <w:t>he</w:t>
+      </w:r>
+      <w:r>
+        <w:rPr>
+          <w:rFonts w:ascii="Aptos" w:hAnsi="Aptos"/>
+        </w:rPr>
+        <w:t xml:space="preserve"> cloud base </w:t>
+      </w:r>
+      <w:r>
+        <w:rPr>
+          <w:rFonts w:ascii="Aptos" w:hAnsi="Aptos"/>
+        </w:rPr>
+        <w:t xml:space="preserve">is expected to </w:t>
+      </w:r>
+      <w:r>
+        <w:rPr>
+          <w:rFonts w:ascii="Aptos" w:hAnsi="Aptos"/>
+        </w:rPr>
+        <w:t>form at the lifting condensation level, at a similar relative humidity</w:t>
+      </w:r>
+      <w:r>
+        <w:rPr>
+          <w:rFonts w:ascii="Aptos" w:hAnsi="Aptos"/>
+        </w:rPr>
+        <w:t xml:space="preserve"> among the control and the experiments</w:t>
+      </w:r>
+      <w:r>
         <w:t>.</w:t>
       </w:r>
     </w:p>
@@ -7916,6 +8087,12 @@
           <w:rFonts w:ascii="Aptos Narrow" w:hAnsi="Aptos Narrow"/>
         </w:rPr>
         <w:t>Table 1. Cloud fraction change relative to the control simulation (%).</w:t>
+      </w:r>
+      <w:r>
+        <w:rPr>
+          <w:rFonts w:ascii="Aptos Narrow" w:hAnsi="Aptos Narrow"/>
+        </w:rPr>
+        <w:t xml:space="preserve"> The DIM experiment has -5% reduced subsidence, +2% increased moisture flux, and +7% increased humidity.</w:t>
       </w:r>
     </w:p>
     <w:tbl>
@@ -8007,7 +8184,7 @@
                 <w:rPr>
                   <w:rFonts w:ascii="Cambria Math" w:hAnsi="Cambria Math"/>
                 </w:rPr>
-                <m:t>a</m:t>
+                <m:t>C</m:t>
               </m:r>
             </m:oMath>
             <w:r>
@@ -8110,6 +8287,9 @@
             <w:r>
               <w:t>q&amp;qs+7%</w:t>
             </w:r>
+            <w:r>
+              <w:t xml:space="preserve"> (DIM)</w:t>
+            </w:r>
           </w:p>
         </w:tc>
         <w:tc>
@@ -8166,51 +8346,6 @@
           </w:p>
         </w:tc>
       </w:tr>
-      <w:tr>
-        <w:trPr>
-          <w:trHeight w:val="21"/>
-          <w:tblCellSpacing w:w="15" w:type="dxa"/>
-        </w:trPr>
-        <w:tc>
-          <w:tcPr>
-            <w:tcW w:w="3250" w:type="dxa"/>
-            <w:tcBorders>
-              <w:bottom w:val="nil"/>
-            </w:tcBorders>
-            <w:hideMark/>
-          </w:tcPr>
-          <w:p>
-            <w:pPr>
-              <w:pStyle w:val="BodyText"/>
-              <w:spacing w:before="0" w:after="0"/>
-            </w:pPr>
-            <w:r>
-              <w:t>lclRH+0.0</w:t>
-            </w:r>
-            <w:r>
-              <w:t>06</w:t>
-            </w:r>
-          </w:p>
-        </w:tc>
-        <w:tc>
-          <w:tcPr>
-            <w:tcW w:w="990" w:type="dxa"/>
-            <w:tcBorders>
-              <w:bottom w:val="nil"/>
-            </w:tcBorders>
-            <w:hideMark/>
-          </w:tcPr>
-          <w:p>
-            <w:pPr>
-              <w:pStyle w:val="BodyText"/>
-              <w:spacing w:before="0" w:after="0"/>
-            </w:pPr>
-            <w:r>
-              <w:t>-2.27</w:t>
-            </w:r>
-          </w:p>
-        </w:tc>
-      </w:tr>
     </w:tbl>
     <w:p>
       <w:pPr>
@@ -8225,6 +8360,7 @@
         <w:pStyle w:val="FirstParagraph"/>
       </w:pPr>
       <w:r>
+        <w:lastRenderedPageBreak/>
         <w:t xml:space="preserve">Relative humidity (RH) increases clouds, but absolute humidity decreases them. A 0.00875 increase of RH at cloud base increases clouds 2.7% [???by increasing which clouds???], compensating the 5% reduction of cloud fraction associated with their moisture flux. Increasing absolute (specific) humidity, as due to saturation vapor pressure, increases the cloud moisture flux </w:t>
       </w:r>
       <m:oMath>
@@ -8285,7 +8421,21 @@
         <w:rPr>
           <w:rFonts w:ascii="Aptos" w:hAnsi="Aptos"/>
         </w:rPr>
-        <w:t>While shallow cumulus decrease with reduced large-scale overturning, local scaling of the moist turbulent subcloud boundary layer sugges</w:t>
+        <w:t xml:space="preserve">While shallow cumulus decrease with reduced large-scale overturning, local scaling of the moist turbulent </w:t>
+      </w:r>
+      <w:proofErr w:type="spellStart"/>
+      <w:r>
+        <w:rPr>
+          <w:rFonts w:ascii="Aptos" w:hAnsi="Aptos"/>
+        </w:rPr>
+        <w:t>subcloud</w:t>
+      </w:r>
+      <w:proofErr w:type="spellEnd"/>
+      <w:r>
+        <w:rPr>
+          <w:rFonts w:ascii="Aptos" w:hAnsi="Aptos"/>
+        </w:rPr>
+        <w:t xml:space="preserve"> boundary layer sugges</w:t>
       </w:r>
       <w:r>
         <w:rPr>
@@ -8421,7 +8571,21 @@
         <w:rPr>
           <w:rFonts w:ascii="Aptos" w:hAnsi="Aptos"/>
         </w:rPr>
-        <w:t>condenses from turbulent subcloud thermals</w:t>
+        <w:t xml:space="preserve">condenses from turbulent </w:t>
+      </w:r>
+      <w:proofErr w:type="spellStart"/>
+      <w:r>
+        <w:rPr>
+          <w:rFonts w:ascii="Aptos" w:hAnsi="Aptos"/>
+        </w:rPr>
+        <w:t>subcloud</w:t>
+      </w:r>
+      <w:proofErr w:type="spellEnd"/>
+      <w:r>
+        <w:rPr>
+          <w:rFonts w:ascii="Aptos" w:hAnsi="Aptos"/>
+        </w:rPr>
+        <w:t xml:space="preserve"> thermals</w:t>
       </w:r>
       <w:r>
         <w:rPr>
@@ -8469,7 +8633,21 @@
         <w:rPr>
           <w:rFonts w:ascii="Aptos" w:hAnsi="Aptos"/>
         </w:rPr>
-        <w:t>(Sommeria and Deardorff, 1977; Mellor 1977). For a normal distribution of relative humidity, the cloud fraction is</w:t>
+        <w:t>(</w:t>
+      </w:r>
+      <w:proofErr w:type="spellStart"/>
+      <w:r>
+        <w:rPr>
+          <w:rFonts w:ascii="Aptos" w:hAnsi="Aptos"/>
+        </w:rPr>
+        <w:t>Sommeria</w:t>
+      </w:r>
+      <w:proofErr w:type="spellEnd"/>
+      <w:r>
+        <w:rPr>
+          <w:rFonts w:ascii="Aptos" w:hAnsi="Aptos"/>
+        </w:rPr>
+        <w:t xml:space="preserve"> and Deardorff, 1977; Mellor 1977). For a normal distribution of relative humidity, the cloud fraction is</w:t>
       </w:r>
       <w:r>
         <w:rPr>
@@ -11352,7 +11530,21 @@
         <w:rPr>
           <w:rFonts w:ascii="Aptos" w:hAnsi="Aptos"/>
         </w:rPr>
-        <w:t>scales with the humidity scale, the subcloud mean humidity difference, and the saturation specific humidity.</w:t>
+        <w:t xml:space="preserve">scales with the humidity scale, the </w:t>
+      </w:r>
+      <w:proofErr w:type="spellStart"/>
+      <w:r>
+        <w:rPr>
+          <w:rFonts w:ascii="Aptos" w:hAnsi="Aptos"/>
+        </w:rPr>
+        <w:t>subcloud</w:t>
+      </w:r>
+      <w:proofErr w:type="spellEnd"/>
+      <w:r>
+        <w:rPr>
+          <w:rFonts w:ascii="Aptos" w:hAnsi="Aptos"/>
+        </w:rPr>
+        <w:t xml:space="preserve"> mean humidity difference, and the saturation specific humidity.</w:t>
       </w:r>
     </w:p>
     <w:p>
@@ -12815,14 +13007,28 @@
         <w:rPr>
           <w:rFonts w:ascii="Aptos" w:hAnsi="Aptos"/>
         </w:rPr>
-        <w:t xml:space="preserve">Figure MODISISCCP shows ISCCP-H </w:t>
+        <w:t>Figure MODISISCCP shows ISCCP-H cloud top height and optical thickness cloud fraction histograms observed from the 1-km pixel MODIS observations in the Northern Atlantic shallow cumulus region (80-20°W, 15-</w:t>
       </w:r>
       <w:r>
         <w:rPr>
           <w:rFonts w:ascii="Aptos" w:hAnsi="Aptos"/>
         </w:rPr>
         <w:lastRenderedPageBreak/>
-        <w:t>cloud top height and optical thickness cloud fraction histograms observed from the 1-km pixel MODIS observations in the Northern Atlantic shallow cumulus region (80-20°W, 15-35°N) for January-February of 2019-2021. These high-resolution observations avoid partially cloudy pixels and are designed to be compared to COSP satellite simulators in climate models. Most (29.1%) of the clouds are below 800 hPa with cloud optical thickness between 1.3-9.4.</w:t>
+        <w:t xml:space="preserve">35°N) for January-February of 2019-2021. These high-resolution observations avoid partially cloudy pixels and are designed to be compared to COSP satellite simulators in climate models. Most (29.1%) of the clouds are below 800 </w:t>
+      </w:r>
+      <w:proofErr w:type="spellStart"/>
+      <w:r>
+        <w:rPr>
+          <w:rFonts w:ascii="Aptos" w:hAnsi="Aptos"/>
+        </w:rPr>
+        <w:t>hPa</w:t>
+      </w:r>
+      <w:proofErr w:type="spellEnd"/>
+      <w:r>
+        <w:rPr>
+          <w:rFonts w:ascii="Aptos" w:hAnsi="Aptos"/>
+        </w:rPr>
+        <w:t xml:space="preserve"> with cloud optical thickness between 1.3-9.4.</w:t>
       </w:r>
     </w:p>
     <w:p>
@@ -13567,7 +13773,21 @@
         <w:rPr>
           <w:rFonts w:eastAsiaTheme="minorEastAsia"/>
         </w:rPr>
-        <w:t>is an underconstrained problem</w:t>
+        <w:t xml:space="preserve">is an </w:t>
+      </w:r>
+      <w:proofErr w:type="spellStart"/>
+      <w:r>
+        <w:rPr>
+          <w:rFonts w:eastAsiaTheme="minorEastAsia"/>
+        </w:rPr>
+        <w:t>underconstrained</w:t>
+      </w:r>
+      <w:proofErr w:type="spellEnd"/>
+      <w:r>
+        <w:rPr>
+          <w:rFonts w:eastAsiaTheme="minorEastAsia"/>
+        </w:rPr>
+        <w:t xml:space="preserve"> problem</w:t>
       </w:r>
       <w:r>
         <w:rPr>
@@ -14338,12 +14558,14 @@
       <w:r>
         <w:t xml:space="preserve"> </w:t>
       </w:r>
+      <w:proofErr w:type="spellStart"/>
       <w:r>
         <w:rPr>
           <w:rFonts w:ascii="ComicShannsMono Nerd Font" w:hAnsi="ComicShannsMono Nerd Font"/>
         </w:rPr>
         <w:t>amip</w:t>
       </w:r>
+      <w:proofErr w:type="spellEnd"/>
       <w:r>
         <w:t xml:space="preserve"> (historical) and </w:t>
       </w:r>
@@ -14377,12 +14599,14 @@
       <w:r>
         <w:t xml:space="preserve"> and </w:t>
       </w:r>
+      <w:proofErr w:type="spellStart"/>
       <w:r>
         <w:rPr>
           <w:rFonts w:ascii="ComicShannsMono Nerd Font" w:hAnsi="ComicShannsMono Nerd Font"/>
         </w:rPr>
         <w:t>amip</w:t>
       </w:r>
+      <w:proofErr w:type="spellEnd"/>
       <w:r>
         <w:t xml:space="preserve"> during</w:t>
       </w:r>
@@ -16619,11 +16843,19 @@
         </w:rPr>
         <w:t>relax</w:t>
       </w:r>
+      <w:proofErr w:type="spellStart"/>
       <w:r>
         <w:rPr>
           <w:rFonts w:ascii="Aptos" w:eastAsiaTheme="minorEastAsia" w:hAnsi="Aptos" w:cs="Times New Roman"/>
         </w:rPr>
-        <w:t xml:space="preserve">ing </w:t>
+        <w:t>ing</w:t>
+      </w:r>
+      <w:proofErr w:type="spellEnd"/>
+      <w:r>
+        <w:rPr>
+          <w:rFonts w:ascii="Aptos" w:eastAsiaTheme="minorEastAsia" w:hAnsi="Aptos" w:cs="Times New Roman"/>
+        </w:rPr>
+        <w:t xml:space="preserve"> </w:t>
       </w:r>
       <m:oMath>
         <m:sSub>
@@ -16939,7 +17171,21 @@
         <w:rPr>
           <w:rFonts w:ascii="Aptos" w:eastAsiaTheme="minorEastAsia" w:hAnsi="Aptos" w:cs="Times New Roman"/>
         </w:rPr>
-        <w:t xml:space="preserve">[q and cloud top where q=qs depends only on the sounding and cloud base initial condition, so it can be computed from the sounding, without the flux condition. </w:t>
+        <w:t>[q and cloud top where q=</w:t>
+      </w:r>
+      <w:proofErr w:type="spellStart"/>
+      <w:r>
+        <w:rPr>
+          <w:rFonts w:ascii="Aptos" w:eastAsiaTheme="minorEastAsia" w:hAnsi="Aptos" w:cs="Times New Roman"/>
+        </w:rPr>
+        <w:t>qs</w:t>
+      </w:r>
+      <w:proofErr w:type="spellEnd"/>
+      <w:r>
+        <w:rPr>
+          <w:rFonts w:ascii="Aptos" w:eastAsiaTheme="minorEastAsia" w:hAnsi="Aptos" w:cs="Times New Roman"/>
+        </w:rPr>
+        <w:t xml:space="preserve"> depends only on the sounding and cloud base initial condition, so it can be computed from the sounding, without the flux condition. </w:t>
       </w:r>
       <w:r>
         <w:rPr>
@@ -20896,7 +21142,15 @@
         <w:pStyle w:val="BodyText"/>
       </w:pPr>
       <w:r>
-        <w:t xml:space="preserve">[[For discussion on the compensation between cumulus and stratocumulus clouds: Myers and Norris (2014) show, all else being equal, subsidence reduces stratocumulus clouds. Cloud properties and within-regime feedbacks are similar between shallow cumulus and optically thicker stratocumulus clouds (Tselioudis et al., 2021; Zelinka et al. 2025), suggesting temperature-induced changes result in compensation between stratocumulus </w:t>
+        <w:t>[[For discussion on the compensation between cumulus and stratocumulus clouds: Myers and Norris (2014) show, all else being equal, subsidence reduces stratocumulus clouds. Cloud properties and within-regime feedbacks are similar between shallow cumulus and optically thicker stratocumulus clouds (</w:t>
+      </w:r>
+      <w:proofErr w:type="spellStart"/>
+      <w:r>
+        <w:t>Tselioudis</w:t>
+      </w:r>
+      <w:proofErr w:type="spellEnd"/>
+      <w:r>
+        <w:t xml:space="preserve"> et al., 2021; Zelinka et al. 2025), suggesting temperature-induced changes result in compensation between stratocumulus </w:t>
       </w:r>
       <w:r>
         <w:lastRenderedPageBreak/>
@@ -21030,7 +21284,25 @@
           <w:kern w:val="0"/>
           <w14:ligatures w14:val="none"/>
         </w:rPr>
-        <w:t>Figure GOESISCCP. GOES-16 (a) cloud fraction by cloud type for 12.5-16 °N, 60-49 °W, 2020 Jan 15- February 28. (b) Shortwave cloud radiative effect (CRE) for each cloud top pressure and optical depth. The total cloud radiative effect for clouds below 680 hPa is 32 W m</w:t>
+        <w:t xml:space="preserve">Figure GOESISCCP. GOES-16 (a) cloud fraction by cloud type for 12.5-16 °N, 60-49 °W, 2020 Jan 15- February 28. (b) Shortwave cloud radiative effect (CRE) for each cloud top pressure and optical depth. The total cloud radiative effect for clouds below 680 </w:t>
+      </w:r>
+      <w:proofErr w:type="spellStart"/>
+      <w:r>
+        <w:rPr>
+          <w:rFonts w:ascii="Aptos Narrow" w:eastAsiaTheme="minorEastAsia" w:hAnsi="Aptos Narrow" w:cs="Times New Roman"/>
+          <w:kern w:val="0"/>
+          <w14:ligatures w14:val="none"/>
+        </w:rPr>
+        <w:t>hPa</w:t>
+      </w:r>
+      <w:proofErr w:type="spellEnd"/>
+      <w:r>
+        <w:rPr>
+          <w:rFonts w:ascii="Aptos Narrow" w:eastAsiaTheme="minorEastAsia" w:hAnsi="Aptos Narrow" w:cs="Times New Roman"/>
+          <w:kern w:val="0"/>
+          <w14:ligatures w14:val="none"/>
+        </w:rPr>
+        <w:t xml:space="preserve"> is 32 W m</w:t>
       </w:r>
       <w:r>
         <w:rPr>

</xml_diff>

<commit_message>
start mesoscale org result section
</commit_message>
<xml_diff>
--- a/doc/DiM_ms20260713.docx
+++ b/doc/DiM_ms20260713.docx
@@ -1577,7 +1577,13 @@
         <w:t>decrease in mass flux</w:t>
       </w:r>
       <w:r>
-        <w:t xml:space="preserve"> (DIM) mechanism predicts the shallow cumulus cloud</w:t>
+        <w:t xml:space="preserve"> (DIM) mechanism predicts th</w:t>
+      </w:r>
+      <w:r>
+        <w:t>at</w:t>
+      </w:r>
+      <w:r>
+        <w:t xml:space="preserve"> shallow cumulus cloud</w:t>
       </w:r>
       <w:r>
         <w:t xml:space="preserve">s </w:t>
@@ -1586,7 +1592,25 @@
         <w:t xml:space="preserve">decrease in proportion to the </w:t>
       </w:r>
       <w:r>
-        <w:t xml:space="preserve">decrease in mean </w:t>
+        <w:t>reduction</w:t>
+      </w:r>
+      <w:r>
+        <w:t xml:space="preserve"> </w:t>
+      </w:r>
+      <w:r>
+        <w:t>of</w:t>
+      </w:r>
+      <w:r>
+        <w:t xml:space="preserve"> </w:t>
+      </w:r>
+      <w:r>
+        <w:t xml:space="preserve">the </w:t>
+      </w:r>
+      <w:r>
+        <w:t xml:space="preserve">mean </w:t>
+      </w:r>
+      <w:r>
+        <w:t xml:space="preserve">tropical </w:t>
       </w:r>
       <w:r>
         <w:t>large-scale circulation</w:t>
@@ -1595,343 +1619,311 @@
         <w:rPr>
           <w:rFonts w:ascii="Aptos" w:hAnsi="Aptos"/>
         </w:rPr>
-        <w:t>:</w:t>
-      </w:r>
-      <w:r>
-        <w:t xml:space="preserve"> (1) The large-scale circulation slows in a warmer climate (Held and Soden, 2006</w:t>
-      </w:r>
-      <w:r>
-        <w:t>; HS06</w:t>
-      </w:r>
-      <w:r>
-        <w:t xml:space="preserve">). </w:t>
-      </w:r>
-      <w:r>
-        <w:rPr>
-          <w:rFonts w:ascii="Aptos" w:hAnsi="Aptos"/>
-        </w:rPr>
-        <w:t>In a steady climate</w:t>
-      </w:r>
-      <w:r>
-        <w:rPr>
-          <w:rFonts w:ascii="Aptos" w:hAnsi="Aptos"/>
-        </w:rPr>
-        <w:t>,</w:t>
-      </w:r>
-      <w:r>
-        <w:rPr>
-          <w:rFonts w:ascii="Aptos" w:hAnsi="Aptos"/>
-        </w:rPr>
-        <w:t xml:space="preserve"> the moisture budget is balanced. </w:t>
-      </w:r>
-      <w:r>
-        <w:rPr>
-          <w:rFonts w:ascii="Aptos" w:hAnsi="Aptos"/>
-        </w:rPr>
-        <w:t>(</w:t>
-      </w:r>
-      <w:r>
-        <w:rPr>
-          <w:rFonts w:ascii="Aptos" w:hAnsi="Aptos"/>
-        </w:rPr>
-        <w:t>2</w:t>
-      </w:r>
-      <w:r>
-        <w:rPr>
-          <w:rFonts w:ascii="Aptos" w:hAnsi="Aptos"/>
-        </w:rPr>
-        <w:t xml:space="preserve">) </w:t>
-      </w:r>
-      <w:r>
-        <w:rPr>
-          <w:rFonts w:ascii="Aptos" w:hAnsi="Aptos"/>
-        </w:rPr>
-        <w:t>A</w:t>
-      </w:r>
-      <w:r>
-        <w:rPr>
-          <w:rFonts w:ascii="Aptos" w:hAnsi="Aptos"/>
-        </w:rPr>
-        <w:t xml:space="preserve">n </w:t>
-      </w:r>
-      <w:r>
-        <w:rPr>
-          <w:rFonts w:ascii="Aptos" w:hAnsi="Aptos"/>
-        </w:rPr>
-        <w:t>in</w:t>
-      </w:r>
-      <w:r>
-        <w:rPr>
-          <w:rFonts w:ascii="Aptos" w:hAnsi="Aptos"/>
-        </w:rPr>
-        <w:t>crease of</w:t>
-      </w:r>
-      <w:r>
-        <w:rPr>
-          <w:rFonts w:ascii="Aptos" w:hAnsi="Aptos"/>
-        </w:rPr>
-        <w:t xml:space="preserve"> the </w:t>
-      </w:r>
-      <w:r>
-        <w:rPr>
-          <w:rFonts w:ascii="Aptos" w:hAnsi="Aptos"/>
-        </w:rPr>
-        <w:t xml:space="preserve">advective </w:t>
-      </w:r>
-      <w:r>
-        <w:rPr>
-          <w:rFonts w:ascii="Aptos" w:hAnsi="Aptos"/>
-        </w:rPr>
-        <w:t>drying by the large</w:t>
-      </w:r>
-      <w:r>
-        <w:rPr>
-          <w:rFonts w:ascii="Aptos" w:hAnsi="Aptos"/>
-        </w:rPr>
-        <w:t>-</w:t>
-      </w:r>
-      <w:r>
-        <w:rPr>
-          <w:rFonts w:ascii="Aptos" w:hAnsi="Aptos"/>
-        </w:rPr>
-        <w:t xml:space="preserve">scale circulation </w:t>
-      </w:r>
-      <w:r>
-        <w:rPr>
-          <w:rFonts w:ascii="Aptos" w:hAnsi="Aptos"/>
-        </w:rPr>
-        <w:t xml:space="preserve">over the shallow cumulus regime </w:t>
-      </w:r>
-      <w:r>
-        <w:rPr>
-          <w:rFonts w:ascii="Aptos" w:hAnsi="Aptos"/>
-        </w:rPr>
-        <w:t xml:space="preserve">is thus compensated by moistening by the divergence of the shallow cumulus eddy </w:t>
-      </w:r>
-      <w:r>
-        <w:rPr>
-          <w:rFonts w:ascii="Aptos" w:hAnsi="Aptos"/>
-        </w:rPr>
-        <w:t xml:space="preserve">mass </w:t>
-      </w:r>
-      <w:r>
-        <w:rPr>
-          <w:rFonts w:ascii="Aptos" w:hAnsi="Aptos"/>
-        </w:rPr>
-        <w:t>flux.</w:t>
-      </w:r>
-      <w:r>
-        <w:rPr>
-          <w:rFonts w:ascii="Aptos" w:hAnsi="Aptos"/>
-        </w:rPr>
-        <w:t xml:space="preserve"> (</w:t>
-      </w:r>
-      <w:r>
-        <w:rPr>
-          <w:rFonts w:ascii="Aptos" w:hAnsi="Aptos"/>
-        </w:rPr>
-        <w:t>3</w:t>
-      </w:r>
-      <w:r>
-        <w:rPr>
-          <w:rFonts w:ascii="Aptos" w:hAnsi="Aptos"/>
-        </w:rPr>
-        <w:t xml:space="preserve">) </w:t>
-      </w:r>
-      <w:r>
-        <w:rPr>
-          <w:rFonts w:ascii="Aptos" w:hAnsi="Aptos"/>
-        </w:rPr>
-        <w:t>Because the</w:t>
-      </w:r>
-      <w:r>
-        <w:rPr>
-          <w:rFonts w:ascii="Aptos" w:hAnsi="Aptos"/>
-        </w:rPr>
-        <w:t xml:space="preserve"> moisture transported by the cloud eddy mass flux is proportional to the moisture advected by the mean circulation, the </w:t>
-      </w:r>
-      <w:r>
-        <w:rPr>
-          <w:rFonts w:ascii="Aptos" w:hAnsi="Aptos"/>
-        </w:rPr>
-        <w:t xml:space="preserve">moisture balance implies the cumulus </w:t>
-      </w:r>
-      <w:r>
-        <w:rPr>
-          <w:rFonts w:ascii="Aptos" w:hAnsi="Aptos"/>
-        </w:rPr>
-        <w:t xml:space="preserve">mass flux is proportional to the mean circulation. </w:t>
-      </w:r>
-      <w:r>
-        <w:t>(</w:t>
-      </w:r>
-      <w:r>
-        <w:t>4</w:t>
-      </w:r>
-      <w:r>
-        <w:t xml:space="preserve">) </w:t>
-      </w:r>
-      <w:r>
-        <w:t>B</w:t>
-      </w:r>
-      <w:r>
-        <w:t>ecause cloud albedo scales with mass flux</w:t>
-      </w:r>
-      <w:r>
-        <w:t>, t</w:t>
-      </w:r>
-      <w:r>
-        <w:t>he DIM mechanism</w:t>
-      </w:r>
-      <w:r>
-        <w:rPr>
-          <w:i/>
-          <w:iCs/>
-        </w:rPr>
         <w:t xml:space="preserve"> </w:t>
       </w:r>
       <w:r>
-        <w:t>dims the planetary albedo</w:t>
-      </w:r>
-      <w:r>
-        <w:t xml:space="preserve">. It generates </w:t>
-      </w:r>
-      <w:proofErr w:type="gramStart"/>
-      <w:r>
-        <w:t>a positive radiative feedback</w:t>
-      </w:r>
-      <w:proofErr w:type="gramEnd"/>
-      <w:r>
-        <w:t xml:space="preserve"> that scales with the </w:t>
-      </w:r>
-      <w:r>
-        <w:t xml:space="preserve">planetary </w:t>
-      </w:r>
-      <w:r>
-        <w:t>albedo</w:t>
-      </w:r>
-      <w:r>
-        <w:t xml:space="preserve"> of </w:t>
-      </w:r>
-      <w:r>
-        <w:t>shallow cumulus cloud</w:t>
-      </w:r>
-      <w:r>
-        <w:t>s</w:t>
-      </w:r>
-      <w:r>
-        <w:t>.</w:t>
+        <w:rPr>
+          <w:rFonts w:ascii="Aptos" w:hAnsi="Aptos"/>
+        </w:rPr>
+        <w:t>based on</w:t>
+      </w:r>
+      <w:r>
+        <w:rPr>
+          <w:rFonts w:ascii="Aptos" w:hAnsi="Aptos"/>
+        </w:rPr>
+        <w:t xml:space="preserve"> 4 relationships:</w:t>
       </w:r>
     </w:p>
     <w:p>
       <w:pPr>
-        <w:spacing w:line="240" w:lineRule="auto"/>
+        <w:pStyle w:val="BodyText"/>
         <w:rPr>
           <w:rFonts w:eastAsiaTheme="minorEastAsia"/>
         </w:rPr>
       </w:pPr>
       <w:r>
+        <w:t xml:space="preserve">(1) The large-scale </w:t>
+      </w:r>
+      <w:r>
+        <w:t xml:space="preserve">tropical overturning </w:t>
+      </w:r>
+      <w:r>
+        <w:t xml:space="preserve">circulation slows </w:t>
+      </w:r>
+      <w:r>
+        <w:t>-5% K</w:t>
+      </w:r>
+      <w:r>
+        <w:rPr>
+          <w:vertAlign w:val="superscript"/>
+        </w:rPr>
+        <w:t>-1</w:t>
+      </w:r>
+      <w:r>
+        <w:t xml:space="preserve"> with </w:t>
+      </w:r>
+      <w:r>
+        <w:t xml:space="preserve">climate </w:t>
+      </w:r>
+      <w:r>
+        <w:t>due to</w:t>
+      </w:r>
+      <w:r>
+        <w:t xml:space="preserve"> the </w:t>
+      </w:r>
+      <w:r>
+        <w:t>radiatively-constrained</w:t>
+      </w:r>
+      <w:r>
+        <w:t xml:space="preserve"> </w:t>
+      </w:r>
+      <w:r>
+        <w:t xml:space="preserve">+2% increase </w:t>
+      </w:r>
+      <w:r>
+        <w:t>precipitation</w:t>
+      </w:r>
+      <w:r>
+        <w:t xml:space="preserve"> and +7% increase in specific humidity </w:t>
+      </w:r>
+      <w:r>
+        <w:t>(Held and Soden, 2006, HS06; Vecchi and Soden, 2007)</w:t>
+      </w:r>
+      <w:r>
+        <w:t xml:space="preserve">. </w:t>
+      </w:r>
+      <w:r>
+        <w:t xml:space="preserve">The mean </w:t>
+      </w:r>
+      <w:r>
+        <w:t xml:space="preserve">horizontal and </w:t>
+      </w:r>
+      <w:r>
+        <w:t>subsidence</w:t>
+      </w:r>
+      <w:r>
         <w:rPr>
           <w:rFonts w:eastAsiaTheme="minorEastAsia"/>
         </w:rPr>
-        <w:t>The hypothesis</w:t>
-      </w:r>
+        <w:t xml:space="preserve"> advection </w:t>
+      </w:r>
+      <w:proofErr w:type="gramStart"/>
       <w:r>
         <w:rPr>
           <w:rFonts w:eastAsiaTheme="minorEastAsia"/>
         </w:rPr>
-        <w:t xml:space="preserve"> depend</w:t>
-      </w:r>
+        <w:t>dry</w:t>
+      </w:r>
+      <w:proofErr w:type="gramEnd"/>
       <w:r>
         <w:rPr>
           <w:rFonts w:eastAsiaTheme="minorEastAsia"/>
         </w:rPr>
-        <w:t>s</w:t>
+        <w:t xml:space="preserve"> the lower troposphere</w:t>
       </w:r>
       <w:r>
         <w:rPr>
           <w:rFonts w:eastAsiaTheme="minorEastAsia"/>
         </w:rPr>
-        <w:t xml:space="preserve"> on </w:t>
-      </w:r>
-      <w:r>
-        <w:rPr>
-          <w:rFonts w:eastAsiaTheme="minorEastAsia"/>
-        </w:rPr>
-        <w:t>4</w:t>
-      </w:r>
-      <w:r>
-        <w:rPr>
-          <w:rFonts w:eastAsiaTheme="minorEastAsia"/>
-        </w:rPr>
-        <w:t xml:space="preserve"> </w:t>
-      </w:r>
-      <w:r>
-        <w:rPr>
-          <w:rFonts w:eastAsiaTheme="minorEastAsia"/>
-        </w:rPr>
-        <w:t>relationships</w:t>
-      </w:r>
-      <w:r>
-        <w:rPr>
-          <w:rFonts w:eastAsiaTheme="minorEastAsia"/>
-        </w:rPr>
-        <w:t>; more detail</w:t>
-      </w:r>
-      <w:r>
-        <w:rPr>
-          <w:rFonts w:eastAsiaTheme="minorEastAsia"/>
-        </w:rPr>
-        <w:t>:</w:t>
+        <w:t>.</w:t>
       </w:r>
     </w:p>
     <w:p>
       <w:pPr>
-        <w:pStyle w:val="ListParagraph"/>
-        <w:numPr>
-          <w:ilvl w:val="0"/>
-          <w:numId w:val="3"/>
-        </w:numPr>
-        <w:spacing w:line="240" w:lineRule="auto"/>
+        <w:pStyle w:val="BodyText"/>
+        <w:rPr>
+          <w:rFonts w:ascii="Aptos" w:eastAsiaTheme="minorEastAsia" w:hAnsi="Aptos"/>
+        </w:rPr>
       </w:pPr>
       <w:r>
-        <w:t>S</w:t>
-      </w:r>
-      <w:r>
-        <w:t>ubsidence decreases with warming</w:t>
-      </w:r>
-      <w:r>
-        <w:t xml:space="preserve"> (</w:t>
+        <w:t xml:space="preserve">(2) </w:t>
+      </w:r>
+      <w:r>
+        <w:rPr>
+          <w:rFonts w:ascii="Aptos" w:hAnsi="Aptos"/>
+        </w:rPr>
+        <w:t>In a steady climate</w:t>
+      </w:r>
+      <w:r>
+        <w:rPr>
+          <w:rFonts w:ascii="Aptos" w:hAnsi="Aptos"/>
+        </w:rPr>
+        <w:t>,</w:t>
+      </w:r>
+      <w:r>
+        <w:rPr>
+          <w:rFonts w:ascii="Aptos" w:hAnsi="Aptos"/>
+        </w:rPr>
+        <w:t xml:space="preserve"> the moisture budget is balanced</w:t>
+      </w:r>
+      <w:r>
+        <w:rPr>
+          <w:rFonts w:ascii="Aptos" w:hAnsi="Aptos"/>
+        </w:rPr>
+        <w:t>. In the shallow cumulus regime,</w:t>
+      </w:r>
+      <w:r>
+        <w:rPr>
+          <w:rFonts w:ascii="Aptos" w:hAnsi="Aptos"/>
+        </w:rPr>
+        <w:t xml:space="preserve"> </w:t>
+      </w:r>
+      <w:r>
+        <w:rPr>
+          <w:rFonts w:ascii="Aptos" w:hAnsi="Aptos"/>
+        </w:rPr>
+        <w:t xml:space="preserve">mean </w:t>
+      </w:r>
+      <w:r>
+        <w:rPr>
+          <w:rFonts w:ascii="Aptos" w:hAnsi="Aptos"/>
+        </w:rPr>
+        <w:t xml:space="preserve">advective </w:t>
+      </w:r>
+      <w:r>
+        <w:rPr>
+          <w:rFonts w:ascii="Aptos" w:hAnsi="Aptos"/>
+        </w:rPr>
+        <w:t xml:space="preserve">drying is </w:t>
+      </w:r>
+      <w:proofErr w:type="gramStart"/>
+      <w:r>
+        <w:rPr>
+          <w:rFonts w:ascii="Aptos" w:hAnsi="Aptos"/>
+        </w:rPr>
+        <w:t>compensated</w:t>
+      </w:r>
+      <w:proofErr w:type="gramEnd"/>
+      <w:r>
+        <w:rPr>
+          <w:rFonts w:ascii="Aptos" w:hAnsi="Aptos"/>
+        </w:rPr>
+        <w:t xml:space="preserve"> </w:t>
+      </w:r>
+      <w:r>
+        <w:rPr>
+          <w:rFonts w:ascii="Aptos" w:hAnsi="Aptos"/>
+        </w:rPr>
+        <w:t>t</w:t>
+      </w:r>
+      <w:r>
+        <w:rPr>
+          <w:rFonts w:ascii="Aptos" w:hAnsi="Aptos"/>
+        </w:rPr>
+        <w:t xml:space="preserve">he divergence of the shallow cumulus eddy </w:t>
+      </w:r>
+      <w:r>
+        <w:rPr>
+          <w:rFonts w:ascii="Aptos" w:hAnsi="Aptos"/>
+        </w:rPr>
+        <w:t>moisture</w:t>
+      </w:r>
+      <w:r>
+        <w:rPr>
+          <w:rFonts w:ascii="Aptos" w:hAnsi="Aptos"/>
+        </w:rPr>
+        <w:t xml:space="preserve"> </w:t>
+      </w:r>
+      <w:r>
+        <w:rPr>
+          <w:rFonts w:ascii="Aptos" w:hAnsi="Aptos"/>
+        </w:rPr>
+        <w:t>flux</w:t>
+      </w:r>
+      <w:r>
+        <w:rPr>
+          <w:rFonts w:ascii="Aptos" w:hAnsi="Aptos"/>
+        </w:rPr>
+        <w:t>,</w:t>
+      </w:r>
+      <w:r>
+        <w:rPr>
+          <w:rFonts w:ascii="Cambria Math" w:hAnsi="Cambria Math"/>
+        </w:rPr>
+        <w:t xml:space="preserve"> </w:t>
       </w:r>
       <m:oMath>
-        <m:f>
-          <m:fPr>
-            <m:type m:val="lin"/>
+        <m:r>
+          <m:rPr>
+            <m:sty m:val="p"/>
+          </m:rPr>
+          <w:rPr>
+            <w:rFonts w:ascii="Cambria Math" w:hAnsi="Cambria Math"/>
+          </w:rPr>
+          <m:t>0=-</m:t>
+        </m:r>
+        <m:r>
+          <w:rPr>
+            <w:rFonts w:ascii="Cambria Math" w:hAnsi="Cambria Math"/>
+          </w:rPr>
+          <m:t>∂</m:t>
+        </m:r>
+        <m:r>
+          <m:rPr>
+            <m:sty m:val="p"/>
+          </m:rPr>
+          <w:rPr>
+            <w:rFonts w:ascii="Cambria Math" w:hAnsi="Cambria Math"/>
+          </w:rPr>
+          <m:t>/</m:t>
+        </m:r>
+        <m:r>
+          <w:rPr>
+            <w:rFonts w:ascii="Cambria Math" w:hAnsi="Cambria Math"/>
+          </w:rPr>
+          <m:t>∂z</m:t>
+        </m:r>
+        <m:d>
+          <m:dPr>
+            <m:begChr m:val="["/>
+            <m:endChr m:val="]"/>
             <m:ctrlPr>
               <w:rPr>
                 <w:rFonts w:ascii="Cambria Math" w:hAnsi="Cambria Math"/>
-                <w:i/>
               </w:rPr>
             </m:ctrlPr>
-          </m:fPr>
-          <m:num>
+          </m:dPr>
+          <m:e>
             <m:r>
               <w:rPr>
                 <w:rFonts w:ascii="Cambria Math" w:hAnsi="Cambria Math"/>
               </w:rPr>
-              <m:t>d</m:t>
-            </m:r>
-            <m:func>
-              <m:funcPr>
+              <m:t>M</m:t>
+            </m:r>
+            <m:d>
+              <m:dPr>
                 <m:ctrlPr>
                   <w:rPr>
                     <w:rFonts w:ascii="Cambria Math" w:hAnsi="Cambria Math"/>
-                    <w:bCs/>
-                    <w:i/>
                   </w:rPr>
                 </m:ctrlPr>
-              </m:funcPr>
-              <m:fName>
+              </m:dPr>
+              <m:e>
+                <m:sSub>
+                  <m:sSubPr>
+                    <m:ctrlPr>
+                      <w:rPr>
+                        <w:rFonts w:ascii="Cambria Math" w:hAnsi="Cambria Math"/>
+                      </w:rPr>
+                    </m:ctrlPr>
+                  </m:sSubPr>
+                  <m:e>
+                    <m:r>
+                      <w:rPr>
+                        <w:rFonts w:ascii="Cambria Math" w:hAnsi="Cambria Math"/>
+                      </w:rPr>
+                      <m:t>q</m:t>
+                    </m:r>
+                  </m:e>
+                  <m:sub>
+                    <m:r>
+                      <w:rPr>
+                        <w:rFonts w:ascii="Cambria Math" w:hAnsi="Cambria Math"/>
+                      </w:rPr>
+                      <m:t>c</m:t>
+                    </m:r>
+                  </m:sub>
+                </m:sSub>
                 <m:r>
                   <m:rPr>
                     <m:sty m:val="p"/>
@@ -1939,576 +1931,8 @@
                   <w:rPr>
                     <w:rFonts w:ascii="Cambria Math" w:hAnsi="Cambria Math"/>
                   </w:rPr>
-                  <m:t>ln</m:t>
+                  <m:t>-</m:t>
                 </m:r>
-                <m:ctrlPr>
-                  <w:rPr>
-                    <w:rFonts w:ascii="Cambria Math" w:hAnsi="Cambria Math"/>
-                  </w:rPr>
-                </m:ctrlPr>
-              </m:fName>
-              <m:e>
-                <m:r>
-                  <w:rPr>
-                    <w:rFonts w:ascii="Cambria Math" w:hAnsi="Cambria Math"/>
-                  </w:rPr>
-                  <m:t>W</m:t>
-                </m:r>
-              </m:e>
-            </m:func>
-          </m:num>
-          <m:den>
-            <m:r>
-              <w:rPr>
-                <w:rFonts w:ascii="Cambria Math" w:hAnsi="Cambria Math"/>
-              </w:rPr>
-              <m:t>dT</m:t>
-            </m:r>
-          </m:den>
-        </m:f>
-        <m:r>
-          <w:rPr>
-            <w:rFonts w:ascii="Cambria Math" w:hAnsi="Cambria Math"/>
-          </w:rPr>
-          <m:t>&lt;0</m:t>
-        </m:r>
-      </m:oMath>
-      <w:r>
-        <w:rPr>
-          <w:rFonts w:eastAsiaTheme="minorEastAsia"/>
-          <w:bCs/>
-        </w:rPr>
-        <w:t>)</w:t>
-      </w:r>
-      <w:r>
-        <w:t xml:space="preserve">. </w:t>
-      </w:r>
-      <w:r>
-        <w:t xml:space="preserve">Based on energetics, </w:t>
-      </w:r>
-      <w:r>
-        <w:t>HS</w:t>
-      </w:r>
-      <w:r>
-        <w:t>06</w:t>
-      </w:r>
-      <w:r>
-        <w:t xml:space="preserve"> hypothesize</w:t>
-      </w:r>
-      <w:r>
-        <w:t>d and</w:t>
-      </w:r>
-      <w:r>
-        <w:t xml:space="preserve"> Vecchi and Soden (2007) estimate</w:t>
-      </w:r>
-      <w:r>
-        <w:t>d</w:t>
-      </w:r>
-      <w:r>
-        <w:t xml:space="preserve"> </w:t>
-      </w:r>
-      <m:oMath>
-        <m:f>
-          <m:fPr>
-            <m:type m:val="lin"/>
-            <m:ctrlPr>
-              <w:rPr>
-                <w:rFonts w:ascii="Cambria Math" w:hAnsi="Cambria Math"/>
-                <w:i/>
-              </w:rPr>
-            </m:ctrlPr>
-          </m:fPr>
-          <m:num>
-            <m:r>
-              <w:rPr>
-                <w:rFonts w:ascii="Cambria Math" w:hAnsi="Cambria Math"/>
-              </w:rPr>
-              <m:t>d</m:t>
-            </m:r>
-            <m:func>
-              <m:funcPr>
-                <m:ctrlPr>
-                  <w:rPr>
-                    <w:rFonts w:ascii="Cambria Math" w:hAnsi="Cambria Math"/>
-                    <w:i/>
-                  </w:rPr>
-                </m:ctrlPr>
-              </m:funcPr>
-              <m:fName>
-                <m:r>
-                  <m:rPr>
-                    <m:sty m:val="p"/>
-                  </m:rPr>
-                  <w:rPr>
-                    <w:rFonts w:ascii="Cambria Math" w:hAnsi="Cambria Math"/>
-                  </w:rPr>
-                  <m:t>ln</m:t>
-                </m:r>
-                <m:ctrlPr>
-                  <w:rPr>
-                    <w:rFonts w:ascii="Cambria Math" w:hAnsi="Cambria Math"/>
-                  </w:rPr>
-                </m:ctrlPr>
-              </m:fName>
-              <m:e>
-                <m:r>
-                  <w:rPr>
-                    <w:rFonts w:ascii="Cambria Math" w:hAnsi="Cambria Math"/>
-                  </w:rPr>
-                  <m:t>W</m:t>
-                </m:r>
-              </m:e>
-            </m:func>
-          </m:num>
-          <m:den>
-            <m:r>
-              <w:rPr>
-                <w:rFonts w:ascii="Cambria Math" w:hAnsi="Cambria Math"/>
-              </w:rPr>
-              <m:t>dT</m:t>
-            </m:r>
-          </m:den>
-        </m:f>
-        <m:r>
-          <w:rPr>
-            <w:rFonts w:ascii="Cambria Math" w:hAnsi="Cambria Math"/>
-          </w:rPr>
-          <m:t xml:space="preserve">≈-5 % </m:t>
-        </m:r>
-        <m:sSup>
-          <m:sSupPr>
-            <m:ctrlPr>
-              <w:rPr>
-                <w:rFonts w:ascii="Cambria Math" w:hAnsi="Cambria Math"/>
-                <w:iCs/>
-              </w:rPr>
-            </m:ctrlPr>
-          </m:sSupPr>
-          <m:e>
-            <m:r>
-              <m:rPr>
-                <m:sty m:val="p"/>
-              </m:rPr>
-              <w:rPr>
-                <w:rFonts w:ascii="Cambria Math" w:hAnsi="Cambria Math"/>
-              </w:rPr>
-              <m:t>K</m:t>
-            </m:r>
-            <m:ctrlPr>
-              <w:rPr>
-                <w:rFonts w:ascii="Cambria Math" w:hAnsi="Cambria Math"/>
-                <w:i/>
-              </w:rPr>
-            </m:ctrlPr>
-          </m:e>
-          <m:sup>
-            <m:r>
-              <m:rPr>
-                <m:sty m:val="p"/>
-              </m:rPr>
-              <w:rPr>
-                <w:rFonts w:ascii="Cambria Math" w:hAnsi="Cambria Math"/>
-              </w:rPr>
-              <m:t>-1</m:t>
-            </m:r>
-          </m:sup>
-        </m:sSup>
-      </m:oMath>
-      <w:r>
-        <w:t>.</w:t>
-      </w:r>
-      <w:r>
-        <w:t xml:space="preserve"> </w:t>
-      </w:r>
-      <w:r>
-        <w:rPr>
-          <w:color w:val="153D63" w:themeColor="text2" w:themeTint="E6"/>
-        </w:rPr>
-        <w:t xml:space="preserve">Variation in the change in subsidence among several CMIP6 climate models is correlated to their warming </w:t>
-      </w:r>
-      <w:r>
-        <w:rPr>
-          <w:color w:val="153D63" w:themeColor="text2" w:themeTint="E6"/>
-        </w:rPr>
-        <w:t>(</w:t>
-      </w:r>
-      <w:r>
-        <w:rPr>
-          <w:color w:val="153D63" w:themeColor="text2" w:themeTint="E6"/>
-        </w:rPr>
-        <w:t>Fig</w:t>
-      </w:r>
-      <w:r>
-        <w:rPr>
-          <w:color w:val="153D63" w:themeColor="text2" w:themeTint="E6"/>
-        </w:rPr>
-        <w:t>.</w:t>
-      </w:r>
-      <w:r>
-        <w:rPr>
-          <w:color w:val="153D63" w:themeColor="text2" w:themeTint="E6"/>
-        </w:rPr>
-        <w:t xml:space="preserve"> </w:t>
-      </w:r>
-      <w:r>
-        <w:rPr>
-          <w:color w:val="153D63" w:themeColor="text2" w:themeTint="E6"/>
-        </w:rPr>
-        <w:t>GC</w:t>
-      </w:r>
-      <w:r>
-        <w:rPr>
-          <w:color w:val="153D63" w:themeColor="text2" w:themeTint="E6"/>
-        </w:rPr>
-        <w:t>MSUBS</w:t>
-      </w:r>
-      <w:r>
-        <w:rPr>
-          <w:color w:val="153D63" w:themeColor="text2" w:themeTint="E6"/>
-        </w:rPr>
-        <w:t>)</w:t>
-      </w:r>
-      <w:r>
-        <w:rPr>
-          <w:color w:val="153D63" w:themeColor="text2" w:themeTint="E6"/>
-        </w:rPr>
-        <w:t xml:space="preserve">. While the multi-model variability agrees with HS06, </w:t>
-      </w:r>
-      <w:r>
-        <w:rPr>
-          <w:color w:val="153D63" w:themeColor="text2" w:themeTint="E6"/>
-        </w:rPr>
-        <w:t xml:space="preserve">there is variety </w:t>
-      </w:r>
-      <w:r>
-        <w:rPr>
-          <w:color w:val="153D63" w:themeColor="text2" w:themeTint="E6"/>
-        </w:rPr>
-        <w:t xml:space="preserve">among the models, </w:t>
-      </w:r>
-      <w:r>
-        <w:rPr>
-          <w:color w:val="153D63" w:themeColor="text2" w:themeTint="E6"/>
-        </w:rPr>
-        <w:t>which would change</w:t>
-      </w:r>
-      <w:r>
-        <w:rPr>
-          <w:color w:val="153D63" w:themeColor="text2" w:themeTint="E6"/>
-        </w:rPr>
-        <w:t xml:space="preserve"> </w:t>
-      </w:r>
-      <w:r>
-        <w:rPr>
-          <w:color w:val="153D63" w:themeColor="text2" w:themeTint="E6"/>
-        </w:rPr>
-        <w:t>the drying by the mean subsidence.</w:t>
-      </w:r>
-    </w:p>
-    <w:p>
-      <w:pPr>
-        <w:pStyle w:val="ListParagraph"/>
-        <w:numPr>
-          <w:ilvl w:val="0"/>
-          <w:numId w:val="3"/>
-        </w:numPr>
-        <w:spacing w:line="240" w:lineRule="auto"/>
-      </w:pPr>
-      <w:r>
-        <w:t>T</w:t>
-      </w:r>
-      <w:r>
-        <w:t xml:space="preserve">he </w:t>
-      </w:r>
-      <w:r>
-        <w:t xml:space="preserve">vertical </w:t>
-      </w:r>
-      <w:r>
-        <w:t xml:space="preserve">cloud moisture flux divergence </w:t>
-      </w:r>
-      <w:r>
-        <w:t xml:space="preserve">source </w:t>
-      </w:r>
-      <w:r>
-        <w:t xml:space="preserve">balances the drying </w:t>
-      </w:r>
-      <w:r>
-        <w:t xml:space="preserve">sink </w:t>
-      </w:r>
-      <w:r>
-        <w:t xml:space="preserve">by </w:t>
-      </w:r>
-      <w:r>
-        <w:t>large scale advection</w:t>
-      </w:r>
-      <w:r>
-        <w:t xml:space="preserve">. Assuming large scale advection is </w:t>
-      </w:r>
-      <w:r>
-        <w:t>mostly subsidence</w:t>
-      </w:r>
-      <w:r>
-        <w:t>,</w:t>
-      </w:r>
-      <w:r>
-        <w:t xml:space="preserve"> </w:t>
-      </w:r>
-      <m:oMath>
-        <m:r>
-          <w:rPr>
-            <w:rFonts w:ascii="Cambria Math" w:hAnsi="Cambria Math"/>
-          </w:rPr>
-          <m:t>W</m:t>
-        </m:r>
-      </m:oMath>
-      <w:r>
-        <w:t>,</w:t>
-      </w:r>
-      <w:r>
-        <w:t xml:space="preserve"> </w:t>
-      </w:r>
-      <w:r>
-        <w:t>t</w:t>
-      </w:r>
-      <w:r>
-        <w:t>he steady m</w:t>
-      </w:r>
-      <w:r>
-        <w:t xml:space="preserve">oisture balance </w:t>
-      </w:r>
-      <w:r>
-        <w:t>is</w:t>
-      </w:r>
-      <w:r>
-        <w:t>,</w:t>
-      </w:r>
-      <w:r>
-        <w:br/>
-      </w:r>
-      <m:oMathPara>
-        <m:oMath>
-          <m:r>
-            <m:rPr>
-              <m:sty m:val="p"/>
-            </m:rPr>
-            <w:rPr>
-              <w:rFonts w:ascii="Cambria Math" w:hAnsi="Cambria Math"/>
-            </w:rPr>
-            <m:t>0=-</m:t>
-          </m:r>
-          <m:r>
-            <w:rPr>
-              <w:rFonts w:ascii="Cambria Math" w:hAnsi="Cambria Math"/>
-            </w:rPr>
-            <m:t>∂</m:t>
-          </m:r>
-          <m:r>
-            <m:rPr>
-              <m:sty m:val="p"/>
-            </m:rPr>
-            <w:rPr>
-              <w:rFonts w:ascii="Cambria Math" w:hAnsi="Cambria Math"/>
-            </w:rPr>
-            <m:t>/</m:t>
-          </m:r>
-          <m:r>
-            <w:rPr>
-              <w:rFonts w:ascii="Cambria Math" w:hAnsi="Cambria Math"/>
-            </w:rPr>
-            <m:t>∂z</m:t>
-          </m:r>
-          <m:d>
-            <m:dPr>
-              <m:begChr m:val="["/>
-              <m:endChr m:val="]"/>
-              <m:ctrlPr>
-                <w:rPr>
-                  <w:rFonts w:ascii="Cambria Math" w:hAnsi="Cambria Math"/>
-                </w:rPr>
-              </m:ctrlPr>
-            </m:dPr>
-            <m:e>
-              <m:r>
-                <w:rPr>
-                  <w:rFonts w:ascii="Cambria Math" w:hAnsi="Cambria Math"/>
-                </w:rPr>
-                <m:t>M</m:t>
-              </m:r>
-              <m:d>
-                <m:dPr>
-                  <m:ctrlPr>
-                    <w:rPr>
-                      <w:rFonts w:ascii="Cambria Math" w:hAnsi="Cambria Math"/>
-                    </w:rPr>
-                  </m:ctrlPr>
-                </m:dPr>
-                <m:e>
-                  <m:sSub>
-                    <m:sSubPr>
-                      <m:ctrlPr>
-                        <w:rPr>
-                          <w:rFonts w:ascii="Cambria Math" w:hAnsi="Cambria Math"/>
-                        </w:rPr>
-                      </m:ctrlPr>
-                    </m:sSubPr>
-                    <m:e>
-                      <m:r>
-                        <w:rPr>
-                          <w:rFonts w:ascii="Cambria Math" w:hAnsi="Cambria Math"/>
-                        </w:rPr>
-                        <m:t>q</m:t>
-                      </m:r>
-                    </m:e>
-                    <m:sub>
-                      <m:r>
-                        <w:rPr>
-                          <w:rFonts w:ascii="Cambria Math" w:hAnsi="Cambria Math"/>
-                        </w:rPr>
-                        <m:t>c</m:t>
-                      </m:r>
-                    </m:sub>
-                  </m:sSub>
-                  <m:r>
-                    <m:rPr>
-                      <m:sty m:val="p"/>
-                    </m:rPr>
-                    <w:rPr>
-                      <w:rFonts w:ascii="Cambria Math" w:hAnsi="Cambria Math"/>
-                    </w:rPr>
-                    <m:t>-</m:t>
-                  </m:r>
-                  <m:r>
-                    <w:rPr>
-                      <w:rFonts w:ascii="Cambria Math" w:hAnsi="Cambria Math"/>
-                    </w:rPr>
-                    <m:t>q</m:t>
-                  </m:r>
-                </m:e>
-              </m:d>
-              <m:r>
-                <m:rPr>
-                  <m:sty m:val="p"/>
-                </m:rPr>
-                <w:rPr>
-                  <w:rFonts w:ascii="Cambria Math" w:hAnsi="Cambria Math"/>
-                </w:rPr>
-                <m:t>-</m:t>
-              </m:r>
-              <m:r>
-                <w:rPr>
-                  <w:rFonts w:ascii="Cambria Math" w:hAnsi="Cambria Math"/>
-                </w:rPr>
-                <m:t>P</m:t>
-              </m:r>
-            </m:e>
-          </m:d>
-          <m:r>
-            <m:rPr>
-              <m:sty m:val="p"/>
-            </m:rPr>
-            <w:rPr>
-              <w:rFonts w:ascii="Cambria Math" w:hAnsi="Cambria Math"/>
-            </w:rPr>
-            <m:t>-</m:t>
-          </m:r>
-          <m:r>
-            <w:rPr>
-              <w:rFonts w:ascii="Cambria Math" w:hAnsi="Cambria Math"/>
-            </w:rPr>
-            <m:t>W</m:t>
-          </m:r>
-          <m:r>
-            <m:rPr>
-              <m:sty m:val="p"/>
-            </m:rPr>
-            <w:rPr>
-              <w:rFonts w:ascii="Cambria Math" w:hAnsi="Cambria Math"/>
-            </w:rPr>
-            <m:t>(</m:t>
-          </m:r>
-          <m:f>
-            <m:fPr>
-              <m:type m:val="lin"/>
-              <m:ctrlPr>
-                <w:rPr>
-                  <w:rFonts w:ascii="Cambria Math" w:hAnsi="Cambria Math"/>
-                </w:rPr>
-              </m:ctrlPr>
-            </m:fPr>
-            <m:num>
-              <m:r>
-                <w:rPr>
-                  <w:rFonts w:ascii="Cambria Math" w:hAnsi="Cambria Math"/>
-                </w:rPr>
-                <m:t>∂</m:t>
-              </m:r>
-              <m:r>
-                <w:rPr>
-                  <w:rFonts w:ascii="Cambria Math" w:hAnsi="Cambria Math"/>
-                </w:rPr>
-                <m:t>q</m:t>
-              </m:r>
-            </m:num>
-            <m:den>
-              <m:r>
-                <w:rPr>
-                  <w:rFonts w:ascii="Cambria Math" w:hAnsi="Cambria Math"/>
-                </w:rPr>
-                <m:t>∂z</m:t>
-              </m:r>
-              <m:r>
-                <m:rPr>
-                  <m:sty m:val="p"/>
-                </m:rPr>
-                <w:rPr>
-                  <w:rFonts w:ascii="Cambria Math" w:hAnsi="Cambria Math"/>
-                </w:rPr>
-                <m:t>)</m:t>
-              </m:r>
-            </m:den>
-          </m:f>
-          <m:r>
-            <w:rPr>
-              <w:rFonts w:ascii="Cambria Math" w:hAnsi="Cambria Math"/>
-            </w:rPr>
-            <m:t>,</m:t>
-          </m:r>
-          <m:r>
-            <w:rPr>
-              <w:rFonts w:ascii="Cambria Math" w:hAnsi="Cambria Math"/>
-            </w:rPr>
-            <w:br/>
-          </m:r>
-        </m:oMath>
-      </m:oMathPara>
-      <w:r>
-        <w:t xml:space="preserve">where </w:t>
-      </w:r>
-      <m:oMath>
-        <m:r>
-          <w:rPr>
-            <w:rFonts w:ascii="Cambria Math" w:hAnsi="Cambria Math"/>
-          </w:rPr>
-          <m:t>M</m:t>
-        </m:r>
-        <m:d>
-          <m:dPr>
-            <m:ctrlPr>
-              <w:rPr>
-                <w:rFonts w:ascii="Cambria Math" w:hAnsi="Cambria Math"/>
-              </w:rPr>
-            </m:ctrlPr>
-          </m:dPr>
-          <m:e>
-            <m:sSub>
-              <m:sSubPr>
-                <m:ctrlPr>
-                  <w:rPr>
-                    <w:rFonts w:ascii="Cambria Math" w:hAnsi="Cambria Math"/>
-                  </w:rPr>
-                </m:ctrlPr>
-              </m:sSubPr>
-              <m:e>
                 <m:r>
                   <w:rPr>
                     <w:rFonts w:ascii="Cambria Math" w:hAnsi="Cambria Math"/>
@@ -2516,15 +1940,7 @@
                   <m:t>q</m:t>
                 </m:r>
               </m:e>
-              <m:sub>
-                <m:r>
-                  <w:rPr>
-                    <w:rFonts w:ascii="Cambria Math" w:hAnsi="Cambria Math"/>
-                  </w:rPr>
-                  <m:t>c</m:t>
-                </m:r>
-              </m:sub>
-            </m:sSub>
+            </m:d>
             <m:r>
               <m:rPr>
                 <m:sty m:val="p"/>
@@ -2538,27 +1954,390 @@
               <w:rPr>
                 <w:rFonts w:ascii="Cambria Math" w:hAnsi="Cambria Math"/>
               </w:rPr>
-              <m:t>q</m:t>
+              <m:t>P</m:t>
             </m:r>
           </m:e>
         </m:d>
+        <m:r>
+          <m:rPr>
+            <m:sty m:val="p"/>
+          </m:rPr>
+          <w:rPr>
+            <w:rFonts w:ascii="Cambria Math" w:hAnsi="Cambria Math"/>
+          </w:rPr>
+          <m:t>-</m:t>
+        </m:r>
+        <m:r>
+          <w:rPr>
+            <w:rFonts w:ascii="Cambria Math" w:hAnsi="Cambria Math"/>
+          </w:rPr>
+          <m:t>W</m:t>
+        </m:r>
+        <m:r>
+          <m:rPr>
+            <m:sty m:val="p"/>
+          </m:rPr>
+          <w:rPr>
+            <w:rFonts w:ascii="Cambria Math" w:hAnsi="Cambria Math"/>
+          </w:rPr>
+          <m:t>(</m:t>
+        </m:r>
+        <m:f>
+          <m:fPr>
+            <m:type m:val="lin"/>
+            <m:ctrlPr>
+              <w:rPr>
+                <w:rFonts w:ascii="Cambria Math" w:hAnsi="Cambria Math"/>
+              </w:rPr>
+            </m:ctrlPr>
+          </m:fPr>
+          <m:num>
+            <m:r>
+              <w:rPr>
+                <w:rFonts w:ascii="Cambria Math" w:hAnsi="Cambria Math"/>
+              </w:rPr>
+              <m:t>∂q</m:t>
+            </m:r>
+          </m:num>
+          <m:den>
+            <m:r>
+              <w:rPr>
+                <w:rFonts w:ascii="Cambria Math" w:hAnsi="Cambria Math"/>
+              </w:rPr>
+              <m:t>∂z</m:t>
+            </m:r>
+            <m:r>
+              <m:rPr>
+                <m:sty m:val="p"/>
+              </m:rPr>
+              <w:rPr>
+                <w:rFonts w:ascii="Cambria Math" w:hAnsi="Cambria Math"/>
+              </w:rPr>
+              <m:t>)</m:t>
+            </m:r>
+          </m:den>
+        </m:f>
       </m:oMath>
       <w:r>
-        <w:t xml:space="preserve"> is the cloud moisture flux,</w:t>
-      </w:r>
-      <w:r>
-        <w:t xml:space="preserve"> </w:t>
+        <w:rPr>
+          <w:rFonts w:ascii="Aptos" w:hAnsi="Aptos"/>
+        </w:rPr>
+        <w:t>,</w:t>
+      </w:r>
+      <w:r>
+        <w:rPr>
+          <w:rFonts w:ascii="Aptos" w:hAnsi="Aptos"/>
+        </w:rPr>
+        <w:t xml:space="preserve"> where </w:t>
       </w:r>
       <m:oMath>
         <m:r>
           <w:rPr>
             <w:rFonts w:ascii="Cambria Math" w:hAnsi="Cambria Math"/>
           </w:rPr>
-          <m:t>M</m:t>
+          <m:t xml:space="preserve">M </m:t>
         </m:r>
       </m:oMath>
       <w:r>
-        <w:t xml:space="preserve"> is the mass flux, </w:t>
+        <w:rPr>
+          <w:rFonts w:ascii="Aptos" w:eastAsiaTheme="minorEastAsia" w:hAnsi="Aptos"/>
+        </w:rPr>
+        <w:t>is the cumulus mass flux,</w:t>
+      </w:r>
+      <w:r>
+        <w:rPr>
+          <w:rFonts w:ascii="Aptos" w:eastAsiaTheme="minorEastAsia" w:hAnsi="Aptos"/>
+        </w:rPr>
+        <w:t xml:space="preserve"> </w:t>
+      </w:r>
+      <m:oMath>
+        <m:sSub>
+          <m:sSubPr>
+            <m:ctrlPr>
+              <w:rPr>
+                <w:rFonts w:ascii="Cambria Math" w:eastAsiaTheme="minorEastAsia" w:hAnsi="Cambria Math"/>
+                <w:i/>
+              </w:rPr>
+            </m:ctrlPr>
+          </m:sSubPr>
+          <m:e>
+            <m:r>
+              <w:rPr>
+                <w:rFonts w:ascii="Cambria Math" w:eastAsiaTheme="minorEastAsia" w:hAnsi="Cambria Math"/>
+              </w:rPr>
+              <m:t>q</m:t>
+            </m:r>
+          </m:e>
+          <m:sub>
+            <m:r>
+              <w:rPr>
+                <w:rFonts w:ascii="Cambria Math" w:eastAsiaTheme="minorEastAsia" w:hAnsi="Cambria Math"/>
+              </w:rPr>
+              <m:t>c</m:t>
+            </m:r>
+          </m:sub>
+        </m:sSub>
+      </m:oMath>
+      <w:r>
+        <w:rPr>
+          <w:rFonts w:ascii="Aptos" w:eastAsiaTheme="minorEastAsia" w:hAnsi="Aptos"/>
+        </w:rPr>
+        <w:t xml:space="preserve"> is the cloud humidity,</w:t>
+      </w:r>
+      <w:r>
+        <w:rPr>
+          <w:rFonts w:ascii="Aptos" w:eastAsiaTheme="minorEastAsia" w:hAnsi="Aptos"/>
+        </w:rPr>
+        <w:t xml:space="preserve"> </w:t>
+      </w:r>
+      <m:oMath>
+        <m:r>
+          <w:rPr>
+            <w:rFonts w:ascii="Cambria Math" w:eastAsiaTheme="minorEastAsia" w:hAnsi="Cambria Math"/>
+          </w:rPr>
+          <m:t>q</m:t>
+        </m:r>
+      </m:oMath>
+      <w:r>
+        <w:rPr>
+          <w:rFonts w:ascii="Aptos" w:eastAsiaTheme="minorEastAsia" w:hAnsi="Aptos"/>
+        </w:rPr>
+        <w:t xml:space="preserve"> is the env</w:t>
+      </w:r>
+      <w:proofErr w:type="spellStart"/>
+      <w:r>
+        <w:rPr>
+          <w:rFonts w:ascii="Aptos" w:eastAsiaTheme="minorEastAsia" w:hAnsi="Aptos"/>
+        </w:rPr>
+        <w:t>ironmental</w:t>
+      </w:r>
+      <w:proofErr w:type="spellEnd"/>
+      <w:r>
+        <w:rPr>
+          <w:rFonts w:ascii="Aptos" w:eastAsiaTheme="minorEastAsia" w:hAnsi="Aptos"/>
+        </w:rPr>
+        <w:t xml:space="preserve"> humidity, and </w:t>
+      </w:r>
+      <m:oMath>
+        <m:r>
+          <w:rPr>
+            <w:rFonts w:ascii="Cambria Math" w:eastAsiaTheme="minorEastAsia" w:hAnsi="Cambria Math"/>
+          </w:rPr>
+          <m:t>-</m:t>
+        </m:r>
+        <m:r>
+          <w:rPr>
+            <w:rFonts w:ascii="Cambria Math" w:hAnsi="Cambria Math"/>
+          </w:rPr>
+          <m:t>W</m:t>
+        </m:r>
+        <m:r>
+          <m:rPr>
+            <m:sty m:val="p"/>
+          </m:rPr>
+          <w:rPr>
+            <w:rFonts w:ascii="Cambria Math" w:hAnsi="Cambria Math"/>
+          </w:rPr>
+          <m:t>(</m:t>
+        </m:r>
+        <m:f>
+          <m:fPr>
+            <m:type m:val="lin"/>
+            <m:ctrlPr>
+              <w:rPr>
+                <w:rFonts w:ascii="Cambria Math" w:hAnsi="Cambria Math"/>
+              </w:rPr>
+            </m:ctrlPr>
+          </m:fPr>
+          <m:num>
+            <m:r>
+              <w:rPr>
+                <w:rFonts w:ascii="Cambria Math" w:hAnsi="Cambria Math"/>
+              </w:rPr>
+              <m:t>∂q</m:t>
+            </m:r>
+          </m:num>
+          <m:den>
+            <m:r>
+              <w:rPr>
+                <w:rFonts w:ascii="Cambria Math" w:hAnsi="Cambria Math"/>
+              </w:rPr>
+              <m:t>∂z</m:t>
+            </m:r>
+            <m:r>
+              <m:rPr>
+                <m:sty m:val="p"/>
+              </m:rPr>
+              <w:rPr>
+                <w:rFonts w:ascii="Cambria Math" w:hAnsi="Cambria Math"/>
+              </w:rPr>
+              <m:t>)</m:t>
+            </m:r>
+          </m:den>
+        </m:f>
+      </m:oMath>
+      <w:r>
+        <w:rPr>
+          <w:rFonts w:ascii="Aptos" w:eastAsiaTheme="minorEastAsia" w:hAnsi="Aptos"/>
+        </w:rPr>
+        <w:t xml:space="preserve"> </w:t>
+      </w:r>
+      <w:r>
+        <w:rPr>
+          <w:rFonts w:ascii="Aptos" w:eastAsiaTheme="minorEastAsia" w:hAnsi="Aptos"/>
+        </w:rPr>
+        <w:t xml:space="preserve">is </w:t>
+      </w:r>
+      <w:r>
+        <w:rPr>
+          <w:rFonts w:ascii="Aptos" w:hAnsi="Aptos"/>
+        </w:rPr>
+        <w:t xml:space="preserve">the </w:t>
+      </w:r>
+      <w:r>
+        <w:rPr>
+          <w:rFonts w:ascii="Aptos" w:hAnsi="Aptos"/>
+        </w:rPr>
+        <w:t xml:space="preserve">mean </w:t>
+      </w:r>
+      <w:r>
+        <w:rPr>
+          <w:rFonts w:ascii="Aptos" w:hAnsi="Aptos"/>
+        </w:rPr>
+        <w:t>moisture</w:t>
+      </w:r>
+      <w:r>
+        <w:rPr>
+          <w:rFonts w:ascii="Aptos" w:hAnsi="Aptos"/>
+        </w:rPr>
+        <w:t xml:space="preserve"> advection,</w:t>
+      </w:r>
+      <w:r>
+        <w:rPr>
+          <w:rFonts w:ascii="Aptos" w:hAnsi="Aptos"/>
+        </w:rPr>
+        <w:t xml:space="preserve"> though only the </w:t>
+      </w:r>
+      <w:r>
+        <w:rPr>
+          <w:rFonts w:ascii="Aptos" w:hAnsi="Aptos"/>
+        </w:rPr>
+        <w:t xml:space="preserve">subsidence </w:t>
+      </w:r>
+      <w:r>
+        <w:rPr>
+          <w:rFonts w:ascii="Aptos" w:eastAsiaTheme="minorEastAsia" w:hAnsi="Aptos"/>
+        </w:rPr>
+        <w:t>component is shown</w:t>
+      </w:r>
+      <w:r>
+        <w:rPr>
+          <w:rFonts w:ascii="Aptos" w:eastAsiaTheme="minorEastAsia" w:hAnsi="Aptos"/>
+        </w:rPr>
+        <w:t>.</w:t>
+      </w:r>
+      <w:r>
+        <w:rPr>
+          <w:rFonts w:ascii="Aptos" w:eastAsiaTheme="minorEastAsia" w:hAnsi="Aptos"/>
+        </w:rPr>
+        <w:t xml:space="preserve"> </w:t>
+      </w:r>
+      <w:r>
+        <w:t>For constant humidity, the large-scale mean moisture advection</w:t>
+      </w:r>
+      <w:r>
+        <w:rPr>
+          <w:rFonts w:eastAsiaTheme="minorEastAsia"/>
+        </w:rPr>
+        <w:t xml:space="preserve"> decrease</w:t>
+      </w:r>
+      <w:r>
+        <w:rPr>
+          <w:rFonts w:eastAsiaTheme="minorEastAsia"/>
+        </w:rPr>
+        <w:t>s</w:t>
+      </w:r>
+      <w:r>
+        <w:rPr>
+          <w:rFonts w:eastAsiaTheme="minorEastAsia"/>
+        </w:rPr>
+        <w:t xml:space="preserve"> -5% in response to</w:t>
+      </w:r>
+      <w:r>
+        <w:rPr>
+          <w:rFonts w:eastAsiaTheme="minorEastAsia"/>
+        </w:rPr>
+        <w:t xml:space="preserve"> circulation</w:t>
+      </w:r>
+      <w:r>
+        <w:rPr>
+          <w:rFonts w:eastAsiaTheme="minorEastAsia"/>
+        </w:rPr>
+        <w:t xml:space="preserve"> </w:t>
+      </w:r>
+      <m:oMath>
+        <m:r>
+          <w:rPr>
+            <w:rFonts w:ascii="Cambria Math" w:eastAsiaTheme="minorEastAsia" w:hAnsi="Cambria Math"/>
+          </w:rPr>
+          <m:t>W</m:t>
+        </m:r>
+      </m:oMath>
+      <w:r>
+        <w:rPr>
+          <w:rFonts w:eastAsiaTheme="minorEastAsia"/>
+        </w:rPr>
+        <w:t>.</w:t>
+      </w:r>
+    </w:p>
+    <w:p>
+      <w:pPr>
+        <w:pStyle w:val="BodyText"/>
+        <w:rPr>
+          <w:rFonts w:ascii="Aptos" w:hAnsi="Aptos"/>
+        </w:rPr>
+      </w:pPr>
+      <w:r>
+        <w:rPr>
+          <w:rFonts w:ascii="Aptos" w:hAnsi="Aptos"/>
+        </w:rPr>
+        <w:t>(</w:t>
+      </w:r>
+      <w:r>
+        <w:rPr>
+          <w:rFonts w:ascii="Aptos" w:hAnsi="Aptos"/>
+        </w:rPr>
+        <w:t>3</w:t>
+      </w:r>
+      <w:r>
+        <w:rPr>
+          <w:rFonts w:ascii="Aptos" w:hAnsi="Aptos"/>
+        </w:rPr>
+        <w:t xml:space="preserve">) </w:t>
+      </w:r>
+      <w:r>
+        <w:rPr>
+          <w:rFonts w:ascii="Aptos" w:hAnsi="Aptos"/>
+        </w:rPr>
+        <w:t>T</w:t>
+      </w:r>
+      <w:r>
+        <w:rPr>
+          <w:rFonts w:ascii="Aptos" w:hAnsi="Aptos"/>
+        </w:rPr>
+        <w:t xml:space="preserve">he </w:t>
+      </w:r>
+      <w:r>
+        <w:rPr>
+          <w:rFonts w:ascii="Aptos" w:hAnsi="Aptos"/>
+        </w:rPr>
+        <w:t>saturation and environmental humidity</w:t>
+      </w:r>
+      <w:r>
+        <w:rPr>
+          <w:rFonts w:ascii="Aptos" w:hAnsi="Aptos"/>
+        </w:rPr>
+        <w:t xml:space="preserve"> </w:t>
       </w:r>
       <m:oMath>
         <m:r>
@@ -2569,264 +2348,147 @@
         </m:r>
       </m:oMath>
       <w:r>
-        <w:t xml:space="preserve"> is the </w:t>
-      </w:r>
-      <w:proofErr w:type="gramStart"/>
-      <w:r>
-        <w:t>environmental</w:t>
-      </w:r>
-      <w:proofErr w:type="gramEnd"/>
-      <w:r>
-        <w:t xml:space="preserve"> mean humidity</w:t>
-      </w:r>
-      <w:r>
-        <w:t xml:space="preserve">, and </w:t>
+        <w:rPr>
+          <w:rFonts w:ascii="Aptos" w:hAnsi="Aptos"/>
+        </w:rPr>
+        <w:t>, cloud humidity</w:t>
+      </w:r>
+      <w:r>
+        <w:rPr>
+          <w:rFonts w:ascii="Aptos" w:hAnsi="Aptos"/>
+        </w:rPr>
+        <w:t xml:space="preserve"> </w:t>
+      </w:r>
+      <m:oMath>
+        <m:sSub>
+          <m:sSubPr>
+            <m:ctrlPr>
+              <w:rPr>
+                <w:rFonts w:ascii="Cambria Math" w:hAnsi="Cambria Math"/>
+                <w:i/>
+              </w:rPr>
+            </m:ctrlPr>
+          </m:sSubPr>
+          <m:e>
+            <m:r>
+              <w:rPr>
+                <w:rFonts w:ascii="Cambria Math" w:hAnsi="Cambria Math"/>
+              </w:rPr>
+              <m:t>q</m:t>
+            </m:r>
+          </m:e>
+          <m:sub>
+            <m:r>
+              <w:rPr>
+                <w:rFonts w:ascii="Cambria Math" w:hAnsi="Cambria Math"/>
+              </w:rPr>
+              <m:t>c</m:t>
+            </m:r>
+          </m:sub>
+        </m:sSub>
+      </m:oMath>
+      <w:r>
+        <w:rPr>
+          <w:rFonts w:ascii="Aptos" w:eastAsiaTheme="minorEastAsia" w:hAnsi="Aptos"/>
+        </w:rPr>
+        <w:t xml:space="preserve">, and precipitation </w:t>
+      </w:r>
+      <m:oMath>
+        <m:r>
+          <w:rPr>
+            <w:rFonts w:ascii="Cambria Math" w:eastAsiaTheme="minorEastAsia" w:hAnsi="Cambria Math"/>
+          </w:rPr>
+          <m:t>P</m:t>
+        </m:r>
+      </m:oMath>
+      <w:r>
+        <w:rPr>
+          <w:rFonts w:ascii="Aptos" w:eastAsiaTheme="minorEastAsia" w:hAnsi="Aptos"/>
+        </w:rPr>
+        <w:t xml:space="preserve"> </w:t>
+      </w:r>
+      <w:r>
+        <w:rPr>
+          <w:rFonts w:ascii="Aptos" w:hAnsi="Aptos"/>
+        </w:rPr>
+        <w:t>increase +7% K</w:t>
+      </w:r>
+      <w:r>
+        <w:rPr>
+          <w:rFonts w:ascii="Aptos" w:hAnsi="Aptos"/>
+          <w:vertAlign w:val="superscript"/>
+        </w:rPr>
+        <w:t>-1</w:t>
+      </w:r>
+      <w:r>
+        <w:rPr>
+          <w:rFonts w:ascii="Aptos" w:hAnsi="Aptos"/>
+        </w:rPr>
+        <w:t xml:space="preserve">. Factoring out the proportional </w:t>
+      </w:r>
+      <w:r>
+        <w:rPr>
+          <w:rFonts w:ascii="Aptos" w:hAnsi="Aptos"/>
+        </w:rPr>
+        <w:t>change</w:t>
+      </w:r>
+      <w:r>
+        <w:rPr>
+          <w:rFonts w:ascii="Aptos" w:hAnsi="Aptos"/>
+        </w:rPr>
+        <w:t xml:space="preserve"> of all the humidities, m</w:t>
+      </w:r>
+      <w:r>
+        <w:rPr>
+          <w:rFonts w:ascii="Aptos" w:hAnsi="Aptos"/>
+        </w:rPr>
+        <w:t>oisture balance</w:t>
+      </w:r>
+      <w:r>
+        <w:rPr>
+          <w:rFonts w:ascii="Aptos" w:hAnsi="Aptos"/>
+        </w:rPr>
+        <w:t xml:space="preserve"> then</w:t>
+      </w:r>
+      <w:r>
+        <w:rPr>
+          <w:rFonts w:ascii="Aptos" w:hAnsi="Aptos"/>
+        </w:rPr>
+        <w:t xml:space="preserve"> implies </w:t>
       </w:r>
       <m:oMath>
         <m:r>
           <w:rPr>
             <w:rFonts w:ascii="Cambria Math" w:hAnsi="Cambria Math"/>
           </w:rPr>
-          <m:t>P</m:t>
+          <m:t>M∝W</m:t>
         </m:r>
       </m:oMath>
       <w:r>
-        <w:t xml:space="preserve"> (&gt;0</w:t>
-      </w:r>
-      <w:proofErr w:type="gramStart"/>
-      <w:r>
-        <w:t>) is</w:t>
-      </w:r>
-      <w:proofErr w:type="gramEnd"/>
-      <w:r>
-        <w:t xml:space="preserve"> the precipitation</w:t>
-      </w:r>
-      <w:r>
-        <w:t xml:space="preserve">, which </w:t>
-      </w:r>
-      <w:r>
-        <w:t>also scales with the mass flux and the humidity</w:t>
-      </w:r>
-      <w:r>
-        <w:t>. Though the eddy flux and circulation terms change, they balance</w:t>
-      </w:r>
-      <w:r>
-        <w:t xml:space="preserve"> each other</w:t>
-      </w:r>
-      <w:r>
-        <w:t xml:space="preserve"> in the climatological mean. </w:t>
-      </w:r>
-      <w:r>
-        <w:t>For constant humidity, the large-scale mean moisture advection</w:t>
-      </w:r>
-      <w:r>
-        <w:rPr>
-          <w:rFonts w:eastAsiaTheme="minorEastAsia"/>
-        </w:rPr>
-        <w:t xml:space="preserve"> would </w:t>
-      </w:r>
-      <w:r>
-        <w:rPr>
-          <w:rFonts w:eastAsiaTheme="minorEastAsia"/>
-        </w:rPr>
-        <w:t xml:space="preserve">decrease -5% in response to </w:t>
-      </w:r>
-      <m:oMath>
-        <m:r>
-          <w:rPr>
-            <w:rFonts w:ascii="Cambria Math" w:eastAsiaTheme="minorEastAsia" w:hAnsi="Cambria Math"/>
-          </w:rPr>
-          <m:t>W</m:t>
-        </m:r>
-      </m:oMath>
-      <w:r>
-        <w:rPr>
-          <w:rFonts w:eastAsiaTheme="minorEastAsia"/>
-        </w:rPr>
-        <w:t>. We address the specific humidity next.</w:t>
+        <w:rPr>
+          <w:rFonts w:ascii="Aptos" w:hAnsi="Aptos"/>
+        </w:rPr>
+        <w:t>.</w:t>
       </w:r>
     </w:p>
     <w:p>
       <w:pPr>
-        <w:pStyle w:val="ListParagraph"/>
-        <w:numPr>
-          <w:ilvl w:val="0"/>
-          <w:numId w:val="3"/>
-        </w:numPr>
-        <w:spacing w:line="240" w:lineRule="auto"/>
+        <w:pStyle w:val="BodyText"/>
+        <w:rPr>
+          <w:rFonts w:ascii="Aptos" w:hAnsi="Aptos"/>
+        </w:rPr>
       </w:pPr>
       <w:r>
-        <w:t xml:space="preserve">Specific humidity </w:t>
-      </w:r>
-      <m:oMath>
-        <m:r>
-          <w:rPr>
-            <w:rFonts w:ascii="Cambria Math" w:hAnsi="Cambria Math"/>
-          </w:rPr>
-          <m:t>q</m:t>
-        </m:r>
-      </m:oMath>
-      <w:r>
-        <w:rPr>
-          <w:rFonts w:eastAsiaTheme="minorEastAsia"/>
-        </w:rPr>
-        <w:t xml:space="preserve"> and saturation specific humidity increase by +7%, but f</w:t>
-      </w:r>
-      <w:r>
-        <w:t xml:space="preserve">actoring </w:t>
-      </w:r>
-      <w:r>
-        <w:t>th</w:t>
-      </w:r>
-      <w:r>
-        <w:t>is</w:t>
-      </w:r>
-      <w:r>
-        <w:t xml:space="preserve"> </w:t>
-      </w:r>
-      <w:r>
-        <w:t xml:space="preserve">specific </w:t>
-      </w:r>
-      <w:r>
-        <w:t>humidity dependence</w:t>
-      </w:r>
-      <w:r>
-        <w:t xml:space="preserve"> </w:t>
-      </w:r>
-      <w:r>
-        <w:t>from</w:t>
-      </w:r>
-      <w:r>
-        <w:t xml:space="preserve"> </w:t>
-      </w:r>
-      <w:r>
-        <w:t xml:space="preserve">each </w:t>
-      </w:r>
-      <w:r>
-        <w:t>term</w:t>
-      </w:r>
-      <w:r>
-        <w:t>,</w:t>
-      </w:r>
-      <w:r>
-        <w:t xml:space="preserve"> </w:t>
-      </w:r>
-      <w:r>
-        <w:rPr>
-          <w:rFonts w:ascii="Aptos" w:hAnsi="Aptos"/>
-        </w:rPr>
-        <w:t>t</w:t>
-      </w:r>
-      <w:r>
-        <w:rPr>
-          <w:rFonts w:ascii="Aptos" w:hAnsi="Aptos"/>
-        </w:rPr>
-        <w:t xml:space="preserve">he humidity dependence of the cloud humidity difference and the dry advection down the mean moisture gradient cancel, leaving a proportionality between the </w:t>
-      </w:r>
-      <w:proofErr w:type="gramStart"/>
-      <w:r>
-        <w:rPr>
-          <w:rFonts w:ascii="Aptos" w:hAnsi="Aptos"/>
-        </w:rPr>
-        <w:t>large scale</w:t>
-      </w:r>
-      <w:proofErr w:type="gramEnd"/>
-      <w:r>
-        <w:rPr>
-          <w:rFonts w:ascii="Aptos" w:hAnsi="Aptos"/>
-        </w:rPr>
-        <w:t xml:space="preserve"> advection </w:t>
-      </w:r>
-      <w:r>
-        <w:rPr>
-          <w:rFonts w:ascii="Aptos" w:eastAsiaTheme="minorEastAsia" w:hAnsi="Aptos"/>
-        </w:rPr>
-        <w:t xml:space="preserve">and </w:t>
-      </w:r>
-      <w:r>
-        <w:rPr>
-          <w:rFonts w:ascii="Aptos" w:hAnsi="Aptos"/>
-        </w:rPr>
-        <w:t>cloud mass flux</w:t>
-      </w:r>
-      <m:oMath>
-        <m:r>
-          <w:rPr>
-            <w:rFonts w:ascii="Cambria Math" w:hAnsi="Cambria Math"/>
-          </w:rPr>
-          <m:t>,</m:t>
-        </m:r>
-      </m:oMath>
-      <w:r>
-        <w:rPr>
-          <w:rFonts w:ascii="Aptos" w:hAnsi="Aptos"/>
-        </w:rPr>
-        <w:t xml:space="preserve"> </w:t>
-      </w:r>
-      <m:oMath>
-        <m:r>
-          <w:rPr>
-            <w:rFonts w:ascii="Cambria Math" w:hAnsi="Cambria Math"/>
-          </w:rPr>
-          <m:t>M</m:t>
-        </m:r>
-        <m:r>
-          <m:rPr>
-            <m:sty m:val="p"/>
-          </m:rPr>
-          <w:rPr>
-            <w:rFonts w:ascii="Cambria Math" w:hAnsi="Cambria Math"/>
-          </w:rPr>
-          <m:t>∝</m:t>
-        </m:r>
-        <m:r>
-          <w:rPr>
-            <w:rFonts w:ascii="Cambria Math" w:hAnsi="Cambria Math"/>
-          </w:rPr>
-          <m:t>W</m:t>
-        </m:r>
-      </m:oMath>
-      <w:r>
-        <w:t>.</w:t>
-      </w:r>
-    </w:p>
-    <w:p>
-      <w:pPr>
-        <w:pStyle w:val="ListParagraph"/>
-        <w:numPr>
-          <w:ilvl w:val="0"/>
-          <w:numId w:val="3"/>
-        </w:numPr>
-        <w:spacing w:line="240" w:lineRule="auto"/>
-      </w:pPr>
-      <w:r>
-        <w:t xml:space="preserve">The shallow cumulus </w:t>
-      </w:r>
-      <w:r>
-        <w:t xml:space="preserve">cloud fraction </w:t>
-      </w:r>
-      <m:oMath>
-        <m:r>
-          <w:rPr>
-            <w:rFonts w:ascii="Cambria Math" w:hAnsi="Cambria Math"/>
-          </w:rPr>
-          <m:t>C</m:t>
-        </m:r>
-      </m:oMath>
-      <w:r>
-        <w:t xml:space="preserve"> </w:t>
-      </w:r>
-      <w:r>
-        <w:t xml:space="preserve">is </w:t>
-      </w:r>
-      <w:r>
-        <w:t>proportional to mass flux</w:t>
-      </w:r>
-      <w:r>
-        <w:t>,</w:t>
-      </w:r>
-      <w:r>
-        <w:t xml:space="preserve"> </w:t>
+        <w:t>(</w:t>
+      </w:r>
+      <w:r>
+        <w:t>4</w:t>
+      </w:r>
+      <w:r>
+        <w:t xml:space="preserve">) </w:t>
+      </w:r>
+      <w:r>
+        <w:t xml:space="preserve">The shallow cumulus cloud fraction is proportional to mass flux, </w:t>
       </w:r>
       <m:oMath>
         <m:r>
@@ -2852,19 +2514,25 @@
         </m:r>
       </m:oMath>
       <w:r>
-        <w:t>. This is</w:t>
+        <w:t>. T</w:t>
       </w:r>
       <w:r>
         <w:rPr>
           <w:rFonts w:eastAsiaTheme="minorEastAsia"/>
         </w:rPr>
-        <w:t xml:space="preserve"> supported by the cloud mass flux </w:t>
+        <w:t>he cloud mass flux definition</w:t>
       </w:r>
       <w:r>
         <w:rPr>
           <w:rFonts w:eastAsiaTheme="minorEastAsia"/>
         </w:rPr>
-        <w:t xml:space="preserve">definition, </w:t>
+        <w:t xml:space="preserve"> is</w:t>
+      </w:r>
+      <w:r>
+        <w:rPr>
+          <w:rFonts w:eastAsiaTheme="minorEastAsia"/>
+        </w:rPr>
+        <w:t xml:space="preserve"> </w:t>
       </w:r>
       <m:oMath>
         <m:r>
@@ -2904,49 +2572,31 @@
         <w:rPr>
           <w:rFonts w:eastAsiaTheme="minorEastAsia"/>
         </w:rPr>
-        <w:t>, and the correlation of cloud base mass flux (Vogel et al., 2022)</w:t>
+        <w:t xml:space="preserve">. </w:t>
       </w:r>
       <w:r>
         <w:rPr>
           <w:rFonts w:eastAsiaTheme="minorEastAsia"/>
         </w:rPr>
-        <w:t xml:space="preserve">. </w:t>
-      </w:r>
-      <w:r>
-        <w:rPr>
-          <w:rFonts w:ascii="Aptos" w:hAnsi="Aptos"/>
-        </w:rPr>
-        <w:t xml:space="preserve">The </w:t>
-      </w:r>
-      <w:r>
-        <w:rPr>
-          <w:rFonts w:ascii="Aptos" w:hAnsi="Aptos"/>
-        </w:rPr>
-        <w:t>slope</w:t>
-      </w:r>
-      <w:r>
-        <w:rPr>
-          <w:rFonts w:ascii="Aptos" w:hAnsi="Aptos"/>
-        </w:rPr>
-        <w:t xml:space="preserve"> of the </w:t>
-      </w:r>
-      <w:r>
-        <w:rPr>
-          <w:rFonts w:ascii="Aptos" w:hAnsi="Aptos"/>
-        </w:rPr>
-        <w:t xml:space="preserve">mass flux to </w:t>
-      </w:r>
-      <w:r>
-        <w:rPr>
-          <w:rFonts w:ascii="Aptos" w:hAnsi="Aptos"/>
-        </w:rPr>
-        <w:t>cloud base cloud fracti</w:t>
-      </w:r>
-      <w:r>
-        <w:rPr>
-          <w:rFonts w:ascii="Aptos" w:hAnsi="Aptos"/>
-        </w:rPr>
-        <w:t xml:space="preserve">on </w:t>
+        <w:t>C</w:t>
+      </w:r>
+      <w:r>
+        <w:rPr>
+          <w:rFonts w:eastAsiaTheme="minorEastAsia"/>
+        </w:rPr>
+        <w:t xml:space="preserve">loud base mass flux </w:t>
+      </w:r>
+      <w:r>
+        <w:rPr>
+          <w:rFonts w:eastAsiaTheme="minorEastAsia"/>
+        </w:rPr>
+        <w:t xml:space="preserve">was correlated (R=XX) to cloud base cloud fraction with </w:t>
+      </w:r>
+      <w:r>
+        <w:rPr>
+          <w:rFonts w:ascii="Aptos" w:hAnsi="Aptos"/>
+        </w:rPr>
+        <w:t xml:space="preserve">slope </w:t>
       </w:r>
       <m:oMath>
         <m:f>
@@ -2964,13 +2614,7 @@
               <w:rPr>
                 <w:rFonts w:ascii="Cambria Math" w:hAnsi="Cambria Math"/>
               </w:rPr>
-              <m:t>d</m:t>
-            </m:r>
-            <m:r>
-              <w:rPr>
-                <w:rFonts w:ascii="Cambria Math" w:hAnsi="Cambria Math"/>
-              </w:rPr>
-              <m:t>M</m:t>
+              <m:t>dM</m:t>
             </m:r>
           </m:num>
           <m:den>
@@ -2978,13 +2622,7 @@
               <w:rPr>
                 <w:rFonts w:ascii="Cambria Math" w:hAnsi="Cambria Math"/>
               </w:rPr>
-              <m:t>d</m:t>
-            </m:r>
-            <m:r>
-              <w:rPr>
-                <w:rFonts w:ascii="Cambria Math" w:hAnsi="Cambria Math"/>
-              </w:rPr>
-              <m:t>C</m:t>
+              <m:t>dC</m:t>
             </m:r>
           </m:den>
         </m:f>
@@ -3024,71 +2662,18 @@
           <w:rPr>
             <w:rFonts w:ascii="Cambria Math" w:eastAsiaTheme="minorEastAsia" w:hAnsi="Cambria Math"/>
           </w:rPr>
-          <m:t>=</m:t>
+          <m:t>≈</m:t>
         </m:r>
       </m:oMath>
       <w:r>
-        <w:t xml:space="preserve"> 2.4-X.X % (mm s</w:t>
-      </w:r>
-      <w:r>
-        <w:rPr>
-          <w:vertAlign w:val="superscript"/>
-        </w:rPr>
-        <w:t>–1</w:t>
-      </w:r>
-      <w:r>
-        <w:t>)</w:t>
-      </w:r>
-      <w:r>
-        <w:rPr>
-          <w:vertAlign w:val="superscript"/>
-        </w:rPr>
-        <w:t>-1</w:t>
-      </w:r>
-      <w:r>
-        <w:rPr>
-          <w:rFonts w:ascii="Aptos" w:hAnsi="Aptos"/>
-        </w:rPr>
-        <w:t xml:space="preserve"> suggests </w:t>
-      </w:r>
-      <w:r>
-        <w:rPr>
-          <w:rFonts w:ascii="Aptos" w:eastAsiaTheme="minorEastAsia" w:hAnsi="Aptos"/>
-        </w:rPr>
-        <w:t xml:space="preserve">a nearly constant cloud-mean vertical velocity </w:t>
+        <w:t xml:space="preserve"> </w:t>
       </w:r>
       <m:oMath>
-        <m:sSub>
-          <m:sSubPr>
-            <m:ctrlPr>
-              <w:rPr>
-                <w:rFonts w:ascii="Cambria Math" w:eastAsiaTheme="minorEastAsia" w:hAnsi="Cambria Math"/>
-                <w:i/>
-              </w:rPr>
-            </m:ctrlPr>
-          </m:sSubPr>
-          <m:e>
-            <m:r>
-              <w:rPr>
-                <w:rFonts w:ascii="Cambria Math" w:eastAsiaTheme="minorEastAsia" w:hAnsi="Cambria Math"/>
-              </w:rPr>
-              <m:t>w</m:t>
-            </m:r>
-          </m:e>
-          <m:sub>
-            <m:r>
-              <w:rPr>
-                <w:rFonts w:ascii="Cambria Math" w:eastAsiaTheme="minorEastAsia" w:hAnsi="Cambria Math"/>
-              </w:rPr>
-              <m:t>c</m:t>
-            </m:r>
-          </m:sub>
-        </m:sSub>
         <m:r>
           <w:rPr>
             <w:rFonts w:ascii="Cambria Math" w:eastAsiaTheme="minorEastAsia" w:hAnsi="Cambria Math"/>
           </w:rPr>
-          <m:t>=4.2</m:t>
+          <m:t>4.2</m:t>
         </m:r>
       </m:oMath>
       <w:r>
@@ -3105,67 +2690,117 @@
         <w:t>-1</w:t>
       </w:r>
       <w:r>
-        <w:rPr>
-          <w:rFonts w:ascii="Aptos" w:hAnsi="Aptos"/>
+        <w:t xml:space="preserve"> (</w:t>
+      </w:r>
+      <w:r>
+        <w:rPr>
+          <w:rFonts w:eastAsiaTheme="minorEastAsia"/>
+        </w:rPr>
+        <w:t xml:space="preserve">Vogel et al., 2022). </w:t>
+      </w:r>
+      <w:r>
+        <w:rPr>
+          <w:rFonts w:ascii="Aptos" w:hAnsi="Aptos"/>
+        </w:rPr>
+        <w:t xml:space="preserve">The </w:t>
+      </w:r>
+      <w:r>
+        <w:rPr>
+          <w:rFonts w:eastAsiaTheme="minorEastAsia"/>
+        </w:rPr>
+        <w:t>slope</w:t>
+      </w:r>
+      <w:r>
+        <w:rPr>
+          <w:rFonts w:eastAsiaTheme="minorEastAsia"/>
+        </w:rPr>
+        <w:t xml:space="preserve"> </w:t>
+      </w:r>
+      <w:r>
+        <w:rPr>
+          <w:rFonts w:eastAsiaTheme="minorEastAsia"/>
+        </w:rPr>
+        <w:t xml:space="preserve">of mass flux to albedo is </w:t>
+      </w:r>
+      <m:oMath>
+        <m:r>
+          <w:rPr>
+            <w:rFonts w:ascii="Cambria Math" w:eastAsiaTheme="minorEastAsia" w:hAnsi="Cambria Math"/>
+          </w:rPr>
+          <m:t>dM/dA =</m:t>
+        </m:r>
+      </m:oMath>
+      <w:r>
+        <w:rPr>
+          <w:rFonts w:eastAsiaTheme="minorEastAsia"/>
+        </w:rPr>
+        <w:t xml:space="preserve"> 4.2 cm s</w:t>
+      </w:r>
+      <w:r>
+        <w:rPr>
+          <w:rFonts w:eastAsiaTheme="minorEastAsia"/>
+          <w:vertAlign w:val="superscript"/>
+        </w:rPr>
+        <w:t>-1</w:t>
+      </w:r>
+      <w:r>
+        <w:rPr>
+          <w:rFonts w:eastAsiaTheme="minorEastAsia"/>
+        </w:rPr>
+        <w:t xml:space="preserve"> </w:t>
+      </w:r>
+      <w:r>
+        <w:rPr>
+          <w:rFonts w:eastAsiaTheme="minorEastAsia"/>
+        </w:rPr>
+        <w:t xml:space="preserve">is confirmed </w:t>
+      </w:r>
+      <w:r>
+        <w:rPr>
+          <w:rFonts w:eastAsiaTheme="minorEastAsia"/>
+        </w:rPr>
+        <w:t xml:space="preserve">for GOES scenes </w:t>
+      </w:r>
+      <w:r>
+        <w:rPr>
+          <w:rFonts w:eastAsiaTheme="minorEastAsia"/>
+        </w:rPr>
+        <w:t xml:space="preserve">with a mass flux </w:t>
+      </w:r>
+      <w:r>
+        <w:rPr>
+          <w:rFonts w:eastAsiaTheme="minorEastAsia"/>
+        </w:rPr>
+        <w:t xml:space="preserve">model tuned to reproduce moisture balance </w:t>
+      </w:r>
+      <w:r>
+        <w:rPr>
+          <w:rFonts w:eastAsiaTheme="minorEastAsia"/>
+        </w:rPr>
+        <w:t>and</w:t>
+      </w:r>
+      <w:r>
+        <w:rPr>
+          <w:rFonts w:eastAsiaTheme="minorEastAsia"/>
+        </w:rPr>
+        <w:t xml:space="preserve"> the observed distribution of cloud top heights</w:t>
+      </w:r>
+      <w:r>
+        <w:rPr>
+          <w:rFonts w:eastAsiaTheme="minorEastAsia"/>
+        </w:rPr>
+        <w:t xml:space="preserve"> (results subsection 1)</w:t>
+      </w:r>
+      <w:r>
+        <w:rPr>
+          <w:rFonts w:eastAsiaTheme="minorEastAsia"/>
         </w:rPr>
         <w:t>.</w:t>
-      </w:r>
-      <w:r>
-        <w:rPr>
-          <w:rFonts w:ascii="Aptos" w:hAnsi="Aptos"/>
-        </w:rPr>
-        <w:t xml:space="preserve"> </w:t>
-      </w:r>
-      <w:r>
-        <w:rPr>
-          <w:rFonts w:eastAsiaTheme="minorEastAsia"/>
-        </w:rPr>
-        <w:t>We</w:t>
-      </w:r>
-      <w:r>
-        <w:rPr>
-          <w:rFonts w:eastAsiaTheme="minorEastAsia"/>
-        </w:rPr>
-        <w:t xml:space="preserve"> confirm</w:t>
-      </w:r>
-      <w:r>
-        <w:rPr>
-          <w:rFonts w:eastAsiaTheme="minorEastAsia"/>
-        </w:rPr>
-        <w:t xml:space="preserve"> this slope from </w:t>
-      </w:r>
-      <w:r>
-        <w:rPr>
-          <w:rFonts w:eastAsiaTheme="minorEastAsia"/>
-        </w:rPr>
-        <w:t xml:space="preserve">a heuristic model with </w:t>
-      </w:r>
-      <w:r>
-        <w:rPr>
-          <w:rFonts w:eastAsiaTheme="minorEastAsia"/>
-        </w:rPr>
-        <w:lastRenderedPageBreak/>
-        <w:t xml:space="preserve">entrainment rates tuned to reproduce moisture balance </w:t>
-      </w:r>
-      <w:r>
-        <w:rPr>
-          <w:rFonts w:eastAsiaTheme="minorEastAsia"/>
-        </w:rPr>
-        <w:t>by</w:t>
-      </w:r>
-      <w:r>
-        <w:rPr>
-          <w:rFonts w:eastAsiaTheme="minorEastAsia"/>
-        </w:rPr>
-        <w:t xml:space="preserve"> the observed distribution of cloud top heights.</w:t>
       </w:r>
     </w:p>
     <w:p>
       <w:pPr>
         <w:pStyle w:val="BodyText"/>
-        <w:rPr>
-          <w:rFonts w:ascii="Aptos" w:hAnsi="Aptos"/>
-        </w:rPr>
       </w:pPr>
       <w:r>
         <w:rPr>
@@ -3199,15 +2834,9 @@
       </w:r>
       <w:r>
         <w:rPr>
-          <w:rFonts w:ascii="Aptos" w:hAnsi="Aptos"/>
-        </w:rPr>
-        <w:t>predict</w:t>
-      </w:r>
-      <w:r>
-        <w:rPr>
-          <w:rFonts w:ascii="Aptos" w:hAnsi="Aptos"/>
-        </w:rPr>
-        <w:t>ing</w:t>
+          <w:rFonts w:ascii="Aptos" w:eastAsiaTheme="minorEastAsia" w:hAnsi="Aptos"/>
+        </w:rPr>
+        <w:t>from</w:t>
       </w:r>
       <w:r>
         <w:rPr>
@@ -3246,7 +2875,7 @@
               <w:rPr>
                 <w:rFonts w:ascii="Cambria Math" w:hAnsi="Cambria Math"/>
               </w:rPr>
-              <m:t>C</m:t>
+              <m:t>A</m:t>
             </m:r>
           </m:e>
         </m:func>
@@ -3347,7 +2976,13 @@
         <w:rPr>
           <w:rFonts w:ascii="Aptos" w:hAnsi="Aptos"/>
         </w:rPr>
-        <w:t>from</w:t>
+        <w:t xml:space="preserve">predicting the shallow cumulus cloud albedo </w:t>
+      </w:r>
+      <w:r>
+        <w:rPr>
+          <w:rFonts w:ascii="Aptos" w:hAnsi="Aptos"/>
+        </w:rPr>
+        <w:t>dims with warming</w:t>
       </w:r>
       <w:r>
         <w:rPr>
@@ -3396,7 +3031,7 @@
                   <w:rPr>
                     <w:rFonts w:ascii="Cambria Math" w:hAnsi="Cambria Math"/>
                   </w:rPr>
-                  <m:t>C</m:t>
+                  <m:t>A</m:t>
                 </m:r>
               </m:e>
             </m:func>
@@ -3457,199 +3092,307 @@
         </w:rPr>
         <w:t>.</w:t>
       </w:r>
+      <w:r>
+        <w:t xml:space="preserve"> </w:t>
+      </w:r>
+      <w:r>
+        <w:t>This</w:t>
+      </w:r>
+      <w:r>
+        <w:t xml:space="preserve"> generates </w:t>
+      </w:r>
+      <w:proofErr w:type="gramStart"/>
+      <w:r>
+        <w:t>a positive radiative feedback</w:t>
+      </w:r>
+      <w:proofErr w:type="gramEnd"/>
+      <w:r>
+        <w:t xml:space="preserve"> that scales with the </w:t>
+      </w:r>
+      <w:r>
+        <w:t xml:space="preserve">planetary </w:t>
+      </w:r>
+      <w:r>
+        <w:t>albedo</w:t>
+      </w:r>
+      <w:r>
+        <w:t xml:space="preserve"> of </w:t>
+      </w:r>
+      <w:r>
+        <w:t>shallow cumulus cloud</w:t>
+      </w:r>
+      <w:r>
+        <w:t>s</w:t>
+      </w:r>
+      <w:r>
+        <w:t>.</w:t>
+      </w:r>
     </w:p>
     <w:p>
       <w:pPr>
-        <w:pStyle w:val="Heading1"/>
+        <w:pStyle w:val="Heading2"/>
+        <w:rPr>
+          <w:rFonts w:eastAsiaTheme="minorEastAsia"/>
+        </w:rPr>
       </w:pPr>
       <w:r>
-        <w:t>Results</w:t>
+        <w:rPr>
+          <w:rFonts w:eastAsiaTheme="minorEastAsia"/>
+        </w:rPr>
+        <w:t>Cloud and flux model</w:t>
+      </w:r>
+    </w:p>
+    <w:p>
+      <w:pPr>
+        <w:spacing w:line="240" w:lineRule="auto"/>
+        <w:rPr>
+          <w:rFonts w:eastAsiaTheme="minorEastAsia"/>
+        </w:rPr>
+      </w:pPr>
+      <w:r>
+        <w:rPr>
+          <w:rFonts w:eastAsiaTheme="minorEastAsia"/>
+        </w:rPr>
+        <w:t xml:space="preserve">To predict the response of shallow cumulus clouds to climate, we separate the known changes from thermodynamics and circulation, from the properties of cloud geometry, turbulence, and microphysics expected not to change. </w:t>
+      </w:r>
+      <w:r>
+        <w:rPr>
+          <w:rFonts w:eastAsiaTheme="minorEastAsia"/>
+        </w:rPr>
+        <w:t xml:space="preserve">The </w:t>
+      </w:r>
+      <w:proofErr w:type="spellStart"/>
+      <w:r>
+        <w:rPr>
+          <w:rFonts w:eastAsiaTheme="minorEastAsia"/>
+        </w:rPr>
+        <w:t>autoconversion</w:t>
+      </w:r>
+      <w:proofErr w:type="spellEnd"/>
+      <w:r>
+        <w:rPr>
+          <w:rFonts w:eastAsiaTheme="minorEastAsia"/>
+        </w:rPr>
+        <w:t xml:space="preserve"> of cloud droplets to precipitation, the lateral entrainment rate, and the ratio of the area of active updraft to cloud area, are set to match emergent properties of the clouds in the present </w:t>
+      </w:r>
+      <w:proofErr w:type="gramStart"/>
+      <w:r>
+        <w:rPr>
+          <w:rFonts w:eastAsiaTheme="minorEastAsia"/>
+        </w:rPr>
+        <w:t>climate, and</w:t>
+      </w:r>
+      <w:proofErr w:type="gramEnd"/>
+      <w:r>
+        <w:rPr>
+          <w:rFonts w:eastAsiaTheme="minorEastAsia"/>
+        </w:rPr>
+        <w:t xml:space="preserve"> are not expected to change with thermodynamic and circulation responses to CO2.</w:t>
       </w:r>
     </w:p>
     <w:p>
       <w:pPr>
         <w:pStyle w:val="BodyText"/>
-        <w:rPr>
-          <w:rFonts w:ascii="Aptos" w:hAnsi="Aptos"/>
-        </w:rPr>
       </w:pPr>
       <w:r>
         <w:rPr>
           <w:rFonts w:ascii="Aptos" w:hAnsi="Aptos"/>
         </w:rPr>
-        <w:t xml:space="preserve">[a very </w:t>
+        <w:lastRenderedPageBreak/>
+        <w:t>A</w:t>
+      </w:r>
+      <w:r>
+        <w:rPr>
+          <w:rFonts w:ascii="Aptos" w:hAnsi="Aptos"/>
+        </w:rPr>
+        <w:t xml:space="preserve"> mass flux model</w:t>
+      </w:r>
+      <w:r>
+        <w:rPr>
+          <w:rFonts w:ascii="Aptos" w:hAnsi="Aptos"/>
+        </w:rPr>
+        <w:t xml:space="preserve"> of</w:t>
+      </w:r>
+      <w:r>
+        <w:rPr>
+          <w:rFonts w:ascii="Aptos" w:hAnsi="Aptos"/>
+        </w:rPr>
+        <w:t xml:space="preserve"> entraining and precipitating cloud plumes simulates</w:t>
+      </w:r>
+      <w:r>
+        <w:rPr>
+          <w:rFonts w:ascii="Aptos" w:hAnsi="Aptos"/>
+        </w:rPr>
+        <w:t xml:space="preserve"> cloud</w:t>
+      </w:r>
+      <w:r>
+        <w:rPr>
+          <w:rFonts w:ascii="Aptos" w:hAnsi="Aptos"/>
+        </w:rPr>
+        <w:t xml:space="preserve"> humidity, cloud top height, mass fluxes, and moisture fluxes (see Methods)</w:t>
+      </w:r>
+      <w:r>
+        <w:rPr>
+          <w:rFonts w:ascii="Aptos" w:hAnsi="Aptos"/>
+        </w:rPr>
+        <w:t xml:space="preserve">. </w:t>
+      </w:r>
+      <w:r>
+        <w:rPr>
+          <w:rFonts w:ascii="Aptos" w:hAnsi="Aptos"/>
+        </w:rPr>
+        <w:t xml:space="preserve">Updraft water </w:t>
       </w:r>
       <w:proofErr w:type="gramStart"/>
       <w:r>
         <w:rPr>
           <w:rFonts w:ascii="Aptos" w:hAnsi="Aptos"/>
         </w:rPr>
-        <w:t>brief summary</w:t>
+        <w:t>in excess of</w:t>
       </w:r>
       <w:proofErr w:type="gramEnd"/>
       <w:r>
         <w:rPr>
           <w:rFonts w:ascii="Aptos" w:hAnsi="Aptos"/>
         </w:rPr>
-        <w:t xml:space="preserve"> of the model]</w:t>
-      </w:r>
-    </w:p>
-    <w:p>
-      <w:pPr>
-        <w:pStyle w:val="BodyText"/>
-        <w:rPr>
-          <w:rFonts w:ascii="Aptos" w:hAnsi="Aptos"/>
-        </w:rPr>
-      </w:pPr>
-      <w:r>
-        <w:rPr>
-          <w:rFonts w:ascii="Aptos" w:hAnsi="Aptos"/>
-        </w:rPr>
-        <w:t>A</w:t>
-      </w:r>
-      <w:r>
-        <w:rPr>
-          <w:rFonts w:ascii="Aptos" w:hAnsi="Aptos"/>
-        </w:rPr>
-        <w:t xml:space="preserve"> mass flux model </w:t>
-      </w:r>
-      <w:r>
-        <w:rPr>
-          <w:rFonts w:ascii="Aptos" w:hAnsi="Aptos"/>
-        </w:rPr>
-        <w:t>with entraining and precipitating cloud plumes simulates</w:t>
-      </w:r>
-      <w:r>
-        <w:rPr>
-          <w:rFonts w:ascii="Aptos" w:hAnsi="Aptos"/>
-        </w:rPr>
-        <w:t xml:space="preserve"> cloud</w:t>
-      </w:r>
-      <w:r>
-        <w:rPr>
-          <w:rFonts w:ascii="Aptos" w:hAnsi="Aptos"/>
-        </w:rPr>
-        <w:t xml:space="preserve"> humidity, cloud top height, mass fluxes, and moisture fluxes (see Methods)</w:t>
-      </w:r>
-      <w:r>
-        <w:rPr>
-          <w:rFonts w:ascii="Aptos" w:hAnsi="Aptos"/>
-        </w:rPr>
+        <w:t xml:space="preserve"> the saturation specific humidity condenses as cloud liquid.</w:t>
+      </w:r>
+      <w:r>
+        <w:rPr>
+          <w:rFonts w:ascii="Aptos" w:hAnsi="Aptos"/>
+        </w:rPr>
+        <w:t xml:space="preserve"> C</w:t>
+      </w:r>
+      <w:r>
+        <w:rPr>
+          <w:rFonts w:ascii="Aptos" w:hAnsi="Aptos"/>
+        </w:rPr>
+        <w:t xml:space="preserve">loud and large-scale advective fluxes </w:t>
+      </w:r>
+      <w:r>
+        <w:rPr>
+          <w:rFonts w:ascii="Aptos" w:hAnsi="Aptos"/>
+        </w:rPr>
+        <w:t xml:space="preserve">are both proportional to the </w:t>
+      </w:r>
+      <w:r>
+        <w:rPr>
+          <w:rFonts w:ascii="Aptos" w:hAnsi="Aptos"/>
+        </w:rPr>
+        <w:t xml:space="preserve">mean </w:t>
+      </w:r>
+      <w:r>
+        <w:rPr>
+          <w:rFonts w:ascii="Aptos" w:hAnsi="Aptos"/>
+        </w:rPr>
+        <w:t>humidity</w:t>
+      </w:r>
+      <w:r>
+        <w:rPr>
+          <w:rFonts w:ascii="Aptos" w:hAnsi="Aptos"/>
+        </w:rPr>
+        <w:t xml:space="preserve"> gradient. </w:t>
+      </w:r>
+      <w:r>
+        <w:rPr>
+          <w:rFonts w:eastAsiaTheme="minorEastAsia"/>
+        </w:rPr>
+        <w:t xml:space="preserve">The </w:t>
+      </w:r>
+      <w:r>
+        <w:rPr>
+          <w:rFonts w:eastAsiaTheme="minorEastAsia"/>
+        </w:rPr>
+        <w:t xml:space="preserve">total </w:t>
+      </w:r>
+      <w:r>
+        <w:rPr>
+          <w:rFonts w:eastAsiaTheme="minorEastAsia"/>
+        </w:rPr>
+        <w:t xml:space="preserve">moisture sink rate </w:t>
+      </w:r>
+      <w:r>
+        <w:t>(</w:t>
+      </w:r>
+      <w:r>
+        <w:t xml:space="preserve">vapor </w:t>
+      </w:r>
+      <w:r>
+        <w:t xml:space="preserve">entrainment </w:t>
+      </w:r>
+      <w:r>
+        <w:t>and</w:t>
+      </w:r>
+      <w:r>
+        <w:t xml:space="preserve"> </w:t>
+      </w:r>
+      <w:r>
+        <w:t xml:space="preserve">liquid </w:t>
+      </w:r>
+      <w:proofErr w:type="spellStart"/>
+      <w:r>
+        <w:t>autoconversion</w:t>
+      </w:r>
+      <w:proofErr w:type="spellEnd"/>
+      <w:r>
+        <w:t xml:space="preserve">) </w:t>
+      </w:r>
+      <w:r>
+        <w:rPr>
+          <w:rFonts w:eastAsiaTheme="minorEastAsia"/>
+        </w:rPr>
+        <w:t>parameterizes turbulence-scale processes within the clouds</w:t>
+      </w:r>
+      <w:r>
+        <w:rPr>
+          <w:rFonts w:eastAsiaTheme="minorEastAsia"/>
+        </w:rPr>
+        <w:t xml:space="preserve"> and </w:t>
+      </w:r>
+      <w:r>
+        <w:t xml:space="preserve">determines the cloud </w:t>
+      </w:r>
+      <w:r>
+        <w:t xml:space="preserve">humidity and cloud </w:t>
+      </w:r>
+      <w:r>
+        <w:t>top heigh</w:t>
+      </w:r>
+      <w:r>
+        <w:t>t</w:t>
+      </w:r>
+      <w:r>
+        <w:t>. Plumes</w:t>
+      </w:r>
+      <w:r>
+        <w:t xml:space="preserve"> with weaker sink rates </w:t>
+      </w:r>
+      <w:r>
+        <w:t>have</w:t>
+      </w:r>
+      <w:r>
+        <w:t xml:space="preserve"> higher</w:t>
+      </w:r>
+      <w:r>
+        <w:t xml:space="preserve"> cloud tops</w:t>
+      </w:r>
+      <w:r>
         <w:t xml:space="preserve">. </w:t>
       </w:r>
       <w:r>
-        <w:rPr>
-          <w:rFonts w:ascii="Aptos" w:hAnsi="Aptos"/>
-        </w:rPr>
-        <w:t xml:space="preserve">Updraft water </w:t>
-      </w:r>
-      <w:proofErr w:type="gramStart"/>
-      <w:r>
-        <w:rPr>
-          <w:rFonts w:ascii="Aptos" w:hAnsi="Aptos"/>
-        </w:rPr>
-        <w:t>in excess of</w:t>
-      </w:r>
-      <w:proofErr w:type="gramEnd"/>
-      <w:r>
-        <w:rPr>
-          <w:rFonts w:ascii="Aptos" w:hAnsi="Aptos"/>
-        </w:rPr>
-        <w:t xml:space="preserve"> the saturation specific humidity condenses as cloud liquid.</w:t>
-      </w:r>
-      <w:r>
-        <w:rPr>
-          <w:rFonts w:ascii="Aptos" w:hAnsi="Aptos"/>
-        </w:rPr>
-        <w:t xml:space="preserve"> C</w:t>
-      </w:r>
-      <w:r>
-        <w:rPr>
-          <w:rFonts w:ascii="Aptos" w:hAnsi="Aptos"/>
-        </w:rPr>
-        <w:t xml:space="preserve">loud and large-scale advective fluxes </w:t>
-      </w:r>
-      <w:r>
-        <w:rPr>
-          <w:rFonts w:ascii="Aptos" w:hAnsi="Aptos"/>
-        </w:rPr>
-        <w:t xml:space="preserve">are both proportional to the </w:t>
-      </w:r>
-      <w:r>
-        <w:rPr>
-          <w:rFonts w:ascii="Aptos" w:hAnsi="Aptos"/>
-        </w:rPr>
-        <w:t xml:space="preserve">mean </w:t>
-      </w:r>
-      <w:r>
-        <w:rPr>
-          <w:rFonts w:ascii="Aptos" w:hAnsi="Aptos"/>
-        </w:rPr>
-        <w:t>humidity</w:t>
-      </w:r>
-      <w:r>
-        <w:rPr>
-          <w:rFonts w:ascii="Aptos" w:hAnsi="Aptos"/>
-        </w:rPr>
-        <w:t xml:space="preserve"> gradient. </w:t>
-      </w:r>
-      <w:r>
-        <w:t xml:space="preserve">The </w:t>
-      </w:r>
-      <w:r>
-        <w:t>total sink rate (</w:t>
-      </w:r>
-      <w:r>
-        <w:t xml:space="preserve">entrainment </w:t>
-      </w:r>
-      <w:r>
-        <w:t xml:space="preserve">+ </w:t>
-      </w:r>
-      <w:proofErr w:type="spellStart"/>
-      <w:r>
-        <w:t>autoconversion</w:t>
-      </w:r>
-      <w:proofErr w:type="spellEnd"/>
-      <w:r>
-        <w:t xml:space="preserve">) </w:t>
-      </w:r>
-      <w:r>
-        <w:t xml:space="preserve">determines the cloud </w:t>
-      </w:r>
-      <w:r>
-        <w:t xml:space="preserve">humidity and cloud </w:t>
-      </w:r>
-      <w:r>
-        <w:t>top heigh</w:t>
-      </w:r>
-      <w:r>
-        <w:t>t; clouds with weaker sink rates rise higher</w:t>
-      </w:r>
-      <w:r>
-        <w:t xml:space="preserve">. </w:t>
-      </w:r>
-      <w:r>
-        <w:t xml:space="preserve">A </w:t>
-      </w:r>
-      <w:r>
-        <w:t xml:space="preserve">distribution of </w:t>
-      </w:r>
-      <w:r>
-        <w:t>sink</w:t>
-      </w:r>
-      <w:r>
-        <w:t xml:space="preserve"> rates </w:t>
-      </w:r>
-      <w:proofErr w:type="gramStart"/>
-      <w:r>
-        <w:t>are</w:t>
-      </w:r>
-      <w:proofErr w:type="gramEnd"/>
-      <w:r>
-        <w:t xml:space="preserve"> set </w:t>
-      </w:r>
-      <w:r>
-        <w:t>to match the cloud top</w:t>
+        <w:t xml:space="preserve">A distribution of </w:t>
+      </w:r>
+      <w:r>
+        <w:t xml:space="preserve">moisture </w:t>
+      </w:r>
+      <w:r>
+        <w:t xml:space="preserve">sink rates </w:t>
+      </w:r>
+      <w:r>
+        <w:t>is</w:t>
+      </w:r>
+      <w:r>
+        <w:t xml:space="preserve"> set to match the cloud top</w:t>
       </w:r>
       <w:r>
         <w:t xml:space="preserve"> height distribution </w:t>
@@ -3676,7 +3419,13 @@
         <w:rPr>
           <w:rFonts w:ascii="Aptos" w:hAnsi="Aptos"/>
         </w:rPr>
-        <w:t xml:space="preserve">Requiring </w:t>
+        <w:t>Holding the moisture sink rates constant and r</w:t>
+      </w:r>
+      <w:r>
+        <w:rPr>
+          <w:rFonts w:ascii="Aptos" w:hAnsi="Aptos"/>
+        </w:rPr>
+        <w:t xml:space="preserve">equiring </w:t>
       </w:r>
       <w:r>
         <w:rPr>
@@ -3735,6 +3484,14 @@
     <w:bookmarkEnd w:id="2"/>
     <w:p>
       <w:pPr>
+        <w:pStyle w:val="Heading1"/>
+      </w:pPr>
+      <w:r>
+        <w:t>Results</w:t>
+      </w:r>
+    </w:p>
+    <w:p>
+      <w:pPr>
         <w:pStyle w:val="Heading2"/>
         <w:rPr>
           <w:rFonts w:eastAsiaTheme="minorEastAsia"/>
@@ -3866,34 +3623,124 @@
         <w:t>-1</w:t>
       </w:r>
       <w:r>
-        <w:t xml:space="preserve"> [4.2 cm s</w:t>
+        <w:t xml:space="preserve"> agrees with the correlations between cloud base mass flux and cloud fraction observed from dropsonde circles in EUREC4A (2.4 – X.X % (mm s</w:t>
       </w:r>
       <w:r>
         <w:rPr>
           <w:vertAlign w:val="superscript"/>
         </w:rPr>
+        <w:t>–1</w:t>
+      </w:r>
+      <w:r>
+        <w:t>)</w:t>
+      </w:r>
+      <w:r>
+        <w:rPr>
+          <w:vertAlign w:val="superscript"/>
+        </w:rPr>
         <w:t>-1</w:t>
       </w:r>
       <w:r>
-        <w:t>] agrees with the correlations between cloud base mass flux and cloud fraction observed from dropsonde circles in EUREC4A (2.4 – X.X % (mm s</w:t>
+        <w:t>; Vogel et al. 2022).</w:t>
+      </w:r>
+      <w:r>
+        <w:t xml:space="preserve"> The sensitivity of the GOES scene-mean reflectance (albedo) is at the low end of the range of sensitivity from EUREC4A cloud base cloud fraction, presumably because optically thin clouds contribute more to the cloud fraction than to the mean reflectance.  </w:t>
+      </w:r>
+      <w:r>
+        <w:t xml:space="preserve">This slope suggests that in the mean, clouds have a constant in-cloud updraft velocity </w:t>
+      </w:r>
+      <w:r>
+        <w:t>4.2 cm s</w:t>
       </w:r>
       <w:r>
         <w:rPr>
           <w:vertAlign w:val="superscript"/>
         </w:rPr>
-        <w:t>–1</w:t>
-      </w:r>
-      <w:r>
-        <w:t>)</w:t>
-      </w:r>
-      <w:r>
-        <w:rPr>
-          <w:vertAlign w:val="superscript"/>
-        </w:rPr>
         <w:t>-1</w:t>
       </w:r>
       <w:r>
-        <w:t xml:space="preserve">; Vogel et al. 2022). </w:t>
+        <w:t xml:space="preserve">. The proportionality of cloud albedo to mass flux </w:t>
+      </w:r>
+      <m:oMath>
+        <m:r>
+          <w:rPr>
+            <w:rFonts w:ascii="Cambria Math" w:hAnsi="Cambria Math"/>
+          </w:rPr>
+          <m:t>d</m:t>
+        </m:r>
+        <m:func>
+          <m:funcPr>
+            <m:ctrlPr>
+              <w:rPr>
+                <w:rFonts w:ascii="Cambria Math" w:hAnsi="Cambria Math"/>
+                <w:i/>
+              </w:rPr>
+            </m:ctrlPr>
+          </m:funcPr>
+          <m:fName>
+            <m:r>
+              <m:rPr>
+                <m:sty m:val="p"/>
+              </m:rPr>
+              <w:rPr>
+                <w:rFonts w:ascii="Cambria Math" w:hAnsi="Cambria Math"/>
+              </w:rPr>
+              <m:t>ln</m:t>
+            </m:r>
+          </m:fName>
+          <m:e>
+            <m:r>
+              <w:rPr>
+                <w:rFonts w:ascii="Cambria Math" w:hAnsi="Cambria Math"/>
+              </w:rPr>
+              <m:t>A</m:t>
+            </m:r>
+          </m:e>
+        </m:func>
+        <m:r>
+          <w:rPr>
+            <w:rFonts w:ascii="Cambria Math" w:hAnsi="Cambria Math"/>
+          </w:rPr>
+          <m:t>=d</m:t>
+        </m:r>
+        <m:func>
+          <m:funcPr>
+            <m:ctrlPr>
+              <w:rPr>
+                <w:rFonts w:ascii="Cambria Math" w:hAnsi="Cambria Math"/>
+                <w:i/>
+              </w:rPr>
+            </m:ctrlPr>
+          </m:funcPr>
+          <m:fName>
+            <m:r>
+              <m:rPr>
+                <m:sty m:val="p"/>
+              </m:rPr>
+              <w:rPr>
+                <w:rFonts w:ascii="Cambria Math" w:hAnsi="Cambria Math"/>
+              </w:rPr>
+              <m:t>ln</m:t>
+            </m:r>
+          </m:fName>
+          <m:e>
+            <m:r>
+              <w:rPr>
+                <w:rFonts w:ascii="Cambria Math" w:hAnsi="Cambria Math"/>
+              </w:rPr>
+              <m:t>M</m:t>
+            </m:r>
+          </m:e>
+        </m:func>
+      </m:oMath>
+      <w:r>
+        <w:rPr>
+          <w:rFonts w:eastAsiaTheme="minorEastAsia"/>
+        </w:rPr>
+        <w:t xml:space="preserve"> </w:t>
+      </w:r>
+      <w:r>
+        <w:t>is used to infer the change in cloud albedo</w:t>
       </w:r>
     </w:p>
     <w:p>
@@ -6279,6 +6126,93 @@
     </w:tbl>
     <w:p>
       <w:pPr>
+        <w:keepNext/>
+        <w:keepLines/>
+        <w:spacing w:before="160" w:after="80"/>
+        <w:outlineLvl w:val="1"/>
+        <w:rPr>
+          <w:rFonts w:asciiTheme="majorHAnsi" w:eastAsiaTheme="majorEastAsia" w:hAnsiTheme="majorHAnsi" w:cstheme="majorBidi"/>
+          <w:color w:val="0F4761" w:themeColor="accent1" w:themeShade="BF"/>
+          <w:sz w:val="32"/>
+          <w:szCs w:val="32"/>
+        </w:rPr>
+      </w:pPr>
+      <w:r>
+        <w:rPr>
+          <w:rFonts w:asciiTheme="majorHAnsi" w:eastAsiaTheme="majorEastAsia" w:hAnsiTheme="majorHAnsi" w:cstheme="majorBidi"/>
+          <w:color w:val="0F4761" w:themeColor="accent1" w:themeShade="BF"/>
+          <w:sz w:val="32"/>
+          <w:szCs w:val="32"/>
+        </w:rPr>
+        <w:t>Mesoscale organization</w:t>
+      </w:r>
+    </w:p>
+    <w:p>
+      <w:pPr>
+        <w:pStyle w:val="BodyText"/>
+      </w:pPr>
+      <w:r>
+        <w:t xml:space="preserve">Mesoscale organization clusters clouds together, reducing their effective entrainment of </w:t>
+      </w:r>
+      <w:r>
+        <w:t>environmental</w:t>
+      </w:r>
+      <w:r>
+        <w:t xml:space="preserve"> air. Larger cloudy updrafts</w:t>
+      </w:r>
+      <w:r>
+        <w:t>, and updrafts</w:t>
+      </w:r>
+      <w:r>
+        <w:t xml:space="preserve"> </w:t>
+      </w:r>
+      <w:r>
+        <w:t>entraining</w:t>
+      </w:r>
+      <w:r>
+        <w:t xml:space="preserve"> m</w:t>
+      </w:r>
+      <w:r>
+        <w:t xml:space="preserve">oister air from </w:t>
+      </w:r>
+      <w:r>
+        <w:t xml:space="preserve">their </w:t>
+      </w:r>
+      <w:r>
+        <w:t>surroundings</w:t>
+      </w:r>
+      <w:r>
+        <w:t xml:space="preserve">, </w:t>
+      </w:r>
+      <w:r>
+        <w:t>are</w:t>
+      </w:r>
+      <w:r>
+        <w:t xml:space="preserve"> </w:t>
+      </w:r>
+      <w:r>
+        <w:t xml:space="preserve">parameterized </w:t>
+      </w:r>
+      <w:r>
+        <w:t>by increasing the total moisture sink rate.</w:t>
+      </w:r>
+      <w:r>
+        <w:t xml:space="preserve"> Experiments are run with sink rate varied by </w:t>
+      </w:r>
+      <m:oMath>
+        <m:r>
+          <w:rPr>
+            <w:rFonts w:ascii="Cambria Math" w:hAnsi="Cambria Math"/>
+          </w:rPr>
+          <m:t>±</m:t>
+        </m:r>
+      </m:oMath>
+      <w:r>
+        <w:t>5% from the control.</w:t>
+      </w:r>
+    </w:p>
+    <w:p>
+      <w:pPr>
         <w:pStyle w:val="Heading1"/>
       </w:pPr>
       <w:r>
@@ -6298,7 +6232,21 @@
           <w:rFonts w:eastAsiaTheme="minorEastAsia"/>
           <w:iCs/>
         </w:rPr>
-        <w:t xml:space="preserve">Differences from this behavior in climate change simulations suggest (1) variation in the response of the subsidence drying over the shallow cumulus region, or (2 and 3) variations of the proportionalities of clouds or mass flux to the subsidence. A different relationship from </w:t>
+        <w:t xml:space="preserve">Differences from </w:t>
+      </w:r>
+      <w:r>
+        <w:rPr>
+          <w:rFonts w:eastAsiaTheme="minorEastAsia"/>
+          <w:iCs/>
+        </w:rPr>
+        <w:t>the predictions of the DIM mechanism</w:t>
+      </w:r>
+      <w:r>
+        <w:rPr>
+          <w:rFonts w:eastAsiaTheme="minorEastAsia"/>
+          <w:iCs/>
+        </w:rPr>
+        <w:t xml:space="preserve"> in climate change simulations suggest variation in the response of the subsidence drying over the shallow cumulus region, or variations of the proportionalities of clouds or mass flux to the subsidence. A different relationship from </w:t>
       </w:r>
       <m:oMath>
         <m:r>
@@ -6850,6 +6798,7 @@
           <w:rFonts w:eastAsiaTheme="minorEastAsia"/>
           <w:iCs/>
         </w:rPr>
+        <w:lastRenderedPageBreak/>
         <w:t xml:space="preserve">In our heuristic shallow cumulus model, cloud-scale turbulent processes are represented by lateral entrainment into clouds. Each entrainment rate determines </w:t>
       </w:r>
       <w:proofErr w:type="gramStart"/>
@@ -6908,15 +6857,7 @@
           <w:rFonts w:eastAsiaTheme="minorEastAsia"/>
           <w:iCs/>
         </w:rPr>
-        <w:t xml:space="preserve"> and determines its cloud top height. We find a spectrum of entrainment rates that give the observed shallow cumulus cloud top height distribution and moisture flux divergence in the present climate. This entrainment distribution represents cloud-scale processes like cloud parameterizations determined from observations and/or large-eddy </w:t>
-      </w:r>
-      <w:r>
-        <w:rPr>
-          <w:rFonts w:eastAsiaTheme="minorEastAsia"/>
-          <w:iCs/>
-        </w:rPr>
-        <w:lastRenderedPageBreak/>
-        <w:t xml:space="preserve">simulations. The entrainment distribution approximately reproduces the proportionality of cloud fraction to mass flux </w:t>
+        <w:t xml:space="preserve"> and determines its cloud top height. We find a spectrum of entrainment rates that give the observed shallow cumulus cloud top height distribution and moisture flux divergence in the present climate. This entrainment distribution represents cloud-scale processes like cloud parameterizations determined from observations and/or large-eddy simulations. The entrainment distribution approximately reproduces the proportionality of cloud fraction to mass flux </w:t>
       </w:r>
       <m:oMath>
         <m:r>
@@ -7100,54 +7041,6 @@
     </w:p>
     <w:p>
       <w:pPr>
-        <w:spacing w:line="240" w:lineRule="auto"/>
-      </w:pPr>
-      <w:r>
-        <w:rPr>
-          <w:rFonts w:eastAsiaTheme="minorEastAsia"/>
-        </w:rPr>
-        <w:t>[[MOVE into RESULTS: T</w:t>
-      </w:r>
-      <w:r>
-        <w:rPr>
-          <w:rFonts w:eastAsiaTheme="minorEastAsia"/>
-        </w:rPr>
-        <w:t xml:space="preserve">he </w:t>
-      </w:r>
-      <w:r>
-        <w:rPr>
-          <w:rFonts w:eastAsiaTheme="minorEastAsia"/>
-        </w:rPr>
-        <w:t xml:space="preserve">cloud </w:t>
-      </w:r>
-      <w:r>
-        <w:rPr>
-          <w:rFonts w:eastAsiaTheme="minorEastAsia"/>
-        </w:rPr>
-        <w:t xml:space="preserve">moisture flux </w:t>
-      </w:r>
-      <w:r>
-        <w:rPr>
-          <w:rFonts w:eastAsiaTheme="minorEastAsia"/>
-        </w:rPr>
-        <w:t>also scales with moisture, but the cloud fraction scales with the mass flux. The entrainment rate parameterizes turbulence-scale processes within the clouds, which we expect to be unchanged by the temperature of the climate. Specifying the entrainment rate distribution allows the</w:t>
-      </w:r>
-      <w:r>
-        <w:rPr>
-          <w:rFonts w:eastAsiaTheme="minorEastAsia"/>
-          <w:iCs/>
-        </w:rPr>
-        <w:t xml:space="preserve"> cloud top height distribution to change to match the large scale in a changed climate.</w:t>
-      </w:r>
-      <w:r>
-        <w:rPr>
-          <w:rFonts w:eastAsiaTheme="minorEastAsia"/>
-        </w:rPr>
-        <w:t>]]</w:t>
-      </w:r>
-    </w:p>
-    <w:p>
-      <w:pPr>
         <w:pStyle w:val="Heading1"/>
       </w:pPr>
       <w:r>
@@ -7159,7 +7052,57 @@
         <w:pStyle w:val="BodyText"/>
       </w:pPr>
       <w:r>
-        <w:t xml:space="preserve">The climatic water budget conveniently bridges between observations of the shallow cumulus cloud region and large-scale emergent balances which hold there in a perturbed climate. </w:t>
+        <w:t xml:space="preserve">Using its </w:t>
+      </w:r>
+      <w:r>
+        <w:t>emergent mean moisture balance</w:t>
+      </w:r>
+      <w:r>
+        <w:t xml:space="preserve">, we project the climate of the </w:t>
+      </w:r>
+      <w:r>
+        <w:t>shallow cumulus cloud region</w:t>
+      </w:r>
+      <w:r>
+        <w:t xml:space="preserve"> from thermodynamic and cloud o</w:t>
+      </w:r>
+      <w:r>
+        <w:t>bservations</w:t>
+      </w:r>
+      <w:r>
+        <w:t>.</w:t>
+      </w:r>
+    </w:p>
+    <w:p>
+      <w:pPr>
+        <w:pStyle w:val="BodyText"/>
+      </w:pPr>
+      <w:r>
+        <w:t xml:space="preserve">Cloud properties and within-regime </w:t>
+      </w:r>
+      <w:proofErr w:type="gramStart"/>
+      <w:r>
+        <w:t>feedbacks</w:t>
+      </w:r>
+      <w:proofErr w:type="gramEnd"/>
+      <w:r>
+        <w:t xml:space="preserve"> are similar between shallow cumulus and optically thicker stratocumulus clouds (</w:t>
+      </w:r>
+      <w:proofErr w:type="spellStart"/>
+      <w:r>
+        <w:t>Tselioudis</w:t>
+      </w:r>
+      <w:proofErr w:type="spellEnd"/>
+      <w:r>
+        <w:t xml:space="preserve"> et al., 2021; Zelinka et al. 2025), so shifts from stratocumulus to shallow cumulus could result in partial compensation between their radiative effects. The mixing-induced low cloud feedback hypothesis describes a version of this competition in the global average, whereby mixing by precipitating convection dries lower levels and evaporates extensive and optically thick stratocumulus clouds. All else equal, subsidence reduces stratocumulus clouds (Myers and Norris, 2014). While models have both stratocumulus and shallow cumulus clouds over the northern tropical Atlantic in January-February, clouds there are observed to be nearly exclusively shallow cumulus.</w:t>
+      </w:r>
+    </w:p>
+    <w:p>
+      <w:pPr>
+        <w:pStyle w:val="BodyText"/>
+      </w:pPr>
+      <w:r>
+        <w:t>The combination of cloud fraction and optical depth observed depend on resolution.</w:t>
       </w:r>
     </w:p>
     <w:p>
@@ -7172,48 +7115,7 @@
         <w:pStyle w:val="BodyText"/>
       </w:pPr>
       <w:r>
-        <w:t xml:space="preserve">Cloud properties and within-regime </w:t>
-      </w:r>
-      <w:proofErr w:type="gramStart"/>
-      <w:r>
-        <w:t>feedbacks</w:t>
-      </w:r>
-      <w:proofErr w:type="gramEnd"/>
-      <w:r>
-        <w:t xml:space="preserve"> are similar between shallow cumulus and optically thicker stratocumulus clouds (</w:t>
-      </w:r>
-      <w:proofErr w:type="spellStart"/>
-      <w:r>
-        <w:t>Tselioudis</w:t>
-      </w:r>
-      <w:proofErr w:type="spellEnd"/>
-      <w:r>
-        <w:t xml:space="preserve"> et al., 2021; Zelinka et al. 2025), so shifts from stratocumulus to shallow cumulus could result in partial compensation between their radiative effects. The mixing-induced low cloud feedback hypothesis describes a version of this competition in the global average, whereby mixing by precipitating convection dries lower levels and evaporates extensive and optically thick stratocumulus clouds. All else equal, subsidence reduces stratocumulus clouds (Myers and Norris, 2014). While models have both stratocumulus and shallow cumulus clouds over the northern tropical Atlantic in January-February, clouds there are observed to be nearly exclusively shallow cumulus.</w:t>
-      </w:r>
-    </w:p>
-    <w:p>
-      <w:pPr>
-        <w:pStyle w:val="BodyText"/>
-      </w:pPr>
-      <w:r>
-        <w:t>The combination of cloud fraction and optical depth observed depend on resolution.</w:t>
-      </w:r>
-    </w:p>
-    <w:p>
-      <w:pPr>
-        <w:pStyle w:val="BodyText"/>
-      </w:pPr>
-    </w:p>
-    <w:p>
-      <w:pPr>
-        <w:pStyle w:val="BodyText"/>
-      </w:pPr>
-      <w:r>
-        <w:t xml:space="preserve">The mass flux model forms more cumulus clouds to balance greater subsidence drying. While its lowest clouds increase with RH, we caution against extrapolating the mass flux model to stratocumulus clouds. Qualitatively unlike updraft plumes, stratocumulus clouds form in a layer of vertical gradients and diffusive turbulent eddies. While the mass flux model limits this study to shallow cumulus clouds, eddy diffusivity and mass flux </w:t>
-      </w:r>
-      <w:r>
-        <w:lastRenderedPageBreak/>
-        <w:t>schemes are needed to simulate interactions of shallow cumulus and stratocumulus clouds in climate models.</w:t>
+        <w:t>The mass flux model forms more cumulus clouds to balance greater subsidence drying. While its lowest clouds increase with RH, we caution against extrapolating the mass flux model to stratocumulus clouds. Qualitatively unlike updraft plumes, stratocumulus clouds form in a layer of vertical gradients and diffusive turbulent eddies. While the mass flux model limits this study to shallow cumulus clouds, eddy diffusivity and mass flux schemes are needed to simulate interactions of shallow cumulus and stratocumulus clouds in climate models.</w:t>
       </w:r>
     </w:p>
     <w:p>

</xml_diff>

<commit_message>
writing cloud fraction response to tot moisture sink rate section
</commit_message>
<xml_diff>
--- a/doc/DiM_ms20260713.docx
+++ b/doc/DiM_ms20260713.docx
@@ -1,6 +1,6 @@
 
 <file path=word/document.xml><?xml version="1.0" encoding="utf-8"?>
-<w:document xmlns:wpc="http://schemas.microsoft.com/office/word/2010/wordprocessingCanvas" xmlns:cx="http://schemas.microsoft.com/office/drawing/2014/chartex" xmlns:cx1="http://schemas.microsoft.com/office/drawing/2015/9/8/chartex" xmlns:cx2="http://schemas.microsoft.com/office/drawing/2015/10/21/chartex" xmlns:cx3="http://schemas.microsoft.com/office/drawing/2016/5/9/chartex" xmlns:cx4="http://schemas.microsoft.com/office/drawing/2016/5/10/chartex" xmlns:cx5="http://schemas.microsoft.com/office/drawing/2016/5/11/chartex" xmlns:cx6="http://schemas.microsoft.com/office/drawing/2016/5/12/chartex" xmlns:cx7="http://schemas.microsoft.com/office/drawing/2016/5/13/chartex" xmlns:cx8="http://schemas.microsoft.com/office/drawing/2016/5/14/chartex" xmlns:mc="http://schemas.openxmlformats.org/markup-compatibility/2006" xmlns:aink="http://schemas.microsoft.com/office/drawing/2016/ink" xmlns:am3d="http://schemas.microsoft.com/office/drawing/2017/model3d" xmlns:o="urn:schemas-microsoft-com:office:office" xmlns:oel="http://schemas.microsoft.com/office/2019/extlst" xmlns:r="http://schemas.openxmlformats.org/officeDocument/2006/relationships" xmlns:m="http://schemas.openxmlformats.org/officeDocument/2006/math" xmlns:v="urn:schemas-microsoft-com:vml" xmlns:wp14="http://schemas.microsoft.com/office/word/2010/wordprocessingDrawing" xmlns:wp="http://schemas.openxmlformats.org/drawingml/2006/wordprocessingDrawing" xmlns:w10="urn:schemas-microsoft-com:office:word" xmlns:w="http://schemas.openxmlformats.org/wordprocessingml/2006/main" xmlns:w14="http://schemas.microsoft.com/office/word/2010/wordml" xmlns:w15="http://schemas.microsoft.com/office/word/2012/wordml" xmlns:w16cex="http://schemas.microsoft.com/office/word/2018/wordml/cex" xmlns:w16cid="http://schemas.microsoft.com/office/word/2016/wordml/cid" xmlns:w16="http://schemas.microsoft.com/office/word/2018/wordml" xmlns:w16du="http://schemas.microsoft.com/office/word/2023/wordml/word16du" xmlns:w16sdtdh="http://schemas.microsoft.com/office/word/2020/wordml/sdtdatahash" xmlns:w16sdtfl="http://schemas.microsoft.com/office/word/2024/wordml/sdtformatlock" xmlns:w16se="http://schemas.microsoft.com/office/word/2015/wordml/symex" xmlns:wpg="http://schemas.microsoft.com/office/word/2010/wordprocessingGroup" xmlns:wpi="http://schemas.microsoft.com/office/word/2010/wordprocessingInk" xmlns:wne="http://schemas.microsoft.com/office/word/2006/wordml" xmlns:wps="http://schemas.microsoft.com/office/word/2010/wordprocessingShape" mc:Ignorable="w14 w15 w16se w16cid w16 w16cex w16sdtdh w16sdtfl w16du wp14">
+<w:document xmlns:wpc="http://schemas.microsoft.com/office/word/2010/wordprocessingCanvas" xmlns:cx="http://schemas.microsoft.com/office/drawing/2014/chartex" xmlns:cx1="http://schemas.microsoft.com/office/drawing/2015/9/8/chartex" xmlns:cx2="http://schemas.microsoft.com/office/drawing/2015/10/21/chartex" xmlns:cx3="http://schemas.microsoft.com/office/drawing/2016/5/9/chartex" xmlns:cx4="http://schemas.microsoft.com/office/drawing/2016/5/10/chartex" xmlns:cx5="http://schemas.microsoft.com/office/drawing/2016/5/11/chartex" xmlns:cx6="http://schemas.microsoft.com/office/drawing/2016/5/12/chartex" xmlns:cx7="http://schemas.microsoft.com/office/drawing/2016/5/13/chartex" xmlns:cx8="http://schemas.microsoft.com/office/drawing/2016/5/14/chartex" xmlns:mc="http://schemas.openxmlformats.org/markup-compatibility/2006" xmlns:m="http://schemas.openxmlformats.org/officeDocument/2006/math" xmlns:aink="http://schemas.microsoft.com/office/drawing/2016/ink" xmlns:am3d="http://schemas.microsoft.com/office/drawing/2017/model3d" xmlns:oel="http://schemas.microsoft.com/office/2019/extlst" xmlns:r="http://schemas.openxmlformats.org/officeDocument/2006/relationships" xmlns:wp14="http://schemas.microsoft.com/office/word/2010/wordprocessingDrawing" xmlns:wp="http://schemas.openxmlformats.org/drawingml/2006/wordprocessingDrawing" xmlns:wpg="http://schemas.microsoft.com/office/word/2010/wordprocessingGroup" xmlns:wpi="http://schemas.microsoft.com/office/word/2010/wordprocessingInk" xmlns:wps="http://schemas.microsoft.com/office/word/2010/wordprocessingShape" xmlns:o="urn:schemas-microsoft-com:office:office" xmlns:v="urn:schemas-microsoft-com:vml" xmlns:w10="urn:schemas-microsoft-com:office:word" xmlns:w="http://schemas.openxmlformats.org/wordprocessingml/2006/main" xmlns:w14="http://schemas.microsoft.com/office/word/2010/wordml" xmlns:w15="http://schemas.microsoft.com/office/word/2012/wordml" xmlns:w16cei="http://schemas.microsoft.com/office/word/2026/wordml/cei" xmlns:w16cex="http://schemas.microsoft.com/office/word/2018/wordml/cex" xmlns:w16cid="http://schemas.microsoft.com/office/word/2016/wordml/cid" xmlns:w16="http://schemas.microsoft.com/office/word/2018/wordml" xmlns:w16sdtdh="http://schemas.microsoft.com/office/word/2020/wordml/sdtdatahash" xmlns:w16sdtfl="http://schemas.microsoft.com/office/word/2024/wordml/sdtformatlock" xmlns:w16se="http://schemas.microsoft.com/office/word/2015/wordml/symex" xmlns:w16du="http://schemas.microsoft.com/office/word/2023/wordml/word16du" xmlns:wne="http://schemas.microsoft.com/office/word/2006/wordml" mc:Ignorable="w14 w15 w16se w16cid w16 w16cex w16sdtdh w16sdtfl w16du wp14">
   <w:body>
     <w:p>
       <w:pPr>
@@ -591,52 +591,99 @@
         <w:t>decrease with warming</w:t>
       </w:r>
       <w:r>
+        <w:t xml:space="preserve"> (ISCCP, Zelinka XXXX, Webb XXXX, Jin et al. 2026), </w:t>
+      </w:r>
+      <w:proofErr w:type="gramStart"/>
+      <w:r>
+        <w:t>a positive shortwave radiative cloud feedback</w:t>
+      </w:r>
+      <w:proofErr w:type="gramEnd"/>
+      <w:r>
+        <w:t xml:space="preserve">. </w:t>
+      </w:r>
+      <w:r>
+        <w:rPr>
+          <w:rFonts w:ascii="Aptos" w:hAnsi="Aptos"/>
+        </w:rPr>
+        <w:t>V</w:t>
+      </w:r>
+      <w:r>
+        <w:rPr>
+          <w:rFonts w:ascii="Aptos" w:hAnsi="Aptos"/>
+        </w:rPr>
+        <w:t xml:space="preserve">ariation of </w:t>
+      </w:r>
+      <w:r>
+        <w:rPr>
+          <w:rFonts w:ascii="Aptos" w:hAnsi="Aptos"/>
+        </w:rPr>
+        <w:t>the shallow cumulus</w:t>
+      </w:r>
+      <w:r>
+        <w:rPr>
+          <w:rFonts w:ascii="Aptos" w:hAnsi="Aptos"/>
+        </w:rPr>
+        <w:t xml:space="preserve"> feedback </w:t>
+      </w:r>
+      <w:r>
+        <w:rPr>
+          <w:rFonts w:ascii="Aptos" w:hAnsi="Aptos"/>
+        </w:rPr>
+        <w:t>drive</w:t>
+      </w:r>
+      <w:r>
+        <w:rPr>
+          <w:rFonts w:ascii="Aptos" w:hAnsi="Aptos"/>
+        </w:rPr>
+        <w:t>s</w:t>
+      </w:r>
+      <w:r>
+        <w:rPr>
+          <w:rFonts w:ascii="Aptos" w:hAnsi="Aptos"/>
+        </w:rPr>
+        <w:t xml:space="preserve"> variations among climate models in the </w:t>
+      </w:r>
+      <w:r>
+        <w:rPr>
+          <w:rFonts w:ascii="Aptos" w:hAnsi="Aptos"/>
+        </w:rPr>
+        <w:t xml:space="preserve">sensitivity </w:t>
+      </w:r>
+      <w:r>
+        <w:rPr>
+          <w:rFonts w:ascii="Aptos" w:hAnsi="Aptos"/>
+        </w:rPr>
+        <w:t xml:space="preserve">of temperature </w:t>
+      </w:r>
+      <w:r>
+        <w:rPr>
+          <w:rFonts w:ascii="Aptos" w:hAnsi="Aptos"/>
+        </w:rPr>
+        <w:t xml:space="preserve">to CO2 </w:t>
+      </w:r>
+      <w:r>
+        <w:rPr>
+          <w:rFonts w:ascii="Aptos" w:hAnsi="Aptos"/>
+        </w:rPr>
+        <w:t xml:space="preserve">(Bony et al. 2005; Bony and Dufresne, 2006). </w:t>
+      </w:r>
+      <w:r>
+        <w:rPr>
+          <w:rFonts w:ascii="Aptos" w:hAnsi="Aptos"/>
+        </w:rPr>
+        <w:t>Satellite observations of the last decades show clearing of optically thin low clouds represents the strongest contribution to shortwave cloud feedback (Jin et al. 2026), and in models, clearing of shallow cumulus</w:t>
+      </w:r>
+      <w:r>
+        <w:rPr>
+          <w:rFonts w:ascii="Aptos" w:hAnsi="Aptos"/>
+        </w:rPr>
         <w:t xml:space="preserve"> </w:t>
       </w:r>
       <w:r>
-        <w:t>(ISCCP, Zelinka XXXX, Webb XXXX</w:t>
-      </w:r>
-      <w:r>
-        <w:t>, Jin et al. 2026</w:t>
-      </w:r>
-      <w:r>
-        <w:t>)</w:t>
-      </w:r>
-      <w:r>
-        <w:t>, a positive shortwave radiative cloud feedback</w:t>
-      </w:r>
-      <w:r>
-        <w:t xml:space="preserve">. </w:t>
-      </w:r>
-      <w:r>
-        <w:rPr>
-          <w:rFonts w:ascii="Aptos" w:hAnsi="Aptos"/>
-        </w:rPr>
-        <w:t>V</w:t>
-      </w:r>
-      <w:r>
-        <w:rPr>
-          <w:rFonts w:ascii="Aptos" w:hAnsi="Aptos"/>
-        </w:rPr>
-        <w:t xml:space="preserve">ariation of </w:t>
-      </w:r>
-      <w:r>
-        <w:rPr>
-          <w:rFonts w:ascii="Aptos" w:hAnsi="Aptos"/>
-        </w:rPr>
-        <w:t>the shallow cumulus</w:t>
-      </w:r>
-      <w:r>
-        <w:rPr>
-          <w:rFonts w:ascii="Aptos" w:hAnsi="Aptos"/>
-        </w:rPr>
-        <w:t xml:space="preserve"> feedback </w:t>
-      </w:r>
-      <w:r>
-        <w:rPr>
-          <w:rFonts w:ascii="Aptos" w:hAnsi="Aptos"/>
-        </w:rPr>
-        <w:t>drive</w:t>
+        <w:rPr>
+          <w:rFonts w:ascii="Aptos" w:hAnsi="Aptos"/>
+        </w:rPr>
+        <w:t>cloud</w:t>
       </w:r>
       <w:r>
         <w:rPr>
@@ -648,91 +695,7 @@
         <w:rPr>
           <w:rFonts w:ascii="Aptos" w:hAnsi="Aptos"/>
         </w:rPr>
-        <w:t xml:space="preserve"> variations among climate models in the </w:t>
-      </w:r>
-      <w:r>
-        <w:rPr>
-          <w:rFonts w:ascii="Aptos" w:hAnsi="Aptos"/>
-        </w:rPr>
-        <w:t xml:space="preserve">sensitivity </w:t>
-      </w:r>
-      <w:r>
-        <w:rPr>
-          <w:rFonts w:ascii="Aptos" w:hAnsi="Aptos"/>
-        </w:rPr>
-        <w:t xml:space="preserve">of temperature </w:t>
-      </w:r>
-      <w:r>
-        <w:rPr>
-          <w:rFonts w:ascii="Aptos" w:hAnsi="Aptos"/>
-        </w:rPr>
-        <w:t>to CO2</w:t>
-      </w:r>
-      <w:r>
-        <w:rPr>
-          <w:rFonts w:ascii="Aptos" w:hAnsi="Aptos"/>
-        </w:rPr>
-        <w:t xml:space="preserve"> </w:t>
-      </w:r>
-      <w:r>
-        <w:rPr>
-          <w:rFonts w:ascii="Aptos" w:hAnsi="Aptos"/>
-        </w:rPr>
-        <w:t xml:space="preserve">(Bony et al. 2005; Bony and Dufresne, 2006). </w:t>
-      </w:r>
-      <w:r>
-        <w:rPr>
-          <w:rFonts w:ascii="Aptos" w:hAnsi="Aptos"/>
-        </w:rPr>
-        <w:t xml:space="preserve">Satellite observations </w:t>
-      </w:r>
-      <w:r>
-        <w:rPr>
-          <w:rFonts w:ascii="Aptos" w:hAnsi="Aptos"/>
-        </w:rPr>
-        <w:t xml:space="preserve">of the last decades </w:t>
-      </w:r>
-      <w:r>
-        <w:rPr>
-          <w:rFonts w:ascii="Aptos" w:hAnsi="Aptos"/>
-        </w:rPr>
-        <w:t xml:space="preserve">show clearing of optically thin low clouds represents the strongest </w:t>
-      </w:r>
-      <w:r>
-        <w:rPr>
-          <w:rFonts w:ascii="Aptos" w:hAnsi="Aptos"/>
-        </w:rPr>
-        <w:t xml:space="preserve">contribution to </w:t>
-      </w:r>
-      <w:r>
-        <w:rPr>
-          <w:rFonts w:ascii="Aptos" w:hAnsi="Aptos"/>
-        </w:rPr>
-        <w:t>s</w:t>
-      </w:r>
-      <w:r>
-        <w:rPr>
-          <w:rFonts w:ascii="Aptos" w:hAnsi="Aptos"/>
-        </w:rPr>
-        <w:t>hortwave</w:t>
-      </w:r>
-      <w:r>
-        <w:rPr>
-          <w:rFonts w:ascii="Aptos" w:hAnsi="Aptos"/>
-        </w:rPr>
-        <w:t xml:space="preserve"> cloud feedback (Jin et al. 2026)</w:t>
-      </w:r>
-      <w:r>
-        <w:rPr>
-          <w:rFonts w:ascii="Aptos" w:hAnsi="Aptos"/>
-        </w:rPr>
-        <w:t>, and in models, clearing of shallow cumulus</w:t>
-      </w:r>
-      <w:r>
-        <w:rPr>
-          <w:rFonts w:ascii="Aptos" w:hAnsi="Aptos"/>
-        </w:rPr>
-        <w:t xml:space="preserve"> </w:t>
+        <w:t xml:space="preserve"> in that </w:t>
       </w:r>
       <w:r>
         <w:rPr>
@@ -744,31 +707,27 @@
         <w:rPr>
           <w:rFonts w:ascii="Aptos" w:hAnsi="Aptos"/>
         </w:rPr>
-        <w:t>s</w:t>
-      </w:r>
-      <w:r>
-        <w:rPr>
-          <w:rFonts w:ascii="Aptos" w:hAnsi="Aptos"/>
-        </w:rPr>
-        <w:t xml:space="preserve"> in that </w:t>
-      </w:r>
-      <w:r>
-        <w:rPr>
-          <w:rFonts w:ascii="Aptos" w:hAnsi="Aptos"/>
-        </w:rPr>
-        <w:t>cloud</w:t>
-      </w:r>
-      <w:r>
-        <w:rPr>
-          <w:rFonts w:ascii="Aptos" w:hAnsi="Aptos"/>
-        </w:rPr>
         <w:t xml:space="preserve"> regime</w:t>
       </w:r>
       <w:r>
         <w:rPr>
           <w:rFonts w:ascii="Aptos" w:hAnsi="Aptos"/>
         </w:rPr>
-        <w:t xml:space="preserve"> dominate feedbacks from changes in </w:t>
+        <w:t xml:space="preserve"> dominate </w:t>
+      </w:r>
+      <w:proofErr w:type="gramStart"/>
+      <w:r>
+        <w:rPr>
+          <w:rFonts w:ascii="Aptos" w:hAnsi="Aptos"/>
+        </w:rPr>
+        <w:t>feedbacks</w:t>
+      </w:r>
+      <w:proofErr w:type="gramEnd"/>
+      <w:r>
+        <w:rPr>
+          <w:rFonts w:ascii="Aptos" w:hAnsi="Aptos"/>
+        </w:rPr>
+        <w:t xml:space="preserve"> from changes in </w:t>
       </w:r>
       <w:r>
         <w:rPr>
@@ -940,143 +899,216 @@
         <w:spacing w:line="276" w:lineRule="auto"/>
       </w:pPr>
       <w:r>
-        <w:lastRenderedPageBreak/>
         <w:t>The sensitivity of clouds to mixing depends on desiccati</w:t>
       </w:r>
       <w:r>
         <w:t>on of</w:t>
       </w:r>
       <w:r>
+        <w:t xml:space="preserve"> layers of thin clouds near</w:t>
+      </w:r>
+      <w:r>
+        <w:t xml:space="preserve"> the lifting condensation level (LCL)</w:t>
+      </w:r>
+      <w:r>
+        <w:t xml:space="preserve">. In the winter northeastern tropical Pacific, </w:t>
+      </w:r>
+      <w:r>
+        <w:t xml:space="preserve">EUREC4A airborne lidar and radar </w:t>
+      </w:r>
+      <w:r>
+        <w:t xml:space="preserve">observed </w:t>
+      </w:r>
+      <w:r>
+        <w:t xml:space="preserve">cloud-base cloud fraction </w:t>
+      </w:r>
+      <w:r>
+        <w:t>of</w:t>
+      </w:r>
+      <w:r>
+        <w:t xml:space="preserve"> 5.4 % (BASTILIAS XXXX, Vogel et al. 2022)</w:t>
+      </w:r>
+      <w:r>
+        <w:t xml:space="preserve">. </w:t>
+      </w:r>
+      <w:r>
+        <w:t>Satellite albedo from GOES shows</w:t>
+      </w:r>
+      <w:r>
+        <w:t xml:space="preserve"> shallow clouds have </w:t>
+      </w:r>
+      <w:r>
+        <w:t>3%</w:t>
+      </w:r>
+      <w:r>
+        <w:t xml:space="preserve"> cloud fraction </w:t>
+      </w:r>
+      <w:r>
+        <w:t xml:space="preserve">below 1 km </w:t>
+      </w:r>
+      <w:r>
+        <w:t>(</w:t>
+      </w:r>
+      <w:r>
+        <w:t>by random overlap</w:t>
+      </w:r>
+      <w:r>
+        <w:t>;</w:t>
+      </w:r>
+      <w:r>
+        <w:t xml:space="preserve"> 8 % by maximum overlap</w:t>
+      </w:r>
+      <w:r>
+        <w:t xml:space="preserve"> with clouds below 4 km</w:t>
+      </w:r>
+      <w:r>
+        <w:t xml:space="preserve">; Fig. </w:t>
+      </w:r>
+      <w:r>
+        <w:t>REFLALBEDO</w:t>
+      </w:r>
+      <w:r>
+        <w:t xml:space="preserve">). </w:t>
+      </w:r>
+      <w:r>
+        <w:rPr>
+          <w:lang w:val="fr-FR"/>
+        </w:rPr>
+        <w:t>O</w:t>
+      </w:r>
+      <w:r>
+        <w:rPr>
+          <w:lang w:val="fr-FR"/>
+        </w:rPr>
+        <w:t>bservations</w:t>
+      </w:r>
+      <w:r>
+        <w:rPr>
+          <w:lang w:val="fr-FR"/>
+        </w:rPr>
         <w:t xml:space="preserve"> </w:t>
       </w:r>
       <w:r>
-        <w:t xml:space="preserve">layers of thin </w:t>
-      </w:r>
-      <w:r>
-        <w:t>cloud</w:t>
-      </w:r>
-      <w:r>
-        <w:t>s</w:t>
-      </w:r>
-      <w:r>
-        <w:t xml:space="preserve"> near</w:t>
-      </w:r>
-      <w:r>
-        <w:t xml:space="preserve"> the lifting condensation level (LCL)</w:t>
-      </w:r>
-      <w:r>
-        <w:t xml:space="preserve">. In the winter northeastern tropical Pacific, </w:t>
-      </w:r>
-      <w:r>
-        <w:t xml:space="preserve">EUREC4A airborne lidar and radar </w:t>
-      </w:r>
-      <w:r>
-        <w:t xml:space="preserve">observed </w:t>
-      </w:r>
-      <w:r>
-        <w:t xml:space="preserve">cloud-base cloud fraction </w:t>
-      </w:r>
-      <w:r>
-        <w:t>of</w:t>
-      </w:r>
-      <w:r>
-        <w:t xml:space="preserve"> 5.4 % (BASTILIAS XXXX, Vogel et al. 2022)</w:t>
-      </w:r>
-      <w:r>
-        <w:t xml:space="preserve">. </w:t>
-      </w:r>
-      <w:r>
-        <w:t>Satellite albedo from GOES shows</w:t>
-      </w:r>
-      <w:r>
-        <w:t xml:space="preserve"> shallow clouds have </w:t>
-      </w:r>
-      <w:r>
-        <w:t>3%</w:t>
-      </w:r>
-      <w:r>
-        <w:t xml:space="preserve"> cloud fraction </w:t>
-      </w:r>
-      <w:r>
-        <w:t xml:space="preserve">below 1 km </w:t>
-      </w:r>
-      <w:r>
-        <w:t>(</w:t>
-      </w:r>
-      <w:r>
-        <w:t>by random overlap</w:t>
-      </w:r>
-      <w:r>
+        <w:rPr>
+          <w:lang w:val="fr-FR"/>
+        </w:rPr>
+        <w:t xml:space="preserve">and LES </w:t>
+      </w:r>
+      <w:proofErr w:type="spellStart"/>
+      <w:r>
+        <w:rPr>
+          <w:lang w:val="fr-FR"/>
+        </w:rPr>
+        <w:t>suggest</w:t>
+      </w:r>
+      <w:proofErr w:type="spellEnd"/>
+      <w:r>
+        <w:rPr>
+          <w:lang w:val="fr-FR"/>
+        </w:rPr>
+        <w:t xml:space="preserve"> subcloud turbulence </w:t>
+      </w:r>
+      <w:proofErr w:type="spellStart"/>
+      <w:r>
+        <w:rPr>
+          <w:lang w:val="fr-FR"/>
+        </w:rPr>
+        <w:t>moderates</w:t>
+      </w:r>
+      <w:proofErr w:type="spellEnd"/>
+      <w:r>
+        <w:rPr>
+          <w:lang w:val="fr-FR"/>
+        </w:rPr>
+        <w:t xml:space="preserve"> cloud base </w:t>
+      </w:r>
+      <w:proofErr w:type="spellStart"/>
+      <w:r>
+        <w:rPr>
+          <w:lang w:val="fr-FR"/>
+        </w:rPr>
+        <w:t>moisture</w:t>
+      </w:r>
+      <w:proofErr w:type="spellEnd"/>
+      <w:r>
+        <w:rPr>
+          <w:lang w:val="fr-FR"/>
+        </w:rPr>
+        <w:t xml:space="preserve"> and </w:t>
+      </w:r>
+      <w:r>
+        <w:rPr>
+          <w:lang w:val="fr-FR"/>
+        </w:rPr>
+        <w:t xml:space="preserve">cloud fraction </w:t>
+      </w:r>
+      <w:r>
+        <w:rPr>
+          <w:lang w:val="fr-FR"/>
+        </w:rPr>
+        <w:t xml:space="preserve">(Nuijens et al. </w:t>
+      </w:r>
+      <w:proofErr w:type="gramStart"/>
+      <w:r>
+        <w:rPr>
+          <w:lang w:val="fr-FR"/>
+        </w:rPr>
+        <w:t>2013;</w:t>
+      </w:r>
+      <w:proofErr w:type="gramEnd"/>
+      <w:r>
+        <w:rPr>
+          <w:lang w:val="fr-FR"/>
+        </w:rPr>
+        <w:t xml:space="preserve"> Brient et al. </w:t>
+      </w:r>
+      <w:proofErr w:type="gramStart"/>
+      <w:r>
+        <w:rPr>
+          <w:lang w:val="fr-FR"/>
+        </w:rPr>
+        <w:t>2016;</w:t>
+      </w:r>
+      <w:proofErr w:type="gramEnd"/>
+      <w:r>
+        <w:rPr>
+          <w:lang w:val="fr-FR"/>
+        </w:rPr>
+        <w:t xml:space="preserve"> Vial et al. </w:t>
+      </w:r>
+      <w:proofErr w:type="gramStart"/>
+      <w:r>
+        <w:rPr>
+          <w:lang w:val="fr-FR"/>
+        </w:rPr>
+        <w:t>2017;</w:t>
+      </w:r>
+      <w:proofErr w:type="gramEnd"/>
+      <w:r>
+        <w:rPr>
+          <w:lang w:val="fr-FR"/>
+        </w:rPr>
+        <w:t xml:space="preserve"> Vogel et al. </w:t>
+      </w:r>
+      <w:proofErr w:type="gramStart"/>
+      <w:r>
+        <w:rPr>
+          <w:lang w:val="fr-FR"/>
+        </w:rPr>
+        <w:t>2022</w:t>
+      </w:r>
+      <w:r>
+        <w:rPr>
+          <w:lang w:val="fr-FR"/>
+        </w:rPr>
         <w:t>;</w:t>
       </w:r>
-      <w:r>
-        <w:t xml:space="preserve"> 8 % by maximum overlap</w:t>
-      </w:r>
-      <w:r>
-        <w:t xml:space="preserve"> with clouds below 4 km</w:t>
-      </w:r>
-      <w:r>
-        <w:t xml:space="preserve">; Fig. </w:t>
-      </w:r>
-      <w:r>
-        <w:t>REFLALBEDO</w:t>
-      </w:r>
-      <w:r>
-        <w:t xml:space="preserve">). </w:t>
-      </w:r>
+      <w:proofErr w:type="gramEnd"/>
       <w:r>
         <w:rPr>
           <w:lang w:val="fr-FR"/>
         </w:rPr>
-        <w:t>O</w:t>
-      </w:r>
-      <w:r>
-        <w:rPr>
-          <w:lang w:val="fr-FR"/>
-        </w:rPr>
-        <w:t>bservations</w:t>
-      </w:r>
-      <w:r>
-        <w:rPr>
-          <w:lang w:val="fr-FR"/>
-        </w:rPr>
-        <w:t xml:space="preserve"> </w:t>
-      </w:r>
-      <w:r>
-        <w:rPr>
-          <w:lang w:val="fr-FR"/>
-        </w:rPr>
-        <w:t xml:space="preserve">and LES </w:t>
-      </w:r>
-      <w:r>
-        <w:rPr>
-          <w:lang w:val="fr-FR"/>
-        </w:rPr>
-        <w:t>suggest subcloud turbulence moderates cloud base moisture</w:t>
-      </w:r>
-      <w:r>
-        <w:rPr>
-          <w:lang w:val="fr-FR"/>
-        </w:rPr>
-        <w:t xml:space="preserve"> and </w:t>
-      </w:r>
-      <w:r>
-        <w:rPr>
-          <w:lang w:val="fr-FR"/>
-        </w:rPr>
-        <w:t xml:space="preserve">cloud fraction </w:t>
-      </w:r>
-      <w:r>
-        <w:rPr>
-          <w:lang w:val="fr-FR"/>
-        </w:rPr>
-        <w:t>(Nuijens et al. 2013; Brient et al. 2016; Vial et al. 2017; Vogel et al. 2022</w:t>
-      </w:r>
-      <w:r>
-        <w:rPr>
-          <w:lang w:val="fr-FR"/>
-        </w:rPr>
-        <w:t xml:space="preserve">; Bretherton et al. 2013). </w:t>
+        <w:t xml:space="preserve"> Bretherton et al. 2013). </w:t>
       </w:r>
       <w:r>
         <w:t xml:space="preserve">CMIP6 atmosphere models in the Cloud Forcing Intercomparison Project (CFMIP) have excessive stratocumulus clouds </w:t>
@@ -1120,13 +1152,21 @@
         <w:t xml:space="preserve"> in 4 of 5 models</w:t>
       </w:r>
       <w:r>
-        <w:t>, a</w:t>
+        <w:t xml:space="preserve">, </w:t>
+      </w:r>
+      <w:proofErr w:type="gramStart"/>
+      <w:r>
+        <w:t>a</w:t>
       </w:r>
       <w:r>
         <w:t xml:space="preserve"> </w:t>
       </w:r>
       <w:r>
-        <w:t>negative feedback (Huang et al. 2026).</w:t>
+        <w:t>negative feedback (Huang et al. 2026)</w:t>
+      </w:r>
+      <w:proofErr w:type="gramEnd"/>
+      <w:r>
+        <w:t>.</w:t>
       </w:r>
     </w:p>
     <w:p>
@@ -1221,8 +1261,16 @@
         <w:rPr>
           <w:rFonts w:ascii="Aptos Narrow" w:hAnsi="Aptos Narrow"/>
         </w:rPr>
-        <w:t>equency of occurence</w:t>
-      </w:r>
+        <w:t xml:space="preserve">equency of </w:t>
+      </w:r>
+      <w:proofErr w:type="spellStart"/>
+      <w:r>
+        <w:rPr>
+          <w:rFonts w:ascii="Aptos Narrow" w:hAnsi="Aptos Narrow"/>
+        </w:rPr>
+        <w:t>occurence</w:t>
+      </w:r>
+      <w:proofErr w:type="spellEnd"/>
       <w:r>
         <w:rPr>
           <w:rFonts w:ascii="Aptos Narrow" w:hAnsi="Aptos Narrow"/>
@@ -1303,14 +1351,7 @@
         <w:rPr>
           <w:rFonts w:ascii="Aptos" w:hAnsi="Aptos"/>
         </w:rPr>
-        <w:t xml:space="preserve">by desiccating the shallow cumulus layer. Field observations from EUREC4A (Stevens et al. 2021; George et al. 2022) show clouds are correlated more </w:t>
-      </w:r>
-      <w:r>
-        <w:rPr>
-          <w:rFonts w:ascii="Aptos" w:hAnsi="Aptos"/>
-        </w:rPr>
-        <w:lastRenderedPageBreak/>
-        <w:t xml:space="preserve">strongly </w:t>
+        <w:t xml:space="preserve">by desiccating the shallow cumulus layer. Field observations from EUREC4A (Stevens et al. 2021; George et al. 2022) show clouds are correlated more strongly </w:t>
       </w:r>
       <w:r>
         <w:rPr>
@@ -1318,12 +1359,14 @@
         </w:rPr>
         <w:t xml:space="preserve">(R = </w:t>
       </w:r>
+      <w:proofErr w:type="gramStart"/>
       <w:r>
         <w:rPr>
           <w:rFonts w:ascii="Aptos" w:hAnsi="Aptos"/>
         </w:rPr>
         <w:t>0.6X??</w:t>
       </w:r>
+      <w:proofErr w:type="gramEnd"/>
       <w:r>
         <w:rPr>
           <w:rFonts w:ascii="Aptos" w:hAnsi="Aptos"/>
@@ -1420,13 +1463,7 @@
         <w:pStyle w:val="BodyText"/>
       </w:pPr>
       <w:r>
-        <w:t>Th</w:t>
-      </w:r>
-      <w:r>
-        <w:t>e</w:t>
-      </w:r>
-      <w:r>
-        <w:t xml:space="preserve"> </w:t>
+        <w:t xml:space="preserve">The </w:t>
       </w:r>
       <w:r>
         <w:t>decrease in mass flux</w:t>
@@ -1539,10 +1576,7 @@
         <w:t>precipitation</w:t>
       </w:r>
       <w:r>
-        <w:t xml:space="preserve"> and +7% increase in specific humidity </w:t>
-      </w:r>
-      <w:r>
-        <w:t>(Held and Soden, 2006, HS06; Vecchi and Soden, 2007)</w:t>
+        <w:t xml:space="preserve"> and +7% increase in specific humidity (Held and Soden, 2006, HS06; Vecchi and Soden, 2007)</w:t>
       </w:r>
       <w:r>
         <w:t xml:space="preserve">. </w:t>
@@ -2062,31 +2096,7 @@
         <w:rPr>
           <w:rFonts w:eastAsiaTheme="minorEastAsia"/>
         </w:rPr>
-        <w:t xml:space="preserve"> decrease</w:t>
-      </w:r>
-      <w:r>
-        <w:rPr>
-          <w:rFonts w:eastAsiaTheme="minorEastAsia"/>
-        </w:rPr>
-        <w:t>s</w:t>
-      </w:r>
-      <w:r>
-        <w:rPr>
-          <w:rFonts w:eastAsiaTheme="minorEastAsia"/>
-        </w:rPr>
-        <w:t xml:space="preserve"> -5% in response to</w:t>
-      </w:r>
-      <w:r>
-        <w:rPr>
-          <w:rFonts w:eastAsiaTheme="minorEastAsia"/>
-        </w:rPr>
-        <w:t xml:space="preserve"> circulation</w:t>
-      </w:r>
-      <w:r>
-        <w:rPr>
-          <w:rFonts w:eastAsiaTheme="minorEastAsia"/>
-        </w:rPr>
-        <w:t xml:space="preserve"> </w:t>
+        <w:t xml:space="preserve"> decreases -5% in response to circulation </w:t>
       </w:r>
       <m:oMath>
         <m:r>
@@ -2114,19 +2124,7 @@
         <w:rPr>
           <w:rFonts w:ascii="Aptos" w:hAnsi="Aptos"/>
         </w:rPr>
-        <w:t>(</w:t>
-      </w:r>
-      <w:r>
-        <w:rPr>
-          <w:rFonts w:ascii="Aptos" w:hAnsi="Aptos"/>
-        </w:rPr>
-        <w:t>3</w:t>
-      </w:r>
-      <w:r>
-        <w:rPr>
-          <w:rFonts w:ascii="Aptos" w:hAnsi="Aptos"/>
-        </w:rPr>
-        <w:t xml:space="preserve">) </w:t>
+        <w:t xml:space="preserve">(3) </w:t>
       </w:r>
       <w:r>
         <w:rPr>
@@ -2292,13 +2290,7 @@
         </w:rPr>
       </w:pPr>
       <w:r>
-        <w:t>(</w:t>
-      </w:r>
-      <w:r>
-        <w:t>4</w:t>
-      </w:r>
-      <w:r>
-        <w:t xml:space="preserve">) </w:t>
+        <w:t xml:space="preserve">(4) </w:t>
       </w:r>
       <w:r>
         <w:t xml:space="preserve">The shallow cumulus cloud fraction is proportional to mass flux, </w:t>
@@ -2789,13 +2781,7 @@
         <w:rPr>
           <w:rFonts w:ascii="Aptos" w:hAnsi="Aptos"/>
         </w:rPr>
-        <w:t xml:space="preserve">predicting the shallow cumulus cloud albedo </w:t>
-      </w:r>
-      <w:r>
-        <w:rPr>
-          <w:rFonts w:ascii="Aptos" w:hAnsi="Aptos"/>
-        </w:rPr>
-        <w:t>dims with warming</w:t>
+        <w:t>predicting the shallow cumulus cloud albedo dims with warming</w:t>
       </w:r>
       <w:r>
         <w:rPr>
@@ -2914,26 +2900,19 @@
       <w:r>
         <w:t xml:space="preserve"> generates </w:t>
       </w:r>
-      <w:r>
-        <w:t xml:space="preserve">a positive radiative feedback that scales with the </w:t>
-      </w:r>
-      <w:r>
-        <w:t xml:space="preserve">planetary </w:t>
+      <w:proofErr w:type="gramStart"/>
+      <w:r>
+        <w:t>a positive radiative feedback</w:t>
+      </w:r>
+      <w:proofErr w:type="gramEnd"/>
+      <w:r>
+        <w:t xml:space="preserve"> that scales with the planetary </w:t>
       </w:r>
       <w:r>
         <w:t>albedo</w:t>
       </w:r>
       <w:r>
-        <w:t xml:space="preserve"> of </w:t>
-      </w:r>
-      <w:r>
-        <w:t>shallow cumulus cloud</w:t>
-      </w:r>
-      <w:r>
-        <w:t>s</w:t>
-      </w:r>
-      <w:r>
-        <w:t>.</w:t>
+        <w:t xml:space="preserve"> of shallow cumulus clouds.</w:t>
       </w:r>
     </w:p>
     <w:p>
@@ -2967,7 +2946,21 @@
         <w:rPr>
           <w:rFonts w:eastAsiaTheme="minorEastAsia"/>
         </w:rPr>
-        <w:t>The autoconversion of cloud droplets to precipitation, the lateral entrainment rate, and the ratio of the area of active updraft to cloud area, are set to match emergent properties of the clouds in the present climate, and are not expected to change with thermodynamic and circulation responses to CO2.</w:t>
+        <w:t xml:space="preserve">The autoconversion of cloud droplets to precipitation, the lateral entrainment rate, and the ratio of the area of active updraft to cloud area, are set to match emergent properties of the clouds in the present </w:t>
+      </w:r>
+      <w:proofErr w:type="gramStart"/>
+      <w:r>
+        <w:rPr>
+          <w:rFonts w:eastAsiaTheme="minorEastAsia"/>
+        </w:rPr>
+        <w:t>climate, and</w:t>
+      </w:r>
+      <w:proofErr w:type="gramEnd"/>
+      <w:r>
+        <w:rPr>
+          <w:rFonts w:eastAsiaTheme="minorEastAsia"/>
+        </w:rPr>
+        <w:t xml:space="preserve"> are not expected to change with thermodynamic and circulation responses to CO2.</w:t>
       </w:r>
     </w:p>
     <w:p>
@@ -2978,7 +2971,6 @@
         <w:rPr>
           <w:rFonts w:ascii="Aptos" w:hAnsi="Aptos"/>
         </w:rPr>
-        <w:lastRenderedPageBreak/>
         <w:t>A</w:t>
       </w:r>
       <w:r>
@@ -3021,13 +3013,21 @@
         <w:rPr>
           <w:rFonts w:ascii="Aptos" w:hAnsi="Aptos"/>
         </w:rPr>
-        <w:t>Updraft water in excess of the saturation specific humidity condenses as cloud liquid.</w:t>
-      </w:r>
-      <w:r>
-        <w:rPr>
-          <w:rFonts w:ascii="Aptos" w:hAnsi="Aptos"/>
-        </w:rPr>
-        <w:t xml:space="preserve"> C</w:t>
+        <w:t xml:space="preserve">Updraft water </w:t>
+      </w:r>
+      <w:proofErr w:type="gramStart"/>
+      <w:r>
+        <w:rPr>
+          <w:rFonts w:ascii="Aptos" w:hAnsi="Aptos"/>
+        </w:rPr>
+        <w:t>in excess of</w:t>
+      </w:r>
+      <w:proofErr w:type="gramEnd"/>
+      <w:r>
+        <w:rPr>
+          <w:rFonts w:ascii="Aptos" w:hAnsi="Aptos"/>
+        </w:rPr>
+        <w:t xml:space="preserve"> the saturation specific humidity condenses as cloud liquid. C</w:t>
       </w:r>
       <w:r>
         <w:rPr>
@@ -3063,52 +3063,16 @@
         <w:rPr>
           <w:rFonts w:eastAsiaTheme="minorEastAsia"/>
         </w:rPr>
-        <w:t xml:space="preserve">The </w:t>
+        <w:t xml:space="preserve">The total moisture sink rate </w:t>
+      </w:r>
+      <w:r>
+        <w:t xml:space="preserve">(vapor entrainment and liquid autoconversion) </w:t>
       </w:r>
       <w:r>
         <w:rPr>
           <w:rFonts w:eastAsiaTheme="minorEastAsia"/>
         </w:rPr>
-        <w:t xml:space="preserve">total </w:t>
-      </w:r>
-      <w:r>
-        <w:rPr>
-          <w:rFonts w:eastAsiaTheme="minorEastAsia"/>
-        </w:rPr>
-        <w:t xml:space="preserve">moisture sink rate </w:t>
-      </w:r>
-      <w:r>
-        <w:t>(</w:t>
-      </w:r>
-      <w:r>
-        <w:t xml:space="preserve">vapor </w:t>
-      </w:r>
-      <w:r>
-        <w:t xml:space="preserve">entrainment </w:t>
-      </w:r>
-      <w:r>
-        <w:t>and</w:t>
-      </w:r>
-      <w:r>
-        <w:t xml:space="preserve"> </w:t>
-      </w:r>
-      <w:r>
-        <w:t xml:space="preserve">liquid </w:t>
-      </w:r>
-      <w:r>
-        <w:t xml:space="preserve">autoconversion) </w:t>
-      </w:r>
-      <w:r>
-        <w:rPr>
-          <w:rFonts w:eastAsiaTheme="minorEastAsia"/>
-        </w:rPr>
-        <w:t>parameterizes turbulence-scale processes within the clouds</w:t>
-      </w:r>
-      <w:r>
-        <w:rPr>
-          <w:rFonts w:eastAsiaTheme="minorEastAsia"/>
-        </w:rPr>
-        <w:t xml:space="preserve"> and </w:t>
+        <w:t xml:space="preserve">parameterizes turbulence-scale processes within the clouds and </w:t>
       </w:r>
       <w:r>
         <w:t xml:space="preserve">determines the cloud </w:t>
@@ -3147,13 +3111,7 @@
         <w:t xml:space="preserve">moisture </w:t>
       </w:r>
       <w:r>
-        <w:t xml:space="preserve">sink rates </w:t>
-      </w:r>
-      <w:r>
-        <w:t>is</w:t>
-      </w:r>
-      <w:r>
-        <w:t xml:space="preserve"> set to match the cloud top</w:t>
+        <w:t>sink rates is set to match the cloud top</w:t>
       </w:r>
       <w:r>
         <w:t xml:space="preserve"> height distribution </w:t>
@@ -3408,10 +3366,7 @@
         <w:t xml:space="preserve"> The sensitivity of the GOES scene-mean reflectance (albedo) is at the low end of the range of sensitivity from EUREC4A cloud base cloud fraction, presumably because optically thin clouds contribute more to the cloud fraction than to the mean reflectance.  </w:t>
       </w:r>
       <w:r>
-        <w:t xml:space="preserve">This slope suggests that in the mean, clouds have a constant in-cloud updraft velocity </w:t>
-      </w:r>
-      <w:r>
-        <w:t>4.2 cm s</w:t>
+        <w:t>This slope suggests that in the mean, clouds have a constant in-cloud updraft velocity 4.2 cm s</w:t>
       </w:r>
       <w:r>
         <w:rPr>
@@ -3564,7 +3519,6 @@
         <w:rPr>
           <w:rFonts w:ascii="Aptos Narrow" w:eastAsiaTheme="minorEastAsia" w:hAnsi="Aptos Narrow" w:cs="Times New Roman"/>
         </w:rPr>
-        <w:lastRenderedPageBreak/>
         <w:t xml:space="preserve">Figure REFLMASSFL. Modeled mean cloud base (700 m) mass flux for all scenes in each reflectance bin (blue points and whiskers). Black line shows a slope of </w:t>
       </w:r>
       <w:r>
@@ -3662,13 +3616,7 @@
         <w:rPr>
           <w:rFonts w:ascii="Aptos" w:hAnsi="Aptos"/>
         </w:rPr>
-        <w:t>large scale moisture flux</w:t>
-      </w:r>
-      <w:r>
-        <w:rPr>
-          <w:rFonts w:ascii="Aptos" w:hAnsi="Aptos"/>
-        </w:rPr>
-        <w:t xml:space="preserve"> and moister </w:t>
+        <w:t xml:space="preserve">large scale moisture flux and moister </w:t>
       </w:r>
       <w:r>
         <w:rPr>
@@ -4159,25 +4107,7 @@
         <w:rPr>
           <w:rFonts w:ascii="Aptos" w:eastAsiaTheme="minorEastAsia" w:hAnsi="Aptos"/>
         </w:rPr>
-        <w:t>Th t</w:t>
-      </w:r>
-      <w:r>
-        <w:rPr>
-          <w:rFonts w:ascii="Aptos" w:eastAsiaTheme="minorEastAsia" w:hAnsi="Aptos"/>
-        </w:rPr>
-        <w:t>hermodynamic profile and the cloud field are identical to the control</w:t>
-      </w:r>
-      <w:r>
-        <w:rPr>
-          <w:rFonts w:ascii="Aptos" w:eastAsiaTheme="minorEastAsia" w:hAnsi="Aptos"/>
-        </w:rPr>
-        <w:t xml:space="preserve"> in these experiments</w:t>
-      </w:r>
-      <w:r>
-        <w:rPr>
-          <w:rFonts w:ascii="Aptos" w:eastAsiaTheme="minorEastAsia" w:hAnsi="Aptos"/>
-        </w:rPr>
-        <w:t xml:space="preserve">. </w:t>
+        <w:t xml:space="preserve">Th thermodynamic profile and the cloud field are identical to the control in these experiments. </w:t>
       </w:r>
       <w:r>
         <w:rPr>
@@ -5082,7 +5012,6 @@
         <w:rPr>
           <w:rFonts w:ascii="Aptos" w:hAnsi="Aptos"/>
         </w:rPr>
-        <w:lastRenderedPageBreak/>
         <w:t>For surface</w:t>
       </w:r>
       <w:r>
@@ -5591,7 +5520,21 @@
         <w:rPr>
           <w:rFonts w:ascii="Aptos Narrow" w:hAnsi="Aptos Narrow"/>
         </w:rPr>
-        <w:t>Table 1. Cloud fraction change relative to the control simulation (%).</w:t>
+        <w:t xml:space="preserve">Table 1. Cloud </w:t>
+      </w:r>
+      <w:proofErr w:type="gramStart"/>
+      <w:r>
+        <w:rPr>
+          <w:rFonts w:ascii="Aptos Narrow" w:hAnsi="Aptos Narrow"/>
+        </w:rPr>
+        <w:t>fraction</w:t>
+      </w:r>
+      <w:proofErr w:type="gramEnd"/>
+      <w:r>
+        <w:rPr>
+          <w:rFonts w:ascii="Aptos Narrow" w:hAnsi="Aptos Narrow"/>
+        </w:rPr>
+        <w:t xml:space="preserve"> change relative to the control simulation (%).</w:t>
       </w:r>
       <w:r>
         <w:rPr>
@@ -5652,12 +5595,14 @@
             <w:tcBorders>
               <w:bottom w:val="single" w:sz="4" w:space="0" w:color="DCDFE5"/>
             </w:tcBorders>
+            <w:vAlign w:val="center"/>
             <w:hideMark/>
           </w:tcPr>
           <w:p>
             <w:pPr>
               <w:pStyle w:val="BodyText"/>
               <w:spacing w:before="0" w:after="0"/>
+              <w:jc w:val="right"/>
               <w:rPr>
                 <w:b/>
                 <w:bCs/>
@@ -5689,7 +5634,7 @@
                 <w:rPr>
                   <w:rFonts w:ascii="Cambria Math" w:hAnsi="Cambria Math"/>
                 </w:rPr>
-                <m:t>C</m:t>
+                <m:t>A</m:t>
               </m:r>
             </m:oMath>
             <w:r>
@@ -5730,6 +5675,7 @@
             <w:pPr>
               <w:pStyle w:val="BodyText"/>
               <w:spacing w:before="0" w:after="0"/>
+              <w:jc w:val="right"/>
             </w:pPr>
             <w:r>
               <w:t>-5.13</w:t>
@@ -5765,6 +5711,7 @@
             <w:pPr>
               <w:pStyle w:val="BodyText"/>
               <w:spacing w:before="0" w:after="0"/>
+              <w:jc w:val="right"/>
             </w:pPr>
             <w:r>
               <w:t>-</w:t>
@@ -5806,6 +5753,7 @@
             <w:pPr>
               <w:pStyle w:val="BodyText"/>
               <w:spacing w:before="0" w:after="0"/>
+              <w:jc w:val="right"/>
             </w:pPr>
             <w:r>
               <w:t>-7.86</w:t>
@@ -5844,9 +5792,81 @@
             <w:pPr>
               <w:pStyle w:val="BodyText"/>
               <w:spacing w:before="0" w:after="0"/>
+              <w:jc w:val="right"/>
             </w:pPr>
             <w:r>
               <w:t>-5.14</w:t>
+            </w:r>
+          </w:p>
+        </w:tc>
+      </w:tr>
+      <w:tr>
+        <w:trPr>
+          <w:tblCellSpacing w:w="15" w:type="dxa"/>
+        </w:trPr>
+        <w:tc>
+          <w:tcPr>
+            <w:tcW w:w="3250" w:type="dxa"/>
+          </w:tcPr>
+          <w:p>
+            <w:pPr>
+              <w:pStyle w:val="BodyText"/>
+              <w:spacing w:before="0" w:after="0"/>
+            </w:pPr>
+            <w:r>
+              <w:t>sink-5%</w:t>
+            </w:r>
+          </w:p>
+        </w:tc>
+        <w:tc>
+          <w:tcPr>
+            <w:tcW w:w="990" w:type="dxa"/>
+          </w:tcPr>
+          <w:p>
+            <w:pPr>
+              <w:pStyle w:val="BodyText"/>
+              <w:spacing w:before="0" w:after="0"/>
+              <w:jc w:val="right"/>
+            </w:pPr>
+            <w:r>
+              <w:t xml:space="preserve">  </w:t>
+            </w:r>
+            <w:r>
+              <w:t>3.30</w:t>
+            </w:r>
+          </w:p>
+        </w:tc>
+      </w:tr>
+      <w:tr>
+        <w:trPr>
+          <w:tblCellSpacing w:w="15" w:type="dxa"/>
+        </w:trPr>
+        <w:tc>
+          <w:tcPr>
+            <w:tcW w:w="3250" w:type="dxa"/>
+          </w:tcPr>
+          <w:p>
+            <w:pPr>
+              <w:pStyle w:val="BodyText"/>
+              <w:spacing w:before="0" w:after="0"/>
+            </w:pPr>
+            <w:r>
+              <w:t>sink+5%</w:t>
+            </w:r>
+          </w:p>
+        </w:tc>
+        <w:tc>
+          <w:tcPr>
+            <w:tcW w:w="990" w:type="dxa"/>
+          </w:tcPr>
+          <w:p>
+            <w:pPr>
+              <w:pStyle w:val="BodyText"/>
+              <w:spacing w:before="0" w:after="0"/>
+              <w:jc w:val="right"/>
+            </w:pPr>
+            <w:r>
+              <w:t>-3.59</w:t>
             </w:r>
           </w:p>
         </w:tc>
@@ -5880,13 +5900,19 @@
         <w:pStyle w:val="BodyText"/>
       </w:pPr>
       <w:r>
-        <w:t xml:space="preserve">Mesoscale organization clusters clouds together, reducing their effective entrainment of </w:t>
-      </w:r>
-      <w:r>
-        <w:t>environmental</w:t>
-      </w:r>
-      <w:r>
-        <w:t xml:space="preserve"> air. Larger cloudy updrafts</w:t>
+        <w:t>Mesoscale organization clusters clouds together</w:t>
+      </w:r>
+      <w:r>
+        <w:t>, leading to l</w:t>
+      </w:r>
+      <w:r>
+        <w:t xml:space="preserve">arger </w:t>
+      </w:r>
+      <w:r>
+        <w:t xml:space="preserve">cloud </w:t>
+      </w:r>
+      <w:r>
+        <w:t>updrafts</w:t>
       </w:r>
       <w:r>
         <w:t>, and updrafts</w:t>
@@ -5898,10 +5924,7 @@
         <w:t>entraining</w:t>
       </w:r>
       <w:r>
-        <w:t xml:space="preserve"> m</w:t>
-      </w:r>
-      <w:r>
-        <w:t xml:space="preserve">oister air from </w:t>
+        <w:t xml:space="preserve"> moister air from </w:t>
       </w:r>
       <w:r>
         <w:t xml:space="preserve">their </w:t>
@@ -5910,22 +5933,40 @@
         <w:t>surroundings</w:t>
       </w:r>
       <w:r>
-        <w:t xml:space="preserve">, </w:t>
-      </w:r>
-      <w:r>
-        <w:t>are</w:t>
+        <w:t>. These effects</w:t>
       </w:r>
       <w:r>
         <w:t xml:space="preserve"> </w:t>
       </w:r>
       <w:r>
+        <w:t xml:space="preserve">of mesoscale clustering are </w:t>
+      </w:r>
+      <w:r>
         <w:t xml:space="preserve">parameterized </w:t>
       </w:r>
       <w:r>
         <w:t>by increasing the total moisture sink rate.</w:t>
       </w:r>
       <w:r>
-        <w:t xml:space="preserve"> Experiments are run with sink rate varied by </w:t>
+        <w:t xml:space="preserve"> Experiments are run with </w:t>
+      </w:r>
+      <w:r>
+        <w:t xml:space="preserve">the moisture </w:t>
+      </w:r>
+      <w:r>
+        <w:t>sink rate</w:t>
+      </w:r>
+      <w:r>
+        <w:t xml:space="preserve"> for each cloud category</w:t>
+      </w:r>
+      <w:r>
+        <w:t xml:space="preserve"> </w:t>
+      </w:r>
+      <w:r>
+        <w:t>reduced or augmented</w:t>
+      </w:r>
+      <w:r>
+        <w:t xml:space="preserve"> by </w:t>
       </w:r>
       <m:oMath>
         <m:r>
@@ -5936,7 +5977,677 @@
         </m:r>
       </m:oMath>
       <w:r>
-        <w:t>5% from the control.</w:t>
+        <w:t>5% from the control</w:t>
+      </w:r>
+      <w:r>
+        <w:t xml:space="preserve">. </w:t>
+      </w:r>
+      <w:r>
+        <w:t xml:space="preserve">The clouds rise deeper for the weaker sink </w:t>
+      </w:r>
+      <w:proofErr w:type="gramStart"/>
+      <w:r>
+        <w:t>rates, and</w:t>
+      </w:r>
+      <w:proofErr w:type="gramEnd"/>
+      <w:r>
+        <w:t xml:space="preserve"> reach shorter cloud top heights for the stronger sink rates (Fig. SINKZTOP). </w:t>
+      </w:r>
+    </w:p>
+    <w:p>
+      <w:pPr>
+        <w:pStyle w:val="BodyText"/>
+        <w:rPr>
+          <w:rFonts w:eastAsiaTheme="minorEastAsia"/>
+          <w:bCs/>
+          <w:iCs/>
+        </w:rPr>
+      </w:pPr>
+      <w:r>
+        <w:t xml:space="preserve">Redistributing </w:t>
+      </w:r>
+      <w:r>
+        <w:t xml:space="preserve">the total eddy fluxes to the </w:t>
+      </w:r>
+      <w:r>
+        <w:t xml:space="preserve">cloud </w:t>
+      </w:r>
+      <w:r>
+        <w:t xml:space="preserve">with these </w:t>
+      </w:r>
+      <w:r>
+        <w:t xml:space="preserve">cloud tops </w:t>
+      </w:r>
+      <w:r>
+        <w:t xml:space="preserve">results in the total cloud fraction changes relative to the control listed in Table 1. Reducing the sink rate </w:t>
+      </w:r>
+      <w:r>
+        <w:t>-</w:t>
+      </w:r>
+      <w:r>
+        <w:t xml:space="preserve">5% increases the total cloud albedo by </w:t>
+      </w:r>
+      <m:oMath>
+        <m:r>
+          <w:rPr>
+            <w:rFonts w:ascii="Cambria Math" w:hAnsi="Cambria Math"/>
+          </w:rPr>
+          <m:t>d</m:t>
+        </m:r>
+        <m:r>
+          <m:rPr>
+            <m:sty m:val="p"/>
+          </m:rPr>
+          <w:rPr>
+            <w:rFonts w:ascii="Cambria Math" w:hAnsi="Cambria Math"/>
+          </w:rPr>
+          <m:t>ln</m:t>
+        </m:r>
+        <m:r>
+          <w:rPr>
+            <w:rFonts w:ascii="Cambria Math" w:hAnsi="Cambria Math"/>
+          </w:rPr>
+          <m:t>A</m:t>
+        </m:r>
+      </m:oMath>
+      <w:r>
+        <w:rPr>
+          <w:rFonts w:eastAsiaTheme="minorEastAsia"/>
+          <w:bCs/>
+          <w:iCs/>
+        </w:rPr>
+        <w:t xml:space="preserve"> = +3%. </w:t>
+      </w:r>
+      <w:r>
+        <w:rPr>
+          <w:rFonts w:eastAsiaTheme="minorEastAsia"/>
+          <w:bCs/>
+          <w:iCs/>
+        </w:rPr>
+        <w:t>F</w:t>
+      </w:r>
+      <w:r>
+        <w:rPr>
+          <w:rFonts w:eastAsiaTheme="minorEastAsia"/>
+          <w:bCs/>
+          <w:iCs/>
+        </w:rPr>
+        <w:t>or lower moisture sink rate</w:t>
+      </w:r>
+      <w:r>
+        <w:rPr>
+          <w:rFonts w:eastAsiaTheme="minorEastAsia"/>
+          <w:bCs/>
+          <w:iCs/>
+        </w:rPr>
+        <w:t>s</w:t>
+      </w:r>
+      <w:r>
+        <w:rPr>
+          <w:rFonts w:eastAsiaTheme="minorEastAsia"/>
+          <w:bCs/>
+          <w:iCs/>
+        </w:rPr>
+        <w:t>,</w:t>
+      </w:r>
+      <w:r>
+        <w:rPr>
+          <w:rFonts w:eastAsiaTheme="minorEastAsia"/>
+          <w:bCs/>
+          <w:iCs/>
+        </w:rPr>
+        <w:t xml:space="preserve"> cloud fraction </w:t>
+      </w:r>
+      <w:r>
+        <w:rPr>
+          <w:rFonts w:eastAsiaTheme="minorEastAsia"/>
+          <w:bCs/>
+          <w:iCs/>
+        </w:rPr>
+        <w:t xml:space="preserve">in each category </w:t>
+      </w:r>
+      <w:r>
+        <w:rPr>
+          <w:rFonts w:eastAsiaTheme="minorEastAsia"/>
+          <w:bCs/>
+          <w:iCs/>
+        </w:rPr>
+        <w:t xml:space="preserve">increases </w:t>
+      </w:r>
+      <w:r>
+        <w:rPr>
+          <w:rFonts w:eastAsiaTheme="minorEastAsia"/>
+          <w:bCs/>
+          <w:iCs/>
+        </w:rPr>
+        <w:t xml:space="preserve">to generate </w:t>
+      </w:r>
+      <w:r>
+        <w:rPr>
+          <w:rFonts w:eastAsiaTheme="minorEastAsia"/>
+          <w:bCs/>
+          <w:iCs/>
+        </w:rPr>
+        <w:t>a larger required</w:t>
+      </w:r>
+      <w:r>
+        <w:rPr>
+          <w:rFonts w:eastAsiaTheme="minorEastAsia"/>
+          <w:bCs/>
+          <w:iCs/>
+        </w:rPr>
+        <w:t xml:space="preserve"> moisture flux </w:t>
+      </w:r>
+      <w:r>
+        <w:rPr>
+          <w:rFonts w:eastAsiaTheme="minorEastAsia"/>
+          <w:bCs/>
+          <w:iCs/>
+        </w:rPr>
+        <w:t xml:space="preserve">as the </w:t>
+      </w:r>
+      <w:r>
+        <w:rPr>
+          <w:rFonts w:eastAsiaTheme="minorEastAsia"/>
+          <w:bCs/>
+          <w:iCs/>
+        </w:rPr>
+        <w:t xml:space="preserve">cloud top height difference </w:t>
+      </w:r>
+      <m:oMath>
+        <m:sSub>
+          <m:sSubPr>
+            <m:ctrlPr>
+              <w:rPr>
+                <w:rFonts w:ascii="Cambria Math" w:eastAsiaTheme="minorEastAsia" w:hAnsi="Cambria Math"/>
+                <w:bCs/>
+                <w:i/>
+                <w:iCs/>
+              </w:rPr>
+            </m:ctrlPr>
+          </m:sSubPr>
+          <m:e>
+            <m:r>
+              <w:rPr>
+                <w:rFonts w:ascii="Cambria Math" w:eastAsiaTheme="minorEastAsia" w:hAnsi="Cambria Math"/>
+              </w:rPr>
+              <m:t>z</m:t>
+            </m:r>
+          </m:e>
+          <m:sub>
+            <m:r>
+              <w:rPr>
+                <w:rFonts w:ascii="Cambria Math" w:eastAsiaTheme="minorEastAsia" w:hAnsi="Cambria Math"/>
+              </w:rPr>
+              <m:t>top,i</m:t>
+            </m:r>
+          </m:sub>
+        </m:sSub>
+        <m:r>
+          <w:rPr>
+            <w:rFonts w:ascii="Cambria Math" w:eastAsiaTheme="minorEastAsia" w:hAnsi="Cambria Math"/>
+          </w:rPr>
+          <m:t>-</m:t>
+        </m:r>
+        <m:sSub>
+          <m:sSubPr>
+            <m:ctrlPr>
+              <w:rPr>
+                <w:rFonts w:ascii="Cambria Math" w:eastAsiaTheme="minorEastAsia" w:hAnsi="Cambria Math"/>
+                <w:bCs/>
+                <w:i/>
+                <w:iCs/>
+              </w:rPr>
+            </m:ctrlPr>
+          </m:sSubPr>
+          <m:e>
+            <m:r>
+              <w:rPr>
+                <w:rFonts w:ascii="Cambria Math" w:eastAsiaTheme="minorEastAsia" w:hAnsi="Cambria Math"/>
+              </w:rPr>
+              <m:t>z</m:t>
+            </m:r>
+          </m:e>
+          <m:sub>
+            <m:r>
+              <w:rPr>
+                <w:rFonts w:ascii="Cambria Math" w:eastAsiaTheme="minorEastAsia" w:hAnsi="Cambria Math"/>
+              </w:rPr>
+              <m:t>top,i</m:t>
+            </m:r>
+            <m:r>
+              <w:rPr>
+                <w:rFonts w:ascii="Cambria Math" w:eastAsiaTheme="minorEastAsia" w:hAnsi="Cambria Math"/>
+              </w:rPr>
+              <m:t>-1</m:t>
+            </m:r>
+          </m:sub>
+        </m:sSub>
+      </m:oMath>
+      <w:r>
+        <w:rPr>
+          <w:rFonts w:eastAsiaTheme="minorEastAsia"/>
+          <w:bCs/>
+          <w:iCs/>
+        </w:rPr>
+        <w:t xml:space="preserve"> increases</w:t>
+      </w:r>
+      <w:r>
+        <w:rPr>
+          <w:rFonts w:eastAsiaTheme="minorEastAsia"/>
+          <w:bCs/>
+          <w:iCs/>
+        </w:rPr>
+        <w:t xml:space="preserve"> between </w:t>
+      </w:r>
+      <w:r>
+        <w:rPr>
+          <w:rFonts w:eastAsiaTheme="minorEastAsia"/>
+          <w:bCs/>
+          <w:iCs/>
+        </w:rPr>
+        <w:t>cloud</w:t>
+      </w:r>
+      <w:r>
+        <w:rPr>
+          <w:rFonts w:eastAsiaTheme="minorEastAsia"/>
+          <w:bCs/>
+          <w:iCs/>
+        </w:rPr>
+        <w:t xml:space="preserve"> categories </w:t>
+      </w:r>
+      <m:oMath>
+        <m:r>
+          <w:rPr>
+            <w:rFonts w:ascii="Cambria Math" w:eastAsiaTheme="minorEastAsia" w:hAnsi="Cambria Math"/>
+          </w:rPr>
+          <m:t>i</m:t>
+        </m:r>
+      </m:oMath>
+      <w:r>
+        <w:rPr>
+          <w:rFonts w:eastAsiaTheme="minorEastAsia"/>
+          <w:bCs/>
+          <w:iCs/>
+        </w:rPr>
+        <w:t>.</w:t>
+      </w:r>
+    </w:p>
+    <w:p>
+      <w:pPr>
+        <w:pStyle w:val="BodyText"/>
+        <w:rPr>
+          <w:rFonts w:eastAsiaTheme="minorEastAsia"/>
+          <w:bCs/>
+          <w:iCs/>
+        </w:rPr>
+      </w:pPr>
+      <w:r>
+        <w:rPr>
+          <w:rFonts w:eastAsiaTheme="minorEastAsia"/>
+          <w:bCs/>
+          <w:iCs/>
+          <w:color w:val="3A7C22" w:themeColor="accent6" w:themeShade="BF"/>
+        </w:rPr>
+        <w:t xml:space="preserve">[[!! is this stronger </w:t>
+      </w:r>
+      <w:r>
+        <w:rPr>
+          <w:rFonts w:eastAsiaTheme="minorEastAsia"/>
+          <w:bCs/>
+          <w:iCs/>
+          <w:color w:val="3A7C22" w:themeColor="accent6" w:themeShade="BF"/>
+        </w:rPr>
+        <w:t>for the more populous lower clouds</w:t>
+      </w:r>
+      <w:r>
+        <w:rPr>
+          <w:rFonts w:eastAsiaTheme="minorEastAsia"/>
+          <w:bCs/>
+          <w:iCs/>
+          <w:color w:val="3A7C22" w:themeColor="accent6" w:themeShade="BF"/>
+        </w:rPr>
+        <w:t xml:space="preserve">, and weaker for the </w:t>
+      </w:r>
+      <w:proofErr w:type="spellStart"/>
+      <w:r>
+        <w:rPr>
+          <w:rFonts w:eastAsiaTheme="minorEastAsia"/>
+          <w:bCs/>
+          <w:iCs/>
+          <w:color w:val="3A7C22" w:themeColor="accent6" w:themeShade="BF"/>
+        </w:rPr>
+        <w:t>higherclouds</w:t>
+      </w:r>
+      <w:proofErr w:type="spellEnd"/>
+      <w:r>
+        <w:rPr>
+          <w:rFonts w:eastAsiaTheme="minorEastAsia"/>
+          <w:bCs/>
+          <w:iCs/>
+          <w:color w:val="3A7C22" w:themeColor="accent6" w:themeShade="BF"/>
+        </w:rPr>
+        <w:t xml:space="preserve">? I don’t think so. Otherwise, why can’t fewer cloud categories just generate the </w:t>
+      </w:r>
+      <w:r>
+        <w:rPr>
+          <w:rFonts w:eastAsiaTheme="minorEastAsia"/>
+          <w:bCs/>
+          <w:iCs/>
+          <w:color w:val="3A7C22" w:themeColor="accent6" w:themeShade="BF"/>
+          <w:u w:val="single"/>
+        </w:rPr>
+        <w:t>same amount clouds</w:t>
+      </w:r>
+      <w:r>
+        <w:rPr>
+          <w:rFonts w:eastAsiaTheme="minorEastAsia"/>
+          <w:bCs/>
+          <w:iCs/>
+          <w:color w:val="3A7C22" w:themeColor="accent6" w:themeShade="BF"/>
+        </w:rPr>
+        <w:t xml:space="preserve"> as the </w:t>
+      </w:r>
+      <w:proofErr w:type="spellStart"/>
+      <w:r>
+        <w:rPr>
+          <w:rFonts w:eastAsiaTheme="minorEastAsia"/>
+          <w:bCs/>
+          <w:iCs/>
+          <w:color w:val="3A7C22" w:themeColor="accent6" w:themeShade="BF"/>
+        </w:rPr>
+        <w:t>ztop</w:t>
+      </w:r>
+      <w:proofErr w:type="spellEnd"/>
+      <w:r>
+        <w:rPr>
+          <w:rFonts w:eastAsiaTheme="minorEastAsia"/>
+          <w:bCs/>
+          <w:iCs/>
+          <w:color w:val="3A7C22" w:themeColor="accent6" w:themeShade="BF"/>
+        </w:rPr>
+        <w:t xml:space="preserve"> bins widen? Or do higher clouds result in valid clouds now that had been excluded before, increasing the counted clouds mass flux? That’s just a bookkeeping issue. !!]]</w:t>
+      </w:r>
+      <w:r>
+        <w:rPr>
+          <w:rFonts w:eastAsiaTheme="minorEastAsia"/>
+          <w:bCs/>
+          <w:iCs/>
+          <w:color w:val="3A7C22" w:themeColor="accent6" w:themeShade="BF"/>
+        </w:rPr>
+        <w:t xml:space="preserve"> </w:t>
+      </w:r>
+      <w:r>
+        <w:rPr>
+          <w:rFonts w:eastAsiaTheme="minorEastAsia"/>
+          <w:bCs/>
+          <w:iCs/>
+        </w:rPr>
+        <w:t>T</w:t>
+      </w:r>
+      <w:r>
+        <w:rPr>
+          <w:rFonts w:eastAsiaTheme="minorEastAsia"/>
+          <w:bCs/>
+          <w:iCs/>
+        </w:rPr>
+        <w:t xml:space="preserve">his </w:t>
+      </w:r>
+      <w:r>
+        <w:rPr>
+          <w:rFonts w:eastAsiaTheme="minorEastAsia"/>
+          <w:bCs/>
+          <w:iCs/>
+        </w:rPr>
+        <w:t>must be</w:t>
+      </w:r>
+      <w:r>
+        <w:rPr>
+          <w:rFonts w:eastAsiaTheme="minorEastAsia"/>
+          <w:bCs/>
+          <w:iCs/>
+        </w:rPr>
+        <w:t xml:space="preserve"> compensate</w:t>
+      </w:r>
+      <w:r>
+        <w:rPr>
+          <w:rFonts w:eastAsiaTheme="minorEastAsia"/>
+          <w:bCs/>
+          <w:iCs/>
+        </w:rPr>
+        <w:t>d somewhat by larger</w:t>
+      </w:r>
+      <w:r>
+        <w:rPr>
+          <w:rFonts w:eastAsiaTheme="minorEastAsia"/>
+          <w:bCs/>
+          <w:iCs/>
+        </w:rPr>
+        <w:t xml:space="preserve"> </w:t>
+      </w:r>
+      <m:oMath>
+        <m:sSub>
+          <m:sSubPr>
+            <m:ctrlPr>
+              <w:rPr>
+                <w:rFonts w:ascii="Cambria Math" w:eastAsiaTheme="minorEastAsia" w:hAnsi="Cambria Math"/>
+                <w:bCs/>
+                <w:i/>
+                <w:iCs/>
+              </w:rPr>
+            </m:ctrlPr>
+          </m:sSubPr>
+          <m:e>
+            <m:r>
+              <w:rPr>
+                <w:rFonts w:ascii="Cambria Math" w:eastAsiaTheme="minorEastAsia" w:hAnsi="Cambria Math"/>
+              </w:rPr>
+              <m:t>q</m:t>
+            </m:r>
+          </m:e>
+          <m:sub>
+            <m:r>
+              <w:rPr>
+                <w:rFonts w:ascii="Cambria Math" w:eastAsiaTheme="minorEastAsia" w:hAnsi="Cambria Math"/>
+              </w:rPr>
+              <m:t>c</m:t>
+            </m:r>
+          </m:sub>
+        </m:sSub>
+        <m:r>
+          <w:rPr>
+            <w:rFonts w:ascii="Cambria Math" w:eastAsiaTheme="minorEastAsia" w:hAnsi="Cambria Math"/>
+          </w:rPr>
+          <m:t>-q</m:t>
+        </m:r>
+      </m:oMath>
+      <w:r>
+        <w:rPr>
+          <w:rFonts w:eastAsiaTheme="minorEastAsia"/>
+          <w:bCs/>
+          <w:iCs/>
+        </w:rPr>
+        <w:t xml:space="preserve"> </w:t>
+      </w:r>
+      <w:r>
+        <w:rPr>
+          <w:rFonts w:eastAsiaTheme="minorEastAsia"/>
+          <w:bCs/>
+          <w:iCs/>
+        </w:rPr>
+        <w:t>when the</w:t>
+      </w:r>
+      <w:r>
+        <w:rPr>
+          <w:rFonts w:eastAsiaTheme="minorEastAsia"/>
+          <w:bCs/>
+          <w:iCs/>
+        </w:rPr>
+        <w:t xml:space="preserve"> </w:t>
+      </w:r>
+      <w:r>
+        <w:rPr>
+          <w:rFonts w:eastAsiaTheme="minorEastAsia"/>
+          <w:bCs/>
+          <w:iCs/>
+        </w:rPr>
+        <w:t xml:space="preserve">clouds are is less diluted by the weaker </w:t>
+      </w:r>
+      <w:r>
+        <w:rPr>
+          <w:rFonts w:eastAsiaTheme="minorEastAsia"/>
+          <w:bCs/>
+          <w:iCs/>
+        </w:rPr>
+        <w:t>moisture sink</w:t>
+      </w:r>
+      <w:r>
+        <w:rPr>
+          <w:rFonts w:eastAsiaTheme="minorEastAsia"/>
+          <w:bCs/>
+          <w:iCs/>
+        </w:rPr>
+        <w:t>, which</w:t>
+      </w:r>
+      <w:r>
+        <w:rPr>
+          <w:rFonts w:eastAsiaTheme="minorEastAsia"/>
+          <w:bCs/>
+          <w:iCs/>
+        </w:rPr>
+        <w:t>,</w:t>
+      </w:r>
+      <w:r>
+        <w:rPr>
+          <w:rFonts w:eastAsiaTheme="minorEastAsia"/>
+          <w:bCs/>
+          <w:iCs/>
+        </w:rPr>
+        <w:t xml:space="preserve"> </w:t>
+      </w:r>
+      <w:r>
+        <w:rPr>
+          <w:rFonts w:eastAsiaTheme="minorEastAsia"/>
+          <w:bCs/>
+          <w:iCs/>
+        </w:rPr>
+        <w:t xml:space="preserve">as above, </w:t>
+      </w:r>
+      <w:r>
+        <w:rPr>
+          <w:rFonts w:eastAsiaTheme="minorEastAsia"/>
+          <w:bCs/>
+          <w:iCs/>
+        </w:rPr>
+        <w:t>reduces the mass flux and cloud fraction for the same moisture flux.</w:t>
+      </w:r>
+    </w:p>
+    <w:p>
+      <w:pPr>
+        <w:pStyle w:val="BodyText"/>
+      </w:pPr>
+      <w:r>
+        <w:t xml:space="preserve"> </w:t>
+      </w:r>
+    </w:p>
+    <w:p>
+      <w:pPr>
+        <w:pStyle w:val="BodyText"/>
+      </w:pPr>
+      <w:r>
+        <w:drawing>
+          <wp:inline distT="0" distB="0" distL="0" distR="0" wp14:anchorId="1B4D32EB" wp14:editId="43A13E82">
+            <wp:extent cx="4453119" cy="3342254"/>
+            <wp:effectExtent l="0" t="0" r="5080" b="0"/>
+            <wp:docPr id="2049367688" name="Picture 1"/>
+            <wp:cNvGraphicFramePr>
+              <a:graphicFrameLocks xmlns:a="http://schemas.openxmlformats.org/drawingml/2006/main" noChangeAspect="1"/>
+            </wp:cNvGraphicFramePr>
+            <a:graphic xmlns:a="http://schemas.openxmlformats.org/drawingml/2006/main">
+              <a:graphicData uri="http://schemas.openxmlformats.org/drawingml/2006/picture">
+                <pic:pic xmlns:pic="http://schemas.openxmlformats.org/drawingml/2006/picture">
+                  <pic:nvPicPr>
+                    <pic:cNvPr id="2049367688" name=""/>
+                    <pic:cNvPicPr/>
+                  </pic:nvPicPr>
+                  <pic:blipFill>
+                    <a:blip r:embed="rId9"/>
+                    <a:stretch>
+                      <a:fillRect/>
+                    </a:stretch>
+                  </pic:blipFill>
+                  <pic:spPr>
+                    <a:xfrm>
+                      <a:off x="0" y="0"/>
+                      <a:ext cx="4459371" cy="3346946"/>
+                    </a:xfrm>
+                    <a:prstGeom prst="rect">
+                      <a:avLst/>
+                    </a:prstGeom>
+                  </pic:spPr>
+                </pic:pic>
+              </a:graphicData>
+            </a:graphic>
+          </wp:inline>
+        </w:drawing>
+      </w:r>
+    </w:p>
+    <w:p>
+      <w:pPr>
+        <w:pStyle w:val="BodyText"/>
+        <w:rPr>
+          <w:rFonts w:ascii="Aptos Narrow" w:hAnsi="Aptos Narrow"/>
+        </w:rPr>
+      </w:pPr>
+      <w:r>
+        <w:rPr>
+          <w:rFonts w:ascii="Aptos Narrow" w:hAnsi="Aptos Narrow"/>
+        </w:rPr>
+        <w:t xml:space="preserve">Figure SINKZTOP. Cloud top height experiments </w:t>
+      </w:r>
+      <w:r>
+        <w:rPr>
+          <w:rFonts w:ascii="ComicShannsMono Nerd Font" w:hAnsi="ComicShannsMono Nerd Font"/>
+        </w:rPr>
+        <w:t>sink-5%</w:t>
+      </w:r>
+      <w:r>
+        <w:rPr>
+          <w:rFonts w:ascii="Aptos Narrow" w:hAnsi="Aptos Narrow"/>
+        </w:rPr>
+        <w:t xml:space="preserve"> and </w:t>
+      </w:r>
+      <w:r>
+        <w:rPr>
+          <w:rFonts w:ascii="ComicShannsMono Nerd Font" w:hAnsi="ComicShannsMono Nerd Font"/>
+        </w:rPr>
+        <w:t>sink+5%</w:t>
+      </w:r>
+      <w:r>
+        <w:rPr>
+          <w:rFonts w:ascii="Aptos Narrow" w:hAnsi="Aptos Narrow"/>
+        </w:rPr>
+        <w:t xml:space="preserve"> compared to the control experiment.</w:t>
+      </w:r>
+      <w:r>
+        <w:rPr>
+          <w:rFonts w:ascii="Aptos Narrow" w:hAnsi="Aptos Narrow"/>
+        </w:rPr>
+        <w:t xml:space="preserve"> Greater sink rates limit the height of clouds.</w:t>
+      </w:r>
+    </w:p>
+    <w:p>
+      <w:pPr>
+        <w:pStyle w:val="BodyText"/>
+      </w:pPr>
+      <w:r>
+        <w:rPr>
+          <w:rFonts w:ascii="Menlo" w:hAnsi="Menlo" w:cs="Menlo"/>
+          <w:color w:val="3B2322"/>
+          <w:sz w:val="20"/>
+          <w:szCs w:val="20"/>
+        </w:rPr>
+        <w:t>sink_expmt_ztop.pdf</w:t>
       </w:r>
     </w:p>
     <w:p>
@@ -6075,7 +6786,21 @@
         <w:rPr>
           <w:rFonts w:eastAsiaTheme="minorEastAsia"/>
         </w:rPr>
-        <w:t xml:space="preserve">The DIM hypothesis predicts the change in area of low clouds responsible for the moisture flux, but does not account for secondary desiccation of the optically thick stratocumulus clouds at cloud base in most climate models. </w:t>
+        <w:t xml:space="preserve">The DIM hypothesis predicts the change in area of low clouds responsible for the moisture </w:t>
+      </w:r>
+      <w:proofErr w:type="gramStart"/>
+      <w:r>
+        <w:rPr>
+          <w:rFonts w:eastAsiaTheme="minorEastAsia"/>
+        </w:rPr>
+        <w:t>flux, but</w:t>
+      </w:r>
+      <w:proofErr w:type="gramEnd"/>
+      <w:r>
+        <w:rPr>
+          <w:rFonts w:eastAsiaTheme="minorEastAsia"/>
+        </w:rPr>
+        <w:t xml:space="preserve"> does not account for secondary desiccation of the optically thick stratocumulus clouds at cloud base in most climate models. </w:t>
       </w:r>
       <w:r>
         <w:rPr>
@@ -6483,7 +7208,21 @@
         <w:rPr>
           <w:rFonts w:eastAsiaTheme="minorEastAsia"/>
         </w:rPr>
-        <w:t xml:space="preserve"> depend on cloud-scale and smaller processes, which are parameterized in climate models. Cloud parameterizations used in these models must satisfy many global constraints, but might not be suited to faithfully simulate the moisture flux and cloud fraction of shallow cumulus clouds.</w:t>
+        <w:t xml:space="preserve"> depend on cloud-scale and smaller processes, which are parameterized in climate models. Cloud parameterizations used in these models must satisfy many global </w:t>
+      </w:r>
+      <w:proofErr w:type="gramStart"/>
+      <w:r>
+        <w:rPr>
+          <w:rFonts w:eastAsiaTheme="minorEastAsia"/>
+        </w:rPr>
+        <w:t>constraints, but</w:t>
+      </w:r>
+      <w:proofErr w:type="gramEnd"/>
+      <w:r>
+        <w:rPr>
+          <w:rFonts w:eastAsiaTheme="minorEastAsia"/>
+        </w:rPr>
+        <w:t xml:space="preserve"> might not be suited to faithfully simulate the moisture flux and cloud fraction of shallow cumulus clouds.</w:t>
       </w:r>
     </w:p>
     <w:p>
@@ -6498,7 +7237,6 @@
           <w:rFonts w:eastAsiaTheme="minorEastAsia"/>
           <w:iCs/>
         </w:rPr>
-        <w:lastRenderedPageBreak/>
         <w:t xml:space="preserve">In our heuristic shallow cumulus model, cloud-scale turbulent processes are represented by lateral entrainment into clouds. Each entrainment rate determines a profile of a cloud’s moisture </w:t>
       </w:r>
       <m:oMath>
@@ -6613,15 +7351,24 @@
           <w:rFonts w:eastAsiaTheme="minorEastAsia"/>
           <w:iCs/>
         </w:rPr>
-        <w:t xml:space="preserve"> cloud fraction observed in EUREC4A</w:t>
-      </w:r>
+        <w:t xml:space="preserve"> cloud fraction observed in </w:t>
+      </w:r>
+      <w:proofErr w:type="gramStart"/>
       <w:r>
         <w:rPr>
           <w:rFonts w:eastAsiaTheme="minorEastAsia"/>
           <w:iCs/>
         </w:rPr>
+        <w:t>EUREC4A</w:t>
+      </w:r>
+      <w:r>
+        <w:rPr>
+          <w:rFonts w:eastAsiaTheme="minorEastAsia"/>
+          <w:iCs/>
+        </w:rPr>
         <w:t>, and</w:t>
       </w:r>
+      <w:proofErr w:type="gramEnd"/>
       <w:r>
         <w:rPr>
           <w:rFonts w:eastAsiaTheme="minorEastAsia"/>
@@ -6727,19 +7474,7 @@
         <w:pStyle w:val="BodyText"/>
       </w:pPr>
       <w:r>
-        <w:t xml:space="preserve">Using its </w:t>
-      </w:r>
-      <w:r>
-        <w:t>emergent mean moisture balance</w:t>
-      </w:r>
-      <w:r>
-        <w:t xml:space="preserve">, we project the climate of the </w:t>
-      </w:r>
-      <w:r>
-        <w:t>shallow cumulus cloud region</w:t>
-      </w:r>
-      <w:r>
-        <w:t xml:space="preserve"> from thermodynamic and cloud o</w:t>
+        <w:t>Using its emergent mean moisture balance, we project the climate of the shallow cumulus cloud region from thermodynamic and cloud o</w:t>
       </w:r>
       <w:r>
         <w:t>bservations</w:t>
@@ -6753,7 +7488,23 @@
         <w:pStyle w:val="BodyText"/>
       </w:pPr>
       <w:r>
-        <w:t>Cloud properties and within-regime feedbacks are similar between shallow cumulus and optically thicker stratocumulus clouds (Tselioudis et al., 2021; Zelinka et al. 2025), so shifts from stratocumulus to shallow cumulus could result in partial compensation between their radiative effects. The mixing-induced low cloud feedback hypothesis describes a version of this competition in the global average, whereby mixing by precipitating convection dries lower levels and evaporates extensive and optically thick stratocumulus clouds. All else equal, subsidence reduces stratocumulus clouds (Myers and Norris, 2014). While models have both stratocumulus and shallow cumulus clouds over the northern tropical Atlantic in January-February, clouds there are observed to be nearly exclusively shallow cumulus.</w:t>
+        <w:t xml:space="preserve">Cloud properties and within-regime </w:t>
+      </w:r>
+      <w:proofErr w:type="gramStart"/>
+      <w:r>
+        <w:t>feedbacks</w:t>
+      </w:r>
+      <w:proofErr w:type="gramEnd"/>
+      <w:r>
+        <w:t xml:space="preserve"> are similar between shallow cumulus and optically thicker stratocumulus clouds (</w:t>
+      </w:r>
+      <w:proofErr w:type="spellStart"/>
+      <w:r>
+        <w:t>Tselioudis</w:t>
+      </w:r>
+      <w:proofErr w:type="spellEnd"/>
+      <w:r>
+        <w:t xml:space="preserve"> et al., 2021; Zelinka et al. 2025), so shifts from stratocumulus to shallow cumulus could result in partial compensation between their radiative effects. The mixing-induced low cloud feedback hypothesis describes a version of this competition in the global average, whereby mixing by precipitating convection dries lower levels and evaporates extensive and optically thick stratocumulus clouds. All else equal, subsidence reduces stratocumulus clouds (Myers and Norris, 2014). While models have both stratocumulus and shallow cumulus clouds over the northern tropical Atlantic in January-February, clouds there are observed to be nearly exclusively shallow cumulus.</w:t>
       </w:r>
     </w:p>
     <w:p>
@@ -6818,7 +7569,21 @@
         <w:rPr>
           <w:rFonts w:ascii="Aptos" w:hAnsi="Aptos"/>
         </w:rPr>
-        <w:t>Figure MODISISCCP shows ISCCP-H cloud top height and optical thickness cloud fraction histograms observed from the 1-km pixel MODIS observations in the Northern Atlantic shallow cumulus region (80-20°W, 15-35°N) for January-February of 2019-2021. These high-resolution observations avoid partially cloudy pixels and are designed to be compared to COSP satellite simulators in climate models. Most (29.1%) of the clouds are below 800 hPa with cloud optical thickness between 1.3-9.4.</w:t>
+        <w:t xml:space="preserve">Figure MODISISCCP shows ISCCP-H cloud top height and optical thickness cloud fraction histograms observed from the 1-km pixel MODIS observations in the Northern Atlantic shallow cumulus region (80-20°W, 15-35°N) for January-February of 2019-2021. These high-resolution observations avoid partially cloudy pixels and are designed to be compared to COSP satellite simulators in climate models. Most (29.1%) of the clouds are below 800 </w:t>
+      </w:r>
+      <w:proofErr w:type="spellStart"/>
+      <w:r>
+        <w:rPr>
+          <w:rFonts w:ascii="Aptos" w:hAnsi="Aptos"/>
+        </w:rPr>
+        <w:t>hPa</w:t>
+      </w:r>
+      <w:proofErr w:type="spellEnd"/>
+      <w:r>
+        <w:rPr>
+          <w:rFonts w:ascii="Aptos" w:hAnsi="Aptos"/>
+        </w:rPr>
+        <w:t xml:space="preserve"> with cloud optical thickness between 1.3-9.4.</w:t>
       </w:r>
     </w:p>
     <w:p>
@@ -6832,7 +7597,15 @@
         <w:t>2</w:t>
       </w:r>
       <w:r>
-        <w:t xml:space="preserve"> regions, assuming updraft cores are cloudy with saturated specific humidity. The horizontal-time ensemble mean trade cumulus water (vapor + liquid) flux due to updrafts and precipitation balances mean subsidence. Cloud mass flux is initialized at cloud base to match the mean observed surface evaporation minus precipitation. </w:t>
+        <w:t xml:space="preserve"> regions, assuming updraft cores are cloudy with saturated specific humidity. The horizontal-time ensemble </w:t>
+      </w:r>
+      <w:proofErr w:type="gramStart"/>
+      <w:r>
+        <w:t>mean</w:t>
+      </w:r>
+      <w:proofErr w:type="gramEnd"/>
+      <w:r>
+        <w:t xml:space="preserve"> trade cumulus water (vapor + liquid) flux due to updrafts and precipitation balances mean subsidence. Cloud mass flux is initialized at cloud base to match the mean observed surface evaporation minus precipitation. </w:t>
       </w:r>
     </w:p>
     <w:p>
@@ -7108,7 +7881,6 @@
         <w:rPr>
           <w:noProof/>
         </w:rPr>
-        <w:lastRenderedPageBreak/>
         <w:drawing>
           <wp:inline distT="0" distB="0" distL="0" distR="0" wp14:anchorId="70CAFD0C" wp14:editId="365AA6F4">
             <wp:extent cx="5003800" cy="3759200"/>
@@ -7563,7 +8335,21 @@
         <w:rPr>
           <w:rFonts w:eastAsiaTheme="minorEastAsia"/>
         </w:rPr>
-        <w:t>is an underconstrained problem</w:t>
+        <w:t xml:space="preserve">is an </w:t>
+      </w:r>
+      <w:proofErr w:type="spellStart"/>
+      <w:r>
+        <w:rPr>
+          <w:rFonts w:eastAsiaTheme="minorEastAsia"/>
+        </w:rPr>
+        <w:t>underconstrained</w:t>
+      </w:r>
+      <w:proofErr w:type="spellEnd"/>
+      <w:r>
+        <w:rPr>
+          <w:rFonts w:eastAsiaTheme="minorEastAsia"/>
+        </w:rPr>
+        <w:t xml:space="preserve"> problem</w:t>
       </w:r>
       <w:r>
         <w:rPr>
@@ -8146,7 +8932,6 @@
           <w:rFonts w:ascii="Times New Roman" w:hAnsi="Times New Roman" w:cs="Times New Roman"/>
           <w:noProof/>
         </w:rPr>
-        <w:lastRenderedPageBreak/>
         <w:drawing>
           <wp:inline distT="0" distB="0" distL="0" distR="0" wp14:anchorId="16AEB97E" wp14:editId="480EE214">
             <wp:extent cx="3619500" cy="2908300"/>
@@ -8163,7 +8948,7 @@
                     <pic:cNvPicPr/>
                   </pic:nvPicPr>
                   <pic:blipFill>
-                    <a:blip r:embed="rId9"/>
+                    <a:blip r:embed="rId10"/>
                     <a:stretch>
                       <a:fillRect/>
                     </a:stretch>
@@ -8335,12 +9120,14 @@
       <w:r>
         <w:t xml:space="preserve"> </w:t>
       </w:r>
+      <w:proofErr w:type="spellStart"/>
       <w:r>
         <w:rPr>
           <w:rFonts w:ascii="ComicShannsMono Nerd Font" w:hAnsi="ComicShannsMono Nerd Font"/>
         </w:rPr>
         <w:t>amip</w:t>
       </w:r>
+      <w:proofErr w:type="spellEnd"/>
       <w:r>
         <w:t xml:space="preserve"> (historical) and </w:t>
       </w:r>
@@ -8374,12 +9161,14 @@
       <w:r>
         <w:t xml:space="preserve"> and </w:t>
       </w:r>
+      <w:proofErr w:type="spellStart"/>
       <w:r>
         <w:rPr>
           <w:rFonts w:ascii="ComicShannsMono Nerd Font" w:hAnsi="ComicShannsMono Nerd Font"/>
         </w:rPr>
         <w:t>amip</w:t>
       </w:r>
+      <w:proofErr w:type="spellEnd"/>
       <w:r>
         <w:t xml:space="preserve"> during</w:t>
       </w:r>
@@ -9605,13 +10394,7 @@
           <w:rPr>
             <w:rFonts w:ascii="Cambria Math" w:hAnsi="Cambria Math"/>
           </w:rPr>
-          <m:t>&lt;</m:t>
-        </m:r>
-        <m:r>
-          <w:rPr>
-            <w:rFonts w:ascii="Cambria Math" w:hAnsi="Cambria Math"/>
-          </w:rPr>
-          <m:t>0</m:t>
+          <m:t>&lt;0</m:t>
         </m:r>
       </m:oMath>
       <w:r>
@@ -10279,11 +11062,19 @@
         </w:rPr>
         <w:t>, a</w:t>
       </w:r>
+      <w:proofErr w:type="spellStart"/>
       <w:r>
         <w:rPr>
           <w:rFonts w:ascii="Aptos" w:eastAsiaTheme="minorEastAsia" w:hAnsi="Aptos" w:cs="Times New Roman"/>
         </w:rPr>
-        <w:t xml:space="preserve">utoconversion removes cloud liquid, relaxing total water toward </w:t>
+        <w:t>utoconversion</w:t>
+      </w:r>
+      <w:proofErr w:type="spellEnd"/>
+      <w:r>
+        <w:rPr>
+          <w:rFonts w:ascii="Aptos" w:eastAsiaTheme="minorEastAsia" w:hAnsi="Aptos" w:cs="Times New Roman"/>
+        </w:rPr>
+        <w:t xml:space="preserve"> removes cloud liquid, relaxing total water toward </w:t>
       </w:r>
       <m:oMath>
         <m:sSub>
@@ -10552,11 +11343,19 @@
         </w:rPr>
         <w:t>relax</w:t>
       </w:r>
+      <w:proofErr w:type="spellStart"/>
       <w:r>
         <w:rPr>
           <w:rFonts w:ascii="Aptos" w:eastAsiaTheme="minorEastAsia" w:hAnsi="Aptos" w:cs="Times New Roman"/>
         </w:rPr>
-        <w:t xml:space="preserve">ing </w:t>
+        <w:t>ing</w:t>
+      </w:r>
+      <w:proofErr w:type="spellEnd"/>
+      <w:r>
+        <w:rPr>
+          <w:rFonts w:ascii="Aptos" w:eastAsiaTheme="minorEastAsia" w:hAnsi="Aptos" w:cs="Times New Roman"/>
+        </w:rPr>
+        <w:t xml:space="preserve"> </w:t>
       </w:r>
       <m:oMath>
         <m:sSub>
@@ -10935,7 +11734,6 @@
           <w:rFonts w:ascii="Times New Roman" w:eastAsiaTheme="minorEastAsia" w:hAnsi="Times New Roman" w:cs="Times New Roman"/>
           <w:noProof/>
         </w:rPr>
-        <w:lastRenderedPageBreak/>
         <w:drawing>
           <wp:inline distT="0" distB="0" distL="0" distR="0" wp14:anchorId="68DD7473" wp14:editId="12C93EF0">
             <wp:extent cx="4631961" cy="3699022"/>
@@ -10952,7 +11750,7 @@
                     <pic:cNvPicPr/>
                   </pic:nvPicPr>
                   <pic:blipFill>
-                    <a:blip r:embed="rId10"/>
+                    <a:blip r:embed="rId11"/>
                     <a:stretch>
                       <a:fillRect/>
                     </a:stretch>
@@ -11317,8 +12115,16 @@
         <w:rPr>
           <w:rFonts w:ascii="Aptos Narrow" w:eastAsiaTheme="minorEastAsia" w:hAnsi="Aptos Narrow" w:cs="Times New Roman"/>
         </w:rPr>
-        <w:t>[ /home/deszoeks/Projects/ATOMIC/ATOMIC_GOES/julia/RHB/sonde/moisture_clouds.pdf ]</w:t>
-      </w:r>
+        <w:t xml:space="preserve">[ </w:t>
+      </w:r>
+      <w:proofErr w:type="gramStart"/>
+      <w:r>
+        <w:rPr>
+          <w:rFonts w:ascii="Aptos Narrow" w:eastAsiaTheme="minorEastAsia" w:hAnsi="Aptos Narrow" w:cs="Times New Roman"/>
+        </w:rPr>
+        <w:t>/home/deszoeks/Projects/ATOMIC/ATOMIC_GOES/julia/RHB/sonde/moisture_clouds.pdf ]</w:t>
+      </w:r>
+      <w:proofErr w:type="gramEnd"/>
     </w:p>
     <w:p>
       <w:pPr>
@@ -11808,7 +12614,6 @@
         <w:rPr>
           <w:rFonts w:ascii="Aptos" w:eastAsiaTheme="minorEastAsia" w:hAnsi="Aptos" w:cs="Times New Roman"/>
         </w:rPr>
-        <w:lastRenderedPageBreak/>
         <w:t xml:space="preserve">The solution for each cloud type </w:t>
       </w:r>
       <m:oMath>
@@ -12948,7 +13753,7 @@
                     <pic:cNvPicPr/>
                   </pic:nvPicPr>
                   <pic:blipFill>
-                    <a:blip r:embed="rId11"/>
+                    <a:blip r:embed="rId12"/>
                     <a:stretch>
                       <a:fillRect/>
                     </a:stretch>
@@ -13102,28 +13907,14 @@
           <w:rFonts w:ascii="Aptos Narrow" w:eastAsia="Times New Roman" w:hAnsi="Aptos Narrow" w:cstheme="minorHAnsi"/>
           <w:color w:val="323130"/>
         </w:rPr>
-        <w:t>(red)</w:t>
+        <w:t>(red) modeled for a single cloud</w:t>
       </w:r>
       <w:r>
         <w:rPr>
           <w:rFonts w:ascii="Aptos Narrow" w:eastAsia="Times New Roman" w:hAnsi="Aptos Narrow" w:cstheme="minorHAnsi"/>
           <w:color w:val="323130"/>
         </w:rPr>
-        <w:t xml:space="preserve"> modeled for a single cloud</w:t>
-      </w:r>
-      <w:r>
-        <w:rPr>
-          <w:rFonts w:ascii="Aptos Narrow" w:eastAsia="Times New Roman" w:hAnsi="Aptos Narrow" w:cstheme="minorHAnsi"/>
-          <w:color w:val="323130"/>
-        </w:rPr>
-        <w:t xml:space="preserve"> with t</w:t>
-      </w:r>
-      <w:r>
-        <w:rPr>
-          <w:rFonts w:ascii="Aptos Narrow" w:eastAsia="Times New Roman" w:hAnsi="Aptos Narrow" w:cstheme="minorHAnsi"/>
-          <w:color w:val="323130"/>
-        </w:rPr>
-        <w:t xml:space="preserve">otal moisture flux </w:t>
+        <w:t xml:space="preserve"> with total moisture flux </w:t>
       </w:r>
       <m:oMath>
         <m:r>
@@ -13139,14 +13930,7 @@
           <w:rFonts w:ascii="Aptos Narrow" w:eastAsia="Times New Roman" w:hAnsi="Aptos Narrow" w:cstheme="minorHAnsi"/>
           <w:color w:val="323130"/>
         </w:rPr>
-        <w:t xml:space="preserve"> (blue)</w:t>
-      </w:r>
-      <w:r>
-        <w:rPr>
-          <w:rFonts w:ascii="Aptos Narrow" w:eastAsia="Times New Roman" w:hAnsi="Aptos Narrow" w:cstheme="minorHAnsi"/>
-          <w:color w:val="323130"/>
-        </w:rPr>
-        <w:t>.</w:t>
+        <w:t xml:space="preserve"> (blue).</w:t>
       </w:r>
     </w:p>
     <w:p>
@@ -13160,7 +13944,6 @@
         <w:rPr>
           <w:rFonts w:ascii="Aptos" w:eastAsiaTheme="minorEastAsia" w:hAnsi="Aptos" w:cs="Times New Roman"/>
         </w:rPr>
-        <w:lastRenderedPageBreak/>
         <w:t xml:space="preserve">The cloud (a) total specific humidity and (b) cloud-environment humidity difference as a function of height and total sink rate </w:t>
       </w:r>
       <w:r>
@@ -13342,7 +14125,7 @@
                     <pic:cNvPicPr/>
                   </pic:nvPicPr>
                   <pic:blipFill>
-                    <a:blip r:embed="rId12"/>
+                    <a:blip r:embed="rId13"/>
                     <a:stretch>
                       <a:fillRect/>
                     </a:stretch>
@@ -13537,7 +14320,6 @@
           <w:rFonts w:ascii="Aptos Narrow" w:eastAsiaTheme="minorEastAsia" w:hAnsi="Aptos Narrow" w:cs="Times New Roman"/>
           <w:noProof/>
         </w:rPr>
-        <w:lastRenderedPageBreak/>
         <w:drawing>
           <wp:inline distT="0" distB="0" distL="0" distR="0" wp14:anchorId="6A10348B" wp14:editId="0ABCB3A5">
             <wp:extent cx="3759200" cy="2971800"/>
@@ -13554,7 +14336,7 @@
                     <pic:cNvPicPr/>
                   </pic:nvPicPr>
                   <pic:blipFill>
-                    <a:blip r:embed="rId13"/>
+                    <a:blip r:embed="rId14"/>
                     <a:stretch>
                       <a:fillRect/>
                     </a:stretch>
@@ -13858,13 +14640,7 @@
                       <w:rPr>
                         <w:rFonts w:ascii="Cambria Math" w:eastAsiaTheme="minorEastAsia" w:hAnsi="Cambria Math" w:cs="Times New Roman"/>
                       </w:rPr>
-                      <m:t>c</m:t>
-                    </m:r>
-                    <m:r>
-                      <w:rPr>
-                        <w:rFonts w:ascii="Cambria Math" w:eastAsiaTheme="minorEastAsia" w:hAnsi="Cambria Math" w:cs="Times New Roman"/>
-                      </w:rPr>
-                      <m:t>,i</m:t>
+                      <m:t>c,i</m:t>
                     </m:r>
                   </m:sub>
                 </m:sSub>
@@ -14206,12 +14982,14 @@
         </w:rPr>
         <w:t>P</w:t>
       </w:r>
+      <w:proofErr w:type="spellStart"/>
       <w:r>
         <w:rPr>
           <w:rFonts w:ascii="Aptos" w:eastAsiaTheme="minorEastAsia" w:hAnsi="Aptos" w:cs="Times New Roman"/>
         </w:rPr>
         <w:t>recipitation</w:t>
       </w:r>
+      <w:proofErr w:type="spellEnd"/>
       <w:r>
         <w:rPr>
           <w:rFonts w:ascii="Aptos" w:eastAsiaTheme="minorEastAsia" w:hAnsi="Aptos" w:cs="Times New Roman"/>
@@ -15081,19 +15859,7 @@
         <w:rPr>
           <w:rFonts w:ascii="Aptos" w:hAnsi="Aptos"/>
         </w:rPr>
-        <w:t>observations and large-eddy simulation (LES) models</w:t>
-      </w:r>
-      <w:r>
-        <w:rPr>
-          <w:rFonts w:ascii="Aptos" w:hAnsi="Aptos"/>
-        </w:rPr>
-        <w:t xml:space="preserve"> have </w:t>
-      </w:r>
-      <w:r>
-        <w:rPr>
-          <w:rFonts w:ascii="Aptos" w:hAnsi="Aptos"/>
-        </w:rPr>
-        <w:t>a</w:t>
+        <w:t>observations and large-eddy simulation (LES) models have a</w:t>
       </w:r>
       <w:r>
         <w:rPr>
@@ -15129,20 +15895,21 @@
         <w:rPr>
           <w:rFonts w:ascii="Aptos" w:hAnsi="Aptos"/>
         </w:rPr>
-        <w:t xml:space="preserve"> </w:t>
-      </w:r>
-      <w:r>
-        <w:rPr>
-          <w:rFonts w:ascii="Aptos" w:hAnsi="Aptos"/>
-        </w:rPr>
-        <w:t xml:space="preserve">While shallow cumulus decrease with reduced large-scale overturning, local scaling of the moist turbulent subcloud boundary </w:t>
-      </w:r>
-      <w:r>
-        <w:rPr>
-          <w:rFonts w:ascii="Aptos" w:hAnsi="Aptos"/>
-        </w:rPr>
-        <w:lastRenderedPageBreak/>
-        <w:t xml:space="preserve">layer suggests that clouds at the LCL </w:t>
+        <w:t xml:space="preserve"> While shallow cumulus </w:t>
+      </w:r>
+      <w:proofErr w:type="gramStart"/>
+      <w:r>
+        <w:rPr>
+          <w:rFonts w:ascii="Aptos" w:hAnsi="Aptos"/>
+        </w:rPr>
+        <w:t>decrease</w:t>
+      </w:r>
+      <w:proofErr w:type="gramEnd"/>
+      <w:r>
+        <w:rPr>
+          <w:rFonts w:ascii="Aptos" w:hAnsi="Aptos"/>
+        </w:rPr>
+        <w:t xml:space="preserve"> with reduced large-scale overturning, local scaling of the moist turbulent subcloud boundary layer suggests that clouds at the LCL </w:t>
       </w:r>
       <w:r>
         <w:rPr>
@@ -15156,31 +15923,7 @@
         <w:rPr>
           <w:rFonts w:ascii="Aptos" w:hAnsi="Aptos"/>
         </w:rPr>
-        <w:t xml:space="preserve"> by about th</w:t>
-      </w:r>
-      <w:r>
-        <w:rPr>
-          <w:rFonts w:ascii="Aptos" w:hAnsi="Aptos"/>
-        </w:rPr>
-        <w:t>is</w:t>
-      </w:r>
-      <w:r>
-        <w:rPr>
-          <w:rFonts w:ascii="Aptos" w:hAnsi="Aptos"/>
-        </w:rPr>
-        <w:t xml:space="preserve"> same amount. The net cloud radiative effect depends on the relative amount of shallow cumulus vs. </w:t>
-      </w:r>
-      <w:r>
-        <w:rPr>
-          <w:rFonts w:ascii="Aptos" w:hAnsi="Aptos"/>
-        </w:rPr>
-        <w:t>LCL</w:t>
-      </w:r>
-      <w:r>
-        <w:rPr>
-          <w:rFonts w:ascii="Aptos" w:hAnsi="Aptos"/>
-        </w:rPr>
-        <w:t xml:space="preserve"> clouds.</w:t>
+        <w:t xml:space="preserve"> by about this same amount. The net cloud radiative effect depends on the relative amount of shallow cumulus vs. LCL clouds.</w:t>
       </w:r>
     </w:p>
     <w:p>
@@ -15194,13 +15937,7 @@
         <w:rPr>
           <w:rFonts w:ascii="Aptos" w:hAnsi="Aptos"/>
         </w:rPr>
-        <w:t>LCL</w:t>
-      </w:r>
-      <w:r>
-        <w:rPr>
-          <w:rFonts w:ascii="Aptos" w:hAnsi="Aptos"/>
-        </w:rPr>
-        <w:t xml:space="preserve"> clouds</w:t>
+        <w:t>LCL clouds</w:t>
       </w:r>
       <w:r>
         <w:rPr>
@@ -15224,37 +15961,7 @@
         <w:rPr>
           <w:rFonts w:ascii="Aptos" w:hAnsi="Aptos"/>
         </w:rPr>
-        <w:t>moisture condenses from turbulent subcloud thermals, are not</w:t>
-      </w:r>
-      <w:r>
-        <w:rPr>
-          <w:rFonts w:ascii="Aptos" w:hAnsi="Aptos"/>
-        </w:rPr>
-        <w:t xml:space="preserve"> </w:t>
-      </w:r>
-      <w:r>
-        <w:rPr>
-          <w:rFonts w:ascii="Aptos" w:hAnsi="Aptos"/>
-        </w:rPr>
-        <w:t xml:space="preserve">represented by </w:t>
-      </w:r>
-      <w:r>
-        <w:rPr>
-          <w:rFonts w:ascii="Aptos" w:hAnsi="Aptos"/>
-        </w:rPr>
-        <w:t xml:space="preserve">the </w:t>
-      </w:r>
-      <w:r>
-        <w:rPr>
-          <w:rFonts w:ascii="Aptos" w:hAnsi="Aptos"/>
-        </w:rPr>
-        <w:t>moist updraft plumes</w:t>
-      </w:r>
-      <w:r>
-        <w:rPr>
-          <w:rFonts w:ascii="Aptos" w:hAnsi="Aptos"/>
-        </w:rPr>
-        <w:t xml:space="preserve"> of a mass flux model</w:t>
+        <w:t>moisture condenses from turbulent subcloud thermals, are not represented by the moist updraft plumes of a mass flux model</w:t>
       </w:r>
       <w:r>
         <w:rPr>
@@ -15308,7 +16015,21 @@
         <w:rPr>
           <w:rFonts w:ascii="Aptos" w:hAnsi="Aptos"/>
         </w:rPr>
-        <w:t>(Sommeria and Deardorff, 1977; Mellor 1977). For a normal distribution of relative humidity</w:t>
+        <w:t>(</w:t>
+      </w:r>
+      <w:proofErr w:type="spellStart"/>
+      <w:r>
+        <w:rPr>
+          <w:rFonts w:ascii="Aptos" w:hAnsi="Aptos"/>
+        </w:rPr>
+        <w:t>Sommeria</w:t>
+      </w:r>
+      <w:proofErr w:type="spellEnd"/>
+      <w:r>
+        <w:rPr>
+          <w:rFonts w:ascii="Aptos" w:hAnsi="Aptos"/>
+        </w:rPr>
+        <w:t xml:space="preserve"> and Deardorff, 1977; Mellor 1977). For a normal distribution of relative humidity</w:t>
       </w:r>
       <w:r>
         <w:rPr>
@@ -15571,6 +16292,7 @@
         </w:rPr>
         <w:t xml:space="preserve"> m</w:t>
       </w:r>
+      <w:proofErr w:type="spellStart"/>
       <w:r>
         <w:rPr>
           <w:rFonts w:ascii="Aptos" w:hAnsi="Aptos"/>
@@ -15583,6 +16305,7 @@
         </w:rPr>
         <w:t>ing</w:t>
       </w:r>
+      <w:proofErr w:type="spellEnd"/>
       <w:r>
         <w:rPr>
           <w:rFonts w:ascii="Aptos" w:hAnsi="Aptos"/>
@@ -17550,11 +18273,19 @@
         </w:rPr>
         <w:t>D</w:t>
       </w:r>
+      <w:proofErr w:type="spellStart"/>
       <w:r>
         <w:rPr>
           <w:rFonts w:ascii="Aptos" w:eastAsiaTheme="minorEastAsia" w:hAnsi="Aptos"/>
         </w:rPr>
-        <w:t xml:space="preserve">ividing by the saturation specific humidity, </w:t>
+        <w:t>ividing</w:t>
+      </w:r>
+      <w:proofErr w:type="spellEnd"/>
+      <w:r>
+        <w:rPr>
+          <w:rFonts w:ascii="Aptos" w:eastAsiaTheme="minorEastAsia" w:hAnsi="Aptos"/>
+        </w:rPr>
+        <w:t xml:space="preserve"> by the saturation specific humidity, </w:t>
       </w:r>
       <w:r>
         <w:rPr>
@@ -19344,7 +20075,7 @@
                     <pic:cNvPicPr/>
                   </pic:nvPicPr>
                   <pic:blipFill>
-                    <a:blip r:embed="rId14"/>
+                    <a:blip r:embed="rId15"/>
                     <a:stretch>
                       <a:fillRect/>
                     </a:stretch>
@@ -19387,7 +20118,6 @@
         <w:rPr>
           <w:noProof/>
         </w:rPr>
-        <w:lastRenderedPageBreak/>
         <w:drawing>
           <wp:inline distT="0" distB="0" distL="0" distR="0" wp14:anchorId="23630D15" wp14:editId="5BF437A2">
             <wp:extent cx="3397250" cy="4076700"/>
@@ -19404,7 +20134,7 @@
                     <pic:cNvPicPr/>
                   </pic:nvPicPr>
                   <pic:blipFill>
-                    <a:blip r:embed="rId15"/>
+                    <a:blip r:embed="rId16"/>
                     <a:stretch>
                       <a:fillRect/>
                     </a:stretch>
@@ -19439,7 +20169,25 @@
           <w:kern w:val="0"/>
           <w14:ligatures w14:val="none"/>
         </w:rPr>
-        <w:t>Figure GOESISCCP. GOES-16 (a) cloud fraction by cloud type for 12.5-16 °N, 60-49 °W, 2020 Jan 15- February 28. (b) Shortwave cloud radiative effect (CRE) for each cloud top pressure and optical depth. The total cloud radiative effect for clouds below 680 hPa is 32 W m</w:t>
+        <w:t xml:space="preserve">Figure GOESISCCP. GOES-16 (a) cloud fraction by cloud type for 12.5-16 °N, 60-49 °W, 2020 Jan 15- February 28. (b) Shortwave cloud radiative effect (CRE) for each cloud top pressure and optical depth. The total cloud radiative effect for clouds below 680 </w:t>
+      </w:r>
+      <w:proofErr w:type="spellStart"/>
+      <w:r>
+        <w:rPr>
+          <w:rFonts w:ascii="Aptos Narrow" w:eastAsiaTheme="minorEastAsia" w:hAnsi="Aptos Narrow" w:cs="Times New Roman"/>
+          <w:kern w:val="0"/>
+          <w14:ligatures w14:val="none"/>
+        </w:rPr>
+        <w:t>hPa</w:t>
+      </w:r>
+      <w:proofErr w:type="spellEnd"/>
+      <w:r>
+        <w:rPr>
+          <w:rFonts w:ascii="Aptos Narrow" w:eastAsiaTheme="minorEastAsia" w:hAnsi="Aptos Narrow" w:cs="Times New Roman"/>
+          <w:kern w:val="0"/>
+          <w14:ligatures w14:val="none"/>
+        </w:rPr>
+        <w:t xml:space="preserve"> is 32 W m</w:t>
       </w:r>
       <w:r>
         <w:rPr>
@@ -19636,11 +20384,47 @@
           <w:kern w:val="0"/>
           <w14:ligatures w14:val="none"/>
         </w:rPr>
-        <w:t xml:space="preserve"> because reflectance downweights the cloud fraction in pixels that the ISCCP-MODIS like algorithm counts as fully cloudy but having lower optical depth. In this way, we use pixel reflectance as pseudo-albedo, and exclude scenes where the low clouds are obscured.]</w:t>
+        <w:t xml:space="preserve"> because reflectance </w:t>
+      </w:r>
+      <w:proofErr w:type="spellStart"/>
+      <w:r>
+        <w:rPr>
+          <w:rFonts w:eastAsiaTheme="minorEastAsia" w:cs="Times New Roman"/>
+          <w:kern w:val="0"/>
+          <w14:ligatures w14:val="none"/>
+        </w:rPr>
+        <w:t>downweights</w:t>
+      </w:r>
+      <w:proofErr w:type="spellEnd"/>
+      <w:r>
+        <w:rPr>
+          <w:rFonts w:eastAsiaTheme="minorEastAsia" w:cs="Times New Roman"/>
+          <w:kern w:val="0"/>
+          <w14:ligatures w14:val="none"/>
+        </w:rPr>
+        <w:t xml:space="preserve"> the cloud fraction in pixels that the ISCCP-MODIS like algorithm counts as fully cloudy but having lower optical depth. In this way, we use pixel reflectance as pseudo-</w:t>
+      </w:r>
+      <w:proofErr w:type="gramStart"/>
+      <w:r>
+        <w:rPr>
+          <w:rFonts w:eastAsiaTheme="minorEastAsia" w:cs="Times New Roman"/>
+          <w:kern w:val="0"/>
+          <w14:ligatures w14:val="none"/>
+        </w:rPr>
+        <w:t>albedo, and</w:t>
+      </w:r>
+      <w:proofErr w:type="gramEnd"/>
+      <w:r>
+        <w:rPr>
+          <w:rFonts w:eastAsiaTheme="minorEastAsia" w:cs="Times New Roman"/>
+          <w:kern w:val="0"/>
+          <w14:ligatures w14:val="none"/>
+        </w:rPr>
+        <w:t xml:space="preserve"> exclude scenes where the low clouds are obscured.]</w:t>
       </w:r>
     </w:p>
     <w:sectPr>
-      <w:footerReference w:type="default" r:id="rId16"/>
+      <w:footerReference w:type="default" r:id="rId17"/>
       <w:pgSz w:w="12240" w:h="15840"/>
       <w:pgMar w:top="1440" w:right="1440" w:bottom="1440" w:left="1440" w:header="720" w:footer="720" w:gutter="0"/>
       <w:cols w:space="720"/>
@@ -19651,7 +20435,7 @@
 </file>
 
 <file path=word/endnotes.xml><?xml version="1.0" encoding="utf-8"?>
-<w:endnotes xmlns:wpc="http://schemas.microsoft.com/office/word/2010/wordprocessingCanvas" xmlns:cx="http://schemas.microsoft.com/office/drawing/2014/chartex" xmlns:cx1="http://schemas.microsoft.com/office/drawing/2015/9/8/chartex" xmlns:cx2="http://schemas.microsoft.com/office/drawing/2015/10/21/chartex" xmlns:cx3="http://schemas.microsoft.com/office/drawing/2016/5/9/chartex" xmlns:cx4="http://schemas.microsoft.com/office/drawing/2016/5/10/chartex" xmlns:cx5="http://schemas.microsoft.com/office/drawing/2016/5/11/chartex" xmlns:cx6="http://schemas.microsoft.com/office/drawing/2016/5/12/chartex" xmlns:cx7="http://schemas.microsoft.com/office/drawing/2016/5/13/chartex" xmlns:cx8="http://schemas.microsoft.com/office/drawing/2016/5/14/chartex" xmlns:mc="http://schemas.openxmlformats.org/markup-compatibility/2006" xmlns:aink="http://schemas.microsoft.com/office/drawing/2016/ink" xmlns:am3d="http://schemas.microsoft.com/office/drawing/2017/model3d" xmlns:o="urn:schemas-microsoft-com:office:office" xmlns:oel="http://schemas.microsoft.com/office/2019/extlst" xmlns:r="http://schemas.openxmlformats.org/officeDocument/2006/relationships" xmlns:m="http://schemas.openxmlformats.org/officeDocument/2006/math" xmlns:v="urn:schemas-microsoft-com:vml" xmlns:wp14="http://schemas.microsoft.com/office/word/2010/wordprocessingDrawing" xmlns:wp="http://schemas.openxmlformats.org/drawingml/2006/wordprocessingDrawing" xmlns:w10="urn:schemas-microsoft-com:office:word" xmlns:w="http://schemas.openxmlformats.org/wordprocessingml/2006/main" xmlns:w14="http://schemas.microsoft.com/office/word/2010/wordml" xmlns:w15="http://schemas.microsoft.com/office/word/2012/wordml" xmlns:w16cex="http://schemas.microsoft.com/office/word/2018/wordml/cex" xmlns:w16cid="http://schemas.microsoft.com/office/word/2016/wordml/cid" xmlns:w16="http://schemas.microsoft.com/office/word/2018/wordml" xmlns:w16du="http://schemas.microsoft.com/office/word/2023/wordml/word16du" xmlns:w16sdtdh="http://schemas.microsoft.com/office/word/2020/wordml/sdtdatahash" xmlns:w16sdtfl="http://schemas.microsoft.com/office/word/2024/wordml/sdtformatlock" xmlns:w16se="http://schemas.microsoft.com/office/word/2015/wordml/symex" xmlns:wpg="http://schemas.microsoft.com/office/word/2010/wordprocessingGroup" xmlns:wpi="http://schemas.microsoft.com/office/word/2010/wordprocessingInk" xmlns:wne="http://schemas.microsoft.com/office/word/2006/wordml" xmlns:wps="http://schemas.microsoft.com/office/word/2010/wordprocessingShape" mc:Ignorable="w14 w15 w16se w16cid w16 w16cex w16sdtdh w16sdtfl w16du wp14">
+<w:endnotes xmlns:wpc="http://schemas.microsoft.com/office/word/2010/wordprocessingCanvas" xmlns:cx="http://schemas.microsoft.com/office/drawing/2014/chartex" xmlns:cx1="http://schemas.microsoft.com/office/drawing/2015/9/8/chartex" xmlns:cx2="http://schemas.microsoft.com/office/drawing/2015/10/21/chartex" xmlns:cx3="http://schemas.microsoft.com/office/drawing/2016/5/9/chartex" xmlns:cx4="http://schemas.microsoft.com/office/drawing/2016/5/10/chartex" xmlns:cx5="http://schemas.microsoft.com/office/drawing/2016/5/11/chartex" xmlns:cx6="http://schemas.microsoft.com/office/drawing/2016/5/12/chartex" xmlns:cx7="http://schemas.microsoft.com/office/drawing/2016/5/13/chartex" xmlns:cx8="http://schemas.microsoft.com/office/drawing/2016/5/14/chartex" xmlns:mc="http://schemas.openxmlformats.org/markup-compatibility/2006" xmlns:m="http://schemas.openxmlformats.org/officeDocument/2006/math" xmlns:aink="http://schemas.microsoft.com/office/drawing/2016/ink" xmlns:am3d="http://schemas.microsoft.com/office/drawing/2017/model3d" xmlns:oel="http://schemas.microsoft.com/office/2019/extlst" xmlns:r="http://schemas.openxmlformats.org/officeDocument/2006/relationships" xmlns:wp14="http://schemas.microsoft.com/office/word/2010/wordprocessingDrawing" xmlns:wp="http://schemas.openxmlformats.org/drawingml/2006/wordprocessingDrawing" xmlns:wpg="http://schemas.microsoft.com/office/word/2010/wordprocessingGroup" xmlns:wpi="http://schemas.microsoft.com/office/word/2010/wordprocessingInk" xmlns:wps="http://schemas.microsoft.com/office/word/2010/wordprocessingShape" xmlns:o="urn:schemas-microsoft-com:office:office" xmlns:v="urn:schemas-microsoft-com:vml" xmlns:w10="urn:schemas-microsoft-com:office:word" xmlns:w="http://schemas.openxmlformats.org/wordprocessingml/2006/main" xmlns:w14="http://schemas.microsoft.com/office/word/2010/wordml" xmlns:w15="http://schemas.microsoft.com/office/word/2012/wordml" xmlns:w16cei="http://schemas.microsoft.com/office/word/2026/wordml/cei" xmlns:w16cex="http://schemas.microsoft.com/office/word/2018/wordml/cex" xmlns:w16cid="http://schemas.microsoft.com/office/word/2016/wordml/cid" xmlns:w16="http://schemas.microsoft.com/office/word/2018/wordml" xmlns:w16sdtdh="http://schemas.microsoft.com/office/word/2020/wordml/sdtdatahash" xmlns:w16sdtfl="http://schemas.microsoft.com/office/word/2024/wordml/sdtformatlock" xmlns:w16se="http://schemas.microsoft.com/office/word/2015/wordml/symex" xmlns:w16du="http://schemas.microsoft.com/office/word/2023/wordml/word16du" xmlns:wne="http://schemas.microsoft.com/office/word/2006/wordml" mc:Ignorable="w14 w15 w16se w16cid w16 w16cex w16sdtdh w16sdtfl w16du wp14">
   <w:endnote w:type="separator" w:id="-1">
     <w:p>
       <w:pPr>
@@ -19676,7 +20460,7 @@
 </file>
 
 <file path=word/footer1.xml><?xml version="1.0" encoding="utf-8"?>
-<w:ftr xmlns:wpc="http://schemas.microsoft.com/office/word/2010/wordprocessingCanvas" xmlns:cx="http://schemas.microsoft.com/office/drawing/2014/chartex" xmlns:cx1="http://schemas.microsoft.com/office/drawing/2015/9/8/chartex" xmlns:cx2="http://schemas.microsoft.com/office/drawing/2015/10/21/chartex" xmlns:cx3="http://schemas.microsoft.com/office/drawing/2016/5/9/chartex" xmlns:cx4="http://schemas.microsoft.com/office/drawing/2016/5/10/chartex" xmlns:cx5="http://schemas.microsoft.com/office/drawing/2016/5/11/chartex" xmlns:cx6="http://schemas.microsoft.com/office/drawing/2016/5/12/chartex" xmlns:cx7="http://schemas.microsoft.com/office/drawing/2016/5/13/chartex" xmlns:cx8="http://schemas.microsoft.com/office/drawing/2016/5/14/chartex" xmlns:mc="http://schemas.openxmlformats.org/markup-compatibility/2006" xmlns:aink="http://schemas.microsoft.com/office/drawing/2016/ink" xmlns:am3d="http://schemas.microsoft.com/office/drawing/2017/model3d" xmlns:o="urn:schemas-microsoft-com:office:office" xmlns:oel="http://schemas.microsoft.com/office/2019/extlst" xmlns:r="http://schemas.openxmlformats.org/officeDocument/2006/relationships" xmlns:m="http://schemas.openxmlformats.org/officeDocument/2006/math" xmlns:v="urn:schemas-microsoft-com:vml" xmlns:wp14="http://schemas.microsoft.com/office/word/2010/wordprocessingDrawing" xmlns:wp="http://schemas.openxmlformats.org/drawingml/2006/wordprocessingDrawing" xmlns:w10="urn:schemas-microsoft-com:office:word" xmlns:w="http://schemas.openxmlformats.org/wordprocessingml/2006/main" xmlns:w14="http://schemas.microsoft.com/office/word/2010/wordml" xmlns:w15="http://schemas.microsoft.com/office/word/2012/wordml" xmlns:w16cex="http://schemas.microsoft.com/office/word/2018/wordml/cex" xmlns:w16cid="http://schemas.microsoft.com/office/word/2016/wordml/cid" xmlns:w16="http://schemas.microsoft.com/office/word/2018/wordml" xmlns:w16du="http://schemas.microsoft.com/office/word/2023/wordml/word16du" xmlns:w16sdtdh="http://schemas.microsoft.com/office/word/2020/wordml/sdtdatahash" xmlns:w16sdtfl="http://schemas.microsoft.com/office/word/2024/wordml/sdtformatlock" xmlns:w16se="http://schemas.microsoft.com/office/word/2015/wordml/symex" xmlns:wpg="http://schemas.microsoft.com/office/word/2010/wordprocessingGroup" xmlns:wpi="http://schemas.microsoft.com/office/word/2010/wordprocessingInk" xmlns:wne="http://schemas.microsoft.com/office/word/2006/wordml" xmlns:wps="http://schemas.microsoft.com/office/word/2010/wordprocessingShape" mc:Ignorable="w14 w15 w16se w16cid w16 w16cex w16sdtdh w16sdtfl w16du wp14">
+<w:ftr xmlns:wpc="http://schemas.microsoft.com/office/word/2010/wordprocessingCanvas" xmlns:cx="http://schemas.microsoft.com/office/drawing/2014/chartex" xmlns:cx1="http://schemas.microsoft.com/office/drawing/2015/9/8/chartex" xmlns:cx2="http://schemas.microsoft.com/office/drawing/2015/10/21/chartex" xmlns:cx3="http://schemas.microsoft.com/office/drawing/2016/5/9/chartex" xmlns:cx4="http://schemas.microsoft.com/office/drawing/2016/5/10/chartex" xmlns:cx5="http://schemas.microsoft.com/office/drawing/2016/5/11/chartex" xmlns:cx6="http://schemas.microsoft.com/office/drawing/2016/5/12/chartex" xmlns:cx7="http://schemas.microsoft.com/office/drawing/2016/5/13/chartex" xmlns:cx8="http://schemas.microsoft.com/office/drawing/2016/5/14/chartex" xmlns:mc="http://schemas.openxmlformats.org/markup-compatibility/2006" xmlns:m="http://schemas.openxmlformats.org/officeDocument/2006/math" xmlns:aink="http://schemas.microsoft.com/office/drawing/2016/ink" xmlns:am3d="http://schemas.microsoft.com/office/drawing/2017/model3d" xmlns:oel="http://schemas.microsoft.com/office/2019/extlst" xmlns:r="http://schemas.openxmlformats.org/officeDocument/2006/relationships" xmlns:wp14="http://schemas.microsoft.com/office/word/2010/wordprocessingDrawing" xmlns:wp="http://schemas.openxmlformats.org/drawingml/2006/wordprocessingDrawing" xmlns:wpg="http://schemas.microsoft.com/office/word/2010/wordprocessingGroup" xmlns:wpi="http://schemas.microsoft.com/office/word/2010/wordprocessingInk" xmlns:wps="http://schemas.microsoft.com/office/word/2010/wordprocessingShape" xmlns:o="urn:schemas-microsoft-com:office:office" xmlns:v="urn:schemas-microsoft-com:vml" xmlns:w10="urn:schemas-microsoft-com:office:word" xmlns:w="http://schemas.openxmlformats.org/wordprocessingml/2006/main" xmlns:w14="http://schemas.microsoft.com/office/word/2010/wordml" xmlns:w15="http://schemas.microsoft.com/office/word/2012/wordml" xmlns:w16cei="http://schemas.microsoft.com/office/word/2026/wordml/cei" xmlns:w16cex="http://schemas.microsoft.com/office/word/2018/wordml/cex" xmlns:w16cid="http://schemas.microsoft.com/office/word/2016/wordml/cid" xmlns:w16="http://schemas.microsoft.com/office/word/2018/wordml" xmlns:w16sdtdh="http://schemas.microsoft.com/office/word/2020/wordml/sdtdatahash" xmlns:w16sdtfl="http://schemas.microsoft.com/office/word/2024/wordml/sdtformatlock" xmlns:w16se="http://schemas.microsoft.com/office/word/2015/wordml/symex" xmlns:w16du="http://schemas.microsoft.com/office/word/2023/wordml/word16du" xmlns:wne="http://schemas.microsoft.com/office/word/2006/wordml" mc:Ignorable="w14 w15 w16se w16cid w16 w16cex w16sdtdh w16sdtfl w16du wp14">
   <w:sdt>
     <w:sdtPr>
       <w:id w:val="1090047267"/>
@@ -19729,7 +20513,7 @@
 </file>
 
 <file path=word/footnotes.xml><?xml version="1.0" encoding="utf-8"?>
-<w:footnotes xmlns:wpc="http://schemas.microsoft.com/office/word/2010/wordprocessingCanvas" xmlns:cx="http://schemas.microsoft.com/office/drawing/2014/chartex" xmlns:cx1="http://schemas.microsoft.com/office/drawing/2015/9/8/chartex" xmlns:cx2="http://schemas.microsoft.com/office/drawing/2015/10/21/chartex" xmlns:cx3="http://schemas.microsoft.com/office/drawing/2016/5/9/chartex" xmlns:cx4="http://schemas.microsoft.com/office/drawing/2016/5/10/chartex" xmlns:cx5="http://schemas.microsoft.com/office/drawing/2016/5/11/chartex" xmlns:cx6="http://schemas.microsoft.com/office/drawing/2016/5/12/chartex" xmlns:cx7="http://schemas.microsoft.com/office/drawing/2016/5/13/chartex" xmlns:cx8="http://schemas.microsoft.com/office/drawing/2016/5/14/chartex" xmlns:mc="http://schemas.openxmlformats.org/markup-compatibility/2006" xmlns:aink="http://schemas.microsoft.com/office/drawing/2016/ink" xmlns:am3d="http://schemas.microsoft.com/office/drawing/2017/model3d" xmlns:o="urn:schemas-microsoft-com:office:office" xmlns:oel="http://schemas.microsoft.com/office/2019/extlst" xmlns:r="http://schemas.openxmlformats.org/officeDocument/2006/relationships" xmlns:m="http://schemas.openxmlformats.org/officeDocument/2006/math" xmlns:v="urn:schemas-microsoft-com:vml" xmlns:wp14="http://schemas.microsoft.com/office/word/2010/wordprocessingDrawing" xmlns:wp="http://schemas.openxmlformats.org/drawingml/2006/wordprocessingDrawing" xmlns:w10="urn:schemas-microsoft-com:office:word" xmlns:w="http://schemas.openxmlformats.org/wordprocessingml/2006/main" xmlns:w14="http://schemas.microsoft.com/office/word/2010/wordml" xmlns:w15="http://schemas.microsoft.com/office/word/2012/wordml" xmlns:w16cex="http://schemas.microsoft.com/office/word/2018/wordml/cex" xmlns:w16cid="http://schemas.microsoft.com/office/word/2016/wordml/cid" xmlns:w16="http://schemas.microsoft.com/office/word/2018/wordml" xmlns:w16du="http://schemas.microsoft.com/office/word/2023/wordml/word16du" xmlns:w16sdtdh="http://schemas.microsoft.com/office/word/2020/wordml/sdtdatahash" xmlns:w16sdtfl="http://schemas.microsoft.com/office/word/2024/wordml/sdtformatlock" xmlns:w16se="http://schemas.microsoft.com/office/word/2015/wordml/symex" xmlns:wpg="http://schemas.microsoft.com/office/word/2010/wordprocessingGroup" xmlns:wpi="http://schemas.microsoft.com/office/word/2010/wordprocessingInk" xmlns:wne="http://schemas.microsoft.com/office/word/2006/wordml" xmlns:wps="http://schemas.microsoft.com/office/word/2010/wordprocessingShape" mc:Ignorable="w14 w15 w16se w16cid w16 w16cex w16sdtdh w16sdtfl w16du wp14">
+<w:footnotes xmlns:wpc="http://schemas.microsoft.com/office/word/2010/wordprocessingCanvas" xmlns:cx="http://schemas.microsoft.com/office/drawing/2014/chartex" xmlns:cx1="http://schemas.microsoft.com/office/drawing/2015/9/8/chartex" xmlns:cx2="http://schemas.microsoft.com/office/drawing/2015/10/21/chartex" xmlns:cx3="http://schemas.microsoft.com/office/drawing/2016/5/9/chartex" xmlns:cx4="http://schemas.microsoft.com/office/drawing/2016/5/10/chartex" xmlns:cx5="http://schemas.microsoft.com/office/drawing/2016/5/11/chartex" xmlns:cx6="http://schemas.microsoft.com/office/drawing/2016/5/12/chartex" xmlns:cx7="http://schemas.microsoft.com/office/drawing/2016/5/13/chartex" xmlns:cx8="http://schemas.microsoft.com/office/drawing/2016/5/14/chartex" xmlns:mc="http://schemas.openxmlformats.org/markup-compatibility/2006" xmlns:m="http://schemas.openxmlformats.org/officeDocument/2006/math" xmlns:aink="http://schemas.microsoft.com/office/drawing/2016/ink" xmlns:am3d="http://schemas.microsoft.com/office/drawing/2017/model3d" xmlns:oel="http://schemas.microsoft.com/office/2019/extlst" xmlns:r="http://schemas.openxmlformats.org/officeDocument/2006/relationships" xmlns:wp14="http://schemas.microsoft.com/office/word/2010/wordprocessingDrawing" xmlns:wp="http://schemas.openxmlformats.org/drawingml/2006/wordprocessingDrawing" xmlns:wpg="http://schemas.microsoft.com/office/word/2010/wordprocessingGroup" xmlns:wpi="http://schemas.microsoft.com/office/word/2010/wordprocessingInk" xmlns:wps="http://schemas.microsoft.com/office/word/2010/wordprocessingShape" xmlns:o="urn:schemas-microsoft-com:office:office" xmlns:v="urn:schemas-microsoft-com:vml" xmlns:w10="urn:schemas-microsoft-com:office:word" xmlns:w="http://schemas.openxmlformats.org/wordprocessingml/2006/main" xmlns:w14="http://schemas.microsoft.com/office/word/2010/wordml" xmlns:w15="http://schemas.microsoft.com/office/word/2012/wordml" xmlns:w16cei="http://schemas.microsoft.com/office/word/2026/wordml/cei" xmlns:w16cex="http://schemas.microsoft.com/office/word/2018/wordml/cex" xmlns:w16cid="http://schemas.microsoft.com/office/word/2016/wordml/cid" xmlns:w16="http://schemas.microsoft.com/office/word/2018/wordml" xmlns:w16sdtdh="http://schemas.microsoft.com/office/word/2020/wordml/sdtdatahash" xmlns:w16sdtfl="http://schemas.microsoft.com/office/word/2024/wordml/sdtformatlock" xmlns:w16se="http://schemas.microsoft.com/office/word/2015/wordml/symex" xmlns:w16du="http://schemas.microsoft.com/office/word/2023/wordml/word16du" xmlns:wne="http://schemas.microsoft.com/office/word/2006/wordml" mc:Ignorable="w14 w15 w16se w16cid w16 w16cex w16sdtdh w16sdtfl w16du wp14">
   <w:footnote w:type="separator" w:id="-1">
     <w:p>
       <w:pPr>
@@ -19754,7 +20538,7 @@
 </file>
 
 <file path=word/numbering.xml><?xml version="1.0" encoding="utf-8"?>
-<w:numbering xmlns:wpc="http://schemas.microsoft.com/office/word/2010/wordprocessingCanvas" xmlns:cx="http://schemas.microsoft.com/office/drawing/2014/chartex" xmlns:cx1="http://schemas.microsoft.com/office/drawing/2015/9/8/chartex" xmlns:cx2="http://schemas.microsoft.com/office/drawing/2015/10/21/chartex" xmlns:cx3="http://schemas.microsoft.com/office/drawing/2016/5/9/chartex" xmlns:cx4="http://schemas.microsoft.com/office/drawing/2016/5/10/chartex" xmlns:cx5="http://schemas.microsoft.com/office/drawing/2016/5/11/chartex" xmlns:cx6="http://schemas.microsoft.com/office/drawing/2016/5/12/chartex" xmlns:cx7="http://schemas.microsoft.com/office/drawing/2016/5/13/chartex" xmlns:cx8="http://schemas.microsoft.com/office/drawing/2016/5/14/chartex" xmlns:mc="http://schemas.openxmlformats.org/markup-compatibility/2006" xmlns:aink="http://schemas.microsoft.com/office/drawing/2016/ink" xmlns:am3d="http://schemas.microsoft.com/office/drawing/2017/model3d" xmlns:o="urn:schemas-microsoft-com:office:office" xmlns:oel="http://schemas.microsoft.com/office/2019/extlst" xmlns:r="http://schemas.openxmlformats.org/officeDocument/2006/relationships" xmlns:m="http://schemas.openxmlformats.org/officeDocument/2006/math" xmlns:v="urn:schemas-microsoft-com:vml" xmlns:wp14="http://schemas.microsoft.com/office/word/2010/wordprocessingDrawing" xmlns:wp="http://schemas.openxmlformats.org/drawingml/2006/wordprocessingDrawing" xmlns:w10="urn:schemas-microsoft-com:office:word" xmlns:w="http://schemas.openxmlformats.org/wordprocessingml/2006/main" xmlns:w14="http://schemas.microsoft.com/office/word/2010/wordml" xmlns:w15="http://schemas.microsoft.com/office/word/2012/wordml" xmlns:w16cex="http://schemas.microsoft.com/office/word/2018/wordml/cex" xmlns:w16cid="http://schemas.microsoft.com/office/word/2016/wordml/cid" xmlns:w16="http://schemas.microsoft.com/office/word/2018/wordml" xmlns:w16du="http://schemas.microsoft.com/office/word/2023/wordml/word16du" xmlns:w16sdtdh="http://schemas.microsoft.com/office/word/2020/wordml/sdtdatahash" xmlns:w16sdtfl="http://schemas.microsoft.com/office/word/2024/wordml/sdtformatlock" xmlns:w16se="http://schemas.microsoft.com/office/word/2015/wordml/symex" xmlns:wpg="http://schemas.microsoft.com/office/word/2010/wordprocessingGroup" xmlns:wpi="http://schemas.microsoft.com/office/word/2010/wordprocessingInk" xmlns:wne="http://schemas.microsoft.com/office/word/2006/wordml" xmlns:wps="http://schemas.microsoft.com/office/word/2010/wordprocessingShape" mc:Ignorable="w14 w15 w16se w16cid w16 w16cex w16sdtdh w16sdtfl w16du wp14">
+<w:numbering xmlns:wpc="http://schemas.microsoft.com/office/word/2010/wordprocessingCanvas" xmlns:cx="http://schemas.microsoft.com/office/drawing/2014/chartex" xmlns:cx1="http://schemas.microsoft.com/office/drawing/2015/9/8/chartex" xmlns:cx2="http://schemas.microsoft.com/office/drawing/2015/10/21/chartex" xmlns:cx3="http://schemas.microsoft.com/office/drawing/2016/5/9/chartex" xmlns:cx4="http://schemas.microsoft.com/office/drawing/2016/5/10/chartex" xmlns:cx5="http://schemas.microsoft.com/office/drawing/2016/5/11/chartex" xmlns:cx6="http://schemas.microsoft.com/office/drawing/2016/5/12/chartex" xmlns:cx7="http://schemas.microsoft.com/office/drawing/2016/5/13/chartex" xmlns:cx8="http://schemas.microsoft.com/office/drawing/2016/5/14/chartex" xmlns:mc="http://schemas.openxmlformats.org/markup-compatibility/2006" xmlns:m="http://schemas.openxmlformats.org/officeDocument/2006/math" xmlns:aink="http://schemas.microsoft.com/office/drawing/2016/ink" xmlns:am3d="http://schemas.microsoft.com/office/drawing/2017/model3d" xmlns:oel="http://schemas.microsoft.com/office/2019/extlst" xmlns:r="http://schemas.openxmlformats.org/officeDocument/2006/relationships" xmlns:wp14="http://schemas.microsoft.com/office/word/2010/wordprocessingDrawing" xmlns:wp="http://schemas.openxmlformats.org/drawingml/2006/wordprocessingDrawing" xmlns:wpg="http://schemas.microsoft.com/office/word/2010/wordprocessingGroup" xmlns:wpi="http://schemas.microsoft.com/office/word/2010/wordprocessingInk" xmlns:wps="http://schemas.microsoft.com/office/word/2010/wordprocessingShape" xmlns:o="urn:schemas-microsoft-com:office:office" xmlns:v="urn:schemas-microsoft-com:vml" xmlns:w10="urn:schemas-microsoft-com:office:word" xmlns:w="http://schemas.openxmlformats.org/wordprocessingml/2006/main" xmlns:w14="http://schemas.microsoft.com/office/word/2010/wordml" xmlns:w15="http://schemas.microsoft.com/office/word/2012/wordml" xmlns:w16cei="http://schemas.microsoft.com/office/word/2026/wordml/cei" xmlns:w16cex="http://schemas.microsoft.com/office/word/2018/wordml/cex" xmlns:w16cid="http://schemas.microsoft.com/office/word/2016/wordml/cid" xmlns:w16="http://schemas.microsoft.com/office/word/2018/wordml" xmlns:w16sdtdh="http://schemas.microsoft.com/office/word/2020/wordml/sdtdatahash" xmlns:w16sdtfl="http://schemas.microsoft.com/office/word/2024/wordml/sdtformatlock" xmlns:w16se="http://schemas.microsoft.com/office/word/2015/wordml/symex" xmlns:w16du="http://schemas.microsoft.com/office/word/2023/wordml/word16du" xmlns:wne="http://schemas.microsoft.com/office/word/2006/wordml" mc:Ignorable="w14 w15 w16se w16cid w16 w16cex w16sdtdh w16sdtfl w16du wp14">
   <w:abstractNum w:abstractNumId="0" w15:restartNumberingAfterBreak="0">
     <w:nsid w:val="018F7683"/>
     <w:multiLevelType w:val="hybridMultilevel"/>
@@ -20305,7 +21089,7 @@
 </file>
 
 <file path=word/styles.xml><?xml version="1.0" encoding="utf-8"?>
-<w:styles xmlns:mc="http://schemas.openxmlformats.org/markup-compatibility/2006" xmlns:r="http://schemas.openxmlformats.org/officeDocument/2006/relationships" xmlns:w="http://schemas.openxmlformats.org/wordprocessingml/2006/main" xmlns:w14="http://schemas.microsoft.com/office/word/2010/wordml" xmlns:w15="http://schemas.microsoft.com/office/word/2012/wordml" xmlns:w16cex="http://schemas.microsoft.com/office/word/2018/wordml/cex" xmlns:w16cid="http://schemas.microsoft.com/office/word/2016/wordml/cid" xmlns:w16="http://schemas.microsoft.com/office/word/2018/wordml" xmlns:w16du="http://schemas.microsoft.com/office/word/2023/wordml/word16du" xmlns:w16sdtdh="http://schemas.microsoft.com/office/word/2020/wordml/sdtdatahash" xmlns:w16sdtfl="http://schemas.microsoft.com/office/word/2024/wordml/sdtformatlock" xmlns:w16se="http://schemas.microsoft.com/office/word/2015/wordml/symex" mc:Ignorable="w14 w15 w16se w16cid w16 w16cex w16sdtdh w16sdtfl w16du">
+<w:styles xmlns:mc="http://schemas.openxmlformats.org/markup-compatibility/2006" xmlns:r="http://schemas.openxmlformats.org/officeDocument/2006/relationships" xmlns:w="http://schemas.openxmlformats.org/wordprocessingml/2006/main" xmlns:w14="http://schemas.microsoft.com/office/word/2010/wordml" xmlns:w15="http://schemas.microsoft.com/office/word/2012/wordml" xmlns:w16cex="http://schemas.microsoft.com/office/word/2018/wordml/cex" xmlns:w16cid="http://schemas.microsoft.com/office/word/2016/wordml/cid" xmlns:w16="http://schemas.microsoft.com/office/word/2018/wordml" xmlns:w16sdtdh="http://schemas.microsoft.com/office/word/2020/wordml/sdtdatahash" xmlns:w16sdtfl="http://schemas.microsoft.com/office/word/2024/wordml/sdtformatlock" xmlns:w16se="http://schemas.microsoft.com/office/word/2015/wordml/symex" xmlns:w16du="http://schemas.microsoft.com/office/word/2023/wordml/word16du" mc:Ignorable="w14 w15 w16se w16cid w16 w16cex w16sdtdh w16sdtfl w16du">
   <w:docDefaults>
     <w:rPrDefault>
       <w:rPr>
@@ -20906,6 +21690,7 @@
   <w:style w:type="character" w:default="1" w:styleId="DefaultParagraphFont">
     <w:name w:val="Default Paragraph Font"/>
     <w:uiPriority w:val="1"/>
+    <w:semiHidden/>
     <w:unhideWhenUsed/>
   </w:style>
   <w:style w:type="table" w:default="1" w:styleId="TableNormal">

</xml_diff>

<commit_message>
sink rate experiment results
</commit_message>
<xml_diff>
--- a/doc/DiM_ms20260713.docx
+++ b/doc/DiM_ms20260713.docx
@@ -6104,6 +6104,14 @@
           <w:bCs/>
           <w:iCs/>
         </w:rPr>
+        <w:t xml:space="preserve">and moisture flux </w:t>
+      </w:r>
+      <w:r>
+        <w:rPr>
+          <w:rFonts w:eastAsiaTheme="minorEastAsia"/>
+          <w:bCs/>
+          <w:iCs/>
+        </w:rPr>
         <w:t xml:space="preserve">in each category </w:t>
       </w:r>
       <w:r>
@@ -6307,9 +6315,8 @@
           <w:iCs/>
           <w:color w:val="3A7C22" w:themeColor="accent6" w:themeShade="BF"/>
         </w:rPr>
-        <w:t xml:space="preserve">, and weaker for the </w:t>
-      </w:r>
-      <w:proofErr w:type="spellStart"/>
+        <w:t>, and weaker for the higher</w:t>
+      </w:r>
       <w:r>
         <w:rPr>
           <w:rFonts w:eastAsiaTheme="minorEastAsia"/>
@@ -6317,9 +6324,8 @@
           <w:iCs/>
           <w:color w:val="3A7C22" w:themeColor="accent6" w:themeShade="BF"/>
         </w:rPr>
-        <w:t>higherclouds</w:t>
-      </w:r>
-      <w:proofErr w:type="spellEnd"/>
+        <w:t xml:space="preserve"> </w:t>
+      </w:r>
       <w:r>
         <w:rPr>
           <w:rFonts w:eastAsiaTheme="minorEastAsia"/>
@@ -6327,7 +6333,7 @@
           <w:iCs/>
           <w:color w:val="3A7C22" w:themeColor="accent6" w:themeShade="BF"/>
         </w:rPr>
-        <w:t xml:space="preserve">? I don’t think so. Otherwise, why can’t fewer cloud categories just generate the </w:t>
+        <w:t xml:space="preserve">clouds? Otherwise, why can’t fewer cloud categories just generate the </w:t>
       </w:r>
       <w:r>
         <w:rPr>
@@ -6366,7 +6372,43 @@
           <w:iCs/>
           <w:color w:val="3A7C22" w:themeColor="accent6" w:themeShade="BF"/>
         </w:rPr>
-        <w:t xml:space="preserve"> bins widen? Or do higher clouds result in valid clouds now that had been excluded before, increasing the counted clouds mass flux? That’s just a bookkeeping issue. !!]]</w:t>
+        <w:t xml:space="preserve"> bins widen? Or do higher clouds result in valid clouds now that had been excluded before, increasing the counted clouds mass flux? That</w:t>
+      </w:r>
+      <w:r>
+        <w:rPr>
+          <w:rFonts w:eastAsiaTheme="minorEastAsia"/>
+          <w:bCs/>
+          <w:iCs/>
+          <w:color w:val="3A7C22" w:themeColor="accent6" w:themeShade="BF"/>
+        </w:rPr>
+        <w:t xml:space="preserve"> would be</w:t>
+      </w:r>
+      <w:r>
+        <w:rPr>
+          <w:rFonts w:eastAsiaTheme="minorEastAsia"/>
+          <w:bCs/>
+          <w:iCs/>
+          <w:color w:val="3A7C22" w:themeColor="accent6" w:themeShade="BF"/>
+        </w:rPr>
+        <w:t xml:space="preserve"> just a bookkeeping issue. </w:t>
+      </w:r>
+      <w:r>
+        <w:rPr>
+          <w:rFonts w:eastAsiaTheme="minorEastAsia"/>
+          <w:bCs/>
+          <w:iCs/>
+          <w:color w:val="3A7C22" w:themeColor="accent6" w:themeShade="BF"/>
+        </w:rPr>
+        <w:t>Clouds that have now weaker moisture sink rate are replaced by clouds that had higher sink rates but are now reduced</w:t>
+      </w:r>
+      <w:r>
+        <w:rPr>
+          <w:rFonts w:eastAsiaTheme="minorEastAsia"/>
+          <w:bCs/>
+          <w:iCs/>
+          <w:color w:val="3A7C22" w:themeColor="accent6" w:themeShade="BF"/>
+        </w:rPr>
+        <w:t>!!]]</w:t>
       </w:r>
       <w:r>
         <w:rPr>
@@ -6507,7 +6549,7 @@
           <w:bCs/>
           <w:iCs/>
         </w:rPr>
-        <w:t>, which</w:t>
+        <w:t xml:space="preserve">, which </w:t>
       </w:r>
       <w:r>
         <w:rPr>
@@ -6515,7 +6557,7 @@
           <w:bCs/>
           <w:iCs/>
         </w:rPr>
-        <w:t>,</w:t>
+        <w:t xml:space="preserve">as above, </w:t>
       </w:r>
       <w:r>
         <w:rPr>
@@ -6523,7 +6565,7 @@
           <w:bCs/>
           <w:iCs/>
         </w:rPr>
-        <w:t xml:space="preserve"> </w:t>
+        <w:t>for the same moisture flux</w:t>
       </w:r>
       <w:r>
         <w:rPr>
@@ -6531,7 +6573,7 @@
           <w:bCs/>
           <w:iCs/>
         </w:rPr>
-        <w:t xml:space="preserve">as above, </w:t>
+        <w:t xml:space="preserve"> </w:t>
       </w:r>
       <w:r>
         <w:rPr>
@@ -6539,7 +6581,7 @@
           <w:bCs/>
           <w:iCs/>
         </w:rPr>
-        <w:t>reduces the mass flux and cloud fraction for the same moisture flux.</w:t>
+        <w:t>reduces the mass flux and cloud fraction.</w:t>
       </w:r>
     </w:p>
     <w:p>

</xml_diff>

<commit_message>
upd figures and ms
</commit_message>
<xml_diff>
--- a/doc/DiM_ms20260713.docx
+++ b/doc/DiM_ms20260713.docx
@@ -5800,1153 +5800,34 @@
           </w:p>
         </w:tc>
       </w:tr>
-      <w:tr>
-        <w:trPr>
-          <w:tblCellSpacing w:w="15" w:type="dxa"/>
-        </w:trPr>
-        <w:tc>
-          <w:tcPr>
-            <w:tcW w:w="3250" w:type="dxa"/>
-          </w:tcPr>
-          <w:p>
-            <w:pPr>
-              <w:pStyle w:val="BodyText"/>
-              <w:spacing w:before="0" w:after="0"/>
-            </w:pPr>
-            <w:r>
-              <w:t>sink-5%</w:t>
-            </w:r>
-          </w:p>
-        </w:tc>
-        <w:tc>
-          <w:tcPr>
-            <w:tcW w:w="990" w:type="dxa"/>
-          </w:tcPr>
-          <w:p>
-            <w:pPr>
-              <w:pStyle w:val="BodyText"/>
-              <w:spacing w:before="0" w:after="0"/>
-              <w:jc w:val="right"/>
-            </w:pPr>
-            <w:r>
-              <w:t xml:space="preserve">  </w:t>
-            </w:r>
-            <w:r>
-              <w:t>3.30</w:t>
-            </w:r>
-          </w:p>
-        </w:tc>
-      </w:tr>
-      <w:tr>
-        <w:trPr>
-          <w:tblCellSpacing w:w="15" w:type="dxa"/>
-        </w:trPr>
-        <w:tc>
-          <w:tcPr>
-            <w:tcW w:w="3250" w:type="dxa"/>
-          </w:tcPr>
-          <w:p>
-            <w:pPr>
-              <w:pStyle w:val="BodyText"/>
-              <w:spacing w:before="0" w:after="0"/>
-            </w:pPr>
-            <w:r>
-              <w:t>sink+5%</w:t>
-            </w:r>
-          </w:p>
-        </w:tc>
-        <w:tc>
-          <w:tcPr>
-            <w:tcW w:w="990" w:type="dxa"/>
-          </w:tcPr>
-          <w:p>
-            <w:pPr>
-              <w:pStyle w:val="BodyText"/>
-              <w:spacing w:before="0" w:after="0"/>
-              <w:jc w:val="right"/>
-            </w:pPr>
-            <w:r>
-              <w:t>-3.59</w:t>
-            </w:r>
-          </w:p>
-        </w:tc>
-      </w:tr>
     </w:tbl>
     <w:p>
       <w:pPr>
-        <w:keepNext/>
-        <w:keepLines/>
-        <w:spacing w:before="160" w:after="80"/>
-        <w:outlineLvl w:val="1"/>
-        <w:rPr>
-          <w:rFonts w:asciiTheme="majorHAnsi" w:eastAsiaTheme="majorEastAsia" w:hAnsiTheme="majorHAnsi" w:cstheme="majorBidi"/>
-          <w:color w:val="0F4761" w:themeColor="accent1" w:themeShade="BF"/>
-          <w:sz w:val="32"/>
-          <w:szCs w:val="32"/>
-        </w:rPr>
+        <w:pStyle w:val="Heading2"/>
       </w:pPr>
-      <w:r>
-        <w:rPr>
-          <w:rFonts w:asciiTheme="majorHAnsi" w:eastAsiaTheme="majorEastAsia" w:hAnsiTheme="majorHAnsi" w:cstheme="majorBidi"/>
-          <w:color w:val="0F4761" w:themeColor="accent1" w:themeShade="BF"/>
-          <w:sz w:val="32"/>
-          <w:szCs w:val="32"/>
-        </w:rPr>
-        <w:t>Mesoscale organization</w:t>
+    </w:p>
+    <w:p>
+      <w:pPr>
+        <w:pStyle w:val="Heading2"/>
+      </w:pPr>
+      <w:r>
+        <w:t>Cloud radiative effect</w:t>
       </w:r>
     </w:p>
     <w:p>
       <w:pPr>
         <w:pStyle w:val="BodyText"/>
+        <w:rPr>
+          <w:rFonts w:ascii="Aptos" w:hAnsi="Aptos"/>
+        </w:rPr>
       </w:pPr>
       <w:r>
-        <w:t>Mesoscale organization clusters clouds together</w:t>
-      </w:r>
-      <w:r>
-        <w:t>, leading to l</w:t>
-      </w:r>
-      <w:r>
-        <w:t xml:space="preserve">arger </w:t>
-      </w:r>
-      <w:r>
-        <w:t xml:space="preserve">cloud </w:t>
-      </w:r>
-      <w:r>
-        <w:t>updrafts</w:t>
-      </w:r>
-      <w:r>
-        <w:t>, and updrafts</w:t>
-      </w:r>
-      <w:r>
-        <w:t xml:space="preserve"> </w:t>
-      </w:r>
-      <w:r>
-        <w:t>entraining</w:t>
-      </w:r>
-      <w:r>
-        <w:t xml:space="preserve"> moister air from </w:t>
-      </w:r>
-      <w:r>
-        <w:t xml:space="preserve">their </w:t>
-      </w:r>
-      <w:r>
-        <w:t>surroundings</w:t>
-      </w:r>
-      <w:r>
-        <w:t>. These effects</w:t>
-      </w:r>
-      <w:r>
-        <w:t xml:space="preserve"> </w:t>
-      </w:r>
-      <w:r>
-        <w:t xml:space="preserve">of mesoscale clustering are </w:t>
-      </w:r>
-      <w:r>
-        <w:t xml:space="preserve">parameterized </w:t>
-      </w:r>
-      <w:r>
-        <w:t>by increasing the total moisture sink rate.</w:t>
-      </w:r>
-      <w:r>
-        <w:t xml:space="preserve"> Experiments are run with </w:t>
-      </w:r>
-      <w:r>
-        <w:t xml:space="preserve">the moisture </w:t>
-      </w:r>
-      <w:r>
-        <w:t>sink rate</w:t>
-      </w:r>
-      <w:r>
-        <w:t xml:space="preserve"> for each cloud category</w:t>
-      </w:r>
-      <w:r>
-        <w:t xml:space="preserve"> </w:t>
-      </w:r>
-      <w:r>
-        <w:t>reduced or augmented</w:t>
-      </w:r>
-      <w:r>
-        <w:t xml:space="preserve"> by </w:t>
+        <w:rPr>
+          <w:rFonts w:ascii="Aptos" w:hAnsi="Aptos"/>
+        </w:rPr>
+        <w:t xml:space="preserve">Cloud radiative effect is computed from radiative kernels (Zelinka et al. 2015???), using the albedo </w:t>
       </w:r>
       <m:oMath>
-        <m:r>
-          <w:rPr>
-            <w:rFonts w:ascii="Cambria Math" w:hAnsi="Cambria Math"/>
-          </w:rPr>
-          <m:t>±</m:t>
-        </m:r>
-      </m:oMath>
-      <w:r>
-        <w:t>5% from the control</w:t>
-      </w:r>
-      <w:r>
-        <w:t xml:space="preserve">. </w:t>
-      </w:r>
-      <w:r>
-        <w:t>The clouds rise deeper for weaker sink rates and reach shorter cloud top heights for stronger sink rates (Fig. SINKZTOP).</w:t>
-      </w:r>
-    </w:p>
-    <w:p>
-      <w:pPr>
-        <w:pStyle w:val="BodyText"/>
-        <w:rPr>
-          <w:rFonts w:eastAsiaTheme="minorEastAsia"/>
-        </w:rPr>
-      </w:pPr>
-      <w:r>
-        <w:t xml:space="preserve">For a given thermodynamic profile (and precipitation efficiency), cloud water </w:t>
-      </w:r>
-      <m:oMath>
-        <m:sSub>
-          <m:sSubPr>
-            <m:ctrlPr>
-              <w:rPr>
-                <w:rFonts w:ascii="Cambria Math" w:hAnsi="Cambria Math"/>
-                <w:i/>
-              </w:rPr>
-            </m:ctrlPr>
-          </m:sSubPr>
-          <m:e>
-            <m:r>
-              <w:rPr>
-                <w:rFonts w:ascii="Cambria Math" w:hAnsi="Cambria Math"/>
-              </w:rPr>
-              <m:t>q</m:t>
-            </m:r>
-          </m:e>
-          <m:sub>
-            <m:r>
-              <w:rPr>
-                <w:rFonts w:ascii="Cambria Math" w:hAnsi="Cambria Math"/>
-              </w:rPr>
-              <m:t>c</m:t>
-            </m:r>
-          </m:sub>
-        </m:sSub>
-      </m:oMath>
-      <w:r>
-        <w:rPr>
-          <w:rFonts w:eastAsiaTheme="minorEastAsia"/>
-        </w:rPr>
-        <w:t xml:space="preserve"> </w:t>
-      </w:r>
-      <w:r>
-        <w:t xml:space="preserve">and cloud top height </w:t>
-      </w:r>
-      <m:oMath>
-        <m:r>
-          <w:rPr>
-            <w:rFonts w:ascii="Cambria Math" w:hAnsi="Cambria Math"/>
-          </w:rPr>
-          <m:t xml:space="preserve">h </m:t>
-        </m:r>
-      </m:oMath>
-      <w:r>
-        <w:t>are</w:t>
-      </w:r>
-      <w:r>
-        <w:rPr>
-          <w:rFonts w:eastAsiaTheme="minorEastAsia"/>
-        </w:rPr>
-        <w:t xml:space="preserve"> completely determined by the moisture sink rate </w:t>
-      </w:r>
-      <m:oMath>
-        <m:r>
-          <w:rPr>
-            <w:rFonts w:ascii="Cambria Math" w:eastAsiaTheme="minorEastAsia" w:hAnsi="Cambria Math"/>
-          </w:rPr>
-          <m:t>α+ϵ</m:t>
-        </m:r>
-      </m:oMath>
-      <w:r>
-        <w:rPr>
-          <w:rFonts w:eastAsiaTheme="minorEastAsia"/>
-        </w:rPr>
-        <w:t xml:space="preserve">. Clouds with the same cloud top height (and the same precipitation efficiency) have the </w:t>
-      </w:r>
-      <w:r>
-        <w:rPr>
-          <w:rFonts w:eastAsiaTheme="minorEastAsia"/>
-        </w:rPr>
-        <w:t>identical</w:t>
-      </w:r>
-      <w:r>
-        <w:rPr>
-          <w:rFonts w:eastAsiaTheme="minorEastAsia"/>
-        </w:rPr>
-        <w:t xml:space="preserve"> sink rate and cloud water profile </w:t>
-      </w:r>
-      <m:oMath>
-        <m:sSub>
-          <m:sSubPr>
-            <m:ctrlPr>
-              <w:rPr>
-                <w:rFonts w:ascii="Cambria Math" w:hAnsi="Cambria Math"/>
-                <w:i/>
-              </w:rPr>
-            </m:ctrlPr>
-          </m:sSubPr>
-          <m:e>
-            <m:r>
-              <w:rPr>
-                <w:rFonts w:ascii="Cambria Math" w:hAnsi="Cambria Math"/>
-              </w:rPr>
-              <m:t>q</m:t>
-            </m:r>
-          </m:e>
-          <m:sub>
-            <m:r>
-              <w:rPr>
-                <w:rFonts w:ascii="Cambria Math" w:hAnsi="Cambria Math"/>
-              </w:rPr>
-              <m:t>c</m:t>
-            </m:r>
-          </m:sub>
-        </m:sSub>
-      </m:oMath>
-      <w:r>
-        <w:rPr>
-          <w:rFonts w:eastAsiaTheme="minorEastAsia"/>
-        </w:rPr>
-        <w:t xml:space="preserve">. The </w:t>
-      </w:r>
-      <w:r>
-        <w:rPr>
-          <w:rFonts w:eastAsiaTheme="minorEastAsia"/>
-        </w:rPr>
-        <w:t xml:space="preserve">scalar </w:t>
-      </w:r>
-      <w:r>
-        <w:rPr>
-          <w:rFonts w:eastAsiaTheme="minorEastAsia"/>
-        </w:rPr>
-        <w:t xml:space="preserve">cloud fraction </w:t>
-      </w:r>
-      <m:oMath>
-        <m:sSub>
-          <m:sSubPr>
-            <m:ctrlPr>
-              <w:rPr>
-                <w:rFonts w:ascii="Cambria Math" w:eastAsiaTheme="minorEastAsia" w:hAnsi="Cambria Math"/>
-                <w:i/>
-              </w:rPr>
-            </m:ctrlPr>
-          </m:sSubPr>
-          <m:e>
-            <m:r>
-              <w:rPr>
-                <w:rFonts w:ascii="Cambria Math" w:eastAsiaTheme="minorEastAsia" w:hAnsi="Cambria Math"/>
-              </w:rPr>
-              <m:t>a</m:t>
-            </m:r>
-          </m:e>
-          <m:sub>
-            <m:r>
-              <w:rPr>
-                <w:rFonts w:ascii="Cambria Math" w:eastAsiaTheme="minorEastAsia" w:hAnsi="Cambria Math"/>
-              </w:rPr>
-              <m:t>i</m:t>
-            </m:r>
-          </m:sub>
-        </m:sSub>
-      </m:oMath>
-      <w:r>
-        <w:rPr>
-          <w:rFonts w:eastAsiaTheme="minorEastAsia"/>
-        </w:rPr>
-        <w:t xml:space="preserve"> and moisture flux </w:t>
-      </w:r>
-      <m:oMath>
-        <m:sSub>
-          <m:sSubPr>
-            <m:ctrlPr>
-              <w:rPr>
-                <w:rFonts w:ascii="Cambria Math" w:eastAsiaTheme="minorEastAsia" w:hAnsi="Cambria Math"/>
-                <w:i/>
-              </w:rPr>
-            </m:ctrlPr>
-          </m:sSubPr>
-          <m:e>
-            <m:r>
-              <w:rPr>
-                <w:rFonts w:ascii="Cambria Math" w:eastAsiaTheme="minorEastAsia" w:hAnsi="Cambria Math"/>
-              </w:rPr>
-              <m:t>F</m:t>
-            </m:r>
-          </m:e>
-          <m:sub>
-            <m:r>
-              <w:rPr>
-                <w:rFonts w:ascii="Cambria Math" w:eastAsiaTheme="minorEastAsia" w:hAnsi="Cambria Math"/>
-              </w:rPr>
-              <m:t>i</m:t>
-            </m:r>
-          </m:sub>
-        </m:sSub>
-      </m:oMath>
-      <w:r>
-        <w:rPr>
-          <w:rFonts w:eastAsiaTheme="minorEastAsia"/>
-        </w:rPr>
-        <w:t xml:space="preserve"> </w:t>
-      </w:r>
-      <w:r>
-        <w:rPr>
-          <w:rFonts w:eastAsiaTheme="minorEastAsia"/>
-        </w:rPr>
-        <w:t xml:space="preserve">for each category </w:t>
-      </w:r>
-      <m:oMath>
-        <m:r>
-          <w:rPr>
-            <w:rFonts w:ascii="Cambria Math" w:eastAsiaTheme="minorEastAsia" w:hAnsi="Cambria Math"/>
-          </w:rPr>
-          <m:t>i</m:t>
-        </m:r>
-      </m:oMath>
-      <w:r>
-        <w:rPr>
-          <w:rFonts w:eastAsiaTheme="minorEastAsia"/>
-        </w:rPr>
-        <w:t xml:space="preserve"> </w:t>
-      </w:r>
-      <w:r>
-        <w:rPr>
-          <w:rFonts w:eastAsiaTheme="minorEastAsia"/>
-        </w:rPr>
-        <w:t xml:space="preserve">completely determine everything else about plumes </w:t>
-      </w:r>
-      <w:r>
-        <w:rPr>
-          <w:rFonts w:eastAsiaTheme="minorEastAsia"/>
-        </w:rPr>
-        <w:t xml:space="preserve">of </w:t>
-      </w:r>
-      <w:r>
-        <w:rPr>
-          <w:rFonts w:eastAsiaTheme="minorEastAsia"/>
-        </w:rPr>
-        <w:t xml:space="preserve">category </w:t>
-      </w:r>
-      <m:oMath>
-        <m:r>
-          <w:rPr>
-            <w:rFonts w:ascii="Cambria Math" w:eastAsiaTheme="minorEastAsia" w:hAnsi="Cambria Math"/>
-          </w:rPr>
-          <m:t>i</m:t>
-        </m:r>
-      </m:oMath>
-      <w:r>
-        <w:rPr>
-          <w:rFonts w:eastAsiaTheme="minorEastAsia"/>
-        </w:rPr>
-        <w:t xml:space="preserve">, namely mass flux and vertical velocity profiles </w:t>
-      </w:r>
-      <m:oMath>
-        <m:sSub>
-          <m:sSubPr>
-            <m:ctrlPr>
-              <w:rPr>
-                <w:rFonts w:ascii="Cambria Math" w:eastAsiaTheme="minorEastAsia" w:hAnsi="Cambria Math"/>
-                <w:i/>
-              </w:rPr>
-            </m:ctrlPr>
-          </m:sSubPr>
-          <m:e>
-            <m:r>
-              <w:rPr>
-                <w:rFonts w:ascii="Cambria Math" w:eastAsiaTheme="minorEastAsia" w:hAnsi="Cambria Math"/>
-              </w:rPr>
-              <m:t>M</m:t>
-            </m:r>
-          </m:e>
-          <m:sub>
-            <m:r>
-              <w:rPr>
-                <w:rFonts w:ascii="Cambria Math" w:eastAsiaTheme="minorEastAsia" w:hAnsi="Cambria Math"/>
-              </w:rPr>
-              <m:t>i</m:t>
-            </m:r>
-          </m:sub>
-        </m:sSub>
-        <m:r>
-          <w:rPr>
-            <w:rFonts w:ascii="Cambria Math" w:eastAsiaTheme="minorEastAsia" w:hAnsi="Cambria Math"/>
-          </w:rPr>
-          <m:t xml:space="preserve">, </m:t>
-        </m:r>
-        <m:sSub>
-          <m:sSubPr>
-            <m:ctrlPr>
-              <w:rPr>
-                <w:rFonts w:ascii="Cambria Math" w:eastAsiaTheme="minorEastAsia" w:hAnsi="Cambria Math"/>
-                <w:i/>
-              </w:rPr>
-            </m:ctrlPr>
-          </m:sSubPr>
-          <m:e>
-            <m:r>
-              <w:rPr>
-                <w:rFonts w:ascii="Cambria Math" w:eastAsiaTheme="minorEastAsia" w:hAnsi="Cambria Math"/>
-              </w:rPr>
-              <m:t>w</m:t>
-            </m:r>
-          </m:e>
-          <m:sub>
-            <m:r>
-              <w:rPr>
-                <w:rFonts w:ascii="Cambria Math" w:eastAsiaTheme="minorEastAsia" w:hAnsi="Cambria Math"/>
-              </w:rPr>
-              <m:t>i</m:t>
-            </m:r>
-          </m:sub>
-        </m:sSub>
-      </m:oMath>
-      <w:r>
-        <w:rPr>
-          <w:rFonts w:eastAsiaTheme="minorEastAsia"/>
-        </w:rPr>
-        <w:t>.</w:t>
-      </w:r>
-    </w:p>
-    <w:p>
-      <w:pPr>
-        <w:pStyle w:val="BodyText"/>
-        <w:rPr>
-          <w:rFonts w:eastAsiaTheme="minorEastAsia"/>
-        </w:rPr>
-      </w:pPr>
-      <w:r>
-        <w:t>C</w:t>
-      </w:r>
-      <w:r>
-        <w:t xml:space="preserve">loud category </w:t>
-      </w:r>
-      <m:oMath>
-        <m:r>
-          <w:rPr>
-            <w:rFonts w:ascii="Cambria Math" w:hAnsi="Cambria Math"/>
-          </w:rPr>
-          <m:t>i</m:t>
-        </m:r>
-      </m:oMath>
-      <w:r>
-        <w:rPr>
-          <w:rFonts w:eastAsiaTheme="minorEastAsia"/>
-        </w:rPr>
-        <w:t xml:space="preserve"> is not physical but</w:t>
-      </w:r>
-      <w:r>
-        <w:rPr>
-          <w:rFonts w:eastAsiaTheme="minorEastAsia"/>
-        </w:rPr>
-        <w:t xml:space="preserve"> the index </w:t>
-      </w:r>
-      <w:r>
-        <w:rPr>
-          <w:rFonts w:eastAsiaTheme="minorEastAsia"/>
-        </w:rPr>
-        <w:t>of</w:t>
-      </w:r>
-      <w:r>
-        <w:rPr>
-          <w:rFonts w:eastAsiaTheme="minorEastAsia"/>
-        </w:rPr>
-        <w:t xml:space="preserve"> </w:t>
-      </w:r>
-      <w:r>
-        <w:rPr>
-          <w:rFonts w:eastAsiaTheme="minorEastAsia"/>
-        </w:rPr>
-        <w:t xml:space="preserve">the </w:t>
-      </w:r>
-      <w:r>
-        <w:rPr>
-          <w:rFonts w:eastAsiaTheme="minorEastAsia"/>
-        </w:rPr>
-        <w:t>discrete</w:t>
-      </w:r>
-      <w:r>
-        <w:rPr>
-          <w:rFonts w:eastAsiaTheme="minorEastAsia"/>
-        </w:rPr>
-        <w:t xml:space="preserve"> sink rate</w:t>
-      </w:r>
-      <w:r>
-        <w:rPr>
-          <w:rFonts w:eastAsiaTheme="minorEastAsia"/>
-        </w:rPr>
-        <w:t>. Thus, r</w:t>
-      </w:r>
-      <w:r>
-        <w:rPr>
-          <w:rFonts w:eastAsiaTheme="minorEastAsia"/>
-        </w:rPr>
-        <w:t>edistributing</w:t>
-      </w:r>
-      <w:r>
-        <w:rPr>
-          <w:rFonts w:eastAsiaTheme="minorEastAsia"/>
-        </w:rPr>
-        <w:t xml:space="preserve"> the moisture flux </w:t>
-      </w:r>
-      <m:oMath>
-        <m:r>
-          <w:rPr>
-            <w:rFonts w:ascii="Cambria Math" w:eastAsiaTheme="minorEastAsia" w:hAnsi="Cambria Math"/>
-          </w:rPr>
-          <m:t>G(z)</m:t>
-        </m:r>
-      </m:oMath>
-      <w:r>
-        <w:rPr>
-          <w:rFonts w:eastAsiaTheme="minorEastAsia"/>
-        </w:rPr>
-        <w:t xml:space="preserve"> to</w:t>
-      </w:r>
-      <w:r>
-        <w:rPr>
-          <w:rFonts w:eastAsiaTheme="minorEastAsia"/>
-        </w:rPr>
-        <w:t xml:space="preserve"> the new clouds </w:t>
-      </w:r>
-      <w:r>
-        <w:rPr>
-          <w:rFonts w:eastAsiaTheme="minorEastAsia"/>
-        </w:rPr>
-        <w:t>height</w:t>
-      </w:r>
-      <w:r>
-        <w:rPr>
-          <w:rFonts w:eastAsiaTheme="minorEastAsia"/>
-        </w:rPr>
-        <w:t>s</w:t>
-      </w:r>
-      <w:r>
-        <w:rPr>
-          <w:rFonts w:eastAsiaTheme="minorEastAsia"/>
-        </w:rPr>
-        <w:t xml:space="preserve"> </w:t>
-      </w:r>
-      <m:oMath>
-        <m:sSubSup>
-          <m:sSubSupPr>
-            <m:ctrlPr>
-              <w:rPr>
-                <w:rFonts w:ascii="Cambria Math" w:eastAsiaTheme="minorEastAsia" w:hAnsi="Cambria Math"/>
-                <w:i/>
-              </w:rPr>
-            </m:ctrlPr>
-          </m:sSubSupPr>
-          <m:e>
-            <m:r>
-              <w:rPr>
-                <w:rFonts w:ascii="Cambria Math" w:eastAsiaTheme="minorEastAsia" w:hAnsi="Cambria Math"/>
-              </w:rPr>
-              <m:t>h</m:t>
-            </m:r>
-          </m:e>
-          <m:sub>
-            <m:r>
-              <w:rPr>
-                <w:rFonts w:ascii="Cambria Math" w:eastAsiaTheme="minorEastAsia" w:hAnsi="Cambria Math"/>
-              </w:rPr>
-              <m:t>i</m:t>
-            </m:r>
-          </m:sub>
-          <m:sup>
-            <m:r>
-              <w:rPr>
-                <w:rFonts w:ascii="Cambria Math" w:eastAsiaTheme="minorEastAsia" w:hAnsi="Cambria Math"/>
-              </w:rPr>
-              <m:t>'</m:t>
-            </m:r>
-          </m:sup>
-        </m:sSubSup>
-      </m:oMath>
-      <w:r>
-        <w:rPr>
-          <w:rFonts w:eastAsiaTheme="minorEastAsia"/>
-        </w:rPr>
-        <w:t xml:space="preserve"> </w:t>
-      </w:r>
-      <w:r>
-        <w:rPr>
-          <w:rFonts w:eastAsiaTheme="minorEastAsia"/>
-        </w:rPr>
-        <w:t xml:space="preserve">for the perturbed moisture sink rates </w:t>
-      </w:r>
-      <m:oMath>
-        <m:sSubSup>
-          <m:sSubSupPr>
-            <m:ctrlPr>
-              <w:rPr>
-                <w:rFonts w:ascii="Cambria Math" w:eastAsiaTheme="minorEastAsia" w:hAnsi="Cambria Math"/>
-                <w:i/>
-              </w:rPr>
-            </m:ctrlPr>
-          </m:sSubSupPr>
-          <m:e>
-            <m:d>
-              <m:dPr>
-                <m:ctrlPr>
-                  <w:rPr>
-                    <w:rFonts w:ascii="Cambria Math" w:eastAsiaTheme="minorEastAsia" w:hAnsi="Cambria Math"/>
-                    <w:i/>
-                  </w:rPr>
-                </m:ctrlPr>
-              </m:dPr>
-              <m:e>
-                <m:r>
-                  <w:rPr>
-                    <w:rFonts w:ascii="Cambria Math" w:eastAsiaTheme="minorEastAsia" w:hAnsi="Cambria Math"/>
-                  </w:rPr>
-                  <m:t>α+ϵ</m:t>
-                </m:r>
-              </m:e>
-            </m:d>
-          </m:e>
-          <m:sub>
-            <m:r>
-              <w:rPr>
-                <w:rFonts w:ascii="Cambria Math" w:eastAsiaTheme="minorEastAsia" w:hAnsi="Cambria Math"/>
-              </w:rPr>
-              <m:t>i</m:t>
-            </m:r>
-          </m:sub>
-          <m:sup>
-            <m:r>
-              <w:rPr>
-                <w:rFonts w:ascii="Cambria Math" w:eastAsiaTheme="minorEastAsia" w:hAnsi="Cambria Math"/>
-              </w:rPr>
-              <m:t>'</m:t>
-            </m:r>
-          </m:sup>
-        </m:sSubSup>
-      </m:oMath>
-      <w:r>
-        <w:rPr>
-          <w:rFonts w:eastAsiaTheme="minorEastAsia"/>
-        </w:rPr>
-        <w:t>, only result</w:t>
-      </w:r>
-      <w:r>
-        <w:rPr>
-          <w:rFonts w:eastAsiaTheme="minorEastAsia"/>
-        </w:rPr>
-        <w:t>s</w:t>
-      </w:r>
-      <w:r>
-        <w:rPr>
-          <w:rFonts w:eastAsiaTheme="minorEastAsia"/>
-        </w:rPr>
-        <w:t xml:space="preserve"> in a different</w:t>
-      </w:r>
-      <w:r>
-        <w:rPr>
-          <w:rFonts w:eastAsiaTheme="minorEastAsia"/>
-        </w:rPr>
-        <w:t xml:space="preserve"> numerical</w:t>
-      </w:r>
-      <w:r>
-        <w:rPr>
-          <w:rFonts w:eastAsiaTheme="minorEastAsia"/>
-        </w:rPr>
-        <w:t xml:space="preserve"> discretization of the same physical cloud field. I</w:t>
-      </w:r>
-      <w:r>
-        <w:rPr>
-          <w:rFonts w:eastAsiaTheme="minorEastAsia"/>
-        </w:rPr>
-        <w:t>n our</w:t>
-      </w:r>
-      <w:r>
-        <w:rPr>
-          <w:rFonts w:eastAsiaTheme="minorEastAsia"/>
-        </w:rPr>
-        <w:t xml:space="preserve"> </w:t>
-      </w:r>
-      <w:r>
-        <w:rPr>
-          <w:rFonts w:eastAsiaTheme="minorEastAsia"/>
-        </w:rPr>
-        <w:t xml:space="preserve">moisture </w:t>
-      </w:r>
-      <w:r>
-        <w:rPr>
-          <w:rFonts w:eastAsiaTheme="minorEastAsia"/>
-        </w:rPr>
-        <w:t>sink rate experiment</w:t>
-      </w:r>
-      <w:r>
-        <w:rPr>
-          <w:rFonts w:eastAsiaTheme="minorEastAsia"/>
-        </w:rPr>
-        <w:t>, therefore</w:t>
-      </w:r>
-      <w:r>
-        <w:rPr>
-          <w:rFonts w:eastAsiaTheme="minorEastAsia"/>
-        </w:rPr>
-        <w:t xml:space="preserve">, </w:t>
-      </w:r>
-      <w:r>
-        <w:rPr>
-          <w:rFonts w:eastAsiaTheme="minorEastAsia"/>
-        </w:rPr>
-        <w:t xml:space="preserve">we keep the </w:t>
-      </w:r>
-      <w:r>
-        <w:rPr>
-          <w:rFonts w:eastAsiaTheme="minorEastAsia"/>
-        </w:rPr>
-        <w:t>cloud fractional area</w:t>
-      </w:r>
-      <w:r>
-        <w:rPr>
-          <w:rFonts w:eastAsiaTheme="minorEastAsia"/>
-        </w:rPr>
-        <w:t>s</w:t>
-      </w:r>
-      <w:r>
-        <w:rPr>
-          <w:rFonts w:eastAsiaTheme="minorEastAsia"/>
-        </w:rPr>
-        <w:t xml:space="preserve"> </w:t>
-      </w:r>
-      <m:oMath>
-        <m:sSub>
-          <m:sSubPr>
-            <m:ctrlPr>
-              <w:rPr>
-                <w:rFonts w:ascii="Cambria Math" w:eastAsiaTheme="minorEastAsia" w:hAnsi="Cambria Math"/>
-                <w:i/>
-              </w:rPr>
-            </m:ctrlPr>
-          </m:sSubPr>
-          <m:e>
-            <m:sSubSup>
-              <m:sSubSupPr>
-                <m:ctrlPr>
-                  <w:rPr>
-                    <w:rFonts w:ascii="Cambria Math" w:eastAsiaTheme="minorEastAsia" w:hAnsi="Cambria Math"/>
-                    <w:i/>
-                  </w:rPr>
-                </m:ctrlPr>
-              </m:sSubSupPr>
-              <m:e>
-                <m:r>
-                  <w:rPr>
-                    <w:rFonts w:ascii="Cambria Math" w:eastAsiaTheme="minorEastAsia" w:hAnsi="Cambria Math"/>
-                  </w:rPr>
-                  <m:t>a</m:t>
-                </m:r>
-              </m:e>
-              <m:sub>
-                <m:r>
-                  <w:rPr>
-                    <w:rFonts w:ascii="Cambria Math" w:eastAsiaTheme="minorEastAsia" w:hAnsi="Cambria Math"/>
-                  </w:rPr>
-                  <m:t>i</m:t>
-                </m:r>
-              </m:sub>
-              <m:sup>
-                <m:r>
-                  <w:rPr>
-                    <w:rFonts w:ascii="Cambria Math" w:eastAsiaTheme="minorEastAsia" w:hAnsi="Cambria Math"/>
-                  </w:rPr>
-                  <m:t>'</m:t>
-                </m:r>
-              </m:sup>
-            </m:sSubSup>
-            <m:r>
-              <w:rPr>
-                <w:rFonts w:ascii="Cambria Math" w:eastAsiaTheme="minorEastAsia" w:hAnsi="Cambria Math"/>
-              </w:rPr>
-              <m:t>=a</m:t>
-            </m:r>
-          </m:e>
-          <m:sub>
-            <m:r>
-              <w:rPr>
-                <w:rFonts w:ascii="Cambria Math" w:eastAsiaTheme="minorEastAsia" w:hAnsi="Cambria Math"/>
-              </w:rPr>
-              <m:t>i</m:t>
-            </m:r>
-          </m:sub>
-        </m:sSub>
-      </m:oMath>
-      <w:r>
-        <w:rPr>
-          <w:rFonts w:eastAsiaTheme="minorEastAsia"/>
-        </w:rPr>
-        <w:t xml:space="preserve"> constant and recompute </w:t>
-      </w:r>
-      <m:oMath>
-        <m:sSubSup>
-          <m:sSubSupPr>
-            <m:ctrlPr>
-              <w:rPr>
-                <w:rFonts w:ascii="Cambria Math" w:eastAsiaTheme="minorEastAsia" w:hAnsi="Cambria Math"/>
-                <w:i/>
-              </w:rPr>
-            </m:ctrlPr>
-          </m:sSubSupPr>
-          <m:e>
-            <m:r>
-              <w:rPr>
-                <w:rFonts w:ascii="Cambria Math" w:eastAsiaTheme="minorEastAsia" w:hAnsi="Cambria Math"/>
-              </w:rPr>
-              <m:t>M</m:t>
-            </m:r>
-          </m:e>
-          <m:sub>
-            <m:r>
-              <w:rPr>
-                <w:rFonts w:ascii="Cambria Math" w:eastAsiaTheme="minorEastAsia" w:hAnsi="Cambria Math"/>
-              </w:rPr>
-              <m:t>i</m:t>
-            </m:r>
-          </m:sub>
-          <m:sup>
-            <m:r>
-              <w:rPr>
-                <w:rFonts w:ascii="Cambria Math" w:eastAsiaTheme="minorEastAsia" w:hAnsi="Cambria Math"/>
-              </w:rPr>
-              <m:t>'</m:t>
-            </m:r>
-          </m:sup>
-        </m:sSubSup>
-      </m:oMath>
-      <w:r>
-        <w:rPr>
-          <w:rFonts w:eastAsiaTheme="minorEastAsia"/>
-        </w:rPr>
-        <w:t xml:space="preserve">, </w:t>
-      </w:r>
-      <m:oMath>
-        <m:sSubSup>
-          <m:sSubSupPr>
-            <m:ctrlPr>
-              <w:rPr>
-                <w:rFonts w:ascii="Cambria Math" w:eastAsiaTheme="minorEastAsia" w:hAnsi="Cambria Math"/>
-                <w:i/>
-              </w:rPr>
-            </m:ctrlPr>
-          </m:sSubSupPr>
-          <m:e>
-            <m:r>
-              <w:rPr>
-                <w:rFonts w:ascii="Cambria Math" w:eastAsiaTheme="minorEastAsia" w:hAnsi="Cambria Math"/>
-              </w:rPr>
-              <m:t>w</m:t>
-            </m:r>
-          </m:e>
-          <m:sub>
-            <m:r>
-              <w:rPr>
-                <w:rFonts w:ascii="Cambria Math" w:eastAsiaTheme="minorEastAsia" w:hAnsi="Cambria Math"/>
-              </w:rPr>
-              <m:t>i</m:t>
-            </m:r>
-          </m:sub>
-          <m:sup>
-            <m:r>
-              <w:rPr>
-                <w:rFonts w:ascii="Cambria Math" w:eastAsiaTheme="minorEastAsia" w:hAnsi="Cambria Math"/>
-              </w:rPr>
-              <m:t>'</m:t>
-            </m:r>
-          </m:sup>
-        </m:sSubSup>
-      </m:oMath>
-      <w:r>
-        <w:rPr>
-          <w:rFonts w:eastAsiaTheme="minorEastAsia"/>
-        </w:rPr>
-        <w:t xml:space="preserve">, and </w:t>
-      </w:r>
-      <m:oMath>
-        <m:sSub>
-          <m:sSubPr>
-            <m:ctrlPr>
-              <w:rPr>
-                <w:rFonts w:ascii="Cambria Math" w:eastAsiaTheme="minorEastAsia" w:hAnsi="Cambria Math"/>
-                <w:i/>
-              </w:rPr>
-            </m:ctrlPr>
-          </m:sSubPr>
-          <m:e>
-            <m:r>
-              <w:rPr>
-                <w:rFonts w:ascii="Cambria Math" w:eastAsiaTheme="minorEastAsia" w:hAnsi="Cambria Math"/>
-              </w:rPr>
-              <m:t>F</m:t>
-            </m:r>
-          </m:e>
-          <m:sub>
-            <m:r>
-              <w:rPr>
-                <w:rFonts w:ascii="Cambria Math" w:eastAsiaTheme="minorEastAsia" w:hAnsi="Cambria Math"/>
-              </w:rPr>
-              <m:t>i</m:t>
-            </m:r>
-          </m:sub>
-        </m:sSub>
-        <m:r>
-          <w:rPr>
-            <w:rFonts w:ascii="Cambria Math" w:eastAsiaTheme="minorEastAsia" w:hAnsi="Cambria Math"/>
-          </w:rPr>
-          <m:t>'</m:t>
-        </m:r>
-      </m:oMath>
-      <w:r>
-        <w:rPr>
-          <w:rFonts w:eastAsiaTheme="minorEastAsia"/>
-        </w:rPr>
-        <w:t xml:space="preserve"> for the modified sink rates </w:t>
-      </w:r>
-      <m:oMath>
-        <m:sSubSup>
-          <m:sSubSupPr>
-            <m:ctrlPr>
-              <w:rPr>
-                <w:rFonts w:ascii="Cambria Math" w:eastAsiaTheme="minorEastAsia" w:hAnsi="Cambria Math"/>
-                <w:i/>
-              </w:rPr>
-            </m:ctrlPr>
-          </m:sSubSupPr>
-          <m:e>
-            <m:d>
-              <m:dPr>
-                <m:ctrlPr>
-                  <w:rPr>
-                    <w:rFonts w:ascii="Cambria Math" w:eastAsiaTheme="minorEastAsia" w:hAnsi="Cambria Math"/>
-                    <w:i/>
-                  </w:rPr>
-                </m:ctrlPr>
-              </m:dPr>
-              <m:e>
-                <m:r>
-                  <w:rPr>
-                    <w:rFonts w:ascii="Cambria Math" w:eastAsiaTheme="minorEastAsia" w:hAnsi="Cambria Math"/>
-                  </w:rPr>
-                  <m:t>α+ϵ</m:t>
-                </m:r>
-              </m:e>
-            </m:d>
-          </m:e>
-          <m:sub>
-            <m:r>
-              <w:rPr>
-                <w:rFonts w:ascii="Cambria Math" w:eastAsiaTheme="minorEastAsia" w:hAnsi="Cambria Math"/>
-              </w:rPr>
-              <m:t>i</m:t>
-            </m:r>
-          </m:sub>
-          <m:sup>
-            <m:r>
-              <w:rPr>
-                <w:rFonts w:ascii="Cambria Math" w:eastAsiaTheme="minorEastAsia" w:hAnsi="Cambria Math"/>
-              </w:rPr>
-              <m:t>'</m:t>
-            </m:r>
-          </m:sup>
-        </m:sSubSup>
-      </m:oMath>
-      <w:r>
-        <w:rPr>
-          <w:rFonts w:eastAsiaTheme="minorEastAsia"/>
-        </w:rPr>
-        <w:t>.</w:t>
-      </w:r>
-    </w:p>
-    <w:p>
-      <w:pPr>
-        <w:pStyle w:val="BodyText"/>
-        <w:rPr>
-          <w:rFonts w:eastAsiaTheme="minorEastAsia"/>
-        </w:rPr>
-      </w:pPr>
-    </w:p>
-    <w:p>
-      <w:pPr>
-        <w:pStyle w:val="BodyText"/>
-        <w:rPr>
-          <w:rFonts w:eastAsiaTheme="minorEastAsia"/>
-        </w:rPr>
-      </w:pPr>
-      <w:r>
-        <w:t xml:space="preserve">? What question is </w:t>
-      </w:r>
-      <w:r>
-        <w:t xml:space="preserve">a moisture sink rate </w:t>
-      </w:r>
-      <w:r>
-        <w:t>experiment trying to answer?</w:t>
-      </w:r>
-      <w:r>
-        <w:t xml:space="preserve"> As we multiply sink rate in each category, what do we keep constant in that category? </w:t>
-      </w:r>
-      <w:r>
-        <w:sym w:font="Wingdings" w:char="F0E0"/>
-      </w:r>
-      <w:r>
-        <w:t xml:space="preserve"> TRY Cloud base cloud fraction. Then the simulation, by design, deliberately changes the cloud humidity (difference), mass flux and moisture flux</w:t>
-      </w:r>
-      <w:r>
-        <w:t>.</w:t>
-      </w:r>
-    </w:p>
-    <w:p>
-      <w:pPr>
-        <w:pStyle w:val="BodyText"/>
-        <w:rPr>
-          <w:rFonts w:eastAsiaTheme="minorEastAsia"/>
-          <w:bCs/>
-          <w:iCs/>
-        </w:rPr>
-      </w:pPr>
-      <w:r>
-        <w:t xml:space="preserve">Redistributing </w:t>
-      </w:r>
-      <w:r>
-        <w:t xml:space="preserve">the total eddy fluxes to the </w:t>
-      </w:r>
-      <w:r>
-        <w:t xml:space="preserve">cloud </w:t>
-      </w:r>
-      <w:r>
-        <w:t xml:space="preserve">with these </w:t>
-      </w:r>
-      <w:r>
-        <w:t xml:space="preserve">cloud tops </w:t>
-      </w:r>
-      <w:r>
-        <w:t xml:space="preserve">results in the total cloud fraction changes relative to the control listed in Table 1. Reducing the sink rate </w:t>
-      </w:r>
-      <w:r>
-        <w:t>-</w:t>
-      </w:r>
-      <w:r>
-        <w:t xml:space="preserve">5% increases the total cloud albedo by </w:t>
-      </w:r>
-      <m:oMath>
-        <m:r>
-          <w:rPr>
-            <w:rFonts w:ascii="Cambria Math" w:hAnsi="Cambria Math"/>
-          </w:rPr>
-          <m:t>d</m:t>
-        </m:r>
-        <m:r>
-          <m:rPr>
-            <m:sty m:val="p"/>
-          </m:rPr>
-          <w:rPr>
-            <w:rFonts w:ascii="Cambria Math" w:hAnsi="Cambria Math"/>
-          </w:rPr>
-          <m:t>ln</m:t>
-        </m:r>
         <m:r>
           <w:rPr>
             <w:rFonts w:ascii="Cambria Math" w:hAnsi="Cambria Math"/>
@@ -6956,556 +5837,39 @@
       </m:oMath>
       <w:r>
         <w:rPr>
-          <w:rFonts w:eastAsiaTheme="minorEastAsia"/>
-          <w:bCs/>
-          <w:iCs/>
-        </w:rPr>
-        <w:t xml:space="preserve"> = +3%. </w:t>
-      </w:r>
-      <w:r>
-        <w:rPr>
-          <w:rFonts w:eastAsiaTheme="minorEastAsia"/>
-          <w:bCs/>
-          <w:iCs/>
-        </w:rPr>
-        <w:t>F</w:t>
-      </w:r>
-      <w:r>
-        <w:rPr>
-          <w:rFonts w:eastAsiaTheme="minorEastAsia"/>
-          <w:bCs/>
-          <w:iCs/>
-        </w:rPr>
-        <w:t>or lower moisture sink rate</w:t>
-      </w:r>
-      <w:r>
-        <w:rPr>
-          <w:rFonts w:eastAsiaTheme="minorEastAsia"/>
-          <w:bCs/>
-          <w:iCs/>
-        </w:rPr>
-        <w:t>s</w:t>
-      </w:r>
-      <w:r>
-        <w:rPr>
-          <w:rFonts w:eastAsiaTheme="minorEastAsia"/>
-          <w:bCs/>
-          <w:iCs/>
-        </w:rPr>
-        <w:t>,</w:t>
-      </w:r>
-      <w:r>
-        <w:rPr>
-          <w:rFonts w:eastAsiaTheme="minorEastAsia"/>
-          <w:bCs/>
-          <w:iCs/>
-        </w:rPr>
-        <w:t xml:space="preserve"> cloud fraction </w:t>
-      </w:r>
-      <w:r>
-        <w:rPr>
-          <w:rFonts w:eastAsiaTheme="minorEastAsia"/>
-          <w:bCs/>
-          <w:iCs/>
-        </w:rPr>
-        <w:t xml:space="preserve">and moisture flux </w:t>
-      </w:r>
-      <w:r>
-        <w:rPr>
-          <w:rFonts w:eastAsiaTheme="minorEastAsia"/>
-          <w:bCs/>
-          <w:iCs/>
-        </w:rPr>
-        <w:t xml:space="preserve">in each category </w:t>
-      </w:r>
-      <w:r>
-        <w:rPr>
-          <w:rFonts w:eastAsiaTheme="minorEastAsia"/>
-          <w:bCs/>
-          <w:iCs/>
-        </w:rPr>
-        <w:t xml:space="preserve">increases </w:t>
-      </w:r>
-      <w:r>
-        <w:rPr>
-          <w:rFonts w:eastAsiaTheme="minorEastAsia"/>
-          <w:bCs/>
-          <w:iCs/>
-        </w:rPr>
-        <w:t xml:space="preserve">to generate </w:t>
-      </w:r>
-      <w:r>
-        <w:rPr>
-          <w:rFonts w:eastAsiaTheme="minorEastAsia"/>
-          <w:bCs/>
-          <w:iCs/>
-        </w:rPr>
-        <w:t>a larger required</w:t>
-      </w:r>
-      <w:r>
-        <w:rPr>
-          <w:rFonts w:eastAsiaTheme="minorEastAsia"/>
-          <w:bCs/>
-          <w:iCs/>
-        </w:rPr>
-        <w:t xml:space="preserve"> moisture flux </w:t>
-      </w:r>
-      <w:r>
-        <w:rPr>
-          <w:rFonts w:eastAsiaTheme="minorEastAsia"/>
-          <w:bCs/>
-          <w:iCs/>
-        </w:rPr>
-        <w:t xml:space="preserve">as the </w:t>
-      </w:r>
-      <w:r>
-        <w:rPr>
-          <w:rFonts w:eastAsiaTheme="minorEastAsia"/>
-          <w:bCs/>
-          <w:iCs/>
-        </w:rPr>
-        <w:t xml:space="preserve">cloud top height difference </w:t>
-      </w:r>
-      <m:oMath>
-        <m:sSub>
-          <m:sSubPr>
-            <m:ctrlPr>
-              <w:rPr>
-                <w:rFonts w:ascii="Cambria Math" w:eastAsiaTheme="minorEastAsia" w:hAnsi="Cambria Math"/>
-                <w:bCs/>
-                <w:i/>
-                <w:iCs/>
-              </w:rPr>
-            </m:ctrlPr>
-          </m:sSubPr>
-          <m:e>
-            <m:r>
-              <w:rPr>
-                <w:rFonts w:ascii="Cambria Math" w:eastAsiaTheme="minorEastAsia" w:hAnsi="Cambria Math"/>
-              </w:rPr>
-              <m:t>z</m:t>
-            </m:r>
-          </m:e>
-          <m:sub>
-            <m:r>
-              <w:rPr>
-                <w:rFonts w:ascii="Cambria Math" w:eastAsiaTheme="minorEastAsia" w:hAnsi="Cambria Math"/>
-              </w:rPr>
-              <m:t>top,i</m:t>
-            </m:r>
-          </m:sub>
-        </m:sSub>
-        <m:r>
-          <w:rPr>
-            <w:rFonts w:ascii="Cambria Math" w:eastAsiaTheme="minorEastAsia" w:hAnsi="Cambria Math"/>
-          </w:rPr>
-          <m:t>-</m:t>
-        </m:r>
-        <m:sSub>
-          <m:sSubPr>
-            <m:ctrlPr>
-              <w:rPr>
-                <w:rFonts w:ascii="Cambria Math" w:eastAsiaTheme="minorEastAsia" w:hAnsi="Cambria Math"/>
-                <w:bCs/>
-                <w:i/>
-                <w:iCs/>
-              </w:rPr>
-            </m:ctrlPr>
-          </m:sSubPr>
-          <m:e>
-            <m:r>
-              <w:rPr>
-                <w:rFonts w:ascii="Cambria Math" w:eastAsiaTheme="minorEastAsia" w:hAnsi="Cambria Math"/>
-              </w:rPr>
-              <m:t>z</m:t>
-            </m:r>
-          </m:e>
-          <m:sub>
-            <m:r>
-              <w:rPr>
-                <w:rFonts w:ascii="Cambria Math" w:eastAsiaTheme="minorEastAsia" w:hAnsi="Cambria Math"/>
-              </w:rPr>
-              <m:t>top,i</m:t>
-            </m:r>
-            <m:r>
-              <w:rPr>
-                <w:rFonts w:ascii="Cambria Math" w:eastAsiaTheme="minorEastAsia" w:hAnsi="Cambria Math"/>
-              </w:rPr>
-              <m:t>-1</m:t>
-            </m:r>
-          </m:sub>
-        </m:sSub>
-      </m:oMath>
-      <w:r>
-        <w:rPr>
-          <w:rFonts w:eastAsiaTheme="minorEastAsia"/>
-          <w:bCs/>
-          <w:iCs/>
-        </w:rPr>
-        <w:t xml:space="preserve"> increases</w:t>
-      </w:r>
-      <w:r>
-        <w:rPr>
-          <w:rFonts w:eastAsiaTheme="minorEastAsia"/>
-          <w:bCs/>
-          <w:iCs/>
-        </w:rPr>
-        <w:t xml:space="preserve"> between </w:t>
-      </w:r>
-      <w:r>
-        <w:rPr>
-          <w:rFonts w:eastAsiaTheme="minorEastAsia"/>
-          <w:bCs/>
-          <w:iCs/>
-        </w:rPr>
-        <w:t>cloud</w:t>
-      </w:r>
-      <w:r>
-        <w:rPr>
-          <w:rFonts w:eastAsiaTheme="minorEastAsia"/>
-          <w:bCs/>
-          <w:iCs/>
-        </w:rPr>
-        <w:t xml:space="preserve"> categories </w:t>
-      </w:r>
-      <m:oMath>
-        <m:r>
-          <w:rPr>
-            <w:rFonts w:ascii="Cambria Math" w:eastAsiaTheme="minorEastAsia" w:hAnsi="Cambria Math"/>
-          </w:rPr>
-          <m:t>i</m:t>
-        </m:r>
-      </m:oMath>
-      <w:r>
-        <w:rPr>
-          <w:rFonts w:eastAsiaTheme="minorEastAsia"/>
-          <w:bCs/>
-          <w:iCs/>
+          <w:rFonts w:ascii="Aptos" w:eastAsiaTheme="minorEastAsia" w:hAnsi="Aptos"/>
+        </w:rPr>
+        <w:t xml:space="preserve"> </w:t>
+      </w:r>
+      <w:r>
+        <w:rPr>
+          <w:rFonts w:ascii="Aptos" w:hAnsi="Aptos"/>
+        </w:rPr>
+        <w:t>from the shallow cumulus cloud model results</w:t>
+      </w:r>
+      <w:r>
+        <w:rPr>
+          <w:rFonts w:ascii="Aptos" w:hAnsi="Aptos"/>
+        </w:rPr>
+        <w:t xml:space="preserve"> (Fig. GOESISCCP)</w:t>
+      </w:r>
+      <w:r>
+        <w:rPr>
+          <w:rFonts w:ascii="Aptos" w:hAnsi="Aptos"/>
         </w:rPr>
         <w:t>.</w:t>
       </w:r>
     </w:p>
     <w:p>
-      <w:pPr>
-        <w:pStyle w:val="BodyText"/>
-        <w:rPr>
-          <w:rFonts w:eastAsiaTheme="minorEastAsia"/>
-          <w:bCs/>
-          <w:iCs/>
-        </w:rPr>
-      </w:pPr>
-      <w:r>
-        <w:rPr>
-          <w:rFonts w:eastAsiaTheme="minorEastAsia"/>
-          <w:bCs/>
-          <w:iCs/>
-          <w:color w:val="3A7C22" w:themeColor="accent6" w:themeShade="BF"/>
-        </w:rPr>
-        <w:t xml:space="preserve">[[!! is this stronger </w:t>
-      </w:r>
-      <w:r>
-        <w:rPr>
-          <w:rFonts w:eastAsiaTheme="minorEastAsia"/>
-          <w:bCs/>
-          <w:iCs/>
-          <w:color w:val="3A7C22" w:themeColor="accent6" w:themeShade="BF"/>
-        </w:rPr>
-        <w:t>for the more populous lower clouds</w:t>
-      </w:r>
-      <w:r>
-        <w:rPr>
-          <w:rFonts w:eastAsiaTheme="minorEastAsia"/>
-          <w:bCs/>
-          <w:iCs/>
-          <w:color w:val="3A7C22" w:themeColor="accent6" w:themeShade="BF"/>
-        </w:rPr>
-        <w:t>, and weaker for the higher</w:t>
-      </w:r>
-      <w:r>
-        <w:rPr>
-          <w:rFonts w:eastAsiaTheme="minorEastAsia"/>
-          <w:bCs/>
-          <w:iCs/>
-          <w:color w:val="3A7C22" w:themeColor="accent6" w:themeShade="BF"/>
-        </w:rPr>
-        <w:t xml:space="preserve"> </w:t>
-      </w:r>
-      <w:r>
-        <w:rPr>
-          <w:rFonts w:eastAsiaTheme="minorEastAsia"/>
-          <w:bCs/>
-          <w:iCs/>
-          <w:color w:val="3A7C22" w:themeColor="accent6" w:themeShade="BF"/>
-        </w:rPr>
-        <w:t xml:space="preserve">clouds? Otherwise, why can’t fewer cloud categories just generate the </w:t>
-      </w:r>
-      <w:r>
-        <w:rPr>
-          <w:rFonts w:eastAsiaTheme="minorEastAsia"/>
-          <w:bCs/>
-          <w:iCs/>
-          <w:color w:val="3A7C22" w:themeColor="accent6" w:themeShade="BF"/>
-          <w:u w:val="single"/>
-        </w:rPr>
-        <w:t>same amount clouds</w:t>
-      </w:r>
-      <w:r>
-        <w:rPr>
-          <w:rFonts w:eastAsiaTheme="minorEastAsia"/>
-          <w:bCs/>
-          <w:iCs/>
-          <w:color w:val="3A7C22" w:themeColor="accent6" w:themeShade="BF"/>
-        </w:rPr>
-        <w:t xml:space="preserve"> as the </w:t>
-      </w:r>
-      <w:proofErr w:type="spellStart"/>
-      <w:r>
-        <w:rPr>
-          <w:rFonts w:eastAsiaTheme="minorEastAsia"/>
-          <w:bCs/>
-          <w:iCs/>
-          <w:color w:val="3A7C22" w:themeColor="accent6" w:themeShade="BF"/>
-        </w:rPr>
-        <w:t>ztop</w:t>
-      </w:r>
-      <w:proofErr w:type="spellEnd"/>
-      <w:r>
-        <w:rPr>
-          <w:rFonts w:eastAsiaTheme="minorEastAsia"/>
-          <w:bCs/>
-          <w:iCs/>
-          <w:color w:val="3A7C22" w:themeColor="accent6" w:themeShade="BF"/>
-        </w:rPr>
-        <w:t xml:space="preserve"> bins widen? Or do higher clouds result in valid clouds now that had been excluded before, increasing the counted clouds mass flux? That</w:t>
-      </w:r>
-      <w:r>
-        <w:rPr>
-          <w:rFonts w:eastAsiaTheme="minorEastAsia"/>
-          <w:bCs/>
-          <w:iCs/>
-          <w:color w:val="3A7C22" w:themeColor="accent6" w:themeShade="BF"/>
-        </w:rPr>
-        <w:t xml:space="preserve"> would be</w:t>
-      </w:r>
-      <w:r>
-        <w:rPr>
-          <w:rFonts w:eastAsiaTheme="minorEastAsia"/>
-          <w:bCs/>
-          <w:iCs/>
-          <w:color w:val="3A7C22" w:themeColor="accent6" w:themeShade="BF"/>
-        </w:rPr>
-        <w:t xml:space="preserve"> just a bookkeeping issue. </w:t>
-      </w:r>
-      <w:r>
-        <w:rPr>
-          <w:rFonts w:eastAsiaTheme="minorEastAsia"/>
-          <w:bCs/>
-          <w:iCs/>
-          <w:color w:val="3A7C22" w:themeColor="accent6" w:themeShade="BF"/>
-        </w:rPr>
-        <w:t>Clouds that have now weaker moisture sink rate are replaced by clouds that had higher sink rates but are now reduced</w:t>
-      </w:r>
-      <w:r>
-        <w:rPr>
-          <w:rFonts w:eastAsiaTheme="minorEastAsia"/>
-          <w:bCs/>
-          <w:iCs/>
-          <w:color w:val="3A7C22" w:themeColor="accent6" w:themeShade="BF"/>
-        </w:rPr>
-        <w:t>!!]]</w:t>
-      </w:r>
-      <w:r>
-        <w:rPr>
-          <w:rFonts w:eastAsiaTheme="minorEastAsia"/>
-          <w:bCs/>
-          <w:iCs/>
-          <w:color w:val="3A7C22" w:themeColor="accent6" w:themeShade="BF"/>
-        </w:rPr>
-        <w:t xml:space="preserve"> </w:t>
-      </w:r>
-      <w:r>
-        <w:rPr>
-          <w:rFonts w:eastAsiaTheme="minorEastAsia"/>
-          <w:bCs/>
-          <w:iCs/>
-        </w:rPr>
-        <w:t>T</w:t>
-      </w:r>
-      <w:r>
-        <w:rPr>
-          <w:rFonts w:eastAsiaTheme="minorEastAsia"/>
-          <w:bCs/>
-          <w:iCs/>
-        </w:rPr>
-        <w:t xml:space="preserve">his </w:t>
-      </w:r>
-      <w:r>
-        <w:rPr>
-          <w:rFonts w:eastAsiaTheme="minorEastAsia"/>
-          <w:bCs/>
-          <w:iCs/>
-        </w:rPr>
-        <w:t>must be</w:t>
-      </w:r>
-      <w:r>
-        <w:rPr>
-          <w:rFonts w:eastAsiaTheme="minorEastAsia"/>
-          <w:bCs/>
-          <w:iCs/>
-        </w:rPr>
-        <w:t xml:space="preserve"> compensate</w:t>
-      </w:r>
-      <w:r>
-        <w:rPr>
-          <w:rFonts w:eastAsiaTheme="minorEastAsia"/>
-          <w:bCs/>
-          <w:iCs/>
-        </w:rPr>
-        <w:t>d somewhat by larger</w:t>
-      </w:r>
-      <w:r>
-        <w:rPr>
-          <w:rFonts w:eastAsiaTheme="minorEastAsia"/>
-          <w:bCs/>
-          <w:iCs/>
-        </w:rPr>
-        <w:t xml:space="preserve"> </w:t>
-      </w:r>
-      <m:oMath>
-        <m:sSub>
-          <m:sSubPr>
-            <m:ctrlPr>
-              <w:rPr>
-                <w:rFonts w:ascii="Cambria Math" w:eastAsiaTheme="minorEastAsia" w:hAnsi="Cambria Math"/>
-                <w:bCs/>
-                <w:i/>
-                <w:iCs/>
-              </w:rPr>
-            </m:ctrlPr>
-          </m:sSubPr>
-          <m:e>
-            <m:r>
-              <w:rPr>
-                <w:rFonts w:ascii="Cambria Math" w:eastAsiaTheme="minorEastAsia" w:hAnsi="Cambria Math"/>
-              </w:rPr>
-              <m:t>q</m:t>
-            </m:r>
-          </m:e>
-          <m:sub>
-            <m:r>
-              <w:rPr>
-                <w:rFonts w:ascii="Cambria Math" w:eastAsiaTheme="minorEastAsia" w:hAnsi="Cambria Math"/>
-              </w:rPr>
-              <m:t>c</m:t>
-            </m:r>
-          </m:sub>
-        </m:sSub>
-        <m:r>
-          <w:rPr>
-            <w:rFonts w:ascii="Cambria Math" w:eastAsiaTheme="minorEastAsia" w:hAnsi="Cambria Math"/>
-          </w:rPr>
-          <m:t>-q</m:t>
-        </m:r>
-      </m:oMath>
-      <w:r>
-        <w:rPr>
-          <w:rFonts w:eastAsiaTheme="minorEastAsia"/>
-          <w:bCs/>
-          <w:iCs/>
-        </w:rPr>
-        <w:t xml:space="preserve"> </w:t>
-      </w:r>
-      <w:r>
-        <w:rPr>
-          <w:rFonts w:eastAsiaTheme="minorEastAsia"/>
-          <w:bCs/>
-          <w:iCs/>
-        </w:rPr>
-        <w:t>when the</w:t>
-      </w:r>
-      <w:r>
-        <w:rPr>
-          <w:rFonts w:eastAsiaTheme="minorEastAsia"/>
-          <w:bCs/>
-          <w:iCs/>
-        </w:rPr>
-        <w:t xml:space="preserve"> </w:t>
-      </w:r>
-      <w:r>
-        <w:rPr>
-          <w:rFonts w:eastAsiaTheme="minorEastAsia"/>
-          <w:bCs/>
-          <w:iCs/>
-        </w:rPr>
-        <w:t xml:space="preserve">clouds are is less diluted by the weaker </w:t>
-      </w:r>
-      <w:r>
-        <w:rPr>
-          <w:rFonts w:eastAsiaTheme="minorEastAsia"/>
-          <w:bCs/>
-          <w:iCs/>
-        </w:rPr>
-        <w:t>moisture sink</w:t>
-      </w:r>
-      <w:r>
-        <w:rPr>
-          <w:rFonts w:eastAsiaTheme="minorEastAsia"/>
-          <w:bCs/>
-          <w:iCs/>
-        </w:rPr>
-        <w:t xml:space="preserve">, which </w:t>
-      </w:r>
-      <w:r>
-        <w:rPr>
-          <w:rFonts w:eastAsiaTheme="minorEastAsia"/>
-          <w:bCs/>
-          <w:iCs/>
-        </w:rPr>
-        <w:t xml:space="preserve">as above, </w:t>
-      </w:r>
-      <w:r>
-        <w:rPr>
-          <w:rFonts w:eastAsiaTheme="minorEastAsia"/>
-          <w:bCs/>
-          <w:iCs/>
-        </w:rPr>
-        <w:t>for the same moisture flux</w:t>
-      </w:r>
-      <w:r>
-        <w:rPr>
-          <w:rFonts w:eastAsiaTheme="minorEastAsia"/>
-          <w:bCs/>
-          <w:iCs/>
-        </w:rPr>
-        <w:t xml:space="preserve"> </w:t>
-      </w:r>
-      <w:r>
-        <w:rPr>
-          <w:rFonts w:eastAsiaTheme="minorEastAsia"/>
-          <w:bCs/>
-          <w:iCs/>
-        </w:rPr>
-        <w:t>reduces the mass flux and cloud fraction.</w:t>
-      </w:r>
-    </w:p>
-    <w:p>
-      <w:pPr>
-        <w:pStyle w:val="BodyText"/>
-      </w:pPr>
-      <w:r>
-        <w:t xml:space="preserve"> </w:t>
-      </w:r>
-    </w:p>
-    <w:p>
-      <w:pPr>
-        <w:pStyle w:val="BodyText"/>
-      </w:pPr>
-      <w:r>
+      <w:r>
+        <w:rPr>
+          <w:noProof/>
+        </w:rPr>
         <w:drawing>
-          <wp:inline distT="0" distB="0" distL="0" distR="0" wp14:anchorId="1B4D32EB" wp14:editId="43A13E82">
-            <wp:extent cx="4453119" cy="3342254"/>
-            <wp:effectExtent l="0" t="0" r="5080" b="0"/>
-            <wp:docPr id="2049367688" name="Picture 1"/>
+          <wp:inline distT="0" distB="0" distL="0" distR="0" wp14:anchorId="3A32B20B" wp14:editId="45E52A36">
+            <wp:extent cx="3397250" cy="4076700"/>
+            <wp:effectExtent l="0" t="0" r="0" b="0"/>
+            <wp:docPr id="2118579599" name="Picture 4"/>
             <wp:cNvGraphicFramePr>
               <a:graphicFrameLocks xmlns:a="http://schemas.openxmlformats.org/drawingml/2006/main" noChangeAspect="1"/>
             </wp:cNvGraphicFramePr>
@@ -7513,7 +5877,7 @@
               <a:graphicData uri="http://schemas.openxmlformats.org/drawingml/2006/picture">
                 <pic:pic xmlns:pic="http://schemas.openxmlformats.org/drawingml/2006/picture">
                   <pic:nvPicPr>
-                    <pic:cNvPr id="2049367688" name=""/>
+                    <pic:cNvPr id="2118579599" name="Picture 2118579599"/>
                     <pic:cNvPicPr/>
                   </pic:nvPicPr>
                   <pic:blipFill>
@@ -7525,7 +5889,7 @@
                   <pic:spPr>
                     <a:xfrm>
                       <a:off x="0" y="0"/>
-                      <a:ext cx="4459371" cy="3346946"/>
+                      <a:ext cx="3417418" cy="4100901"/>
                     </a:xfrm>
                     <a:prstGeom prst="rect">
                       <a:avLst/>
@@ -7540,61 +5904,342 @@
     </w:p>
     <w:p>
       <w:pPr>
-        <w:pStyle w:val="BodyText"/>
-        <w:rPr>
-          <w:rFonts w:ascii="Aptos Narrow" w:hAnsi="Aptos Narrow"/>
+        <w:rPr>
+          <w:rFonts w:ascii="Aptos Narrow" w:eastAsiaTheme="minorEastAsia" w:hAnsi="Aptos Narrow" w:cs="Times New Roman"/>
+          <w:kern w:val="0"/>
+          <w14:ligatures w14:val="none"/>
         </w:rPr>
       </w:pPr>
       <w:r>
         <w:rPr>
-          <w:rFonts w:ascii="Aptos Narrow" w:hAnsi="Aptos Narrow"/>
-        </w:rPr>
-        <w:t xml:space="preserve">Figure SINKZTOP. Cloud top height experiments </w:t>
-      </w:r>
-      <w:r>
-        <w:rPr>
-          <w:rFonts w:ascii="ComicShannsMono Nerd Font" w:hAnsi="ComicShannsMono Nerd Font"/>
-        </w:rPr>
-        <w:t>sink-5%</w:t>
-      </w:r>
-      <w:r>
-        <w:rPr>
-          <w:rFonts w:ascii="Aptos Narrow" w:hAnsi="Aptos Narrow"/>
-        </w:rPr>
-        <w:t xml:space="preserve"> and </w:t>
-      </w:r>
-      <w:r>
-        <w:rPr>
-          <w:rFonts w:ascii="ComicShannsMono Nerd Font" w:hAnsi="ComicShannsMono Nerd Font"/>
-        </w:rPr>
-        <w:t>sink+5%</w:t>
-      </w:r>
-      <w:r>
-        <w:rPr>
-          <w:rFonts w:ascii="Aptos Narrow" w:hAnsi="Aptos Narrow"/>
-        </w:rPr>
-        <w:t xml:space="preserve"> compared to the control experiment.</w:t>
-      </w:r>
-      <w:r>
-        <w:rPr>
-          <w:rFonts w:ascii="Aptos Narrow" w:hAnsi="Aptos Narrow"/>
-        </w:rPr>
-        <w:t xml:space="preserve"> Greater sink rates limit the height of clouds.</w:t>
+          <w:rFonts w:ascii="Aptos Narrow" w:eastAsiaTheme="minorEastAsia" w:hAnsi="Aptos Narrow" w:cs="Times New Roman"/>
+          <w:kern w:val="0"/>
+          <w14:ligatures w14:val="none"/>
+        </w:rPr>
+        <w:t xml:space="preserve">Figure GOESISCCP. GOES-16 (a) cloud fraction by cloud type for 12.5-16 °N, 60-49 °W, 2020 Jan 15- February 28. (b) Shortwave cloud radiative effect (CRE) for each cloud top pressure and optical depth. The total cloud radiative effect for clouds below 680 </w:t>
+      </w:r>
+      <w:proofErr w:type="spellStart"/>
+      <w:r>
+        <w:rPr>
+          <w:rFonts w:ascii="Aptos Narrow" w:eastAsiaTheme="minorEastAsia" w:hAnsi="Aptos Narrow" w:cs="Times New Roman"/>
+          <w:kern w:val="0"/>
+          <w14:ligatures w14:val="none"/>
+        </w:rPr>
+        <w:t>hPa</w:t>
+      </w:r>
+      <w:proofErr w:type="spellEnd"/>
+      <w:r>
+        <w:rPr>
+          <w:rFonts w:ascii="Aptos Narrow" w:eastAsiaTheme="minorEastAsia" w:hAnsi="Aptos Narrow" w:cs="Times New Roman"/>
+          <w:kern w:val="0"/>
+          <w14:ligatures w14:val="none"/>
+        </w:rPr>
+        <w:t xml:space="preserve"> is 32 W m</w:t>
+      </w:r>
+      <w:r>
+        <w:rPr>
+          <w:rFonts w:ascii="Aptos Narrow" w:eastAsiaTheme="minorEastAsia" w:hAnsi="Aptos Narrow" w:cs="Times New Roman"/>
+          <w:kern w:val="0"/>
+          <w:vertAlign w:val="superscript"/>
+          <w14:ligatures w14:val="none"/>
+        </w:rPr>
+        <w:t>–2</w:t>
+      </w:r>
+      <w:r>
+        <w:rPr>
+          <w:rFonts w:ascii="Aptos Narrow" w:eastAsiaTheme="minorEastAsia" w:hAnsi="Aptos Narrow" w:cs="Times New Roman"/>
+          <w:kern w:val="0"/>
+          <w14:ligatures w14:val="none"/>
+        </w:rPr>
+        <w:t xml:space="preserve">. </w:t>
+      </w:r>
+      <w:r>
+        <w:rPr>
+          <w:rFonts w:ascii="Aptos Narrow" w:eastAsiaTheme="minorEastAsia" w:hAnsi="Aptos Narrow" w:cs="Times New Roman"/>
+          <w:kern w:val="0"/>
+          <w14:ligatures w14:val="none"/>
+        </w:rPr>
+        <w:t>Reducing</w:t>
+      </w:r>
+      <w:r>
+        <w:rPr>
+          <w:rFonts w:ascii="Aptos Narrow" w:eastAsiaTheme="minorEastAsia" w:hAnsi="Aptos Narrow" w:cs="Times New Roman"/>
+          <w:kern w:val="0"/>
+          <w14:ligatures w14:val="none"/>
+        </w:rPr>
+        <w:t xml:space="preserve"> </w:t>
+      </w:r>
+      <w:r>
+        <w:rPr>
+          <w:rFonts w:ascii="Aptos Narrow" w:eastAsiaTheme="minorEastAsia" w:hAnsi="Aptos Narrow" w:cs="Times New Roman"/>
+          <w:kern w:val="0"/>
+          <w14:ligatures w14:val="none"/>
+        </w:rPr>
+        <w:t xml:space="preserve">low </w:t>
+      </w:r>
+      <w:r>
+        <w:rPr>
+          <w:rFonts w:ascii="Aptos Narrow" w:eastAsiaTheme="minorEastAsia" w:hAnsi="Aptos Narrow" w:cs="Times New Roman"/>
+          <w:kern w:val="0"/>
+          <w14:ligatures w14:val="none"/>
+        </w:rPr>
+        <w:t xml:space="preserve">cloud fraction by </w:t>
+      </w:r>
+      <w:r>
+        <w:rPr>
+          <w:rFonts w:ascii="Aptos Narrow" w:eastAsiaTheme="minorEastAsia" w:hAnsi="Aptos Narrow" w:cs="Times New Roman"/>
+          <w:kern w:val="0"/>
+          <w14:ligatures w14:val="none"/>
+        </w:rPr>
+        <w:t>–</w:t>
+      </w:r>
+      <w:r>
+        <w:rPr>
+          <w:rFonts w:ascii="Aptos Narrow" w:eastAsiaTheme="minorEastAsia" w:hAnsi="Aptos Narrow" w:cs="Times New Roman"/>
+          <w:kern w:val="0"/>
+          <w14:ligatures w14:val="none"/>
+        </w:rPr>
+        <w:t>5 %</w:t>
+      </w:r>
+      <w:r>
+        <w:rPr>
+          <w:rFonts w:ascii="Aptos Narrow" w:eastAsiaTheme="minorEastAsia" w:hAnsi="Aptos Narrow" w:cs="Times New Roman"/>
+          <w:kern w:val="0"/>
+          <w14:ligatures w14:val="none"/>
+        </w:rPr>
+        <w:t xml:space="preserve"> K</w:t>
+      </w:r>
+      <w:r>
+        <w:rPr>
+          <w:rFonts w:ascii="Aptos Narrow" w:eastAsiaTheme="minorEastAsia" w:hAnsi="Aptos Narrow" w:cs="Times New Roman"/>
+          <w:kern w:val="0"/>
+          <w:vertAlign w:val="superscript"/>
+          <w14:ligatures w14:val="none"/>
+        </w:rPr>
+        <w:t>–1</w:t>
+      </w:r>
+      <w:r>
+        <w:rPr>
+          <w:rFonts w:ascii="Aptos Narrow" w:eastAsiaTheme="minorEastAsia" w:hAnsi="Aptos Narrow" w:cs="Times New Roman"/>
+          <w:kern w:val="0"/>
+          <w14:ligatures w14:val="none"/>
+        </w:rPr>
+        <w:t xml:space="preserve"> would have a local radiative </w:t>
+      </w:r>
+      <w:r>
+        <w:rPr>
+          <w:rFonts w:ascii="Aptos Narrow" w:eastAsiaTheme="minorEastAsia" w:hAnsi="Aptos Narrow" w:cs="Times New Roman"/>
+          <w:kern w:val="0"/>
+          <w14:ligatures w14:val="none"/>
+        </w:rPr>
+        <w:t>effect</w:t>
+      </w:r>
+      <w:r>
+        <w:rPr>
+          <w:rFonts w:ascii="Aptos Narrow" w:eastAsiaTheme="minorEastAsia" w:hAnsi="Aptos Narrow" w:cs="Times New Roman"/>
+          <w:kern w:val="0"/>
+          <w14:ligatures w14:val="none"/>
+        </w:rPr>
+        <w:t xml:space="preserve"> of </w:t>
+      </w:r>
+      <w:r>
+        <w:rPr>
+          <w:rFonts w:ascii="Aptos Narrow" w:eastAsiaTheme="minorEastAsia" w:hAnsi="Aptos Narrow" w:cs="Times New Roman"/>
+          <w:kern w:val="0"/>
+          <w14:ligatures w14:val="none"/>
+        </w:rPr>
+        <w:t>+</w:t>
+      </w:r>
+      <w:r>
+        <w:rPr>
+          <w:rFonts w:ascii="Aptos Narrow" w:eastAsiaTheme="minorEastAsia" w:hAnsi="Aptos Narrow" w:cs="Times New Roman"/>
+          <w:kern w:val="0"/>
+          <w14:ligatures w14:val="none"/>
+        </w:rPr>
+        <w:t>1.6 W m</w:t>
+      </w:r>
+      <w:r>
+        <w:rPr>
+          <w:rFonts w:ascii="Aptos Narrow" w:eastAsiaTheme="minorEastAsia" w:hAnsi="Aptos Narrow" w:cs="Times New Roman"/>
+          <w:kern w:val="0"/>
+          <w:vertAlign w:val="superscript"/>
+          <w14:ligatures w14:val="none"/>
+        </w:rPr>
+        <w:t>–2</w:t>
+      </w:r>
+      <w:r>
+        <w:rPr>
+          <w:rFonts w:ascii="Aptos Narrow" w:eastAsiaTheme="minorEastAsia" w:hAnsi="Aptos Narrow" w:cs="Times New Roman"/>
+          <w:kern w:val="0"/>
+          <w14:ligatures w14:val="none"/>
+        </w:rPr>
+        <w:t xml:space="preserve"> K</w:t>
+      </w:r>
+      <w:r>
+        <w:rPr>
+          <w:rFonts w:ascii="Aptos Narrow" w:eastAsiaTheme="minorEastAsia" w:hAnsi="Aptos Narrow" w:cs="Times New Roman"/>
+          <w:kern w:val="0"/>
+          <w:vertAlign w:val="superscript"/>
+          <w14:ligatures w14:val="none"/>
+        </w:rPr>
+        <w:t>–1</w:t>
+      </w:r>
+      <w:r>
+        <w:rPr>
+          <w:rFonts w:ascii="Aptos Narrow" w:eastAsiaTheme="minorEastAsia" w:hAnsi="Aptos Narrow" w:cs="Times New Roman"/>
+          <w:kern w:val="0"/>
+          <w14:ligatures w14:val="none"/>
+        </w:rPr>
+        <w:t>.</w:t>
+      </w:r>
+    </w:p>
+    <w:p>
+      <w:pPr>
+        <w:rPr>
+          <w:rFonts w:ascii="Aptos Narrow" w:eastAsiaTheme="minorEastAsia" w:hAnsi="Aptos Narrow" w:cs="Times New Roman"/>
+          <w:kern w:val="0"/>
+          <w14:ligatures w14:val="none"/>
+        </w:rPr>
+      </w:pPr>
+    </w:p>
+    <w:p>
+      <w:pPr>
+        <w:pStyle w:val="FirstParagraph"/>
+      </w:pPr>
+      <w:r>
+        <w:rPr>
+          <w:noProof/>
+        </w:rPr>
+        <w:drawing>
+          <wp:inline distT="0" distB="0" distL="0" distR="0" wp14:anchorId="05C6E7D7" wp14:editId="3AB8E2F2">
+            <wp:extent cx="3225800" cy="2421100"/>
+            <wp:effectExtent l="0" t="0" r="0" b="2540"/>
+            <wp:docPr id="375149060" name="Picture 5"/>
+            <wp:cNvGraphicFramePr>
+              <a:graphicFrameLocks xmlns:a="http://schemas.openxmlformats.org/drawingml/2006/main" noChangeAspect="1"/>
+            </wp:cNvGraphicFramePr>
+            <a:graphic xmlns:a="http://schemas.openxmlformats.org/drawingml/2006/main">
+              <a:graphicData uri="http://schemas.openxmlformats.org/drawingml/2006/picture">
+                <pic:pic xmlns:pic="http://schemas.openxmlformats.org/drawingml/2006/picture">
+                  <pic:nvPicPr>
+                    <pic:cNvPr id="375149060" name="Picture 375149060"/>
+                    <pic:cNvPicPr/>
+                  </pic:nvPicPr>
+                  <pic:blipFill>
+                    <a:blip r:embed="rId10"/>
+                    <a:stretch>
+                      <a:fillRect/>
+                    </a:stretch>
+                  </pic:blipFill>
+                  <pic:spPr>
+                    <a:xfrm>
+                      <a:off x="0" y="0"/>
+                      <a:ext cx="3225800" cy="2421100"/>
+                    </a:xfrm>
+                    <a:prstGeom prst="rect">
+                      <a:avLst/>
+                    </a:prstGeom>
+                  </pic:spPr>
+                </pic:pic>
+              </a:graphicData>
+            </a:graphic>
+          </wp:inline>
+        </w:drawing>
+      </w:r>
+    </w:p>
+    <w:p>
+      <w:pPr>
+        <w:rPr>
+          <w:rFonts w:ascii="Aptos Narrow" w:eastAsiaTheme="minorEastAsia" w:hAnsi="Aptos Narrow" w:cs="Times New Roman"/>
+          <w:kern w:val="0"/>
+          <w14:ligatures w14:val="none"/>
+        </w:rPr>
+      </w:pPr>
+      <w:r>
+        <w:rPr>
+          <w:rFonts w:ascii="Aptos Narrow" w:eastAsiaTheme="minorEastAsia" w:hAnsi="Aptos Narrow" w:cs="Times New Roman"/>
+          <w:kern w:val="0"/>
+          <w14:ligatures w14:val="none"/>
+        </w:rPr>
+        <w:t>Figure MODISISCCP. ISCCP-H joint histogram of 1-km pixel cloud fraction in 7 optical thickness and cloud top pressure bins in the North Atlantic shallow cumulus region (12.5-16 °N, 60-49 °W) in Jan-Feb of 2019-2021.</w:t>
+      </w:r>
+    </w:p>
+    <w:p>
+      <w:pPr>
+        <w:rPr>
+          <w:rFonts w:eastAsiaTheme="minorEastAsia" w:cs="Times New Roman"/>
+          <w:kern w:val="0"/>
+          <w14:ligatures w14:val="none"/>
+        </w:rPr>
+      </w:pPr>
+      <w:r>
+        <w:rPr>
+          <w:rFonts w:eastAsiaTheme="minorEastAsia" w:cs="Times New Roman"/>
+          <w:kern w:val="0"/>
+          <w14:ligatures w14:val="none"/>
+        </w:rPr>
+        <w:t>[</w:t>
+      </w:r>
+      <w:r>
+        <w:rPr>
+          <w:rFonts w:eastAsiaTheme="minorEastAsia" w:cs="Times New Roman"/>
+          <w:kern w:val="0"/>
+          <w14:ligatures w14:val="none"/>
+        </w:rPr>
+        <w:t>GOES cloud fraction is greater than the reflectance-weighted cloud fraction</w:t>
+      </w:r>
+      <w:r>
+        <w:rPr>
+          <w:rFonts w:eastAsiaTheme="minorEastAsia" w:cs="Times New Roman"/>
+          <w:kern w:val="0"/>
+          <w14:ligatures w14:val="none"/>
+        </w:rPr>
+        <w:t xml:space="preserve"> below 4-km (Fig. 1) because reflectance </w:t>
+      </w:r>
+      <w:proofErr w:type="spellStart"/>
+      <w:r>
+        <w:rPr>
+          <w:rFonts w:eastAsiaTheme="minorEastAsia" w:cs="Times New Roman"/>
+          <w:kern w:val="0"/>
+          <w14:ligatures w14:val="none"/>
+        </w:rPr>
+        <w:t>downweights</w:t>
+      </w:r>
+      <w:proofErr w:type="spellEnd"/>
+      <w:r>
+        <w:rPr>
+          <w:rFonts w:eastAsiaTheme="minorEastAsia" w:cs="Times New Roman"/>
+          <w:kern w:val="0"/>
+          <w14:ligatures w14:val="none"/>
+        </w:rPr>
+        <w:t xml:space="preserve"> the cloud fraction in pixels that the ISCCP-MODIS like algorithm counts as fully cloudy but having lower optical depth. In this way, we use pixel reflectance as pseudo-</w:t>
+      </w:r>
+      <w:proofErr w:type="gramStart"/>
+      <w:r>
+        <w:rPr>
+          <w:rFonts w:eastAsiaTheme="minorEastAsia" w:cs="Times New Roman"/>
+          <w:kern w:val="0"/>
+          <w14:ligatures w14:val="none"/>
+        </w:rPr>
+        <w:t>albedo, and</w:t>
+      </w:r>
+      <w:proofErr w:type="gramEnd"/>
+      <w:r>
+        <w:rPr>
+          <w:rFonts w:eastAsiaTheme="minorEastAsia" w:cs="Times New Roman"/>
+          <w:kern w:val="0"/>
+          <w14:ligatures w14:val="none"/>
+        </w:rPr>
+        <w:t xml:space="preserve"> exclude scenes where the low clouds are obscured.]</w:t>
       </w:r>
     </w:p>
     <w:p>
       <w:pPr>
         <w:pStyle w:val="BodyText"/>
+        <w:rPr>
+          <w:rFonts w:ascii="Aptos" w:hAnsi="Aptos"/>
+        </w:rPr>
       </w:pPr>
-      <w:r>
-        <w:rPr>
-          <w:rFonts w:ascii="Menlo" w:hAnsi="Menlo" w:cs="Menlo"/>
-          <w:color w:val="3B2322"/>
-          <w:sz w:val="20"/>
-          <w:szCs w:val="20"/>
-        </w:rPr>
-        <w:t>sink_expmt_ztop.pdf</w:t>
-      </w:r>
     </w:p>
     <w:p>
       <w:pPr>
@@ -9894,7 +8539,7 @@
                     <pic:cNvPicPr/>
                   </pic:nvPicPr>
                   <pic:blipFill>
-                    <a:blip r:embed="rId10"/>
+                    <a:blip r:embed="rId11"/>
                     <a:stretch>
                       <a:fillRect/>
                     </a:stretch>
@@ -12696,7 +11341,7 @@
                     <pic:cNvPicPr/>
                   </pic:nvPicPr>
                   <pic:blipFill>
-                    <a:blip r:embed="rId11"/>
+                    <a:blip r:embed="rId12"/>
                     <a:stretch>
                       <a:fillRect/>
                     </a:stretch>
@@ -14699,7 +13344,7 @@
                     <pic:cNvPicPr/>
                   </pic:nvPicPr>
                   <pic:blipFill>
-                    <a:blip r:embed="rId12"/>
+                    <a:blip r:embed="rId13"/>
                     <a:stretch>
                       <a:fillRect/>
                     </a:stretch>
@@ -15071,7 +13716,7 @@
                     <pic:cNvPicPr/>
                   </pic:nvPicPr>
                   <pic:blipFill>
-                    <a:blip r:embed="rId13"/>
+                    <a:blip r:embed="rId14"/>
                     <a:stretch>
                       <a:fillRect/>
                     </a:stretch>
@@ -15282,7 +13927,7 @@
                     <pic:cNvPicPr/>
                   </pic:nvPicPr>
                   <pic:blipFill>
-                    <a:blip r:embed="rId14"/>
+                    <a:blip r:embed="rId15"/>
                     <a:stretch>
                       <a:fillRect/>
                     </a:stretch>
@@ -20991,25 +19636,65 @@
     <w:bookmarkEnd w:id="4"/>
     <w:p>
       <w:pPr>
-        <w:pStyle w:val="FirstParagraph"/>
-        <w:rPr>
-          <w:rFonts w:ascii="Aptos" w:hAnsi="Aptos"/>
+        <w:rPr>
+          <w:rFonts w:eastAsiaTheme="minorEastAsia" w:cs="Times New Roman"/>
+          <w:kern w:val="0"/>
+          <w14:ligatures w14:val="none"/>
         </w:rPr>
       </w:pPr>
     </w:p>
     <w:p>
       <w:pPr>
-        <w:pStyle w:val="FirstParagraph"/>
+        <w:keepNext/>
+        <w:keepLines/>
+        <w:spacing w:before="160" w:after="80"/>
+        <w:outlineLvl w:val="1"/>
+        <w:rPr>
+          <w:rFonts w:asciiTheme="majorHAnsi" w:eastAsiaTheme="majorEastAsia" w:hAnsiTheme="majorHAnsi" w:cstheme="majorBidi"/>
+          <w:color w:val="0F4761" w:themeColor="accent1" w:themeShade="BF"/>
+          <w:sz w:val="32"/>
+          <w:szCs w:val="32"/>
+        </w:rPr>
       </w:pPr>
       <w:r>
         <w:rPr>
-          <w:noProof/>
-        </w:rPr>
+          <w:rFonts w:asciiTheme="majorHAnsi" w:eastAsiaTheme="majorEastAsia" w:hAnsiTheme="majorHAnsi" w:cstheme="majorBidi"/>
+          <w:color w:val="0F4761" w:themeColor="accent1" w:themeShade="BF"/>
+          <w:sz w:val="32"/>
+          <w:szCs w:val="32"/>
+        </w:rPr>
+        <w:t>Mesoscale organization</w:t>
+      </w:r>
+    </w:p>
+    <w:p>
+      <w:pPr>
+        <w:pStyle w:val="BodyText"/>
+      </w:pPr>
+      <w:r>
+        <w:t xml:space="preserve">Mesoscale organization clusters clouds together, leading to larger cloud updrafts, and updrafts entraining moister air from their surroundings. These effects of mesoscale clustering are parameterized by increasing the total moisture sink rate. Experiments are run with the moisture sink rate for each cloud category reduced or augmented by </w:t>
+      </w:r>
+      <m:oMath>
+        <m:r>
+          <w:rPr>
+            <w:rFonts w:ascii="Cambria Math" w:hAnsi="Cambria Math"/>
+          </w:rPr>
+          <m:t>±</m:t>
+        </m:r>
+      </m:oMath>
+      <w:r>
+        <w:t>5% from the control. The clouds rise deeper for weaker sink rates and reach shorter cloud top heights for stronger sink rates (Fig. SINKZTOP).</w:t>
+      </w:r>
+    </w:p>
+    <w:p>
+      <w:pPr>
+        <w:pStyle w:val="BodyText"/>
+      </w:pPr>
+      <w:r>
         <w:drawing>
-          <wp:inline distT="0" distB="0" distL="0" distR="0" wp14:anchorId="3ED8C7DC" wp14:editId="4583526A">
-            <wp:extent cx="3225800" cy="2421100"/>
-            <wp:effectExtent l="0" t="0" r="0" b="2540"/>
-            <wp:docPr id="375149060" name="Picture 5"/>
+          <wp:inline distT="0" distB="0" distL="0" distR="0" wp14:anchorId="4A03FA6B" wp14:editId="15AAB816">
+            <wp:extent cx="3559127" cy="2671275"/>
+            <wp:effectExtent l="0" t="0" r="0" b="0"/>
+            <wp:docPr id="1851364179" name="Picture 1"/>
             <wp:cNvGraphicFramePr>
               <a:graphicFrameLocks xmlns:a="http://schemas.openxmlformats.org/drawingml/2006/main" noChangeAspect="1"/>
             </wp:cNvGraphicFramePr>
@@ -21017,66 +19702,7 @@
               <a:graphicData uri="http://schemas.openxmlformats.org/drawingml/2006/picture">
                 <pic:pic xmlns:pic="http://schemas.openxmlformats.org/drawingml/2006/picture">
                   <pic:nvPicPr>
-                    <pic:cNvPr id="375149060" name="Picture 375149060"/>
-                    <pic:cNvPicPr/>
-                  </pic:nvPicPr>
-                  <pic:blipFill>
-                    <a:blip r:embed="rId15"/>
-                    <a:stretch>
-                      <a:fillRect/>
-                    </a:stretch>
-                  </pic:blipFill>
-                  <pic:spPr>
-                    <a:xfrm>
-                      <a:off x="0" y="0"/>
-                      <a:ext cx="3225800" cy="2421100"/>
-                    </a:xfrm>
-                    <a:prstGeom prst="rect">
-                      <a:avLst/>
-                    </a:prstGeom>
-                  </pic:spPr>
-                </pic:pic>
-              </a:graphicData>
-            </a:graphic>
-          </wp:inline>
-        </w:drawing>
-      </w:r>
-    </w:p>
-    <w:p>
-      <w:pPr>
-        <w:rPr>
-          <w:rFonts w:ascii="Aptos Narrow" w:eastAsiaTheme="minorEastAsia" w:hAnsi="Aptos Narrow" w:cs="Times New Roman"/>
-          <w:kern w:val="0"/>
-          <w14:ligatures w14:val="none"/>
-        </w:rPr>
-      </w:pPr>
-      <w:r>
-        <w:rPr>
-          <w:rFonts w:ascii="Aptos Narrow" w:eastAsiaTheme="minorEastAsia" w:hAnsi="Aptos Narrow" w:cs="Times New Roman"/>
-          <w:kern w:val="0"/>
-          <w14:ligatures w14:val="none"/>
-        </w:rPr>
-        <w:t>Figure MODISISCCP. ISCCP-H joint histogram of 1-km pixel cloud fraction in 7 optical thickness and cloud top pressure bins in the North Atlantic shallow cumulus region (12.5-16 °N, 60-49 °W) in Jan-Feb of 2019-2021.</w:t>
-      </w:r>
-    </w:p>
-    <w:p>
-      <w:r>
-        <w:rPr>
-          <w:noProof/>
-        </w:rPr>
-        <w:drawing>
-          <wp:inline distT="0" distB="0" distL="0" distR="0" wp14:anchorId="23630D15" wp14:editId="5BF437A2">
-            <wp:extent cx="3397250" cy="4076700"/>
-            <wp:effectExtent l="0" t="0" r="0" b="0"/>
-            <wp:docPr id="2118579599" name="Picture 4"/>
-            <wp:cNvGraphicFramePr>
-              <a:graphicFrameLocks xmlns:a="http://schemas.openxmlformats.org/drawingml/2006/main" noChangeAspect="1"/>
-            </wp:cNvGraphicFramePr>
-            <a:graphic xmlns:a="http://schemas.openxmlformats.org/drawingml/2006/main">
-              <a:graphicData uri="http://schemas.openxmlformats.org/drawingml/2006/picture">
-                <pic:pic xmlns:pic="http://schemas.openxmlformats.org/drawingml/2006/picture">
-                  <pic:nvPicPr>
-                    <pic:cNvPr id="2118579599" name="Picture 2118579599"/>
+                    <pic:cNvPr id="2049367688" name=""/>
                     <pic:cNvPicPr/>
                   </pic:nvPicPr>
                   <pic:blipFill>
@@ -21088,7 +19714,7 @@
                   <pic:spPr>
                     <a:xfrm>
                       <a:off x="0" y="0"/>
-                      <a:ext cx="3417418" cy="4100901"/>
+                      <a:ext cx="3582643" cy="2688925"/>
                     </a:xfrm>
                     <a:prstGeom prst="rect">
                       <a:avLst/>
@@ -21103,274 +19729,916 @@
     </w:p>
     <w:p>
       <w:pPr>
-        <w:rPr>
-          <w:rFonts w:ascii="Aptos Narrow" w:eastAsiaTheme="minorEastAsia" w:hAnsi="Aptos Narrow" w:cs="Times New Roman"/>
-          <w:kern w:val="0"/>
-          <w14:ligatures w14:val="none"/>
+        <w:pStyle w:val="BodyText"/>
+        <w:rPr>
+          <w:rFonts w:ascii="Aptos Narrow" w:hAnsi="Aptos Narrow"/>
         </w:rPr>
       </w:pPr>
       <w:r>
         <w:rPr>
-          <w:rFonts w:ascii="Aptos Narrow" w:eastAsiaTheme="minorEastAsia" w:hAnsi="Aptos Narrow" w:cs="Times New Roman"/>
-          <w:kern w:val="0"/>
-          <w14:ligatures w14:val="none"/>
-        </w:rPr>
-        <w:t xml:space="preserve">Figure GOESISCCP. GOES-16 (a) cloud fraction by cloud type for 12.5-16 °N, 60-49 °W, 2020 Jan 15- February 28. (b) Shortwave cloud radiative effect (CRE) for each cloud top pressure and optical depth. The total cloud radiative effect for clouds below 680 </w:t>
-      </w:r>
-      <w:proofErr w:type="spellStart"/>
-      <w:r>
-        <w:rPr>
-          <w:rFonts w:ascii="Aptos Narrow" w:eastAsiaTheme="minorEastAsia" w:hAnsi="Aptos Narrow" w:cs="Times New Roman"/>
-          <w:kern w:val="0"/>
-          <w14:ligatures w14:val="none"/>
-        </w:rPr>
-        <w:t>hPa</w:t>
-      </w:r>
-      <w:proofErr w:type="spellEnd"/>
-      <w:r>
-        <w:rPr>
-          <w:rFonts w:ascii="Aptos Narrow" w:eastAsiaTheme="minorEastAsia" w:hAnsi="Aptos Narrow" w:cs="Times New Roman"/>
-          <w:kern w:val="0"/>
-          <w14:ligatures w14:val="none"/>
-        </w:rPr>
-        <w:t xml:space="preserve"> is 32 W m</w:t>
-      </w:r>
-      <w:r>
-        <w:rPr>
-          <w:rFonts w:ascii="Aptos Narrow" w:eastAsiaTheme="minorEastAsia" w:hAnsi="Aptos Narrow" w:cs="Times New Roman"/>
-          <w:kern w:val="0"/>
-          <w:vertAlign w:val="superscript"/>
-          <w14:ligatures w14:val="none"/>
-        </w:rPr>
-        <w:t>–2</w:t>
-      </w:r>
-      <w:r>
-        <w:rPr>
-          <w:rFonts w:ascii="Aptos Narrow" w:eastAsiaTheme="minorEastAsia" w:hAnsi="Aptos Narrow" w:cs="Times New Roman"/>
-          <w:kern w:val="0"/>
-          <w14:ligatures w14:val="none"/>
-        </w:rPr>
-        <w:t xml:space="preserve">. </w:t>
-      </w:r>
-      <w:r>
-        <w:rPr>
-          <w:rFonts w:ascii="Aptos Narrow" w:eastAsiaTheme="minorEastAsia" w:hAnsi="Aptos Narrow" w:cs="Times New Roman"/>
-          <w:kern w:val="0"/>
-          <w14:ligatures w14:val="none"/>
-        </w:rPr>
-        <w:t>Reducing</w:t>
-      </w:r>
-      <w:r>
-        <w:rPr>
-          <w:rFonts w:ascii="Aptos Narrow" w:eastAsiaTheme="minorEastAsia" w:hAnsi="Aptos Narrow" w:cs="Times New Roman"/>
-          <w:kern w:val="0"/>
-          <w14:ligatures w14:val="none"/>
-        </w:rPr>
-        <w:t xml:space="preserve"> </w:t>
-      </w:r>
-      <w:r>
-        <w:rPr>
-          <w:rFonts w:ascii="Aptos Narrow" w:eastAsiaTheme="minorEastAsia" w:hAnsi="Aptos Narrow" w:cs="Times New Roman"/>
-          <w:kern w:val="0"/>
-          <w14:ligatures w14:val="none"/>
-        </w:rPr>
-        <w:t xml:space="preserve">low </w:t>
-      </w:r>
-      <w:r>
-        <w:rPr>
-          <w:rFonts w:ascii="Aptos Narrow" w:eastAsiaTheme="minorEastAsia" w:hAnsi="Aptos Narrow" w:cs="Times New Roman"/>
-          <w:kern w:val="0"/>
-          <w14:ligatures w14:val="none"/>
-        </w:rPr>
-        <w:t xml:space="preserve">cloud fraction by </w:t>
-      </w:r>
-      <w:r>
-        <w:rPr>
-          <w:rFonts w:ascii="Aptos Narrow" w:eastAsiaTheme="minorEastAsia" w:hAnsi="Aptos Narrow" w:cs="Times New Roman"/>
-          <w:kern w:val="0"/>
-          <w14:ligatures w14:val="none"/>
-        </w:rPr>
-        <w:t>–</w:t>
-      </w:r>
-      <w:r>
-        <w:rPr>
-          <w:rFonts w:ascii="Aptos Narrow" w:eastAsiaTheme="minorEastAsia" w:hAnsi="Aptos Narrow" w:cs="Times New Roman"/>
-          <w:kern w:val="0"/>
-          <w14:ligatures w14:val="none"/>
-        </w:rPr>
-        <w:t>5 %</w:t>
-      </w:r>
-      <w:r>
-        <w:rPr>
-          <w:rFonts w:ascii="Aptos Narrow" w:eastAsiaTheme="minorEastAsia" w:hAnsi="Aptos Narrow" w:cs="Times New Roman"/>
-          <w:kern w:val="0"/>
-          <w14:ligatures w14:val="none"/>
-        </w:rPr>
-        <w:t xml:space="preserve"> K</w:t>
-      </w:r>
-      <w:r>
-        <w:rPr>
-          <w:rFonts w:ascii="Aptos Narrow" w:eastAsiaTheme="minorEastAsia" w:hAnsi="Aptos Narrow" w:cs="Times New Roman"/>
-          <w:kern w:val="0"/>
-          <w:vertAlign w:val="superscript"/>
-          <w14:ligatures w14:val="none"/>
-        </w:rPr>
-        <w:t>–1</w:t>
-      </w:r>
-      <w:r>
-        <w:rPr>
-          <w:rFonts w:ascii="Aptos Narrow" w:eastAsiaTheme="minorEastAsia" w:hAnsi="Aptos Narrow" w:cs="Times New Roman"/>
-          <w:kern w:val="0"/>
-          <w14:ligatures w14:val="none"/>
-        </w:rPr>
-        <w:t xml:space="preserve"> would have a local radiative </w:t>
-      </w:r>
-      <w:r>
-        <w:rPr>
-          <w:rFonts w:ascii="Aptos Narrow" w:eastAsiaTheme="minorEastAsia" w:hAnsi="Aptos Narrow" w:cs="Times New Roman"/>
-          <w:kern w:val="0"/>
-          <w14:ligatures w14:val="none"/>
-        </w:rPr>
-        <w:t>effect</w:t>
-      </w:r>
-      <w:r>
-        <w:rPr>
-          <w:rFonts w:ascii="Aptos Narrow" w:eastAsiaTheme="minorEastAsia" w:hAnsi="Aptos Narrow" w:cs="Times New Roman"/>
-          <w:kern w:val="0"/>
-          <w14:ligatures w14:val="none"/>
-        </w:rPr>
-        <w:t xml:space="preserve"> of </w:t>
-      </w:r>
-      <w:r>
-        <w:rPr>
-          <w:rFonts w:ascii="Aptos Narrow" w:eastAsiaTheme="minorEastAsia" w:hAnsi="Aptos Narrow" w:cs="Times New Roman"/>
-          <w:kern w:val="0"/>
-          <w14:ligatures w14:val="none"/>
-        </w:rPr>
-        <w:t>+</w:t>
-      </w:r>
-      <w:r>
-        <w:rPr>
-          <w:rFonts w:ascii="Aptos Narrow" w:eastAsiaTheme="minorEastAsia" w:hAnsi="Aptos Narrow" w:cs="Times New Roman"/>
-          <w:kern w:val="0"/>
-          <w14:ligatures w14:val="none"/>
-        </w:rPr>
-        <w:t>1.6 W m</w:t>
-      </w:r>
-      <w:r>
-        <w:rPr>
-          <w:rFonts w:ascii="Aptos Narrow" w:eastAsiaTheme="minorEastAsia" w:hAnsi="Aptos Narrow" w:cs="Times New Roman"/>
-          <w:kern w:val="0"/>
-          <w:vertAlign w:val="superscript"/>
-          <w14:ligatures w14:val="none"/>
-        </w:rPr>
-        <w:t>–2</w:t>
-      </w:r>
-      <w:r>
-        <w:rPr>
-          <w:rFonts w:ascii="Aptos Narrow" w:eastAsiaTheme="minorEastAsia" w:hAnsi="Aptos Narrow" w:cs="Times New Roman"/>
-          <w:kern w:val="0"/>
-          <w14:ligatures w14:val="none"/>
-        </w:rPr>
-        <w:t xml:space="preserve"> K</w:t>
-      </w:r>
-      <w:r>
-        <w:rPr>
-          <w:rFonts w:ascii="Aptos Narrow" w:eastAsiaTheme="minorEastAsia" w:hAnsi="Aptos Narrow" w:cs="Times New Roman"/>
-          <w:kern w:val="0"/>
-          <w:vertAlign w:val="superscript"/>
-          <w14:ligatures w14:val="none"/>
-        </w:rPr>
-        <w:t>–1</w:t>
-      </w:r>
-      <w:r>
-        <w:rPr>
-          <w:rFonts w:ascii="Aptos Narrow" w:eastAsiaTheme="minorEastAsia" w:hAnsi="Aptos Narrow" w:cs="Times New Roman"/>
-          <w:kern w:val="0"/>
-          <w14:ligatures w14:val="none"/>
-        </w:rPr>
-        <w:t>.</w:t>
+          <w:rFonts w:ascii="Aptos Narrow" w:hAnsi="Aptos Narrow"/>
+        </w:rPr>
+        <w:t xml:space="preserve">Figure SINKZTOP. Cloud top height experiments </w:t>
+      </w:r>
+      <w:r>
+        <w:rPr>
+          <w:rFonts w:ascii="ComicShannsMono Nerd Font" w:hAnsi="ComicShannsMono Nerd Font"/>
+        </w:rPr>
+        <w:t>sink-5%</w:t>
+      </w:r>
+      <w:r>
+        <w:rPr>
+          <w:rFonts w:ascii="Aptos Narrow" w:hAnsi="Aptos Narrow"/>
+        </w:rPr>
+        <w:t xml:space="preserve"> and </w:t>
+      </w:r>
+      <w:r>
+        <w:rPr>
+          <w:rFonts w:ascii="ComicShannsMono Nerd Font" w:hAnsi="ComicShannsMono Nerd Font"/>
+        </w:rPr>
+        <w:t>sink+5%</w:t>
+      </w:r>
+      <w:r>
+        <w:rPr>
+          <w:rFonts w:ascii="Aptos Narrow" w:hAnsi="Aptos Narrow"/>
+        </w:rPr>
+        <w:t xml:space="preserve"> compared to the control experiment.</w:t>
+      </w:r>
+      <w:r>
+        <w:rPr>
+          <w:rFonts w:ascii="Aptos Narrow" w:hAnsi="Aptos Narrow"/>
+        </w:rPr>
+        <w:t xml:space="preserve"> Greater sink rates limit the height of clouds.</w:t>
       </w:r>
     </w:p>
     <w:p>
       <w:pPr>
+        <w:pStyle w:val="BodyText"/>
+      </w:pPr>
+      <w:r>
+        <w:rPr>
+          <w:rFonts w:ascii="Menlo" w:hAnsi="Menlo" w:cs="Menlo"/>
+          <w:color w:val="3B2322"/>
+          <w:sz w:val="20"/>
+          <w:szCs w:val="20"/>
+        </w:rPr>
+        <w:t>sink_expmt_ztop.pdf</w:t>
+      </w:r>
+    </w:p>
+    <w:p>
+      <w:pPr>
+        <w:pStyle w:val="BodyText"/>
+        <w:rPr>
+          <w:rFonts w:eastAsiaTheme="minorEastAsia"/>
+        </w:rPr>
+      </w:pPr>
+      <w:r>
+        <w:t xml:space="preserve">For a given thermodynamic profile (and precipitation efficiency), cloud water </w:t>
+      </w:r>
+      <m:oMath>
+        <m:sSub>
+          <m:sSubPr>
+            <m:ctrlPr>
+              <w:rPr>
+                <w:rFonts w:ascii="Cambria Math" w:hAnsi="Cambria Math"/>
+                <w:i/>
+              </w:rPr>
+            </m:ctrlPr>
+          </m:sSubPr>
+          <m:e>
+            <m:r>
+              <w:rPr>
+                <w:rFonts w:ascii="Cambria Math" w:hAnsi="Cambria Math"/>
+              </w:rPr>
+              <m:t>q</m:t>
+            </m:r>
+          </m:e>
+          <m:sub>
+            <m:r>
+              <w:rPr>
+                <w:rFonts w:ascii="Cambria Math" w:hAnsi="Cambria Math"/>
+              </w:rPr>
+              <m:t>c</m:t>
+            </m:r>
+          </m:sub>
+        </m:sSub>
+      </m:oMath>
+      <w:r>
+        <w:rPr>
+          <w:rFonts w:eastAsiaTheme="minorEastAsia"/>
+        </w:rPr>
+        <w:t xml:space="preserve"> </w:t>
+      </w:r>
+      <w:r>
+        <w:t xml:space="preserve">and cloud top height </w:t>
+      </w:r>
+      <m:oMath>
+        <m:r>
+          <w:rPr>
+            <w:rFonts w:ascii="Cambria Math" w:hAnsi="Cambria Math"/>
+          </w:rPr>
+          <m:t xml:space="preserve">h </m:t>
+        </m:r>
+      </m:oMath>
+      <w:r>
+        <w:t>are</w:t>
+      </w:r>
+      <w:r>
+        <w:rPr>
+          <w:rFonts w:eastAsiaTheme="minorEastAsia"/>
+        </w:rPr>
+        <w:t xml:space="preserve"> completely determined by the moisture sink rate </w:t>
+      </w:r>
+      <m:oMath>
+        <m:r>
+          <w:rPr>
+            <w:rFonts w:ascii="Cambria Math" w:eastAsiaTheme="minorEastAsia" w:hAnsi="Cambria Math"/>
+          </w:rPr>
+          <m:t>α+ϵ</m:t>
+        </m:r>
+      </m:oMath>
+      <w:r>
+        <w:rPr>
+          <w:rFonts w:eastAsiaTheme="minorEastAsia"/>
+        </w:rPr>
+        <w:t xml:space="preserve">. Clouds with the same cloud top height have the same sink rate and cloud water profile </w:t>
+      </w:r>
+      <m:oMath>
+        <m:sSub>
+          <m:sSubPr>
+            <m:ctrlPr>
+              <w:rPr>
+                <w:rFonts w:ascii="Cambria Math" w:hAnsi="Cambria Math"/>
+                <w:i/>
+              </w:rPr>
+            </m:ctrlPr>
+          </m:sSubPr>
+          <m:e>
+            <m:r>
+              <w:rPr>
+                <w:rFonts w:ascii="Cambria Math" w:hAnsi="Cambria Math"/>
+              </w:rPr>
+              <m:t>q</m:t>
+            </m:r>
+          </m:e>
+          <m:sub>
+            <m:r>
+              <w:rPr>
+                <w:rFonts w:ascii="Cambria Math" w:hAnsi="Cambria Math"/>
+              </w:rPr>
+              <m:t>c</m:t>
+            </m:r>
+          </m:sub>
+        </m:sSub>
+      </m:oMath>
+      <w:r>
+        <w:rPr>
+          <w:rFonts w:eastAsiaTheme="minorEastAsia"/>
+        </w:rPr>
+        <w:t xml:space="preserve">. The scalar cloud fraction </w:t>
+      </w:r>
+      <m:oMath>
+        <m:sSub>
+          <m:sSubPr>
+            <m:ctrlPr>
+              <w:rPr>
+                <w:rFonts w:ascii="Cambria Math" w:eastAsiaTheme="minorEastAsia" w:hAnsi="Cambria Math"/>
+                <w:i/>
+              </w:rPr>
+            </m:ctrlPr>
+          </m:sSubPr>
+          <m:e>
+            <m:r>
+              <w:rPr>
+                <w:rFonts w:ascii="Cambria Math" w:eastAsiaTheme="minorEastAsia" w:hAnsi="Cambria Math"/>
+              </w:rPr>
+              <m:t>a</m:t>
+            </m:r>
+          </m:e>
+          <m:sub>
+            <m:r>
+              <w:rPr>
+                <w:rFonts w:ascii="Cambria Math" w:eastAsiaTheme="minorEastAsia" w:hAnsi="Cambria Math"/>
+              </w:rPr>
+              <m:t>i</m:t>
+            </m:r>
+          </m:sub>
+        </m:sSub>
+      </m:oMath>
+      <w:r>
+        <w:rPr>
+          <w:rFonts w:eastAsiaTheme="minorEastAsia"/>
+        </w:rPr>
+        <w:t xml:space="preserve"> and moisture flux </w:t>
+      </w:r>
+      <m:oMath>
+        <m:sSub>
+          <m:sSubPr>
+            <m:ctrlPr>
+              <w:rPr>
+                <w:rFonts w:ascii="Cambria Math" w:eastAsiaTheme="minorEastAsia" w:hAnsi="Cambria Math"/>
+                <w:i/>
+              </w:rPr>
+            </m:ctrlPr>
+          </m:sSubPr>
+          <m:e>
+            <m:r>
+              <w:rPr>
+                <w:rFonts w:ascii="Cambria Math" w:eastAsiaTheme="minorEastAsia" w:hAnsi="Cambria Math"/>
+              </w:rPr>
+              <m:t>F</m:t>
+            </m:r>
+          </m:e>
+          <m:sub>
+            <m:r>
+              <w:rPr>
+                <w:rFonts w:ascii="Cambria Math" w:eastAsiaTheme="minorEastAsia" w:hAnsi="Cambria Math"/>
+              </w:rPr>
+              <m:t>i</m:t>
+            </m:r>
+          </m:sub>
+        </m:sSub>
+      </m:oMath>
+      <w:r>
+        <w:rPr>
+          <w:rFonts w:eastAsiaTheme="minorEastAsia"/>
+        </w:rPr>
+        <w:t xml:space="preserve"> for each category </w:t>
+      </w:r>
+      <m:oMath>
+        <m:r>
+          <w:rPr>
+            <w:rFonts w:ascii="Cambria Math" w:eastAsiaTheme="minorEastAsia" w:hAnsi="Cambria Math"/>
+          </w:rPr>
+          <m:t>i</m:t>
+        </m:r>
+      </m:oMath>
+      <w:r>
+        <w:rPr>
+          <w:rFonts w:eastAsiaTheme="minorEastAsia"/>
+        </w:rPr>
+        <w:t xml:space="preserve"> completely determine everything else about plumes of category </w:t>
+      </w:r>
+      <m:oMath>
+        <m:r>
+          <w:rPr>
+            <w:rFonts w:ascii="Cambria Math" w:eastAsiaTheme="minorEastAsia" w:hAnsi="Cambria Math"/>
+          </w:rPr>
+          <m:t>i</m:t>
+        </m:r>
+      </m:oMath>
+      <w:r>
+        <w:rPr>
+          <w:rFonts w:eastAsiaTheme="minorEastAsia"/>
+        </w:rPr>
+        <w:t xml:space="preserve">, namely mass flux and vertical velocity profiles </w:t>
+      </w:r>
+      <m:oMath>
+        <m:sSub>
+          <m:sSubPr>
+            <m:ctrlPr>
+              <w:rPr>
+                <w:rFonts w:ascii="Cambria Math" w:eastAsiaTheme="minorEastAsia" w:hAnsi="Cambria Math"/>
+                <w:i/>
+              </w:rPr>
+            </m:ctrlPr>
+          </m:sSubPr>
+          <m:e>
+            <m:r>
+              <w:rPr>
+                <w:rFonts w:ascii="Cambria Math" w:eastAsiaTheme="minorEastAsia" w:hAnsi="Cambria Math"/>
+              </w:rPr>
+              <m:t>M</m:t>
+            </m:r>
+          </m:e>
+          <m:sub>
+            <m:r>
+              <w:rPr>
+                <w:rFonts w:ascii="Cambria Math" w:eastAsiaTheme="minorEastAsia" w:hAnsi="Cambria Math"/>
+              </w:rPr>
+              <m:t>i</m:t>
+            </m:r>
+          </m:sub>
+        </m:sSub>
+        <m:r>
+          <w:rPr>
+            <w:rFonts w:ascii="Cambria Math" w:eastAsiaTheme="minorEastAsia" w:hAnsi="Cambria Math"/>
+          </w:rPr>
+          <m:t xml:space="preserve">, </m:t>
+        </m:r>
+        <m:sSub>
+          <m:sSubPr>
+            <m:ctrlPr>
+              <w:rPr>
+                <w:rFonts w:ascii="Cambria Math" w:eastAsiaTheme="minorEastAsia" w:hAnsi="Cambria Math"/>
+                <w:i/>
+              </w:rPr>
+            </m:ctrlPr>
+          </m:sSubPr>
+          <m:e>
+            <m:r>
+              <w:rPr>
+                <w:rFonts w:ascii="Cambria Math" w:eastAsiaTheme="minorEastAsia" w:hAnsi="Cambria Math"/>
+              </w:rPr>
+              <m:t>w</m:t>
+            </m:r>
+          </m:e>
+          <m:sub>
+            <m:r>
+              <w:rPr>
+                <w:rFonts w:ascii="Cambria Math" w:eastAsiaTheme="minorEastAsia" w:hAnsi="Cambria Math"/>
+              </w:rPr>
+              <m:t>i</m:t>
+            </m:r>
+          </m:sub>
+        </m:sSub>
+      </m:oMath>
+      <w:r>
+        <w:rPr>
+          <w:rFonts w:eastAsiaTheme="minorEastAsia"/>
+        </w:rPr>
+        <w:t>.</w:t>
+      </w:r>
+    </w:p>
+    <w:p>
+      <w:pPr>
+        <w:pStyle w:val="BodyText"/>
+        <w:rPr>
+          <w:rFonts w:eastAsiaTheme="minorEastAsia"/>
+        </w:rPr>
+      </w:pPr>
+      <w:r>
+        <w:t xml:space="preserve">Cloud category </w:t>
+      </w:r>
+      <m:oMath>
+        <m:r>
+          <w:rPr>
+            <w:rFonts w:ascii="Cambria Math" w:hAnsi="Cambria Math"/>
+          </w:rPr>
+          <m:t>i</m:t>
+        </m:r>
+      </m:oMath>
+      <w:r>
+        <w:rPr>
+          <w:rFonts w:eastAsiaTheme="minorEastAsia"/>
+        </w:rPr>
+        <w:t xml:space="preserve"> is only the index of the discretized sink rate. Redistributing the moisture flux </w:t>
+      </w:r>
+      <m:oMath>
+        <m:r>
+          <w:rPr>
+            <w:rFonts w:ascii="Cambria Math" w:eastAsiaTheme="minorEastAsia" w:hAnsi="Cambria Math"/>
+          </w:rPr>
+          <m:t>G(z)</m:t>
+        </m:r>
+      </m:oMath>
+      <w:r>
+        <w:rPr>
+          <w:rFonts w:eastAsiaTheme="minorEastAsia"/>
+        </w:rPr>
+        <w:t xml:space="preserve"> to the clouds generated by the perturbed moisture sink rates </w:t>
+      </w:r>
+      <m:oMath>
+        <m:sSubSup>
+          <m:sSubSupPr>
+            <m:ctrlPr>
+              <w:rPr>
+                <w:rFonts w:ascii="Cambria Math" w:eastAsiaTheme="minorEastAsia" w:hAnsi="Cambria Math"/>
+                <w:i/>
+              </w:rPr>
+            </m:ctrlPr>
+          </m:sSubSupPr>
+          <m:e>
+            <m:d>
+              <m:dPr>
+                <m:ctrlPr>
+                  <w:rPr>
+                    <w:rFonts w:ascii="Cambria Math" w:eastAsiaTheme="minorEastAsia" w:hAnsi="Cambria Math"/>
+                    <w:i/>
+                  </w:rPr>
+                </m:ctrlPr>
+              </m:dPr>
+              <m:e>
+                <m:r>
+                  <w:rPr>
+                    <w:rFonts w:ascii="Cambria Math" w:eastAsiaTheme="minorEastAsia" w:hAnsi="Cambria Math"/>
+                  </w:rPr>
+                  <m:t>α+ϵ</m:t>
+                </m:r>
+              </m:e>
+            </m:d>
+          </m:e>
+          <m:sub>
+            <m:r>
+              <w:rPr>
+                <w:rFonts w:ascii="Cambria Math" w:eastAsiaTheme="minorEastAsia" w:hAnsi="Cambria Math"/>
+              </w:rPr>
+              <m:t>i</m:t>
+            </m:r>
+          </m:sub>
+          <m:sup>
+            <m:r>
+              <w:rPr>
+                <w:rFonts w:ascii="Cambria Math" w:eastAsiaTheme="minorEastAsia" w:hAnsi="Cambria Math"/>
+              </w:rPr>
+              <m:t>'</m:t>
+            </m:r>
+          </m:sup>
+        </m:sSubSup>
+      </m:oMath>
+      <w:r>
+        <w:rPr>
+          <w:rFonts w:eastAsiaTheme="minorEastAsia"/>
+        </w:rPr>
+        <w:t xml:space="preserve"> results in a new numerical discretization of the same physical cloud field, rather than a distinctly perturbed climate.</w:t>
+      </w:r>
+    </w:p>
+    <w:p>
+      <w:pPr>
+        <w:pStyle w:val="BodyText"/>
+        <w:rPr>
+          <w:rFonts w:eastAsiaTheme="minorEastAsia"/>
+        </w:rPr>
+      </w:pPr>
+      <w:r>
+        <w:rPr>
+          <w:rFonts w:eastAsiaTheme="minorEastAsia"/>
+        </w:rPr>
+        <w:t xml:space="preserve">In a moisture sink rate experiment, we keep the cloud fractional areas </w:t>
+      </w:r>
+      <m:oMath>
+        <m:sSub>
+          <m:sSubPr>
+            <m:ctrlPr>
+              <w:rPr>
+                <w:rFonts w:ascii="Cambria Math" w:eastAsiaTheme="minorEastAsia" w:hAnsi="Cambria Math"/>
+                <w:i/>
+              </w:rPr>
+            </m:ctrlPr>
+          </m:sSubPr>
+          <m:e>
+            <m:sSubSup>
+              <m:sSubSupPr>
+                <m:ctrlPr>
+                  <w:rPr>
+                    <w:rFonts w:ascii="Cambria Math" w:eastAsiaTheme="minorEastAsia" w:hAnsi="Cambria Math"/>
+                    <w:i/>
+                  </w:rPr>
+                </m:ctrlPr>
+              </m:sSubSupPr>
+              <m:e>
+                <m:r>
+                  <w:rPr>
+                    <w:rFonts w:ascii="Cambria Math" w:eastAsiaTheme="minorEastAsia" w:hAnsi="Cambria Math"/>
+                  </w:rPr>
+                  <m:t>a</m:t>
+                </m:r>
+              </m:e>
+              <m:sub>
+                <m:r>
+                  <w:rPr>
+                    <w:rFonts w:ascii="Cambria Math" w:eastAsiaTheme="minorEastAsia" w:hAnsi="Cambria Math"/>
+                  </w:rPr>
+                  <m:t>i</m:t>
+                </m:r>
+              </m:sub>
+              <m:sup>
+                <m:r>
+                  <w:rPr>
+                    <w:rFonts w:ascii="Cambria Math" w:eastAsiaTheme="minorEastAsia" w:hAnsi="Cambria Math"/>
+                  </w:rPr>
+                  <m:t>'</m:t>
+                </m:r>
+              </m:sup>
+            </m:sSubSup>
+            <m:r>
+              <w:rPr>
+                <w:rFonts w:ascii="Cambria Math" w:eastAsiaTheme="minorEastAsia" w:hAnsi="Cambria Math"/>
+              </w:rPr>
+              <m:t>=a</m:t>
+            </m:r>
+          </m:e>
+          <m:sub>
+            <m:r>
+              <w:rPr>
+                <w:rFonts w:ascii="Cambria Math" w:eastAsiaTheme="minorEastAsia" w:hAnsi="Cambria Math"/>
+              </w:rPr>
+              <m:t>i</m:t>
+            </m:r>
+          </m:sub>
+        </m:sSub>
+      </m:oMath>
+      <w:r>
+        <w:rPr>
+          <w:rFonts w:eastAsiaTheme="minorEastAsia"/>
+        </w:rPr>
+        <w:t xml:space="preserve"> constant and recompute </w:t>
+      </w:r>
+      <m:oMath>
+        <m:sSubSup>
+          <m:sSubSupPr>
+            <m:ctrlPr>
+              <w:rPr>
+                <w:rFonts w:ascii="Cambria Math" w:eastAsiaTheme="minorEastAsia" w:hAnsi="Cambria Math"/>
+                <w:i/>
+              </w:rPr>
+            </m:ctrlPr>
+          </m:sSubSupPr>
+          <m:e>
+            <m:r>
+              <w:rPr>
+                <w:rFonts w:ascii="Cambria Math" w:eastAsiaTheme="minorEastAsia" w:hAnsi="Cambria Math"/>
+              </w:rPr>
+              <m:t>M</m:t>
+            </m:r>
+          </m:e>
+          <m:sub>
+            <m:r>
+              <w:rPr>
+                <w:rFonts w:ascii="Cambria Math" w:eastAsiaTheme="minorEastAsia" w:hAnsi="Cambria Math"/>
+              </w:rPr>
+              <m:t>i</m:t>
+            </m:r>
+          </m:sub>
+          <m:sup>
+            <m:r>
+              <w:rPr>
+                <w:rFonts w:ascii="Cambria Math" w:eastAsiaTheme="minorEastAsia" w:hAnsi="Cambria Math"/>
+              </w:rPr>
+              <m:t>'</m:t>
+            </m:r>
+          </m:sup>
+        </m:sSubSup>
+      </m:oMath>
+      <w:r>
+        <w:rPr>
+          <w:rFonts w:eastAsiaTheme="minorEastAsia"/>
+        </w:rPr>
+        <w:t xml:space="preserve">, </w:t>
+      </w:r>
+      <m:oMath>
+        <m:sSubSup>
+          <m:sSubSupPr>
+            <m:ctrlPr>
+              <w:rPr>
+                <w:rFonts w:ascii="Cambria Math" w:eastAsiaTheme="minorEastAsia" w:hAnsi="Cambria Math"/>
+                <w:i/>
+              </w:rPr>
+            </m:ctrlPr>
+          </m:sSubSupPr>
+          <m:e>
+            <m:r>
+              <w:rPr>
+                <w:rFonts w:ascii="Cambria Math" w:eastAsiaTheme="minorEastAsia" w:hAnsi="Cambria Math"/>
+              </w:rPr>
+              <m:t>w</m:t>
+            </m:r>
+          </m:e>
+          <m:sub>
+            <m:r>
+              <w:rPr>
+                <w:rFonts w:ascii="Cambria Math" w:eastAsiaTheme="minorEastAsia" w:hAnsi="Cambria Math"/>
+              </w:rPr>
+              <m:t>i</m:t>
+            </m:r>
+          </m:sub>
+          <m:sup>
+            <m:r>
+              <w:rPr>
+                <w:rFonts w:ascii="Cambria Math" w:eastAsiaTheme="minorEastAsia" w:hAnsi="Cambria Math"/>
+              </w:rPr>
+              <m:t>'</m:t>
+            </m:r>
+          </m:sup>
+        </m:sSubSup>
+      </m:oMath>
+      <w:r>
+        <w:rPr>
+          <w:rFonts w:eastAsiaTheme="minorEastAsia"/>
+        </w:rPr>
+        <w:t xml:space="preserve">, and </w:t>
+      </w:r>
+      <m:oMath>
+        <m:sSub>
+          <m:sSubPr>
+            <m:ctrlPr>
+              <w:rPr>
+                <w:rFonts w:ascii="Cambria Math" w:eastAsiaTheme="minorEastAsia" w:hAnsi="Cambria Math"/>
+                <w:i/>
+              </w:rPr>
+            </m:ctrlPr>
+          </m:sSubPr>
+          <m:e>
+            <m:r>
+              <w:rPr>
+                <w:rFonts w:ascii="Cambria Math" w:eastAsiaTheme="minorEastAsia" w:hAnsi="Cambria Math"/>
+              </w:rPr>
+              <m:t>F</m:t>
+            </m:r>
+          </m:e>
+          <m:sub>
+            <m:r>
+              <w:rPr>
+                <w:rFonts w:ascii="Cambria Math" w:eastAsiaTheme="minorEastAsia" w:hAnsi="Cambria Math"/>
+              </w:rPr>
+              <m:t>i</m:t>
+            </m:r>
+          </m:sub>
+        </m:sSub>
+        <m:r>
+          <w:rPr>
+            <w:rFonts w:ascii="Cambria Math" w:eastAsiaTheme="minorEastAsia" w:hAnsi="Cambria Math"/>
+          </w:rPr>
+          <m:t>'</m:t>
+        </m:r>
+      </m:oMath>
+      <w:r>
+        <w:rPr>
+          <w:rFonts w:eastAsiaTheme="minorEastAsia"/>
+        </w:rPr>
+        <w:t xml:space="preserve"> for the modified sink rates </w:t>
+      </w:r>
+      <m:oMath>
+        <m:sSubSup>
+          <m:sSubSupPr>
+            <m:ctrlPr>
+              <w:rPr>
+                <w:rFonts w:ascii="Cambria Math" w:eastAsiaTheme="minorEastAsia" w:hAnsi="Cambria Math"/>
+                <w:i/>
+              </w:rPr>
+            </m:ctrlPr>
+          </m:sSubSupPr>
+          <m:e>
+            <m:d>
+              <m:dPr>
+                <m:ctrlPr>
+                  <w:rPr>
+                    <w:rFonts w:ascii="Cambria Math" w:eastAsiaTheme="minorEastAsia" w:hAnsi="Cambria Math"/>
+                    <w:i/>
+                  </w:rPr>
+                </m:ctrlPr>
+              </m:dPr>
+              <m:e>
+                <m:r>
+                  <w:rPr>
+                    <w:rFonts w:ascii="Cambria Math" w:eastAsiaTheme="minorEastAsia" w:hAnsi="Cambria Math"/>
+                  </w:rPr>
+                  <m:t>α+ϵ</m:t>
+                </m:r>
+              </m:e>
+            </m:d>
+          </m:e>
+          <m:sub>
+            <m:r>
+              <w:rPr>
+                <w:rFonts w:ascii="Cambria Math" w:eastAsiaTheme="minorEastAsia" w:hAnsi="Cambria Math"/>
+              </w:rPr>
+              <m:t>i</m:t>
+            </m:r>
+          </m:sub>
+          <m:sup>
+            <m:r>
+              <w:rPr>
+                <w:rFonts w:ascii="Cambria Math" w:eastAsiaTheme="minorEastAsia" w:hAnsi="Cambria Math"/>
+              </w:rPr>
+              <m:t>'</m:t>
+            </m:r>
+          </m:sup>
+        </m:sSubSup>
+      </m:oMath>
+      <w:r>
+        <w:rPr>
+          <w:rFonts w:eastAsiaTheme="minorEastAsia"/>
+        </w:rPr>
+        <w:t>.</w:t>
+      </w:r>
+    </w:p>
+    <w:p>
+      <w:pPr>
+        <w:pStyle w:val="BodyText"/>
+      </w:pPr>
+      <w:r>
+        <w:rPr>
+          <w:noProof/>
+          <w14:ligatures w14:val="standardContextual"/>
+        </w:rPr>
+        <w:drawing>
+          <wp:inline distT="0" distB="0" distL="0" distR="0" wp14:anchorId="5164D5F8" wp14:editId="24716ADB">
+            <wp:extent cx="7212621" cy="3720904"/>
+            <wp:effectExtent l="0" t="0" r="1270" b="635"/>
+            <wp:docPr id="617612319" name="Picture 15"/>
+            <wp:cNvGraphicFramePr>
+              <a:graphicFrameLocks xmlns:a="http://schemas.openxmlformats.org/drawingml/2006/main" noChangeAspect="1"/>
+            </wp:cNvGraphicFramePr>
+            <a:graphic xmlns:a="http://schemas.openxmlformats.org/drawingml/2006/main">
+              <a:graphicData uri="http://schemas.openxmlformats.org/drawingml/2006/picture">
+                <pic:pic xmlns:pic="http://schemas.openxmlformats.org/drawingml/2006/picture">
+                  <pic:nvPicPr>
+                    <pic:cNvPr id="1436031296" name="Picture 1436031296"/>
+                    <pic:cNvPicPr/>
+                  </pic:nvPicPr>
+                  <pic:blipFill rotWithShape="1">
+                    <a:blip r:embed="rId17">
+                      <a:extLst>
+                        <a:ext uri="{28A0092B-C50C-407E-A947-70E740481C1C}">
+                          <a14:useLocalDpi xmlns:a14="http://schemas.microsoft.com/office/drawing/2010/main" val="0"/>
+                        </a:ext>
+                      </a:extLst>
+                    </a:blip>
+                    <a:srcRect l="-988"/>
+                    <a:stretch>
+                      <a:fillRect/>
+                    </a:stretch>
+                  </pic:blipFill>
+                  <pic:spPr bwMode="auto">
+                    <a:xfrm>
+                      <a:off x="0" y="0"/>
+                      <a:ext cx="7292708" cy="3762220"/>
+                    </a:xfrm>
+                    <a:prstGeom prst="rect">
+                      <a:avLst/>
+                    </a:prstGeom>
+                    <a:ln>
+                      <a:noFill/>
+                    </a:ln>
+                    <a:extLst>
+                      <a:ext uri="{53640926-AAD7-44D8-BBD7-CCE9431645EC}">
+                        <a14:shadowObscured xmlns:a14="http://schemas.microsoft.com/office/drawing/2010/main"/>
+                      </a:ext>
+                    </a:extLst>
+                  </pic:spPr>
+                </pic:pic>
+              </a:graphicData>
+            </a:graphic>
+          </wp:inline>
+        </w:drawing>
+      </w:r>
+    </w:p>
+    <w:p>
+      <w:pPr>
+        <w:pStyle w:val="BodyText"/>
+        <w:rPr>
+          <w:rFonts w:ascii="Aptos Narrow" w:hAnsi="Aptos Narrow"/>
+        </w:rPr>
+      </w:pPr>
+      <w:r>
+        <w:rPr>
+          <w:rFonts w:ascii="Aptos Narrow" w:hAnsi="Aptos Narrow"/>
+        </w:rPr>
+        <w:t xml:space="preserve">Figure </w:t>
+      </w:r>
+      <w:r>
+        <w:rPr>
+          <w:rFonts w:ascii="Aptos Narrow" w:hAnsi="Aptos Narrow"/>
+        </w:rPr>
+        <w:t>SINKWQL.</w:t>
+      </w:r>
+    </w:p>
+    <w:p>
+      <w:pPr>
+        <w:pStyle w:val="BodyText"/>
+      </w:pPr>
+      <w:r>
+        <w:rPr>
+          <w:noProof/>
+          <w14:ligatures w14:val="standardContextual"/>
+        </w:rPr>
+        <w:drawing>
+          <wp:inline distT="0" distB="0" distL="0" distR="0" wp14:anchorId="2E1D0C48" wp14:editId="2B6CECE4">
+            <wp:extent cx="7200118" cy="3751147"/>
+            <wp:effectExtent l="0" t="0" r="1270" b="0"/>
+            <wp:docPr id="1932024058" name="Picture 16"/>
+            <wp:cNvGraphicFramePr>
+              <a:graphicFrameLocks xmlns:a="http://schemas.openxmlformats.org/drawingml/2006/main" noChangeAspect="1"/>
+            </wp:cNvGraphicFramePr>
+            <a:graphic xmlns:a="http://schemas.openxmlformats.org/drawingml/2006/main">
+              <a:graphicData uri="http://schemas.openxmlformats.org/drawingml/2006/picture">
+                <pic:pic xmlns:pic="http://schemas.openxmlformats.org/drawingml/2006/picture">
+                  <pic:nvPicPr>
+                    <pic:cNvPr id="81682234" name="Picture 81682234"/>
+                    <pic:cNvPicPr/>
+                  </pic:nvPicPr>
+                  <pic:blipFill>
+                    <a:blip r:embed="rId18">
+                      <a:extLst>
+                        <a:ext uri="{28A0092B-C50C-407E-A947-70E740481C1C}">
+                          <a14:useLocalDpi xmlns:a14="http://schemas.microsoft.com/office/drawing/2010/main" val="0"/>
+                        </a:ext>
+                      </a:extLst>
+                    </a:blip>
+                    <a:stretch>
+                      <a:fillRect/>
+                    </a:stretch>
+                  </pic:blipFill>
+                  <pic:spPr>
+                    <a:xfrm>
+                      <a:off x="0" y="0"/>
+                      <a:ext cx="7218029" cy="3760478"/>
+                    </a:xfrm>
+                    <a:prstGeom prst="rect">
+                      <a:avLst/>
+                    </a:prstGeom>
+                  </pic:spPr>
+                </pic:pic>
+              </a:graphicData>
+            </a:graphic>
+          </wp:inline>
+        </w:drawing>
+      </w:r>
+    </w:p>
+    <w:p>
+      <w:pPr>
+        <w:pStyle w:val="BodyText"/>
+        <w:rPr>
+          <w:rFonts w:ascii="Aptos Narrow" w:hAnsi="Aptos Narrow"/>
+        </w:rPr>
+      </w:pPr>
+      <w:r>
+        <w:rPr>
+          <w:rFonts w:ascii="Aptos Narrow" w:hAnsi="Aptos Narrow"/>
+        </w:rPr>
+        <w:t xml:space="preserve">Figure </w:t>
+      </w:r>
+      <w:r>
+        <w:rPr>
+          <w:rFonts w:ascii="Aptos Narrow" w:hAnsi="Aptos Narrow"/>
+        </w:rPr>
+        <w:t xml:space="preserve">SINKFM. Mass flux </w:t>
+      </w:r>
+      <m:oMath>
+        <m:r>
+          <w:rPr>
+            <w:rFonts w:ascii="Cambria Math" w:hAnsi="Cambria Math"/>
+          </w:rPr>
+          <m:t>M</m:t>
+        </m:r>
+      </m:oMath>
+      <w:r>
+        <w:rPr>
+          <w:rFonts w:ascii="Aptos Narrow" w:eastAsiaTheme="minorEastAsia" w:hAnsi="Aptos Narrow"/>
+        </w:rPr>
+        <w:t xml:space="preserve"> (top) and in-cloud moisture flux </w:t>
+      </w:r>
+      <m:oMath>
+        <m:r>
+          <w:rPr>
+            <w:rFonts w:ascii="Cambria Math" w:eastAsiaTheme="minorEastAsia" w:hAnsi="Cambria Math"/>
+          </w:rPr>
+          <m:t>F</m:t>
+        </m:r>
+      </m:oMath>
+      <w:r>
+        <w:rPr>
+          <w:rFonts w:ascii="Aptos Narrow" w:eastAsiaTheme="minorEastAsia" w:hAnsi="Aptos Narrow"/>
+        </w:rPr>
+        <w:t xml:space="preserve"> (bottom) for the control experiment, each sink rate diminished by -5%, and each sink rate augmented by +5%. The x-axis shows the control simulation cloud top height </w:t>
+      </w:r>
+      <m:oMath>
+        <m:sSub>
+          <m:sSubPr>
+            <m:ctrlPr>
+              <w:rPr>
+                <w:rFonts w:ascii="Cambria Math" w:eastAsiaTheme="minorEastAsia" w:hAnsi="Cambria Math"/>
+                <w:i/>
+              </w:rPr>
+            </m:ctrlPr>
+          </m:sSubPr>
+          <m:e>
+            <m:r>
+              <w:rPr>
+                <w:rFonts w:ascii="Cambria Math" w:eastAsiaTheme="minorEastAsia" w:hAnsi="Cambria Math"/>
+              </w:rPr>
+              <m:t>h</m:t>
+            </m:r>
+          </m:e>
+          <m:sub>
+            <m:r>
+              <w:rPr>
+                <w:rFonts w:ascii="Cambria Math" w:eastAsiaTheme="minorEastAsia" w:hAnsi="Cambria Math"/>
+              </w:rPr>
+              <m:t>i</m:t>
+            </m:r>
+          </m:sub>
+        </m:sSub>
+      </m:oMath>
+      <w:r>
+        <w:rPr>
+          <w:rFonts w:ascii="Aptos Narrow" w:eastAsiaTheme="minorEastAsia" w:hAnsi="Aptos Narrow"/>
+        </w:rPr>
+        <w:t>.</w:t>
+      </w:r>
+    </w:p>
+    <w:p>
+      <w:pPr>
         <w:rPr>
           <w:rFonts w:eastAsiaTheme="minorEastAsia" w:cs="Times New Roman"/>
           <w:kern w:val="0"/>
           <w14:ligatures w14:val="none"/>
         </w:rPr>
       </w:pPr>
-      <w:r>
-        <w:rPr>
-          <w:rFonts w:eastAsiaTheme="minorEastAsia" w:cs="Times New Roman"/>
-          <w:kern w:val="0"/>
-          <w14:ligatures w14:val="none"/>
-        </w:rPr>
-        <w:t>[</w:t>
-      </w:r>
-      <w:r>
-        <w:rPr>
-          <w:rFonts w:eastAsiaTheme="minorEastAsia" w:cs="Times New Roman"/>
-          <w:kern w:val="0"/>
-          <w14:ligatures w14:val="none"/>
-        </w:rPr>
-        <w:t>GOES cloud fraction is greater than the reflectance-weighted cloud fraction</w:t>
-      </w:r>
-      <w:r>
-        <w:rPr>
-          <w:rFonts w:eastAsiaTheme="minorEastAsia" w:cs="Times New Roman"/>
-          <w:kern w:val="0"/>
-          <w14:ligatures w14:val="none"/>
-        </w:rPr>
-        <w:t xml:space="preserve"> below 4-km (Fig. 1)</w:t>
-      </w:r>
-      <w:r>
-        <w:rPr>
-          <w:rFonts w:eastAsiaTheme="minorEastAsia" w:cs="Times New Roman"/>
-          <w:kern w:val="0"/>
-          <w14:ligatures w14:val="none"/>
-        </w:rPr>
-        <w:t xml:space="preserve"> because reflectance </w:t>
-      </w:r>
-      <w:proofErr w:type="spellStart"/>
-      <w:r>
-        <w:rPr>
-          <w:rFonts w:eastAsiaTheme="minorEastAsia" w:cs="Times New Roman"/>
-          <w:kern w:val="0"/>
-          <w14:ligatures w14:val="none"/>
-        </w:rPr>
-        <w:t>downweights</w:t>
-      </w:r>
-      <w:proofErr w:type="spellEnd"/>
-      <w:r>
-        <w:rPr>
-          <w:rFonts w:eastAsiaTheme="minorEastAsia" w:cs="Times New Roman"/>
-          <w:kern w:val="0"/>
-          <w14:ligatures w14:val="none"/>
-        </w:rPr>
-        <w:t xml:space="preserve"> the cloud fraction in pixels that the ISCCP-MODIS like algorithm counts as fully cloudy but having lower optical depth. In this way, we use pixel reflectance as pseudo-</w:t>
-      </w:r>
-      <w:proofErr w:type="gramStart"/>
-      <w:r>
-        <w:rPr>
-          <w:rFonts w:eastAsiaTheme="minorEastAsia" w:cs="Times New Roman"/>
-          <w:kern w:val="0"/>
-          <w14:ligatures w14:val="none"/>
-        </w:rPr>
-        <w:t>albedo, and</w:t>
-      </w:r>
-      <w:proofErr w:type="gramEnd"/>
-      <w:r>
-        <w:rPr>
-          <w:rFonts w:eastAsiaTheme="minorEastAsia" w:cs="Times New Roman"/>
-          <w:kern w:val="0"/>
-          <w14:ligatures w14:val="none"/>
-        </w:rPr>
-        <w:t xml:space="preserve"> exclude scenes where the low clouds are obscured.]</w:t>
-      </w:r>
     </w:p>
     <w:sectPr>
-      <w:footerReference w:type="default" r:id="rId17"/>
+      <w:footerReference w:type="default" r:id="rId19"/>
       <w:pgSz w:w="12240" w:h="15840"/>
       <w:pgMar w:top="1440" w:right="1440" w:bottom="1440" w:left="1440" w:header="720" w:footer="720" w:gutter="0"/>
       <w:cols w:space="720"/>

</xml_diff>

<commit_message>
clean up TradeCuModel and ms
</commit_message>
<xml_diff>
--- a/doc/DiM_ms20260713.docx
+++ b/doc/DiM_ms20260713.docx
@@ -7178,6 +7178,9 @@
       </w:r>
     </w:p>
     <w:p>
+      <w:pPr>
+        <w:spacing w:line="240" w:lineRule="auto"/>
+      </w:pPr>
       <w:r>
         <w:t>Water fluxes by the clouds are diagnosed to balance a simple vertical water budget for the trade cumulus cloud layer. The updraft area fraction is calculated over large (1000 km)</w:t>
       </w:r>
@@ -7293,6 +7296,7 @@
     </w:p>
     <w:p>
       <w:pPr>
+        <w:spacing w:line="240" w:lineRule="auto"/>
         <w:rPr>
           <w:rFonts w:eastAsiaTheme="minorEastAsia"/>
         </w:rPr>
@@ -7533,6 +7537,7 @@
     </w:p>
     <w:p>
       <w:pPr>
+        <w:spacing w:line="240" w:lineRule="auto"/>
         <w:rPr>
           <w:rFonts w:eastAsiaTheme="minorEastAsia"/>
         </w:rPr>
@@ -7586,7 +7591,44 @@
         </m:sSub>
       </m:oMath>
       <w:r>
-        <w:t>, with the cloud base moisture flux as the boundary condition:</w:t>
+        <w:t xml:space="preserve">, with the cloud base moisture flux </w:t>
+      </w:r>
+      <m:oMath>
+        <m:sSub>
+          <m:sSubPr>
+            <m:ctrlPr>
+              <w:rPr>
+                <w:rFonts w:ascii="Cambria Math" w:hAnsi="Cambria Math"/>
+                <w:i/>
+              </w:rPr>
+            </m:ctrlPr>
+          </m:sSubPr>
+          <m:e>
+            <m:r>
+              <w:rPr>
+                <w:rFonts w:ascii="Cambria Math" w:hAnsi="Cambria Math"/>
+              </w:rPr>
+              <m:t>G</m:t>
+            </m:r>
+          </m:e>
+          <m:sub>
+            <m:r>
+              <w:rPr>
+                <w:rFonts w:ascii="Cambria Math" w:hAnsi="Cambria Math"/>
+              </w:rPr>
+              <m:t>CB</m:t>
+            </m:r>
+          </m:sub>
+        </m:sSub>
+      </m:oMath>
+      <w:r>
+        <w:rPr>
+          <w:rFonts w:eastAsiaTheme="minorEastAsia"/>
+        </w:rPr>
+        <w:t xml:space="preserve"> </w:t>
+      </w:r>
+      <w:r>
+        <w:t>as the boundary condition:</w:t>
       </w:r>
       <w:r>
         <w:br/>
@@ -7655,70 +7697,138 @@
             </w:rPr>
             <m:t>+</m:t>
           </m:r>
-          <m:sSub>
-            <m:sSubPr>
+          <m:nary>
+            <m:naryPr>
+              <m:limLoc m:val="subSup"/>
               <m:ctrlPr>
                 <w:rPr>
-                  <w:rFonts w:ascii="Cambria Math" w:hAnsi="Cambria Math"/>
+                  <w:rFonts w:ascii="Cambria Math" w:eastAsiaTheme="minorEastAsia" w:hAnsi="Cambria Math"/>
                   <w:i/>
                 </w:rPr>
               </m:ctrlPr>
-            </m:sSubPr>
-            <m:e>
+            </m:naryPr>
+            <m:sub>
+              <m:sSub>
+                <m:sSubPr>
+                  <m:ctrlPr>
+                    <w:rPr>
+                      <w:rFonts w:ascii="Cambria Math" w:eastAsiaTheme="minorEastAsia" w:hAnsi="Cambria Math"/>
+                      <w:i/>
+                    </w:rPr>
+                  </m:ctrlPr>
+                </m:sSubPr>
+                <m:e>
+                  <m:r>
+                    <w:rPr>
+                      <w:rFonts w:ascii="Cambria Math" w:eastAsiaTheme="minorEastAsia" w:hAnsi="Cambria Math"/>
+                    </w:rPr>
+                    <m:t>z</m:t>
+                  </m:r>
+                </m:e>
+                <m:sub>
+                  <m:r>
+                    <w:rPr>
+                      <w:rFonts w:ascii="Cambria Math" w:eastAsiaTheme="minorEastAsia" w:hAnsi="Cambria Math"/>
+                    </w:rPr>
+                    <m:t>CB</m:t>
+                  </m:r>
+                </m:sub>
+              </m:sSub>
+            </m:sub>
+            <m:sup>
               <m:r>
                 <w:rPr>
-                  <w:rFonts w:ascii="Cambria Math" w:hAnsi="Cambria Math"/>
-                </w:rPr>
-                <m:t>G</m:t>
-              </m:r>
-            </m:e>
-            <m:sub>
-              <m:r>
-                <w:rPr>
-                  <w:rFonts w:ascii="Cambria Math" w:hAnsi="Cambria Math"/>
-                </w:rPr>
-                <m:t>LS</m:t>
-              </m:r>
-            </m:sub>
-          </m:sSub>
-          <m:d>
-            <m:dPr>
-              <m:ctrlPr>
-                <w:rPr>
-                  <w:rFonts w:ascii="Cambria Math" w:hAnsi="Cambria Math"/>
-                  <w:i/>
-                </w:rPr>
-              </m:ctrlPr>
-            </m:dPr>
-            <m:e>
-              <m:r>
-                <w:rPr>
-                  <w:rFonts w:ascii="Cambria Math" w:hAnsi="Cambria Math"/>
+                  <w:rFonts w:ascii="Cambria Math" w:eastAsiaTheme="minorEastAsia" w:hAnsi="Cambria Math"/>
                 </w:rPr>
                 <m:t>z</m:t>
               </m:r>
+            </m:sup>
+            <m:e>
+              <m:sSub>
+                <m:sSubPr>
+                  <m:ctrlPr>
+                    <w:rPr>
+                      <w:rFonts w:ascii="Cambria Math" w:eastAsiaTheme="minorEastAsia" w:hAnsi="Cambria Math"/>
+                      <w:i/>
+                    </w:rPr>
+                  </m:ctrlPr>
+                </m:sSubPr>
+                <m:e>
+                  <m:r>
+                    <w:rPr>
+                      <w:rFonts w:ascii="Cambria Math" w:eastAsiaTheme="minorEastAsia" w:hAnsi="Cambria Math"/>
+                    </w:rPr>
+                    <m:t>S</m:t>
+                  </m:r>
+                  <m:ctrlPr>
+                    <w:rPr>
+                      <w:rFonts w:ascii="Cambria Math" w:eastAsia="Cambria Math" w:hAnsi="Cambria Math" w:cs="Cambria Math"/>
+                      <w:i/>
+                    </w:rPr>
+                  </m:ctrlPr>
+                </m:e>
+                <m:sub>
+                  <m:r>
+                    <w:rPr>
+                      <w:rFonts w:ascii="Cambria Math" w:eastAsiaTheme="minorEastAsia" w:hAnsi="Cambria Math"/>
+                    </w:rPr>
+                    <m:t>LS</m:t>
+                  </m:r>
+                </m:sub>
+              </m:sSub>
+              <m:r>
+                <w:rPr>
+                  <w:rFonts w:ascii="Cambria Math" w:eastAsiaTheme="minorEastAsia" w:hAnsi="Cambria Math"/>
+                </w:rPr>
+                <m:t xml:space="preserve"> d</m:t>
+              </m:r>
+              <m:sSup>
+                <m:sSupPr>
+                  <m:ctrlPr>
+                    <w:rPr>
+                      <w:rFonts w:ascii="Cambria Math" w:eastAsiaTheme="minorEastAsia" w:hAnsi="Cambria Math"/>
+                      <w:i/>
+                    </w:rPr>
+                  </m:ctrlPr>
+                </m:sSupPr>
+                <m:e>
+                  <m:r>
+                    <w:rPr>
+                      <w:rFonts w:ascii="Cambria Math" w:eastAsiaTheme="minorEastAsia" w:hAnsi="Cambria Math"/>
+                    </w:rPr>
+                    <m:t>z</m:t>
+                  </m:r>
+                </m:e>
+                <m:sup>
+                  <m:r>
+                    <w:rPr>
+                      <w:rFonts w:ascii="Cambria Math" w:eastAsiaTheme="minorEastAsia" w:hAnsi="Cambria Math"/>
+                    </w:rPr>
+                    <m:t>'</m:t>
+                  </m:r>
+                </m:sup>
+              </m:sSup>
             </m:e>
-          </m:d>
+          </m:nary>
           <m:r>
             <w:rPr>
               <w:rFonts w:ascii="Cambria Math" w:hAnsi="Cambria Math"/>
             </w:rPr>
-            <m:t>,</m:t>
+            <m:t>.</m:t>
+          </m:r>
+          <m:r>
+            <w:rPr>
+              <w:rFonts w:eastAsiaTheme="minorEastAsia"/>
+            </w:rPr>
+            <w:br/>
           </m:r>
         </m:oMath>
       </m:oMathPara>
-    </w:p>
-    <w:p>
-      <w:pPr>
+      <w:r>
         <w:rPr>
           <w:rFonts w:eastAsiaTheme="minorEastAsia"/>
         </w:rPr>
-      </w:pPr>
-      <w:r>
-        <w:rPr>
-          <w:rFonts w:eastAsiaTheme="minorEastAsia"/>
-        </w:rPr>
-        <w:t xml:space="preserve">with </w:t>
+        <w:t xml:space="preserve">The large-scale moisture source </w:t>
       </w:r>
       <m:oMath>
         <m:sSub>
@@ -7735,7 +7845,7 @@
               <w:rPr>
                 <w:rFonts w:ascii="Cambria Math" w:eastAsiaTheme="minorEastAsia" w:hAnsi="Cambria Math"/>
               </w:rPr>
-              <m:t>G</m:t>
+              <m:t>S</m:t>
             </m:r>
           </m:e>
           <m:sub>
@@ -7747,153 +7857,25 @@
             </m:r>
           </m:sub>
         </m:sSub>
-        <m:d>
-          <m:dPr>
-            <m:ctrlPr>
-              <w:rPr>
-                <w:rFonts w:ascii="Cambria Math" w:eastAsiaTheme="minorEastAsia" w:hAnsi="Cambria Math"/>
-                <w:i/>
-              </w:rPr>
-            </m:ctrlPr>
-          </m:dPr>
-          <m:e>
-            <m:r>
-              <w:rPr>
-                <w:rFonts w:ascii="Cambria Math" w:eastAsiaTheme="minorEastAsia" w:hAnsi="Cambria Math"/>
-              </w:rPr>
-              <m:t>z</m:t>
-            </m:r>
-          </m:e>
-        </m:d>
+      </m:oMath>
+      <w:r>
+        <w:rPr>
+          <w:rFonts w:eastAsiaTheme="minorEastAsia"/>
+        </w:rPr>
+        <w:t xml:space="preserve"> is drying due to subsidence and horizontal advection</w:t>
+      </w:r>
+      <m:oMath>
         <m:r>
           <w:rPr>
             <w:rFonts w:ascii="Cambria Math" w:eastAsiaTheme="minorEastAsia" w:hAnsi="Cambria Math"/>
           </w:rPr>
-          <m:t>=</m:t>
+          <m:t>.</m:t>
         </m:r>
-        <m:nary>
-          <m:naryPr>
-            <m:limLoc m:val="subSup"/>
-            <m:ctrlPr>
-              <w:rPr>
-                <w:rFonts w:ascii="Cambria Math" w:eastAsiaTheme="minorEastAsia" w:hAnsi="Cambria Math"/>
-                <w:i/>
-              </w:rPr>
-            </m:ctrlPr>
-          </m:naryPr>
-          <m:sub>
-            <m:sSub>
-              <m:sSubPr>
-                <m:ctrlPr>
-                  <w:rPr>
-                    <w:rFonts w:ascii="Cambria Math" w:eastAsiaTheme="minorEastAsia" w:hAnsi="Cambria Math"/>
-                    <w:i/>
-                  </w:rPr>
-                </m:ctrlPr>
-              </m:sSubPr>
-              <m:e>
-                <m:r>
-                  <w:rPr>
-                    <w:rFonts w:ascii="Cambria Math" w:eastAsiaTheme="minorEastAsia" w:hAnsi="Cambria Math"/>
-                  </w:rPr>
-                  <m:t>z</m:t>
-                </m:r>
-              </m:e>
-              <m:sub>
-                <m:r>
-                  <w:rPr>
-                    <w:rFonts w:ascii="Cambria Math" w:eastAsiaTheme="minorEastAsia" w:hAnsi="Cambria Math"/>
-                  </w:rPr>
-                  <m:t>CB</m:t>
-                </m:r>
-              </m:sub>
-            </m:sSub>
-          </m:sub>
-          <m:sup>
-            <m:r>
-              <w:rPr>
-                <w:rFonts w:ascii="Cambria Math" w:eastAsiaTheme="minorEastAsia" w:hAnsi="Cambria Math"/>
-              </w:rPr>
-              <m:t>z</m:t>
-            </m:r>
-          </m:sup>
-          <m:e>
-            <m:sSub>
-              <m:sSubPr>
-                <m:ctrlPr>
-                  <w:rPr>
-                    <w:rFonts w:ascii="Cambria Math" w:eastAsiaTheme="minorEastAsia" w:hAnsi="Cambria Math"/>
-                    <w:i/>
-                  </w:rPr>
-                </m:ctrlPr>
-              </m:sSubPr>
-              <m:e>
-                <m:r>
-                  <w:rPr>
-                    <w:rFonts w:ascii="Cambria Math" w:eastAsiaTheme="minorEastAsia" w:hAnsi="Cambria Math"/>
-                  </w:rPr>
-                  <m:t>S</m:t>
-                </m:r>
-                <m:ctrlPr>
-                  <w:rPr>
-                    <w:rFonts w:ascii="Cambria Math" w:eastAsia="Cambria Math" w:hAnsi="Cambria Math" w:cs="Cambria Math"/>
-                    <w:i/>
-                  </w:rPr>
-                </m:ctrlPr>
-              </m:e>
-              <m:sub>
-                <m:r>
-                  <w:rPr>
-                    <w:rFonts w:ascii="Cambria Math" w:eastAsiaTheme="minorEastAsia" w:hAnsi="Cambria Math"/>
-                  </w:rPr>
-                  <m:t>LS</m:t>
-                </m:r>
-              </m:sub>
-            </m:sSub>
-            <m:r>
-              <w:rPr>
-                <w:rFonts w:ascii="Cambria Math" w:eastAsiaTheme="minorEastAsia" w:hAnsi="Cambria Math"/>
-              </w:rPr>
-              <m:t xml:space="preserve"> d</m:t>
-            </m:r>
-            <m:sSup>
-              <m:sSupPr>
-                <m:ctrlPr>
-                  <w:rPr>
-                    <w:rFonts w:ascii="Cambria Math" w:eastAsiaTheme="minorEastAsia" w:hAnsi="Cambria Math"/>
-                    <w:i/>
-                  </w:rPr>
-                </m:ctrlPr>
-              </m:sSupPr>
-              <m:e>
-                <m:r>
-                  <w:rPr>
-                    <w:rFonts w:ascii="Cambria Math" w:eastAsiaTheme="minorEastAsia" w:hAnsi="Cambria Math"/>
-                  </w:rPr>
-                  <m:t>z</m:t>
-                </m:r>
-              </m:e>
-              <m:sup>
-                <m:r>
-                  <w:rPr>
-                    <w:rFonts w:ascii="Cambria Math" w:eastAsiaTheme="minorEastAsia" w:hAnsi="Cambria Math"/>
-                  </w:rPr>
-                  <m:t>'</m:t>
-                </m:r>
-              </m:sup>
-            </m:sSup>
-          </m:e>
-        </m:nary>
       </m:oMath>
-      <w:r>
-        <w:rPr>
-          <w:rFonts w:eastAsiaTheme="minorEastAsia"/>
-        </w:rPr>
-        <w:t>.</w:t>
-      </w:r>
     </w:p>
     <w:p>
       <w:pPr>
+        <w:spacing w:line="240" w:lineRule="auto"/>
         <w:rPr>
           <w:rFonts w:eastAsiaTheme="minorEastAsia"/>
         </w:rPr>
@@ -7902,57 +7884,13 @@
         <w:rPr>
           <w:rFonts w:eastAsiaTheme="minorEastAsia"/>
         </w:rPr>
-        <w:t>P</w:t>
+        <w:t xml:space="preserve">We </w:t>
       </w:r>
       <w:r>
         <w:rPr>
           <w:rFonts w:eastAsiaTheme="minorEastAsia"/>
         </w:rPr>
-        <w:t>artition</w:t>
-      </w:r>
-      <w:r>
-        <w:rPr>
-          <w:rFonts w:eastAsiaTheme="minorEastAsia"/>
-        </w:rPr>
-        <w:t>ing</w:t>
-      </w:r>
-      <w:r>
-        <w:rPr>
-          <w:rFonts w:eastAsiaTheme="minorEastAsia"/>
-        </w:rPr>
-        <w:t xml:space="preserve"> the mass flux into the ensemble of clouds </w:t>
-      </w:r>
-      <w:r>
-        <w:rPr>
-          <w:rFonts w:eastAsiaTheme="minorEastAsia"/>
-        </w:rPr>
-        <w:t xml:space="preserve">is an </w:t>
-      </w:r>
-      <w:proofErr w:type="spellStart"/>
-      <w:r>
-        <w:rPr>
-          <w:rFonts w:eastAsiaTheme="minorEastAsia"/>
-        </w:rPr>
-        <w:t>underconstrained</w:t>
-      </w:r>
-      <w:proofErr w:type="spellEnd"/>
-      <w:r>
-        <w:rPr>
-          <w:rFonts w:eastAsiaTheme="minorEastAsia"/>
-        </w:rPr>
-        <w:t xml:space="preserve"> problem</w:t>
-      </w:r>
-      <w:r>
-        <w:rPr>
-          <w:rFonts w:eastAsiaTheme="minorEastAsia"/>
-        </w:rPr>
-        <w:t xml:space="preserve">. We </w:t>
-      </w:r>
-      <w:r>
-        <w:rPr>
-          <w:rFonts w:eastAsiaTheme="minorEastAsia"/>
-        </w:rPr>
-        <w:t>close the problem by choosing</w:t>
+        <w:t>partition the moisture flux into a</w:t>
       </w:r>
       <w:r>
         <w:rPr>
@@ -8018,7 +7956,7 @@
         <w:rPr>
           <w:rFonts w:eastAsiaTheme="minorEastAsia"/>
         </w:rPr>
-        <w:t xml:space="preserve"> has a flux difference at each height </w:t>
+        <w:t xml:space="preserve"> has a flux difference </w:t>
       </w:r>
       <m:oMath>
         <m:sSub>
@@ -8035,63 +7973,8 @@
               <w:rPr>
                 <w:rFonts w:ascii="Cambria Math" w:eastAsiaTheme="minorEastAsia" w:hAnsi="Cambria Math"/>
               </w:rPr>
-              <m:t>h</m:t>
-            </m:r>
-          </m:e>
-          <m:sub>
-            <m:r>
-              <w:rPr>
-                <w:rFonts w:ascii="Cambria Math" w:eastAsiaTheme="minorEastAsia" w:hAnsi="Cambria Math"/>
-              </w:rPr>
-              <m:t>i</m:t>
-            </m:r>
-          </m:sub>
-        </m:sSub>
-      </m:oMath>
-      <w:r>
-        <w:rPr>
-          <w:rFonts w:eastAsiaTheme="minorEastAsia"/>
-        </w:rPr>
-        <w:t xml:space="preserve"> of </w:t>
-      </w:r>
-      <m:oMath>
-        <m:sSub>
-          <m:sSubPr>
-            <m:ctrlPr>
-              <w:rPr>
-                <w:rFonts w:ascii="Cambria Math" w:eastAsiaTheme="minorEastAsia" w:hAnsi="Cambria Math"/>
-                <w:i/>
-              </w:rPr>
-            </m:ctrlPr>
-          </m:sSubPr>
-          <m:e>
-            <m:d>
-              <m:dPr>
-                <m:ctrlPr>
-                  <w:rPr>
-                    <w:rFonts w:ascii="Cambria Math" w:eastAsiaTheme="minorEastAsia" w:hAnsi="Cambria Math"/>
-                    <w:i/>
-                  </w:rPr>
-                </m:ctrlPr>
-              </m:dPr>
-              <m:e>
-                <m:r>
-                  <m:rPr>
-                    <m:sty m:val="p"/>
-                  </m:rPr>
-                  <w:rPr>
-                    <w:rFonts w:ascii="Cambria Math" w:eastAsiaTheme="minorEastAsia" w:hAnsi="Cambria Math"/>
-                  </w:rPr>
-                  <m:t>Δ</m:t>
-                </m:r>
-                <m:r>
-                  <w:rPr>
-                    <w:rFonts w:ascii="Cambria Math" w:eastAsiaTheme="minorEastAsia" w:hAnsi="Cambria Math"/>
-                  </w:rPr>
-                  <m:t>G</m:t>
-                </m:r>
-              </m:e>
-            </m:d>
+              <m:t>G</m:t>
+            </m:r>
           </m:e>
           <m:sub>
             <m:r>
@@ -8195,7 +8078,25 @@
         <w:rPr>
           <w:rFonts w:eastAsiaTheme="minorEastAsia"/>
         </w:rPr>
-        <w:t xml:space="preserve">. This flux difference is assumed to be carried by the clouds with area fraction </w:t>
+        <w:t xml:space="preserve"> </w:t>
+      </w:r>
+      <w:r>
+        <w:rPr>
+          <w:rFonts w:eastAsiaTheme="minorEastAsia"/>
+        </w:rPr>
+        <w:t xml:space="preserve">at each </w:t>
+      </w:r>
+      <w:r>
+        <w:rPr>
+          <w:rFonts w:eastAsiaTheme="minorEastAsia"/>
+        </w:rPr>
+        <w:t xml:space="preserve">discreate </w:t>
+      </w:r>
+      <w:r>
+        <w:rPr>
+          <w:rFonts w:eastAsiaTheme="minorEastAsia"/>
+        </w:rPr>
+        <w:t xml:space="preserve">height </w:t>
       </w:r>
       <m:oMath>
         <m:sSub>
@@ -8212,7 +8113,7 @@
               <w:rPr>
                 <w:rFonts w:ascii="Cambria Math" w:eastAsiaTheme="minorEastAsia" w:hAnsi="Cambria Math"/>
               </w:rPr>
-              <m:t>a</m:t>
+              <m:t>h</m:t>
             </m:r>
           </m:e>
           <m:sub>
@@ -8229,53 +8130,19 @@
         <w:rPr>
           <w:rFonts w:eastAsiaTheme="minorEastAsia"/>
         </w:rPr>
-        <w:t xml:space="preserve"> and height </w:t>
-      </w:r>
-      <m:oMath>
-        <m:sSub>
-          <m:sSubPr>
-            <m:ctrlPr>
-              <w:rPr>
-                <w:rFonts w:ascii="Cambria Math" w:eastAsiaTheme="minorEastAsia" w:hAnsi="Cambria Math"/>
-                <w:i/>
-              </w:rPr>
-            </m:ctrlPr>
-          </m:sSubPr>
-          <m:e>
-            <m:r>
-              <w:rPr>
-                <w:rFonts w:ascii="Cambria Math" w:eastAsiaTheme="minorEastAsia" w:hAnsi="Cambria Math"/>
-              </w:rPr>
-              <m:t>h</m:t>
-            </m:r>
-          </m:e>
-          <m:sub>
-            <m:r>
-              <w:rPr>
-                <w:rFonts w:ascii="Cambria Math" w:eastAsiaTheme="minorEastAsia" w:hAnsi="Cambria Math"/>
-              </w:rPr>
-              <m:t>i</m:t>
-            </m:r>
-          </m:sub>
-        </m:sSub>
-      </m:oMath>
+        <w:t xml:space="preserve">, where the </w:t>
+      </w:r>
       <w:r>
         <w:rPr>
           <w:rFonts w:eastAsiaTheme="minorEastAsia"/>
         </w:rPr>
-        <w:t xml:space="preserve">, so the mean flux in </w:t>
+        <w:t xml:space="preserve">vertically uniform </w:t>
       </w:r>
       <w:r>
         <w:rPr>
           <w:rFonts w:eastAsiaTheme="minorEastAsia"/>
         </w:rPr>
-        <w:t xml:space="preserve">cloud </w:t>
-      </w:r>
-      <w:r>
-        <w:rPr>
-          <w:rFonts w:eastAsiaTheme="minorEastAsia"/>
-        </w:rPr>
-        <w:t xml:space="preserve">category </w:t>
+        <w:t xml:space="preserve">moisture flux from cloud </w:t>
       </w:r>
       <m:oMath>
         <m:r>
@@ -8289,13 +8156,1004 @@
         <w:rPr>
           <w:rFonts w:eastAsiaTheme="minorEastAsia"/>
         </w:rPr>
-        <w:t xml:space="preserve"> is </w:t>
+        <w:t xml:space="preserve"> detrains at the cloud top. </w:t>
       </w:r>
       <w:r>
         <w:rPr>
           <w:rFonts w:eastAsiaTheme="minorEastAsia"/>
         </w:rPr>
-        <w:t xml:space="preserve">vertically uniform, </w:t>
+        <w:t xml:space="preserve">This flux difference is assumed to be carried by the clouds with area fraction </w:t>
+      </w:r>
+      <m:oMath>
+        <m:sSub>
+          <m:sSubPr>
+            <m:ctrlPr>
+              <w:rPr>
+                <w:rFonts w:ascii="Cambria Math" w:eastAsiaTheme="minorEastAsia" w:hAnsi="Cambria Math"/>
+                <w:i/>
+              </w:rPr>
+            </m:ctrlPr>
+          </m:sSubPr>
+          <m:e>
+            <m:r>
+              <w:rPr>
+                <w:rFonts w:ascii="Cambria Math" w:eastAsiaTheme="minorEastAsia" w:hAnsi="Cambria Math"/>
+              </w:rPr>
+              <m:t>a</m:t>
+            </m:r>
+          </m:e>
+          <m:sub>
+            <m:r>
+              <w:rPr>
+                <w:rFonts w:ascii="Cambria Math" w:eastAsiaTheme="minorEastAsia" w:hAnsi="Cambria Math"/>
+              </w:rPr>
+              <m:t>i</m:t>
+            </m:r>
+          </m:sub>
+        </m:sSub>
+      </m:oMath>
+      <w:r>
+        <w:rPr>
+          <w:rFonts w:eastAsiaTheme="minorEastAsia"/>
+        </w:rPr>
+        <w:t xml:space="preserve"> and height </w:t>
+      </w:r>
+      <m:oMath>
+        <m:sSub>
+          <m:sSubPr>
+            <m:ctrlPr>
+              <w:rPr>
+                <w:rFonts w:ascii="Cambria Math" w:eastAsiaTheme="minorEastAsia" w:hAnsi="Cambria Math"/>
+                <w:i/>
+              </w:rPr>
+            </m:ctrlPr>
+          </m:sSubPr>
+          <m:e>
+            <m:r>
+              <w:rPr>
+                <w:rFonts w:ascii="Cambria Math" w:eastAsiaTheme="minorEastAsia" w:hAnsi="Cambria Math"/>
+              </w:rPr>
+              <m:t>h</m:t>
+            </m:r>
+          </m:e>
+          <m:sub>
+            <m:r>
+              <w:rPr>
+                <w:rFonts w:ascii="Cambria Math" w:eastAsiaTheme="minorEastAsia" w:hAnsi="Cambria Math"/>
+              </w:rPr>
+              <m:t>i</m:t>
+            </m:r>
+          </m:sub>
+        </m:sSub>
+      </m:oMath>
+      <w:r>
+        <w:rPr>
+          <w:rFonts w:eastAsiaTheme="minorEastAsia"/>
+        </w:rPr>
+        <w:t>.</w:t>
+      </w:r>
+      <w:r>
+        <w:rPr>
+          <w:rFonts w:eastAsiaTheme="minorEastAsia"/>
+        </w:rPr>
+        <w:t xml:space="preserve"> </w:t>
+      </w:r>
+      <w:r>
+        <w:rPr>
+          <w:rFonts w:eastAsiaTheme="minorEastAsia"/>
+        </w:rPr>
+        <w:t>The</w:t>
+      </w:r>
+      <w:r>
+        <w:rPr>
+          <w:rFonts w:eastAsiaTheme="minorEastAsia"/>
+        </w:rPr>
+        <w:t xml:space="preserve"> cloud top height </w:t>
+      </w:r>
+      <m:oMath>
+        <m:sSub>
+          <m:sSubPr>
+            <m:ctrlPr>
+              <w:rPr>
+                <w:rFonts w:ascii="Cambria Math" w:eastAsiaTheme="minorEastAsia" w:hAnsi="Cambria Math"/>
+                <w:i/>
+              </w:rPr>
+            </m:ctrlPr>
+          </m:sSubPr>
+          <m:e>
+            <m:r>
+              <w:rPr>
+                <w:rFonts w:ascii="Cambria Math" w:eastAsiaTheme="minorEastAsia" w:hAnsi="Cambria Math"/>
+              </w:rPr>
+              <m:t>h</m:t>
+            </m:r>
+          </m:e>
+          <m:sub>
+            <m:r>
+              <w:rPr>
+                <w:rFonts w:ascii="Cambria Math" w:eastAsiaTheme="minorEastAsia" w:hAnsi="Cambria Math"/>
+              </w:rPr>
+              <m:t>i</m:t>
+            </m:r>
+          </m:sub>
+        </m:sSub>
+      </m:oMath>
+      <w:r>
+        <w:rPr>
+          <w:rFonts w:eastAsiaTheme="minorEastAsia"/>
+        </w:rPr>
+        <w:t xml:space="preserve"> of each cloud is determined by its moisture sink rate parameter.</w:t>
+      </w:r>
+      <w:r>
+        <w:rPr>
+          <w:rFonts w:eastAsiaTheme="minorEastAsia"/>
+        </w:rPr>
+        <w:t xml:space="preserve"> </w:t>
+      </w:r>
+    </w:p>
+    <w:p>
+      <w:pPr>
+        <w:pStyle w:val="BodyText"/>
+        <w:rPr>
+          <w:rFonts w:ascii="Aptos" w:eastAsiaTheme="minorEastAsia" w:hAnsi="Aptos" w:cs="Times New Roman"/>
+        </w:rPr>
+      </w:pPr>
+      <w:r>
+        <w:rPr>
+          <w:rFonts w:eastAsiaTheme="minorEastAsia"/>
+          <w:kern w:val="2"/>
+          <w14:ligatures w14:val="standardContextual"/>
+        </w:rPr>
+        <w:t>T</w:t>
+      </w:r>
+      <w:r>
+        <w:rPr>
+          <w:rFonts w:eastAsiaTheme="minorEastAsia"/>
+          <w:kern w:val="2"/>
+          <w14:ligatures w14:val="standardContextual"/>
+        </w:rPr>
+        <w:t>he a</w:t>
+      </w:r>
+      <w:r>
+        <w:rPr>
+          <w:rFonts w:eastAsiaTheme="minorEastAsia"/>
+          <w:kern w:val="2"/>
+          <w14:ligatures w14:val="standardContextual"/>
+        </w:rPr>
+        <w:t xml:space="preserve">ll-sky flux </w:t>
+      </w:r>
+      <m:oMath>
+        <m:r>
+          <w:rPr>
+            <w:rFonts w:ascii="Cambria Math" w:eastAsiaTheme="minorEastAsia" w:hAnsi="Cambria Math"/>
+            <w:kern w:val="2"/>
+            <w14:ligatures w14:val="standardContextual"/>
+          </w:rPr>
+          <m:t>G</m:t>
+        </m:r>
+      </m:oMath>
+      <w:r>
+        <w:rPr>
+          <w:rFonts w:eastAsiaTheme="minorEastAsia"/>
+          <w:kern w:val="2"/>
+          <w14:ligatures w14:val="standardContextual"/>
+        </w:rPr>
+        <w:t xml:space="preserve"> and i</w:t>
+      </w:r>
+      <w:r>
+        <w:rPr>
+          <w:rFonts w:eastAsiaTheme="minorEastAsia"/>
+          <w:kern w:val="2"/>
+          <w14:ligatures w14:val="standardContextual"/>
+        </w:rPr>
+        <w:t xml:space="preserve">n-cloud flux is </w:t>
+      </w:r>
+      <m:oMath>
+        <m:r>
+          <w:rPr>
+            <w:rFonts w:ascii="Cambria Math" w:eastAsiaTheme="minorEastAsia" w:hAnsi="Cambria Math"/>
+            <w:kern w:val="2"/>
+            <w14:ligatures w14:val="standardContextual"/>
+          </w:rPr>
+          <m:t>F</m:t>
+        </m:r>
+      </m:oMath>
+      <w:r>
+        <w:rPr>
+          <w:rFonts w:eastAsiaTheme="minorEastAsia"/>
+          <w:kern w:val="2"/>
+          <w14:ligatures w14:val="standardContextual"/>
+        </w:rPr>
+        <w:t xml:space="preserve"> are proportional through the cloud area </w:t>
+      </w:r>
+      <m:oMath>
+        <m:r>
+          <w:rPr>
+            <w:rFonts w:ascii="Cambria Math" w:eastAsiaTheme="minorEastAsia" w:hAnsi="Cambria Math"/>
+            <w:kern w:val="2"/>
+            <w14:ligatures w14:val="standardContextual"/>
+          </w:rPr>
+          <m:t>G=aF</m:t>
+        </m:r>
+      </m:oMath>
+      <w:r>
+        <w:rPr>
+          <w:rFonts w:eastAsiaTheme="minorEastAsia"/>
+          <w:kern w:val="2"/>
+          <w14:ligatures w14:val="standardContextual"/>
+        </w:rPr>
+        <w:t>. The all-sky m</w:t>
+      </w:r>
+      <w:r>
+        <w:rPr>
+          <w:rFonts w:eastAsiaTheme="minorEastAsia"/>
+          <w:kern w:val="2"/>
+          <w14:ligatures w14:val="standardContextual"/>
+        </w:rPr>
+        <w:t xml:space="preserve">ass flux </w:t>
+      </w:r>
+      <m:oMath>
+        <m:r>
+          <w:rPr>
+            <w:rFonts w:ascii="Cambria Math" w:eastAsiaTheme="minorEastAsia" w:hAnsi="Cambria Math"/>
+            <w:kern w:val="2"/>
+            <w14:ligatures w14:val="standardContextual"/>
+          </w:rPr>
+          <m:t>M=aw</m:t>
+        </m:r>
+      </m:oMath>
+      <w:r>
+        <w:rPr>
+          <w:rFonts w:eastAsiaTheme="minorEastAsia"/>
+          <w:kern w:val="2"/>
+          <w14:ligatures w14:val="standardContextual"/>
+        </w:rPr>
+        <w:t xml:space="preserve"> </w:t>
+      </w:r>
+      <w:r>
+        <w:rPr>
+          <w:rFonts w:eastAsiaTheme="minorEastAsia"/>
+          <w:kern w:val="2"/>
+          <w14:ligatures w14:val="standardContextual"/>
+        </w:rPr>
+        <w:t xml:space="preserve">likewise </w:t>
+      </w:r>
+      <w:r>
+        <w:rPr>
+          <w:rFonts w:eastAsiaTheme="minorEastAsia"/>
+          <w:kern w:val="2"/>
+          <w14:ligatures w14:val="standardContextual"/>
+        </w:rPr>
+        <w:t>correspond</w:t>
+      </w:r>
+      <w:r>
+        <w:rPr>
+          <w:rFonts w:eastAsiaTheme="minorEastAsia"/>
+          <w:kern w:val="2"/>
+          <w14:ligatures w14:val="standardContextual"/>
+        </w:rPr>
+        <w:t>s</w:t>
+      </w:r>
+      <w:r>
+        <w:rPr>
+          <w:rFonts w:eastAsiaTheme="minorEastAsia"/>
+          <w:kern w:val="2"/>
+          <w14:ligatures w14:val="standardContextual"/>
+        </w:rPr>
+        <w:t xml:space="preserve"> to the in-cloud vertical velocity </w:t>
+      </w:r>
+      <m:oMath>
+        <m:r>
+          <w:rPr>
+            <w:rFonts w:ascii="Cambria Math" w:eastAsiaTheme="minorEastAsia" w:hAnsi="Cambria Math"/>
+            <w:kern w:val="2"/>
+            <w14:ligatures w14:val="standardContextual"/>
+          </w:rPr>
+          <m:t>w</m:t>
+        </m:r>
+      </m:oMath>
+      <w:r>
+        <w:rPr>
+          <w:rFonts w:eastAsiaTheme="minorEastAsia"/>
+          <w:kern w:val="2"/>
+          <w14:ligatures w14:val="standardContextual"/>
+        </w:rPr>
+        <w:t xml:space="preserve">. </w:t>
+      </w:r>
+      <w:r>
+        <w:rPr>
+          <w:rFonts w:eastAsiaTheme="minorEastAsia"/>
+          <w:kern w:val="2"/>
+          <w14:ligatures w14:val="standardContextual"/>
+        </w:rPr>
+        <w:t xml:space="preserve">Model calculations often consider one cloud category </w:t>
+      </w:r>
+      <m:oMath>
+        <m:r>
+          <w:rPr>
+            <w:rFonts w:ascii="Cambria Math" w:eastAsiaTheme="minorEastAsia" w:hAnsi="Cambria Math"/>
+            <w:kern w:val="2"/>
+            <w14:ligatures w14:val="standardContextual"/>
+          </w:rPr>
+          <m:t>i:</m:t>
+        </m:r>
+      </m:oMath>
+      <w:r>
+        <w:rPr>
+          <w:rFonts w:eastAsiaTheme="minorEastAsia"/>
+          <w:kern w:val="2"/>
+          <w14:ligatures w14:val="standardContextual"/>
+        </w:rPr>
+        <w:br/>
+      </w:r>
+      <m:oMathPara>
+        <m:oMath>
+          <m:sSub>
+            <m:sSubPr>
+              <m:ctrlPr>
+                <w:rPr>
+                  <w:rFonts w:ascii="Cambria Math" w:eastAsiaTheme="minorEastAsia" w:hAnsi="Cambria Math" w:cs="Times New Roman"/>
+                  <w:i/>
+                </w:rPr>
+              </m:ctrlPr>
+            </m:sSubPr>
+            <m:e>
+              <m:r>
+                <w:rPr>
+                  <w:rFonts w:ascii="Cambria Math" w:eastAsiaTheme="minorEastAsia" w:hAnsi="Cambria Math" w:cs="Times New Roman"/>
+                </w:rPr>
+                <m:t>M</m:t>
+              </m:r>
+            </m:e>
+            <m:sub>
+              <m:r>
+                <w:rPr>
+                  <w:rFonts w:ascii="Cambria Math" w:eastAsiaTheme="minorEastAsia" w:hAnsi="Cambria Math" w:cs="Times New Roman"/>
+                </w:rPr>
+                <m:t>i</m:t>
+              </m:r>
+            </m:sub>
+          </m:sSub>
+          <m:r>
+            <w:rPr>
+              <w:rFonts w:ascii="Cambria Math" w:eastAsiaTheme="minorEastAsia" w:hAnsi="Cambria Math" w:cs="Times New Roman"/>
+            </w:rPr>
+            <m:t>=</m:t>
+          </m:r>
+          <m:sSub>
+            <m:sSubPr>
+              <m:ctrlPr>
+                <w:rPr>
+                  <w:rFonts w:ascii="Cambria Math" w:eastAsiaTheme="minorEastAsia" w:hAnsi="Cambria Math" w:cs="Times New Roman"/>
+                  <w:i/>
+                </w:rPr>
+              </m:ctrlPr>
+            </m:sSubPr>
+            <m:e>
+              <m:r>
+                <w:rPr>
+                  <w:rFonts w:ascii="Cambria Math" w:eastAsiaTheme="minorEastAsia" w:hAnsi="Cambria Math" w:cs="Times New Roman"/>
+                </w:rPr>
+                <m:t>a</m:t>
+              </m:r>
+            </m:e>
+            <m:sub>
+              <m:r>
+                <w:rPr>
+                  <w:rFonts w:ascii="Cambria Math" w:eastAsiaTheme="minorEastAsia" w:hAnsi="Cambria Math" w:cs="Times New Roman"/>
+                </w:rPr>
+                <m:t>i</m:t>
+              </m:r>
+            </m:sub>
+          </m:sSub>
+          <m:sSub>
+            <m:sSubPr>
+              <m:ctrlPr>
+                <w:rPr>
+                  <w:rFonts w:ascii="Cambria Math" w:eastAsiaTheme="minorEastAsia" w:hAnsi="Cambria Math" w:cs="Times New Roman"/>
+                  <w:i/>
+                </w:rPr>
+              </m:ctrlPr>
+            </m:sSubPr>
+            <m:e>
+              <m:r>
+                <w:rPr>
+                  <w:rFonts w:ascii="Cambria Math" w:eastAsiaTheme="minorEastAsia" w:hAnsi="Cambria Math" w:cs="Times New Roman"/>
+                </w:rPr>
+                <m:t>w</m:t>
+              </m:r>
+            </m:e>
+            <m:sub>
+              <m:r>
+                <w:rPr>
+                  <w:rFonts w:ascii="Cambria Math" w:eastAsiaTheme="minorEastAsia" w:hAnsi="Cambria Math" w:cs="Times New Roman"/>
+                </w:rPr>
+                <m:t>i</m:t>
+              </m:r>
+            </m:sub>
+          </m:sSub>
+          <m:r>
+            <w:rPr>
+              <w:rFonts w:ascii="Cambria Math" w:eastAsiaTheme="minorEastAsia" w:hAnsi="Cambria Math" w:cs="Times New Roman"/>
+            </w:rPr>
+            <w:br/>
+          </m:r>
+        </m:oMath>
+        <m:oMath>
+          <m:sSub>
+            <m:sSubPr>
+              <m:ctrlPr>
+                <w:rPr>
+                  <w:rFonts w:ascii="Cambria Math" w:eastAsiaTheme="minorEastAsia" w:hAnsi="Cambria Math" w:cs="Times New Roman"/>
+                  <w:i/>
+                </w:rPr>
+              </m:ctrlPr>
+            </m:sSubPr>
+            <m:e>
+              <m:r>
+                <w:rPr>
+                  <w:rFonts w:ascii="Cambria Math" w:eastAsiaTheme="minorEastAsia" w:hAnsi="Cambria Math" w:cs="Times New Roman"/>
+                </w:rPr>
+                <m:t>G</m:t>
+              </m:r>
+            </m:e>
+            <m:sub>
+              <m:r>
+                <w:rPr>
+                  <w:rFonts w:ascii="Cambria Math" w:eastAsiaTheme="minorEastAsia" w:hAnsi="Cambria Math" w:cs="Times New Roman"/>
+                </w:rPr>
+                <m:t>i</m:t>
+              </m:r>
+            </m:sub>
+          </m:sSub>
+          <m:r>
+            <w:rPr>
+              <w:rFonts w:ascii="Cambria Math" w:eastAsiaTheme="minorEastAsia" w:hAnsi="Cambria Math" w:cs="Times New Roman"/>
+            </w:rPr>
+            <m:t>=</m:t>
+          </m:r>
+          <m:sSub>
+            <m:sSubPr>
+              <m:ctrlPr>
+                <w:rPr>
+                  <w:rFonts w:ascii="Cambria Math" w:eastAsiaTheme="minorEastAsia" w:hAnsi="Cambria Math" w:cs="Times New Roman"/>
+                  <w:i/>
+                </w:rPr>
+              </m:ctrlPr>
+            </m:sSubPr>
+            <m:e>
+              <m:r>
+                <w:rPr>
+                  <w:rFonts w:ascii="Cambria Math" w:eastAsiaTheme="minorEastAsia" w:hAnsi="Cambria Math" w:cs="Times New Roman"/>
+                </w:rPr>
+                <m:t>a</m:t>
+              </m:r>
+            </m:e>
+            <m:sub>
+              <m:r>
+                <w:rPr>
+                  <w:rFonts w:ascii="Cambria Math" w:eastAsiaTheme="minorEastAsia" w:hAnsi="Cambria Math" w:cs="Times New Roman"/>
+                </w:rPr>
+                <m:t>i</m:t>
+              </m:r>
+            </m:sub>
+          </m:sSub>
+          <m:sSub>
+            <m:sSubPr>
+              <m:ctrlPr>
+                <w:rPr>
+                  <w:rFonts w:ascii="Cambria Math" w:eastAsiaTheme="minorEastAsia" w:hAnsi="Cambria Math" w:cs="Times New Roman"/>
+                  <w:i/>
+                </w:rPr>
+              </m:ctrlPr>
+            </m:sSubPr>
+            <m:e>
+              <m:r>
+                <w:rPr>
+                  <w:rFonts w:ascii="Cambria Math" w:eastAsiaTheme="minorEastAsia" w:hAnsi="Cambria Math" w:cs="Times New Roman"/>
+                </w:rPr>
+                <m:t>F</m:t>
+              </m:r>
+            </m:e>
+            <m:sub>
+              <m:r>
+                <w:rPr>
+                  <w:rFonts w:ascii="Cambria Math" w:eastAsiaTheme="minorEastAsia" w:hAnsi="Cambria Math" w:cs="Times New Roman"/>
+                </w:rPr>
+                <m:t>i</m:t>
+              </m:r>
+            </m:sub>
+          </m:sSub>
+          <m:r>
+            <w:rPr>
+              <w:rFonts w:ascii="Cambria Math" w:eastAsiaTheme="minorEastAsia" w:hAnsi="Cambria Math" w:cs="Times New Roman"/>
+            </w:rPr>
+            <w:br/>
+          </m:r>
+        </m:oMath>
+        <m:oMath>
+          <m:r>
+            <w:rPr>
+              <w:rFonts w:ascii="Cambria Math" w:eastAsiaTheme="minorEastAsia" w:hAnsi="Cambria Math" w:cs="Times New Roman"/>
+            </w:rPr>
+            <m:t xml:space="preserve">     =</m:t>
+          </m:r>
+          <m:sSub>
+            <m:sSubPr>
+              <m:ctrlPr>
+                <w:rPr>
+                  <w:rFonts w:ascii="Cambria Math" w:eastAsiaTheme="minorEastAsia" w:hAnsi="Cambria Math" w:cs="Times New Roman"/>
+                  <w:i/>
+                </w:rPr>
+              </m:ctrlPr>
+            </m:sSubPr>
+            <m:e>
+              <m:r>
+                <w:rPr>
+                  <w:rFonts w:ascii="Cambria Math" w:eastAsiaTheme="minorEastAsia" w:hAnsi="Cambria Math" w:cs="Times New Roman"/>
+                </w:rPr>
+                <m:t>a</m:t>
+              </m:r>
+            </m:e>
+            <m:sub>
+              <m:r>
+                <w:rPr>
+                  <w:rFonts w:ascii="Cambria Math" w:eastAsiaTheme="minorEastAsia" w:hAnsi="Cambria Math" w:cs="Times New Roman"/>
+                </w:rPr>
+                <m:t>i</m:t>
+              </m:r>
+            </m:sub>
+          </m:sSub>
+          <m:sSub>
+            <m:sSubPr>
+              <m:ctrlPr>
+                <w:rPr>
+                  <w:rFonts w:ascii="Cambria Math" w:eastAsiaTheme="minorEastAsia" w:hAnsi="Cambria Math" w:cs="Times New Roman"/>
+                  <w:i/>
+                </w:rPr>
+              </m:ctrlPr>
+            </m:sSubPr>
+            <m:e>
+              <m:r>
+                <w:rPr>
+                  <w:rFonts w:ascii="Cambria Math" w:eastAsiaTheme="minorEastAsia" w:hAnsi="Cambria Math" w:cs="Times New Roman"/>
+                </w:rPr>
+                <m:t>w</m:t>
+              </m:r>
+            </m:e>
+            <m:sub>
+              <m:r>
+                <w:rPr>
+                  <w:rFonts w:ascii="Cambria Math" w:eastAsiaTheme="minorEastAsia" w:hAnsi="Cambria Math" w:cs="Times New Roman"/>
+                </w:rPr>
+                <m:t>i</m:t>
+              </m:r>
+            </m:sub>
+          </m:sSub>
+          <m:sSub>
+            <m:sSubPr>
+              <m:ctrlPr>
+                <w:rPr>
+                  <w:rFonts w:ascii="Cambria Math" w:eastAsiaTheme="minorEastAsia" w:hAnsi="Cambria Math" w:cs="Times New Roman"/>
+                  <w:i/>
+                </w:rPr>
+              </m:ctrlPr>
+            </m:sSubPr>
+            <m:e>
+              <m:d>
+                <m:dPr>
+                  <m:ctrlPr>
+                    <w:rPr>
+                      <w:rFonts w:ascii="Cambria Math" w:eastAsiaTheme="minorEastAsia" w:hAnsi="Cambria Math" w:cs="Times New Roman"/>
+                      <w:i/>
+                    </w:rPr>
+                  </m:ctrlPr>
+                </m:dPr>
+                <m:e>
+                  <m:r>
+                    <m:rPr>
+                      <m:sty m:val="p"/>
+                    </m:rPr>
+                    <w:rPr>
+                      <w:rFonts w:ascii="Cambria Math" w:eastAsiaTheme="minorEastAsia" w:hAnsi="Cambria Math" w:cs="Times New Roman"/>
+                    </w:rPr>
+                    <m:t>Δ</m:t>
+                  </m:r>
+                  <m:r>
+                    <w:rPr>
+                      <w:rFonts w:ascii="Cambria Math" w:eastAsiaTheme="minorEastAsia" w:hAnsi="Cambria Math" w:cs="Times New Roman"/>
+                    </w:rPr>
+                    <m:t>q</m:t>
+                  </m:r>
+                </m:e>
+              </m:d>
+            </m:e>
+            <m:sub>
+              <m:r>
+                <w:rPr>
+                  <w:rFonts w:ascii="Cambria Math" w:eastAsiaTheme="minorEastAsia" w:hAnsi="Cambria Math" w:cs="Times New Roman"/>
+                </w:rPr>
+                <m:t>i</m:t>
+              </m:r>
+            </m:sub>
+          </m:sSub>
+          <m:r>
+            <w:rPr>
+              <w:rFonts w:ascii="Cambria Math" w:eastAsiaTheme="minorEastAsia" w:hAnsi="Cambria Math" w:cs="Times New Roman"/>
+            </w:rPr>
+            <w:br/>
+          </m:r>
+        </m:oMath>
+        <m:oMath>
+          <m:r>
+            <w:rPr>
+              <w:rFonts w:ascii="Cambria Math" w:eastAsiaTheme="minorEastAsia" w:hAnsi="Cambria Math" w:cs="Times New Roman"/>
+            </w:rPr>
+            <m:t xml:space="preserve">     =</m:t>
+          </m:r>
+          <m:sSub>
+            <m:sSubPr>
+              <m:ctrlPr>
+                <w:rPr>
+                  <w:rFonts w:ascii="Cambria Math" w:eastAsiaTheme="minorEastAsia" w:hAnsi="Cambria Math" w:cs="Times New Roman"/>
+                  <w:i/>
+                </w:rPr>
+              </m:ctrlPr>
+            </m:sSubPr>
+            <m:e>
+              <m:r>
+                <w:rPr>
+                  <w:rFonts w:ascii="Cambria Math" w:eastAsiaTheme="minorEastAsia" w:hAnsi="Cambria Math" w:cs="Times New Roman"/>
+                </w:rPr>
+                <m:t>M</m:t>
+              </m:r>
+            </m:e>
+            <m:sub>
+              <m:r>
+                <w:rPr>
+                  <w:rFonts w:ascii="Cambria Math" w:eastAsiaTheme="minorEastAsia" w:hAnsi="Cambria Math" w:cs="Times New Roman"/>
+                </w:rPr>
+                <m:t>i</m:t>
+              </m:r>
+            </m:sub>
+          </m:sSub>
+          <m:sSub>
+            <m:sSubPr>
+              <m:ctrlPr>
+                <w:rPr>
+                  <w:rFonts w:ascii="Cambria Math" w:eastAsiaTheme="minorEastAsia" w:hAnsi="Cambria Math" w:cs="Times New Roman"/>
+                  <w:i/>
+                </w:rPr>
+              </m:ctrlPr>
+            </m:sSubPr>
+            <m:e>
+              <m:d>
+                <m:dPr>
+                  <m:ctrlPr>
+                    <w:rPr>
+                      <w:rFonts w:ascii="Cambria Math" w:eastAsiaTheme="minorEastAsia" w:hAnsi="Cambria Math" w:cs="Times New Roman"/>
+                      <w:i/>
+                    </w:rPr>
+                  </m:ctrlPr>
+                </m:dPr>
+                <m:e>
+                  <m:r>
+                    <m:rPr>
+                      <m:sty m:val="p"/>
+                    </m:rPr>
+                    <w:rPr>
+                      <w:rFonts w:ascii="Cambria Math" w:eastAsiaTheme="minorEastAsia" w:hAnsi="Cambria Math" w:cs="Times New Roman"/>
+                    </w:rPr>
+                    <m:t>Δ</m:t>
+                  </m:r>
+                  <m:r>
+                    <w:rPr>
+                      <w:rFonts w:ascii="Cambria Math" w:eastAsiaTheme="minorEastAsia" w:hAnsi="Cambria Math" w:cs="Times New Roman"/>
+                    </w:rPr>
+                    <m:t>q</m:t>
+                  </m:r>
+                </m:e>
+              </m:d>
+            </m:e>
+            <m:sub>
+              <m:r>
+                <w:rPr>
+                  <w:rFonts w:ascii="Cambria Math" w:eastAsiaTheme="minorEastAsia" w:hAnsi="Cambria Math" w:cs="Times New Roman"/>
+                </w:rPr>
+                <m:t>i</m:t>
+              </m:r>
+            </m:sub>
+          </m:sSub>
+          <m:r>
+            <w:rPr>
+              <w:rFonts w:ascii="Cambria Math" w:eastAsiaTheme="minorEastAsia" w:hAnsi="Cambria Math" w:cs="Times New Roman"/>
+            </w:rPr>
+            <m:t>,</m:t>
+          </m:r>
+          <m:r>
+            <w:rPr>
+              <w:rFonts w:ascii="Aptos" w:eastAsiaTheme="minorEastAsia" w:hAnsi="Aptos" w:cs="Times New Roman"/>
+            </w:rPr>
+            <w:br/>
+          </m:r>
+        </m:oMath>
+      </m:oMathPara>
+      <w:r>
+        <w:rPr>
+          <w:rFonts w:ascii="Aptos" w:eastAsiaTheme="minorEastAsia" w:hAnsi="Aptos" w:cs="Times New Roman"/>
+        </w:rPr>
+        <w:t xml:space="preserve">where total fluxes are </w:t>
+      </w:r>
+      <w:r>
+        <w:rPr>
+          <w:rFonts w:eastAsiaTheme="minorEastAsia"/>
+          <w:kern w:val="2"/>
+          <w14:ligatures w14:val="standardContextual"/>
+        </w:rPr>
+        <w:t xml:space="preserve">summed over the categories, </w:t>
+      </w:r>
+      <m:oMath>
+        <m:r>
+          <w:rPr>
+            <w:rFonts w:ascii="Cambria Math" w:eastAsiaTheme="minorEastAsia" w:hAnsi="Cambria Math"/>
+            <w:kern w:val="2"/>
+            <w14:ligatures w14:val="standardContextual"/>
+          </w:rPr>
+          <m:t>G</m:t>
+        </m:r>
+        <m:r>
+          <m:rPr>
+            <m:sty m:val="p"/>
+          </m:rPr>
+          <w:rPr>
+            <w:rFonts w:ascii="Cambria Math" w:eastAsiaTheme="minorEastAsia" w:hAnsi="Cambria Math"/>
+            <w:kern w:val="2"/>
+            <w14:ligatures w14:val="standardContextual"/>
+          </w:rPr>
+          <m:t>=</m:t>
+        </m:r>
+        <m:nary>
+          <m:naryPr>
+            <m:chr m:val="∑"/>
+            <m:supHide m:val="1"/>
+            <m:ctrlPr>
+              <w:rPr>
+                <w:rFonts w:ascii="Cambria Math" w:eastAsiaTheme="minorEastAsia" w:hAnsi="Cambria Math"/>
+                <w:kern w:val="2"/>
+                <w14:ligatures w14:val="standardContextual"/>
+              </w:rPr>
+            </m:ctrlPr>
+          </m:naryPr>
+          <m:sub>
+            <m:r>
+              <w:rPr>
+                <w:rFonts w:ascii="Cambria Math" w:eastAsiaTheme="minorEastAsia" w:hAnsi="Cambria Math"/>
+                <w:kern w:val="2"/>
+                <w14:ligatures w14:val="standardContextual"/>
+              </w:rPr>
+              <m:t>i</m:t>
+            </m:r>
+          </m:sub>
+          <m:sup/>
+          <m:e>
+            <m:sSub>
+              <m:sSubPr>
+                <m:ctrlPr>
+                  <w:rPr>
+                    <w:rFonts w:ascii="Cambria Math" w:eastAsiaTheme="minorEastAsia" w:hAnsi="Cambria Math"/>
+                    <w:kern w:val="2"/>
+                    <w14:ligatures w14:val="standardContextual"/>
+                  </w:rPr>
+                </m:ctrlPr>
+              </m:sSubPr>
+              <m:e>
+                <m:r>
+                  <w:rPr>
+                    <w:rFonts w:ascii="Cambria Math" w:eastAsiaTheme="minorEastAsia" w:hAnsi="Cambria Math"/>
+                    <w:kern w:val="2"/>
+                    <w14:ligatures w14:val="standardContextual"/>
+                  </w:rPr>
+                  <m:t>G</m:t>
+                </m:r>
+              </m:e>
+              <m:sub>
+                <m:r>
+                  <w:rPr>
+                    <w:rFonts w:ascii="Cambria Math" w:eastAsiaTheme="minorEastAsia" w:hAnsi="Cambria Math"/>
+                    <w:kern w:val="2"/>
+                    <w14:ligatures w14:val="standardContextual"/>
+                  </w:rPr>
+                  <m:t>i</m:t>
+                </m:r>
+              </m:sub>
+            </m:sSub>
+          </m:e>
+        </m:nary>
+      </m:oMath>
+      <w:r>
+        <w:rPr>
+          <w:rFonts w:eastAsiaTheme="minorEastAsia"/>
+          <w:kern w:val="2"/>
+          <w14:ligatures w14:val="standardContextual"/>
+        </w:rPr>
+        <w:t>,</w:t>
+      </w:r>
+      <w:r>
+        <w:rPr>
+          <w:rFonts w:eastAsiaTheme="minorEastAsia"/>
+          <w:kern w:val="2"/>
+          <w14:ligatures w14:val="standardContextual"/>
+        </w:rPr>
+        <w:t xml:space="preserve"> </w:t>
+      </w:r>
+      <m:oMath>
+        <m:r>
+          <w:rPr>
+            <w:rFonts w:ascii="Cambria Math" w:eastAsiaTheme="minorEastAsia" w:hAnsi="Cambria Math"/>
+            <w:kern w:val="2"/>
+            <w14:ligatures w14:val="standardContextual"/>
+          </w:rPr>
+          <m:t>F</m:t>
+        </m:r>
+        <m:r>
+          <m:rPr>
+            <m:sty m:val="p"/>
+          </m:rPr>
+          <w:rPr>
+            <w:rFonts w:ascii="Cambria Math" w:eastAsiaTheme="minorEastAsia" w:hAnsi="Cambria Math"/>
+            <w:kern w:val="2"/>
+            <w14:ligatures w14:val="standardContextual"/>
+          </w:rPr>
+          <m:t>=</m:t>
+        </m:r>
+        <m:nary>
+          <m:naryPr>
+            <m:chr m:val="∑"/>
+            <m:supHide m:val="1"/>
+            <m:ctrlPr>
+              <w:rPr>
+                <w:rFonts w:ascii="Cambria Math" w:eastAsiaTheme="minorEastAsia" w:hAnsi="Cambria Math"/>
+                <w:kern w:val="2"/>
+                <w14:ligatures w14:val="standardContextual"/>
+              </w:rPr>
+            </m:ctrlPr>
+          </m:naryPr>
+          <m:sub>
+            <m:r>
+              <w:rPr>
+                <w:rFonts w:ascii="Cambria Math" w:eastAsiaTheme="minorEastAsia" w:hAnsi="Cambria Math"/>
+                <w:kern w:val="2"/>
+                <w14:ligatures w14:val="standardContextual"/>
+              </w:rPr>
+              <m:t>i</m:t>
+            </m:r>
+          </m:sub>
+          <m:sup/>
+          <m:e>
+            <m:sSub>
+              <m:sSubPr>
+                <m:ctrlPr>
+                  <w:rPr>
+                    <w:rFonts w:ascii="Cambria Math" w:eastAsiaTheme="minorEastAsia" w:hAnsi="Cambria Math"/>
+                    <w:kern w:val="2"/>
+                    <w14:ligatures w14:val="standardContextual"/>
+                  </w:rPr>
+                </m:ctrlPr>
+              </m:sSubPr>
+              <m:e>
+                <m:r>
+                  <w:rPr>
+                    <w:rFonts w:ascii="Cambria Math" w:eastAsiaTheme="minorEastAsia" w:hAnsi="Cambria Math"/>
+                    <w:kern w:val="2"/>
+                    <w14:ligatures w14:val="standardContextual"/>
+                  </w:rPr>
+                  <m:t>F</m:t>
+                </m:r>
+              </m:e>
+              <m:sub>
+                <m:r>
+                  <w:rPr>
+                    <w:rFonts w:ascii="Cambria Math" w:eastAsiaTheme="minorEastAsia" w:hAnsi="Cambria Math"/>
+                    <w:kern w:val="2"/>
+                    <w14:ligatures w14:val="standardContextual"/>
+                  </w:rPr>
+                  <m:t>i</m:t>
+                </m:r>
+              </m:sub>
+            </m:sSub>
+          </m:e>
+        </m:nary>
+      </m:oMath>
+      <w:r>
+        <w:rPr>
+          <w:rFonts w:eastAsiaTheme="minorEastAsia"/>
+          <w:kern w:val="2"/>
+          <w14:ligatures w14:val="standardContextual"/>
+        </w:rPr>
+        <w:t xml:space="preserve">, and </w:t>
+      </w:r>
+      <m:oMath>
+        <m:r>
+          <w:rPr>
+            <w:rFonts w:ascii="Cambria Math" w:eastAsiaTheme="minorEastAsia" w:hAnsi="Cambria Math"/>
+            <w:kern w:val="2"/>
+            <w14:ligatures w14:val="standardContextual"/>
+          </w:rPr>
+          <m:t>M=</m:t>
+        </m:r>
+        <m:nary>
+          <m:naryPr>
+            <m:chr m:val="∑"/>
+            <m:supHide m:val="1"/>
+            <m:ctrlPr>
+              <w:rPr>
+                <w:rFonts w:ascii="Cambria Math" w:eastAsiaTheme="minorEastAsia" w:hAnsi="Cambria Math"/>
+                <w:i/>
+                <w:kern w:val="2"/>
+                <w14:ligatures w14:val="standardContextual"/>
+              </w:rPr>
+            </m:ctrlPr>
+          </m:naryPr>
+          <m:sub>
+            <m:r>
+              <w:rPr>
+                <w:rFonts w:ascii="Cambria Math" w:eastAsiaTheme="minorEastAsia" w:hAnsi="Cambria Math"/>
+                <w:kern w:val="2"/>
+                <w14:ligatures w14:val="standardContextual"/>
+              </w:rPr>
+              <m:t>i</m:t>
+            </m:r>
+          </m:sub>
+          <m:sup/>
+          <m:e>
+            <m:sSub>
+              <m:sSubPr>
+                <m:ctrlPr>
+                  <w:rPr>
+                    <w:rFonts w:ascii="Cambria Math" w:eastAsiaTheme="minorEastAsia" w:hAnsi="Cambria Math"/>
+                    <w:i/>
+                    <w:kern w:val="2"/>
+                    <w14:ligatures w14:val="standardContextual"/>
+                  </w:rPr>
+                </m:ctrlPr>
+              </m:sSubPr>
+              <m:e>
+                <m:r>
+                  <w:rPr>
+                    <w:rFonts w:ascii="Cambria Math" w:eastAsiaTheme="minorEastAsia" w:hAnsi="Cambria Math"/>
+                    <w:kern w:val="2"/>
+                    <w14:ligatures w14:val="standardContextual"/>
+                  </w:rPr>
+                  <m:t>M</m:t>
+                </m:r>
+              </m:e>
+              <m:sub>
+                <m:r>
+                  <w:rPr>
+                    <w:rFonts w:ascii="Cambria Math" w:eastAsiaTheme="minorEastAsia" w:hAnsi="Cambria Math"/>
+                    <w:kern w:val="2"/>
+                    <w14:ligatures w14:val="standardContextual"/>
+                  </w:rPr>
+                  <m:t>i</m:t>
+                </m:r>
+              </m:sub>
+            </m:sSub>
+          </m:e>
+        </m:nary>
+      </m:oMath>
+      <w:r>
+        <w:rPr>
+          <w:rFonts w:eastAsiaTheme="minorEastAsia"/>
+          <w:kern w:val="2"/>
+          <w14:ligatures w14:val="standardContextual"/>
+        </w:rPr>
+        <w:t xml:space="preserve">. </w:t>
+      </w:r>
+      <w:r>
+        <w:rPr>
+          <w:rFonts w:eastAsiaTheme="minorEastAsia"/>
+        </w:rPr>
+        <w:t xml:space="preserve">Figure FEDDYMETHOD shows the distribution of in-sky fluxes </w:t>
       </w:r>
       <m:oMath>
         <m:sSub>
@@ -8340,73 +9198,44 @@
             </m:ctrlPr>
           </m:sSubPr>
           <m:e>
-            <m:sSubSup>
-              <m:sSubSupPr>
-                <m:ctrlPr>
-                  <w:rPr>
-                    <w:rFonts w:ascii="Cambria Math" w:eastAsiaTheme="minorEastAsia" w:hAnsi="Cambria Math"/>
-                    <w:i/>
-                  </w:rPr>
-                </m:ctrlPr>
-              </m:sSubSupPr>
-              <m:e>
-                <m:r>
-                  <w:rPr>
-                    <w:rFonts w:ascii="Cambria Math" w:eastAsiaTheme="minorEastAsia" w:hAnsi="Cambria Math"/>
-                  </w:rPr>
-                  <m:t>a</m:t>
-                </m:r>
-                <m:ctrlPr>
-                  <w:rPr>
-                    <w:rFonts w:ascii="Cambria Math" w:eastAsia="Cambria Math" w:hAnsi="Cambria Math" w:cs="Cambria Math"/>
-                    <w:i/>
-                  </w:rPr>
-                </m:ctrlPr>
-              </m:e>
-              <m:sub>
-                <m:r>
-                  <w:rPr>
-                    <w:rFonts w:ascii="Cambria Math" w:eastAsiaTheme="minorEastAsia" w:hAnsi="Cambria Math"/>
-                  </w:rPr>
-                  <m:t>i</m:t>
-                </m:r>
-              </m:sub>
-              <m:sup>
-                <m:r>
-                  <w:rPr>
-                    <w:rFonts w:ascii="Cambria Math" w:eastAsiaTheme="minorEastAsia" w:hAnsi="Cambria Math"/>
-                  </w:rPr>
-                  <m:t>-1</m:t>
-                </m:r>
-              </m:sup>
-            </m:sSubSup>
-            <m:d>
-              <m:dPr>
-                <m:ctrlPr>
-                  <w:rPr>
-                    <w:rFonts w:ascii="Cambria Math" w:eastAsiaTheme="minorEastAsia" w:hAnsi="Cambria Math"/>
-                    <w:i/>
-                  </w:rPr>
-                </m:ctrlPr>
-              </m:dPr>
-              <m:e>
-                <m:r>
-                  <m:rPr>
-                    <m:sty m:val="p"/>
-                  </m:rPr>
-                  <w:rPr>
-                    <w:rFonts w:ascii="Cambria Math" w:eastAsiaTheme="minorEastAsia" w:hAnsi="Cambria Math"/>
-                  </w:rPr>
-                  <m:t>Δ</m:t>
-                </m:r>
-                <m:r>
-                  <w:rPr>
-                    <w:rFonts w:ascii="Cambria Math" w:eastAsiaTheme="minorEastAsia" w:hAnsi="Cambria Math"/>
-                  </w:rPr>
-                  <m:t>G</m:t>
-                </m:r>
-              </m:e>
-            </m:d>
+            <m:r>
+              <w:rPr>
+                <w:rFonts w:ascii="Cambria Math" w:eastAsiaTheme="minorEastAsia" w:hAnsi="Cambria Math"/>
+              </w:rPr>
+              <m:t>G</m:t>
+            </m:r>
+          </m:e>
+          <m:sub>
+            <m:r>
+              <w:rPr>
+                <w:rFonts w:ascii="Cambria Math" w:eastAsiaTheme="minorEastAsia" w:hAnsi="Cambria Math"/>
+              </w:rPr>
+              <m:t>i</m:t>
+            </m:r>
+          </m:sub>
+        </m:sSub>
+        <m:r>
+          <w:rPr>
+            <w:rFonts w:ascii="Cambria Math" w:eastAsiaTheme="minorEastAsia" w:hAnsi="Cambria Math"/>
+          </w:rPr>
+          <m:t>/</m:t>
+        </m:r>
+        <m:sSub>
+          <m:sSubPr>
+            <m:ctrlPr>
+              <w:rPr>
+                <w:rFonts w:ascii="Cambria Math" w:eastAsiaTheme="minorEastAsia" w:hAnsi="Cambria Math"/>
+                <w:i/>
+              </w:rPr>
+            </m:ctrlPr>
+          </m:sSubPr>
+          <m:e>
+            <m:r>
+              <w:rPr>
+                <w:rFonts w:ascii="Cambria Math" w:eastAsiaTheme="minorEastAsia" w:hAnsi="Cambria Math"/>
+              </w:rPr>
+              <m:t>a</m:t>
+            </m:r>
           </m:e>
           <m:sub>
             <m:r>
@@ -8422,93 +9251,7 @@
         <w:rPr>
           <w:rFonts w:eastAsiaTheme="minorEastAsia"/>
         </w:rPr>
-        <w:t>.</w:t>
-      </w:r>
-      <w:r>
-        <w:rPr>
-          <w:rFonts w:eastAsiaTheme="minorEastAsia"/>
-        </w:rPr>
-        <w:t xml:space="preserve"> Fig. FEDDYMETHOD shows the distribution of fluxes </w:t>
-      </w:r>
-      <m:oMath>
-        <m:sSub>
-          <m:sSubPr>
-            <m:ctrlPr>
-              <w:rPr>
-                <w:rFonts w:ascii="Cambria Math" w:eastAsiaTheme="minorEastAsia" w:hAnsi="Cambria Math"/>
-                <w:i/>
-              </w:rPr>
-            </m:ctrlPr>
-          </m:sSubPr>
-          <m:e>
-            <m:r>
-              <w:rPr>
-                <w:rFonts w:ascii="Cambria Math" w:eastAsiaTheme="minorEastAsia" w:hAnsi="Cambria Math"/>
-              </w:rPr>
-              <m:t>F</m:t>
-            </m:r>
-          </m:e>
-          <m:sub>
-            <m:r>
-              <w:rPr>
-                <w:rFonts w:ascii="Cambria Math" w:eastAsiaTheme="minorEastAsia" w:hAnsi="Cambria Math"/>
-              </w:rPr>
-              <m:t>i</m:t>
-            </m:r>
-          </m:sub>
-        </m:sSub>
-      </m:oMath>
-      <w:r>
-        <w:rPr>
-          <w:rFonts w:eastAsiaTheme="minorEastAsia"/>
-        </w:rPr>
-        <w:t xml:space="preserve"> to each height category. </w:t>
-      </w:r>
-      <w:r>
-        <w:rPr>
-          <w:rFonts w:eastAsiaTheme="minorEastAsia"/>
-        </w:rPr>
-        <w:t>The</w:t>
-      </w:r>
-      <w:r>
-        <w:rPr>
-          <w:rFonts w:eastAsiaTheme="minorEastAsia"/>
-        </w:rPr>
-        <w:t xml:space="preserve"> cloud top height </w:t>
-      </w:r>
-      <m:oMath>
-        <m:sSub>
-          <m:sSubPr>
-            <m:ctrlPr>
-              <w:rPr>
-                <w:rFonts w:ascii="Cambria Math" w:eastAsiaTheme="minorEastAsia" w:hAnsi="Cambria Math"/>
-                <w:i/>
-              </w:rPr>
-            </m:ctrlPr>
-          </m:sSubPr>
-          <m:e>
-            <m:r>
-              <w:rPr>
-                <w:rFonts w:ascii="Cambria Math" w:eastAsiaTheme="minorEastAsia" w:hAnsi="Cambria Math"/>
-              </w:rPr>
-              <m:t>h</m:t>
-            </m:r>
-          </m:e>
-          <m:sub>
-            <m:r>
-              <w:rPr>
-                <w:rFonts w:ascii="Cambria Math" w:eastAsiaTheme="minorEastAsia" w:hAnsi="Cambria Math"/>
-              </w:rPr>
-              <m:t>i</m:t>
-            </m:r>
-          </m:sub>
-        </m:sSub>
-      </m:oMath>
-      <w:r>
-        <w:rPr>
-          <w:rFonts w:eastAsiaTheme="minorEastAsia"/>
-        </w:rPr>
-        <w:t xml:space="preserve"> of each cloud is determined by its moisture sink rate parameter.</w:t>
+        <w:t xml:space="preserve"> in each height category. </w:t>
       </w:r>
     </w:p>
     <w:p>
@@ -8679,284 +9422,6 @@
           <w:color w:val="323130"/>
         </w:rPr>
         <w:t>.</w:t>
-      </w:r>
-    </w:p>
-    <w:p>
-      <w:pPr>
-        <w:pStyle w:val="Heading2"/>
-      </w:pPr>
-      <w:r>
-        <w:t>AMIP data</w:t>
-      </w:r>
-    </w:p>
-    <w:p>
-      <w:r>
-        <w:t>An-Yi is downloading ISCCP cloud fraction, cumulus mass flux (</w:t>
-      </w:r>
-      <w:r>
-        <w:rPr>
-          <w:rFonts w:ascii="ComicShannsMono Nerd Font" w:hAnsi="ComicShannsMono Nerd Font"/>
-        </w:rPr>
-        <w:t>cm</w:t>
-      </w:r>
-      <w:r>
-        <w:t>), and mean vertical velocity variables from</w:t>
-      </w:r>
-      <w:r>
-        <w:t xml:space="preserve"> </w:t>
-      </w:r>
-      <w:r>
-        <w:t>CMIP6/CFMIP</w:t>
-      </w:r>
-      <w:r>
-        <w:t xml:space="preserve"> </w:t>
-      </w:r>
-      <w:proofErr w:type="spellStart"/>
-      <w:r>
-        <w:rPr>
-          <w:rFonts w:ascii="ComicShannsMono Nerd Font" w:hAnsi="ComicShannsMono Nerd Font"/>
-        </w:rPr>
-        <w:t>amip</w:t>
-      </w:r>
-      <w:proofErr w:type="spellEnd"/>
-      <w:r>
-        <w:t xml:space="preserve"> (historical) and </w:t>
-      </w:r>
-      <w:r>
-        <w:rPr>
-          <w:rFonts w:ascii="ComicShannsMono Nerd Font" w:hAnsi="ComicShannsMono Nerd Font"/>
-        </w:rPr>
-        <w:t>amip-p4k</w:t>
-      </w:r>
-      <w:r>
-        <w:t xml:space="preserve"> (historical SST + 4 K) from 5 </w:t>
-      </w:r>
-      <w:r>
-        <w:t xml:space="preserve">available </w:t>
-      </w:r>
-      <w:r>
-        <w:t>models.</w:t>
-      </w:r>
-      <w:r>
-        <w:t xml:space="preserve"> </w:t>
-      </w:r>
-      <w:r>
-        <w:t xml:space="preserve">Differences of the variables between </w:t>
-      </w:r>
-      <w:r>
-        <w:rPr>
-          <w:rFonts w:ascii="ComicShannsMono Nerd Font" w:hAnsi="ComicShannsMono Nerd Font"/>
-        </w:rPr>
-        <w:t>amip-p4k</w:t>
-      </w:r>
-      <w:r>
-        <w:t xml:space="preserve"> and </w:t>
-      </w:r>
-      <w:proofErr w:type="spellStart"/>
-      <w:r>
-        <w:rPr>
-          <w:rFonts w:ascii="ComicShannsMono Nerd Font" w:hAnsi="ComicShannsMono Nerd Font"/>
-        </w:rPr>
-        <w:t>amip</w:t>
-      </w:r>
-      <w:proofErr w:type="spellEnd"/>
-      <w:r>
-        <w:t xml:space="preserve"> during</w:t>
-      </w:r>
-      <w:r>
-        <w:t xml:space="preserve"> </w:t>
-      </w:r>
-      <w:r>
-        <w:t>January-February 1979-2014 in the North Atlantic shallow cumulus region (YY ° N, XX ° W) are used to compute</w:t>
-      </w:r>
-      <w:r>
-        <w:t xml:space="preserve"> the relative slopes </w:t>
-      </w:r>
-      <m:oMath>
-        <m:r>
-          <m:rPr>
-            <m:sty m:val="p"/>
-          </m:rPr>
-          <w:rPr>
-            <w:rFonts w:ascii="Cambria Math" w:hAnsi="Cambria Math"/>
-          </w:rPr>
-          <m:t>Δ</m:t>
-        </m:r>
-        <m:func>
-          <m:funcPr>
-            <m:ctrlPr>
-              <w:rPr>
-                <w:rFonts w:ascii="Cambria Math" w:hAnsi="Cambria Math"/>
-                <w:i/>
-              </w:rPr>
-            </m:ctrlPr>
-          </m:funcPr>
-          <m:fName>
-            <m:r>
-              <m:rPr>
-                <m:sty m:val="p"/>
-              </m:rPr>
-              <w:rPr>
-                <w:rFonts w:ascii="Cambria Math" w:hAnsi="Cambria Math"/>
-              </w:rPr>
-              <m:t>ln</m:t>
-            </m:r>
-            <m:ctrlPr>
-              <w:rPr>
-                <w:rFonts w:ascii="Cambria Math" w:hAnsi="Cambria Math"/>
-              </w:rPr>
-            </m:ctrlPr>
-          </m:fName>
-          <m:e>
-            <m:r>
-              <w:rPr>
-                <w:rFonts w:ascii="Cambria Math" w:hAnsi="Cambria Math"/>
-              </w:rPr>
-              <m:t>C,</m:t>
-            </m:r>
-          </m:e>
-        </m:func>
-        <m:r>
-          <m:rPr>
-            <m:sty m:val="p"/>
-          </m:rPr>
-          <w:rPr>
-            <w:rFonts w:ascii="Cambria Math" w:hAnsi="Cambria Math"/>
-          </w:rPr>
-          <m:t>Δ</m:t>
-        </m:r>
-        <m:func>
-          <m:funcPr>
-            <m:ctrlPr>
-              <w:rPr>
-                <w:rFonts w:ascii="Cambria Math" w:hAnsi="Cambria Math"/>
-                <w:i/>
-              </w:rPr>
-            </m:ctrlPr>
-          </m:funcPr>
-          <m:fName>
-            <m:r>
-              <m:rPr>
-                <m:sty m:val="p"/>
-              </m:rPr>
-              <w:rPr>
-                <w:rFonts w:ascii="Cambria Math" w:hAnsi="Cambria Math"/>
-              </w:rPr>
-              <m:t>ln</m:t>
-            </m:r>
-            <m:ctrlPr>
-              <w:rPr>
-                <w:rFonts w:ascii="Cambria Math" w:hAnsi="Cambria Math"/>
-              </w:rPr>
-            </m:ctrlPr>
-          </m:fName>
-          <m:e>
-            <m:r>
-              <w:rPr>
-                <w:rFonts w:ascii="Cambria Math" w:hAnsi="Cambria Math"/>
-              </w:rPr>
-              <m:t>W</m:t>
-            </m:r>
-          </m:e>
-        </m:func>
-      </m:oMath>
-      <w:r>
-        <w:rPr>
-          <w:rFonts w:eastAsiaTheme="minorEastAsia"/>
-        </w:rPr>
-        <w:t xml:space="preserve"> and </w:t>
-      </w:r>
-      <m:oMath>
-        <m:r>
-          <m:rPr>
-            <m:sty m:val="p"/>
-          </m:rPr>
-          <w:rPr>
-            <w:rFonts w:ascii="Cambria Math" w:hAnsi="Cambria Math"/>
-          </w:rPr>
-          <m:t>Δ</m:t>
-        </m:r>
-        <m:func>
-          <m:funcPr>
-            <m:ctrlPr>
-              <w:rPr>
-                <w:rFonts w:ascii="Cambria Math" w:hAnsi="Cambria Math"/>
-                <w:i/>
-              </w:rPr>
-            </m:ctrlPr>
-          </m:funcPr>
-          <m:fName>
-            <m:r>
-              <m:rPr>
-                <m:sty m:val="p"/>
-              </m:rPr>
-              <w:rPr>
-                <w:rFonts w:ascii="Cambria Math" w:hAnsi="Cambria Math"/>
-              </w:rPr>
-              <m:t>ln</m:t>
-            </m:r>
-            <m:ctrlPr>
-              <w:rPr>
-                <w:rFonts w:ascii="Cambria Math" w:hAnsi="Cambria Math"/>
-              </w:rPr>
-            </m:ctrlPr>
-          </m:fName>
-          <m:e>
-            <m:r>
-              <w:rPr>
-                <w:rFonts w:ascii="Cambria Math" w:hAnsi="Cambria Math"/>
-              </w:rPr>
-              <m:t>M</m:t>
-            </m:r>
-          </m:e>
-        </m:func>
-      </m:oMath>
-      <w:r>
-        <w:rPr>
-          <w:rFonts w:eastAsiaTheme="minorEastAsia"/>
-        </w:rPr>
-        <w:t xml:space="preserve"> </w:t>
-      </w:r>
-      <w:r>
-        <w:rPr>
-          <w:rFonts w:eastAsiaTheme="minorEastAsia"/>
-        </w:rPr>
-        <w:t xml:space="preserve">where </w:t>
-      </w:r>
-      <m:oMath>
-        <m:r>
-          <m:rPr>
-            <m:sty m:val="p"/>
-          </m:rPr>
-          <w:rPr>
-            <w:rFonts w:ascii="Cambria Math" w:eastAsiaTheme="minorEastAsia" w:hAnsi="Cambria Math"/>
-          </w:rPr>
-          <m:t>Δ</m:t>
-        </m:r>
-      </m:oMath>
-      <w:r>
-        <w:rPr>
-          <w:rFonts w:eastAsiaTheme="minorEastAsia"/>
-        </w:rPr>
-        <w:t xml:space="preserve"> is represents the difference per</w:t>
-      </w:r>
-      <w:r>
-        <w:rPr>
-          <w:rFonts w:eastAsiaTheme="minorEastAsia"/>
-        </w:rPr>
-        <w:t xml:space="preserve"> +1 K </w:t>
-      </w:r>
-      <w:r>
-        <w:rPr>
-          <w:rFonts w:eastAsiaTheme="minorEastAsia"/>
-        </w:rPr>
-        <w:t xml:space="preserve">SST </w:t>
-      </w:r>
-      <w:r>
-        <w:rPr>
-          <w:rFonts w:eastAsiaTheme="minorEastAsia"/>
-        </w:rPr>
-        <w:t>warming.</w:t>
       </w:r>
     </w:p>
     <w:p/>
@@ -14571,16 +15036,14 @@
         <w:rPr>
           <w:rFonts w:ascii="Aptos" w:eastAsiaTheme="minorEastAsia" w:hAnsi="Aptos" w:cs="Times New Roman"/>
         </w:rPr>
-        <w:t>P</w:t>
-      </w:r>
-      <w:proofErr w:type="spellStart"/>
+        <w:t>Pr</w:t>
+      </w:r>
       <w:r>
         <w:rPr>
           <w:rFonts w:ascii="Aptos" w:eastAsiaTheme="minorEastAsia" w:hAnsi="Aptos" w:cs="Times New Roman"/>
         </w:rPr>
-        <w:t>recipitation</w:t>
-      </w:r>
-      <w:proofErr w:type="spellEnd"/>
+        <w:t>ecipitation</w:t>
+      </w:r>
       <w:r>
         <w:rPr>
           <w:rFonts w:ascii="Aptos" w:eastAsiaTheme="minorEastAsia" w:hAnsi="Aptos" w:cs="Times New Roman"/>
@@ -15408,9 +15871,20 @@
     </w:p>
     <w:p>
       <w:pPr>
+        <w:pStyle w:val="BodyText"/>
+        <w:rPr>
+          <w:rFonts w:ascii="Aptos" w:eastAsiaTheme="minorEastAsia" w:hAnsi="Aptos" w:cs="Times New Roman"/>
+        </w:rPr>
+      </w:pPr>
+    </w:p>
+    <w:p>
+      <w:pPr>
         <w:pStyle w:val="Heading2"/>
       </w:pPr>
       <w:bookmarkStart w:id="3" w:name="cloud-base-clouds"/>
+      <w:r>
+        <w:t xml:space="preserve">Supplement: </w:t>
+      </w:r>
       <w:r>
         <w:t>LCL clouds</w:t>
       </w:r>
@@ -19656,6 +20130,15 @@
           <w:szCs w:val="32"/>
         </w:rPr>
       </w:pPr>
+      <w:r>
+        <w:rPr>
+          <w:rFonts w:asciiTheme="majorHAnsi" w:eastAsiaTheme="majorEastAsia" w:hAnsiTheme="majorHAnsi" w:cstheme="majorBidi"/>
+          <w:color w:val="0F4761" w:themeColor="accent1" w:themeShade="BF"/>
+          <w:sz w:val="32"/>
+          <w:szCs w:val="32"/>
+        </w:rPr>
+        <w:t xml:space="preserve">Supplement: </w:t>
+      </w:r>
       <w:r>
         <w:rPr>
           <w:rFonts w:asciiTheme="majorHAnsi" w:eastAsiaTheme="majorEastAsia" w:hAnsiTheme="majorHAnsi" w:cstheme="majorBidi"/>

</xml_diff>

<commit_message>
added CREs to ms table
</commit_message>
<xml_diff>
--- a/doc/DiM_ms20260713.docx
+++ b/doc/DiM_ms20260713.docx
@@ -6144,9 +6144,11 @@
         <w:tblLook w:val="04A0" w:firstRow="1" w:lastRow="0" w:firstColumn="1" w:lastColumn="0" w:noHBand="0" w:noVBand="1"/>
       </w:tblPr>
       <w:tblGrid>
-        <w:gridCol w:w="2790"/>
-        <w:gridCol w:w="1980"/>
-        <w:gridCol w:w="1980"/>
+        <w:gridCol w:w="3060"/>
+        <w:gridCol w:w="1260"/>
+        <w:gridCol w:w="1530"/>
+        <w:gridCol w:w="1530"/>
+        <w:gridCol w:w="1530"/>
       </w:tblGrid>
       <w:tr>
         <w:trPr>
@@ -6154,7 +6156,7 @@
         </w:trPr>
         <w:tc>
           <w:tcPr>
-            <w:tcW w:w="2745" w:type="dxa"/>
+            <w:tcW w:w="3015" w:type="dxa"/>
             <w:tcBorders>
               <w:bottom w:val="single" w:sz="4" w:space="0" w:color="DCDFE5"/>
             </w:tcBorders>
@@ -6180,7 +6182,7 @@
         </w:tc>
         <w:tc>
           <w:tcPr>
-            <w:tcW w:w="1950" w:type="dxa"/>
+            <w:tcW w:w="1230" w:type="dxa"/>
             <w:tcBorders>
               <w:bottom w:val="single" w:sz="4" w:space="0" w:color="DCDFE5"/>
             </w:tcBorders>
@@ -6261,16 +6263,30 @@
             </m:oMath>
             <w:r>
               <w:rPr>
+                <w:rFonts w:eastAsiaTheme="minorEastAsia"/>
+                <w:b/>
+              </w:rPr>
+              <w:t xml:space="preserve"> </w:t>
+            </w:r>
+            <w:r>
+              <w:rPr>
+                <w:rFonts w:eastAsiaTheme="minorEastAsia"/>
+                <w:b/>
+              </w:rPr>
+              <w:br/>
+            </w:r>
+            <w:r>
+              <w:rPr>
                 <w:b/>
                 <w:bCs/>
               </w:rPr>
-              <w:t xml:space="preserve"> (%)</w:t>
+              <w:t>(%)</w:t>
             </w:r>
           </w:p>
         </w:tc>
         <w:tc>
           <w:tcPr>
-            <w:tcW w:w="1935" w:type="dxa"/>
+            <w:tcW w:w="1500" w:type="dxa"/>
             <w:tcBorders>
               <w:bottom w:val="single" w:sz="4" w:space="0" w:color="DCDFE5"/>
             </w:tcBorders>
@@ -6301,14 +6317,154 @@
                 <w:rFonts w:ascii="Aptos Display" w:eastAsia="Times New Roman" w:hAnsi="Aptos Display" w:cs="Times New Roman"/>
                 <w:b/>
               </w:rPr>
-              <w:t>CRE</w:t>
+              <w:t xml:space="preserve">SWCRE </w:t>
             </w:r>
             <w:r>
               <w:rPr>
                 <w:rFonts w:ascii="Aptos Display" w:eastAsia="Times New Roman" w:hAnsi="Aptos Display" w:cs="Times New Roman"/>
                 <w:b/>
               </w:rPr>
-              <w:t xml:space="preserve"> (W m</w:t>
+              <w:br/>
+              <w:t>(W m</w:t>
+            </w:r>
+            <w:r>
+              <w:rPr>
+                <w:rFonts w:ascii="Aptos Display" w:eastAsia="Times New Roman" w:hAnsi="Aptos Display" w:cs="Times New Roman"/>
+                <w:b/>
+                <w:vertAlign w:val="superscript"/>
+              </w:rPr>
+              <w:t>–2</w:t>
+            </w:r>
+            <w:r>
+              <w:rPr>
+                <w:rFonts w:ascii="Aptos Display" w:eastAsia="Times New Roman" w:hAnsi="Aptos Display" w:cs="Times New Roman"/>
+                <w:b/>
+              </w:rPr>
+              <w:t>)</w:t>
+            </w:r>
+          </w:p>
+        </w:tc>
+        <w:tc>
+          <w:tcPr>
+            <w:tcW w:w="1500" w:type="dxa"/>
+            <w:tcBorders>
+              <w:bottom w:val="single" w:sz="4" w:space="0" w:color="DCDFE5"/>
+            </w:tcBorders>
+          </w:tcPr>
+          <w:p>
+            <w:pPr>
+              <w:pStyle w:val="BodyText"/>
+              <w:spacing w:before="0" w:after="0"/>
+              <w:jc w:val="right"/>
+              <w:rPr>
+                <w:rFonts w:ascii="Aptos Display" w:eastAsia="Times New Roman" w:hAnsi="Aptos Display" w:cs="Times New Roman"/>
+                <w:b/>
+              </w:rPr>
+            </w:pPr>
+            <m:oMath>
+              <m:r>
+                <m:rPr>
+                  <m:sty m:val="b"/>
+                </m:rPr>
+                <w:rPr>
+                  <w:rFonts w:ascii="Cambria Math" w:eastAsia="Times New Roman" w:hAnsi="Cambria Math" w:cs="Times New Roman"/>
+                </w:rPr>
+                <m:t>Δ</m:t>
+              </m:r>
+            </m:oMath>
+            <w:r>
+              <w:rPr>
+                <w:rFonts w:ascii="Aptos Display" w:eastAsia="Times New Roman" w:hAnsi="Aptos Display" w:cs="Times New Roman"/>
+                <w:b/>
+              </w:rPr>
+              <w:t>L</w:t>
+            </w:r>
+            <w:r>
+              <w:rPr>
+                <w:rFonts w:ascii="Aptos Display" w:eastAsia="Times New Roman" w:hAnsi="Aptos Display" w:cs="Times New Roman"/>
+                <w:b/>
+              </w:rPr>
+              <w:t xml:space="preserve">WCRE </w:t>
+            </w:r>
+            <w:r>
+              <w:rPr>
+                <w:rFonts w:ascii="Aptos Display" w:eastAsia="Times New Roman" w:hAnsi="Aptos Display" w:cs="Times New Roman"/>
+                <w:b/>
+              </w:rPr>
+              <w:br/>
+            </w:r>
+            <w:r>
+              <w:rPr>
+                <w:rFonts w:ascii="Aptos Display" w:eastAsia="Times New Roman" w:hAnsi="Aptos Display" w:cs="Times New Roman"/>
+                <w:b/>
+              </w:rPr>
+              <w:t>(W m</w:t>
+            </w:r>
+            <w:r>
+              <w:rPr>
+                <w:rFonts w:ascii="Aptos Display" w:eastAsia="Times New Roman" w:hAnsi="Aptos Display" w:cs="Times New Roman"/>
+                <w:b/>
+                <w:vertAlign w:val="superscript"/>
+              </w:rPr>
+              <w:t>–2</w:t>
+            </w:r>
+            <w:r>
+              <w:rPr>
+                <w:rFonts w:ascii="Aptos Display" w:eastAsia="Times New Roman" w:hAnsi="Aptos Display" w:cs="Times New Roman"/>
+                <w:b/>
+              </w:rPr>
+              <w:t>)</w:t>
+            </w:r>
+          </w:p>
+        </w:tc>
+        <w:tc>
+          <w:tcPr>
+            <w:tcW w:w="1485" w:type="dxa"/>
+            <w:tcBorders>
+              <w:bottom w:val="single" w:sz="4" w:space="0" w:color="DCDFE5"/>
+            </w:tcBorders>
+          </w:tcPr>
+          <w:p>
+            <w:pPr>
+              <w:pStyle w:val="BodyText"/>
+              <w:spacing w:before="0" w:after="0"/>
+              <w:jc w:val="right"/>
+              <w:rPr>
+                <w:rFonts w:ascii="Aptos Display" w:eastAsia="Times New Roman" w:hAnsi="Aptos Display" w:cs="Times New Roman"/>
+                <w:b/>
+              </w:rPr>
+            </w:pPr>
+            <m:oMath>
+              <m:r>
+                <m:rPr>
+                  <m:sty m:val="b"/>
+                </m:rPr>
+                <w:rPr>
+                  <w:rFonts w:ascii="Cambria Math" w:eastAsia="Times New Roman" w:hAnsi="Cambria Math" w:cs="Times New Roman"/>
+                </w:rPr>
+                <m:t>Δ</m:t>
+              </m:r>
+            </m:oMath>
+            <w:r>
+              <w:rPr>
+                <w:rFonts w:ascii="Aptos Display" w:eastAsia="Times New Roman" w:hAnsi="Aptos Display" w:cs="Times New Roman"/>
+                <w:b/>
+              </w:rPr>
+              <w:t xml:space="preserve">CRE </w:t>
+            </w:r>
+            <w:r>
+              <w:rPr>
+                <w:rFonts w:ascii="Aptos Display" w:eastAsia="Times New Roman" w:hAnsi="Aptos Display" w:cs="Times New Roman"/>
+                <w:b/>
+              </w:rPr>
+              <w:br/>
+            </w:r>
+            <w:r>
+              <w:rPr>
+                <w:rFonts w:ascii="Aptos Display" w:eastAsia="Times New Roman" w:hAnsi="Aptos Display" w:cs="Times New Roman"/>
+                <w:b/>
+              </w:rPr>
+              <w:t>(W m</w:t>
             </w:r>
             <w:r>
               <w:rPr>
@@ -6334,7 +6490,7 @@
         </w:trPr>
         <w:tc>
           <w:tcPr>
-            <w:tcW w:w="2745" w:type="dxa"/>
+            <w:tcW w:w="3015" w:type="dxa"/>
             <w:hideMark/>
           </w:tcPr>
           <w:p>
@@ -6345,11 +6501,14 @@
             <w:r>
               <w:t>subsidence-5%</w:t>
             </w:r>
+            <w:r>
+              <w:t>, Ecb+2%</w:t>
+            </w:r>
           </w:p>
         </w:tc>
         <w:tc>
           <w:tcPr>
-            <w:tcW w:w="1950" w:type="dxa"/>
+            <w:tcW w:w="1230" w:type="dxa"/>
             <w:hideMark/>
           </w:tcPr>
           <w:p>
@@ -6362,13 +6521,16 @@
               <w:t>–</w:t>
             </w:r>
             <w:r>
-              <w:t>5.13</w:t>
+              <w:t>5</w:t>
+            </w:r>
+            <w:r>
+              <w:t>.00</w:t>
             </w:r>
           </w:p>
         </w:tc>
         <w:tc>
           <w:tcPr>
-            <w:tcW w:w="1935" w:type="dxa"/>
+            <w:tcW w:w="1500" w:type="dxa"/>
           </w:tcPr>
           <w:p>
             <w:pPr>
@@ -6377,7 +6539,37 @@
               <w:jc w:val="right"/>
             </w:pPr>
             <w:r>
-              <w:t>+1.6</w:t>
+              <w:t>+1.02</w:t>
+            </w:r>
+          </w:p>
+        </w:tc>
+        <w:tc>
+          <w:tcPr>
+            <w:tcW w:w="1500" w:type="dxa"/>
+          </w:tcPr>
+          <w:p>
+            <w:pPr>
+              <w:pStyle w:val="BodyText"/>
+              <w:spacing w:before="0" w:after="0"/>
+              <w:jc w:val="right"/>
+            </w:pPr>
+            <w:r>
+              <w:t>–0.18</w:t>
+            </w:r>
+          </w:p>
+        </w:tc>
+        <w:tc>
+          <w:tcPr>
+            <w:tcW w:w="1485" w:type="dxa"/>
+          </w:tcPr>
+          <w:p>
+            <w:pPr>
+              <w:pStyle w:val="BodyText"/>
+              <w:spacing w:before="0" w:after="0"/>
+              <w:jc w:val="right"/>
+            </w:pPr>
+            <w:r>
+              <w:t>+0.84</w:t>
             </w:r>
           </w:p>
         </w:tc>
@@ -6388,61 +6580,7 @@
         </w:trPr>
         <w:tc>
           <w:tcPr>
-            <w:tcW w:w="2745" w:type="dxa"/>
-            <w:hideMark/>
-          </w:tcPr>
-          <w:p>
-            <w:pPr>
-              <w:pStyle w:val="BodyText"/>
-              <w:spacing w:before="0" w:after="0"/>
-            </w:pPr>
-            <w:r>
-              <w:t>Ecb+2%</w:t>
-            </w:r>
-          </w:p>
-        </w:tc>
-        <w:tc>
-          <w:tcPr>
-            <w:tcW w:w="1950" w:type="dxa"/>
-            <w:hideMark/>
-          </w:tcPr>
-          <w:p>
-            <w:pPr>
-              <w:pStyle w:val="BodyText"/>
-              <w:spacing w:before="0" w:after="0"/>
-              <w:jc w:val="right"/>
-            </w:pPr>
-            <w:r>
-              <w:t>–</w:t>
-            </w:r>
-            <w:r>
-              <w:t>5.13</w:t>
-            </w:r>
-          </w:p>
-        </w:tc>
-        <w:tc>
-          <w:tcPr>
-            <w:tcW w:w="1935" w:type="dxa"/>
-          </w:tcPr>
-          <w:p>
-            <w:pPr>
-              <w:pStyle w:val="BodyText"/>
-              <w:spacing w:before="0" w:after="0"/>
-              <w:jc w:val="right"/>
-            </w:pPr>
-            <w:r>
-              <w:t>+</w:t>
-            </w:r>
-          </w:p>
-        </w:tc>
-      </w:tr>
-      <w:tr>
-        <w:trPr>
-          <w:tblCellSpacing w:w="15" w:type="dxa"/>
-        </w:trPr>
-        <w:tc>
-          <w:tcPr>
-            <w:tcW w:w="2745" w:type="dxa"/>
+            <w:tcW w:w="3015" w:type="dxa"/>
             <w:hideMark/>
           </w:tcPr>
           <w:p>
@@ -6457,7 +6595,7 @@
         </w:tc>
         <w:tc>
           <w:tcPr>
-            <w:tcW w:w="1950" w:type="dxa"/>
+            <w:tcW w:w="1230" w:type="dxa"/>
             <w:hideMark/>
           </w:tcPr>
           <w:p>
@@ -6470,13 +6608,19 @@
               <w:t>–</w:t>
             </w:r>
             <w:r>
-              <w:t>7.86</w:t>
+              <w:t>7.</w:t>
+            </w:r>
+            <w:r>
+              <w:t>5</w:t>
+            </w:r>
+            <w:r>
+              <w:t>6</w:t>
             </w:r>
           </w:p>
         </w:tc>
         <w:tc>
           <w:tcPr>
-            <w:tcW w:w="1935" w:type="dxa"/>
+            <w:tcW w:w="1500" w:type="dxa"/>
           </w:tcPr>
           <w:p>
             <w:pPr>
@@ -6485,7 +6629,37 @@
               <w:jc w:val="right"/>
             </w:pPr>
             <w:r>
-              <w:t>+</w:t>
+              <w:t>+1.55</w:t>
+            </w:r>
+          </w:p>
+        </w:tc>
+        <w:tc>
+          <w:tcPr>
+            <w:tcW w:w="1500" w:type="dxa"/>
+          </w:tcPr>
+          <w:p>
+            <w:pPr>
+              <w:pStyle w:val="BodyText"/>
+              <w:spacing w:before="0" w:after="0"/>
+              <w:jc w:val="right"/>
+            </w:pPr>
+            <w:r>
+              <w:t>–0.27</w:t>
+            </w:r>
+          </w:p>
+        </w:tc>
+        <w:tc>
+          <w:tcPr>
+            <w:tcW w:w="1485" w:type="dxa"/>
+          </w:tcPr>
+          <w:p>
+            <w:pPr>
+              <w:pStyle w:val="BodyText"/>
+              <w:spacing w:before="0" w:after="0"/>
+              <w:jc w:val="right"/>
+            </w:pPr>
+            <w:r>
+              <w:t>+1.28</w:t>
             </w:r>
           </w:p>
         </w:tc>
@@ -6496,7 +6670,7 @@
         </w:trPr>
         <w:tc>
           <w:tcPr>
-            <w:tcW w:w="2745" w:type="dxa"/>
+            <w:tcW w:w="3015" w:type="dxa"/>
             <w:hideMark/>
           </w:tcPr>
           <w:p>
@@ -6514,7 +6688,7 @@
         </w:tc>
         <w:tc>
           <w:tcPr>
-            <w:tcW w:w="1950" w:type="dxa"/>
+            <w:tcW w:w="1230" w:type="dxa"/>
             <w:hideMark/>
           </w:tcPr>
           <w:p>
@@ -6527,13 +6701,16 @@
               <w:t>–</w:t>
             </w:r>
             <w:r>
-              <w:t>5.14</w:t>
+              <w:t>5.</w:t>
+            </w:r>
+            <w:r>
+              <w:t>01</w:t>
             </w:r>
           </w:p>
         </w:tc>
         <w:tc>
           <w:tcPr>
-            <w:tcW w:w="1935" w:type="dxa"/>
+            <w:tcW w:w="1500" w:type="dxa"/>
           </w:tcPr>
           <w:p>
             <w:pPr>
@@ -6542,7 +6719,37 @@
               <w:jc w:val="right"/>
             </w:pPr>
             <w:r>
-              <w:t>+</w:t>
+              <w:t>+1.03</w:t>
+            </w:r>
+          </w:p>
+        </w:tc>
+        <w:tc>
+          <w:tcPr>
+            <w:tcW w:w="1500" w:type="dxa"/>
+          </w:tcPr>
+          <w:p>
+            <w:pPr>
+              <w:pStyle w:val="BodyText"/>
+              <w:spacing w:before="0" w:after="0"/>
+              <w:jc w:val="right"/>
+            </w:pPr>
+            <w:r>
+              <w:t>–0.18</w:t>
+            </w:r>
+          </w:p>
+        </w:tc>
+        <w:tc>
+          <w:tcPr>
+            <w:tcW w:w="1485" w:type="dxa"/>
+          </w:tcPr>
+          <w:p>
+            <w:pPr>
+              <w:pStyle w:val="BodyText"/>
+              <w:spacing w:before="0" w:after="0"/>
+              <w:jc w:val="right"/>
+            </w:pPr>
+            <w:r>
+              <w:t>+0.85</w:t>
             </w:r>
           </w:p>
         </w:tc>
@@ -6573,7 +6780,111 @@
         <w:rPr>
           <w:rFonts w:ascii="Aptos" w:hAnsi="Aptos"/>
         </w:rPr>
-        <w:t xml:space="preserve"> (CRE) is estimated from the observed clouds (Fig. REFLALBEDO) with a radiative kernel (Zelinka et al. 2023). CRE for the experiments is multiplied by the relative change in the shallow cumulus albedo </w:t>
+        <w:t xml:space="preserve"> (</w:t>
+      </w:r>
+      <w:r>
+        <w:rPr>
+          <w:rFonts w:ascii="Aptos" w:hAnsi="Aptos"/>
+        </w:rPr>
+        <w:t>SW</w:t>
+      </w:r>
+      <w:r>
+        <w:rPr>
+          <w:rFonts w:ascii="Aptos" w:hAnsi="Aptos"/>
+        </w:rPr>
+        <w:t xml:space="preserve">CRE) is estimated </w:t>
+      </w:r>
+      <w:r>
+        <w:rPr>
+          <w:rFonts w:ascii="Aptos" w:hAnsi="Aptos"/>
+        </w:rPr>
+        <w:t>for</w:t>
+      </w:r>
+      <w:r>
+        <w:rPr>
+          <w:rFonts w:ascii="Aptos" w:hAnsi="Aptos"/>
+        </w:rPr>
+        <w:t xml:space="preserve"> </w:t>
+      </w:r>
+      <w:r>
+        <w:rPr>
+          <w:rFonts w:ascii="Aptos" w:hAnsi="Aptos"/>
+        </w:rPr>
+        <w:t xml:space="preserve">GOES </w:t>
+      </w:r>
+      <w:r>
+        <w:rPr>
+          <w:rFonts w:ascii="Aptos" w:hAnsi="Aptos"/>
+        </w:rPr>
+        <w:t>clouds</w:t>
+      </w:r>
+      <w:r>
+        <w:rPr>
+          <w:rFonts w:ascii="Aptos" w:hAnsi="Aptos"/>
+        </w:rPr>
+        <w:t xml:space="preserve"> </w:t>
+      </w:r>
+      <w:r>
+        <w:rPr>
+          <w:rFonts w:ascii="Aptos" w:hAnsi="Aptos"/>
+        </w:rPr>
+        <w:t xml:space="preserve">below 680 </w:t>
+      </w:r>
+      <w:proofErr w:type="spellStart"/>
+      <w:r>
+        <w:rPr>
+          <w:rFonts w:ascii="Aptos" w:hAnsi="Aptos"/>
+        </w:rPr>
+        <w:t>hPa</w:t>
+      </w:r>
+      <w:proofErr w:type="spellEnd"/>
+      <w:r>
+        <w:rPr>
+          <w:rFonts w:ascii="Aptos" w:hAnsi="Aptos"/>
+        </w:rPr>
+        <w:t>,</w:t>
+      </w:r>
+      <w:r>
+        <w:rPr>
+          <w:rFonts w:ascii="Aptos" w:hAnsi="Aptos"/>
+        </w:rPr>
+        <w:t xml:space="preserve"> </w:t>
+      </w:r>
+      <w:r>
+        <w:rPr>
+          <w:rFonts w:ascii="Aptos" w:hAnsi="Aptos"/>
+        </w:rPr>
+        <w:t>with a cloud optical thickness retrieval (NASA Smith XXXX) and</w:t>
+      </w:r>
+      <w:r>
+        <w:rPr>
+          <w:rFonts w:ascii="Aptos" w:hAnsi="Aptos"/>
+        </w:rPr>
+        <w:t xml:space="preserve"> </w:t>
+      </w:r>
+      <w:r>
+        <w:rPr>
+          <w:rFonts w:ascii="Aptos" w:hAnsi="Aptos"/>
+        </w:rPr>
+        <w:t xml:space="preserve">the </w:t>
+      </w:r>
+      <w:r>
+        <w:rPr>
+          <w:rFonts w:ascii="Aptos" w:hAnsi="Aptos"/>
+        </w:rPr>
+        <w:t>Zelinka et al. (2023)</w:t>
+      </w:r>
+      <w:r>
+        <w:rPr>
+          <w:rFonts w:ascii="Aptos" w:hAnsi="Aptos"/>
+        </w:rPr>
+        <w:t xml:space="preserve"> </w:t>
+      </w:r>
+      <w:r>
+        <w:rPr>
+          <w:rFonts w:ascii="Aptos" w:hAnsi="Aptos"/>
+        </w:rPr>
+        <w:t xml:space="preserve">radiative kernel. CRE for the experiments is multiplied by the relative change in the shallow cumulus albedo </w:t>
       </w:r>
       <m:oMath>
         <m:r>

</xml_diff>